<commit_message>
Add 'Section 0: First-time image upload' to Anna's user manual
Concrete ~25-image checklist for day-one setup: site-wide (logo + OG share),
homepage (4 images), pillar pages (8), programmes (5), coaching sessions (3).
Each entry references the new sidebar names ('1. Homepage', 'Page · About',
'Work · Programme', etc.) so Anna can find the right place from a single
glance at the sidebar.
</commit_message>
<xml_diff>
--- a/Docs/ANNA_USER_MANUAL.docx
+++ b/Docs/ANNA_USER_MANUAL.docx
@@ -65,6 +65,1122 @@
           <w:sz w:val="22"/>
         </w:rPr>
         <w:t>). Use that for daily work; come back here when you need depth.</w:t>
+      </w:r>
+    </w:p>
+    <w:p>
+      <w:pPr>
+        <w:spacing w:before="120" w:after="120"/>
+      </w:pPr>
+      <w:r>
+        <w:rPr>
+          <w:color w:val="555555"/>
+        </w:rPr>
+        <w:t>――――――――――――――――――――――――――――――</w:t>
+      </w:r>
+    </w:p>
+    <w:p>
+      <w:pPr>
+        <w:spacing w:before="280" w:after="80"/>
+      </w:pPr>
+      <w:r>
+        <w:rPr>
+          <w:b/>
+          <w:color w:val="6E3A5A"/>
+          <w:sz w:val="32"/>
+        </w:rPr>
+        <w:t>0. First-time image upload (do this once, before anything else)</w:t>
+      </w:r>
+    </w:p>
+    <w:p>
+      <w:pPr>
+        <w:spacing w:after="80"/>
+      </w:pPr>
+      <w:r>
+        <w:rPr>
+          <w:color w:val="231F20"/>
+          <w:sz w:val="22"/>
+        </w:rPr>
+        <w:t>To make the site look "finished" on day one, upload these ~25 images into the Media Library and attach them to the corresponding pages. Total time: roughly 45 minutes.</w:t>
+      </w:r>
+    </w:p>
+    <w:p>
+      <w:pPr>
+        <w:spacing w:after="80"/>
+      </w:pPr>
+      <w:r>
+        <w:rPr>
+          <w:color w:val="231F20"/>
+          <w:sz w:val="22"/>
+        </w:rPr>
+        <w:t>Image specs to aim for:</w:t>
+      </w:r>
+    </w:p>
+    <w:p>
+      <w:pPr>
+        <w:pStyle w:val="ListBullet"/>
+        <w:spacing w:after="40"/>
+      </w:pPr>
+      <w:r>
+        <w:rPr>
+          <w:b/>
+          <w:color w:val="231F20"/>
+          <w:sz w:val="22"/>
+        </w:rPr>
+        <w:t>Hero / portrait images:</w:t>
+      </w:r>
+      <w:r>
+        <w:rPr>
+          <w:color w:val="231F20"/>
+          <w:sz w:val="22"/>
+        </w:rPr>
+        <w:t xml:space="preserve"> 1600 × 1200 px or larger, JPG/PNG</w:t>
+      </w:r>
+    </w:p>
+    <w:p>
+      <w:pPr>
+        <w:pStyle w:val="ListBullet"/>
+        <w:spacing w:after="40"/>
+      </w:pPr>
+      <w:r>
+        <w:rPr>
+          <w:b/>
+          <w:color w:val="231F20"/>
+          <w:sz w:val="22"/>
+        </w:rPr>
+        <w:t>Logo / wordmark / badge:</w:t>
+      </w:r>
+      <w:r>
+        <w:rPr>
+          <w:color w:val="231F20"/>
+          <w:sz w:val="22"/>
+        </w:rPr>
+        <w:t xml:space="preserve"> SVG preferred (vector), or transparent PNG 600 × 600</w:t>
+      </w:r>
+    </w:p>
+    <w:p>
+      <w:pPr>
+        <w:pStyle w:val="ListBullet"/>
+        <w:spacing w:after="40"/>
+      </w:pPr>
+      <w:r>
+        <w:rPr>
+          <w:b/>
+          <w:color w:val="231F20"/>
+          <w:sz w:val="22"/>
+        </w:rPr>
+        <w:t>Square / product images:</w:t>
+      </w:r>
+      <w:r>
+        <w:rPr>
+          <w:color w:val="231F20"/>
+          <w:sz w:val="22"/>
+        </w:rPr>
+        <w:t xml:space="preserve"> 1500 × 1500 px</w:t>
+      </w:r>
+    </w:p>
+    <w:p>
+      <w:pPr>
+        <w:spacing w:after="80"/>
+      </w:pPr>
+      <w:r>
+        <w:rPr>
+          <w:color w:val="231F20"/>
+          <w:sz w:val="22"/>
+        </w:rPr>
+        <w:t>Strapi automatically generates 5 smaller variants (245 / 500 / 750 / 1200 / 1920 px wide) on upload — you upload once at full resolution and the site picks the right size per use.</w:t>
+      </w:r>
+    </w:p>
+    <w:p>
+      <w:pPr>
+        <w:spacing w:before="200" w:after="60"/>
+      </w:pPr>
+      <w:r>
+        <w:rPr>
+          <w:b/>
+          <w:color w:val="231F20"/>
+          <w:sz w:val="26"/>
+        </w:rPr>
+        <w:t>Site-wide (3 images)</w:t>
+      </w:r>
+    </w:p>
+    <w:tbl>
+      <w:tblPr>
+        <w:tblStyle w:val="LightGrid-Accent1"/>
+        <w:tblW w:type="auto" w:w="0"/>
+        <w:tblLook w:firstColumn="1" w:firstRow="1" w:lastColumn="0" w:lastRow="0" w:noHBand="0" w:noVBand="1" w:val="04A0"/>
+      </w:tblPr>
+      <w:tblGrid>
+        <w:gridCol w:w="4824"/>
+        <w:gridCol w:w="4824"/>
+      </w:tblGrid>
+      <w:tr>
+        <w:tc>
+          <w:tcPr>
+            <w:tcW w:type="dxa" w:w="4824"/>
+          </w:tcPr>
+          <w:p>
+            <w:r/>
+            <w:r>
+              <w:rPr>
+                <w:b/>
+                <w:color w:val="6E3A5A"/>
+                <w:sz w:val="22"/>
+              </w:rPr>
+              <w:t>Where to upload</w:t>
+            </w:r>
+          </w:p>
+        </w:tc>
+        <w:tc>
+          <w:tcPr>
+            <w:tcW w:type="dxa" w:w="4824"/>
+          </w:tcPr>
+          <w:p>
+            <w:r/>
+            <w:r>
+              <w:rPr>
+                <w:b/>
+                <w:color w:val="6E3A5A"/>
+                <w:sz w:val="22"/>
+              </w:rPr>
+              <w:t>What to upload</w:t>
+            </w:r>
+          </w:p>
+        </w:tc>
+      </w:tr>
+      <w:tr>
+        <w:tc>
+          <w:tcPr>
+            <w:tcW w:type="dxa" w:w="4824"/>
+          </w:tcPr>
+          <w:p>
+            <w:r/>
+            <w:r>
+              <w:rPr>
+                <w:rFonts w:ascii="Consolas" w:hAnsi="Consolas"/>
+                <w:color w:val="6E3A5A"/>
+                <w:sz w:val="20"/>
+              </w:rPr>
+              <w:t>3. Site Settings → logo</w:t>
+            </w:r>
+          </w:p>
+        </w:tc>
+        <w:tc>
+          <w:tcPr>
+            <w:tcW w:type="dxa" w:w="4824"/>
+          </w:tcPr>
+          <w:p>
+            <w:r/>
+            <w:r>
+              <w:rPr>
+                <w:color w:val="231F20"/>
+                <w:sz w:val="22"/>
+              </w:rPr>
+              <w:t>Anna Lou Wellness wordmark (light background)</w:t>
+            </w:r>
+          </w:p>
+        </w:tc>
+      </w:tr>
+      <w:tr>
+        <w:tc>
+          <w:tcPr>
+            <w:tcW w:type="dxa" w:w="4824"/>
+          </w:tcPr>
+          <w:p>
+            <w:r/>
+            <w:r>
+              <w:rPr>
+                <w:rFonts w:ascii="Consolas" w:hAnsi="Consolas"/>
+                <w:color w:val="6E3A5A"/>
+                <w:sz w:val="20"/>
+              </w:rPr>
+              <w:t>3. Site Settings → og_default_image</w:t>
+            </w:r>
+          </w:p>
+        </w:tc>
+        <w:tc>
+          <w:tcPr>
+            <w:tcW w:type="dxa" w:w="4824"/>
+          </w:tcPr>
+          <w:p>
+            <w:r/>
+            <w:r>
+              <w:rPr>
+                <w:color w:val="231F20"/>
+                <w:sz w:val="22"/>
+              </w:rPr>
+              <w:t>1200 × 630 social-share image (Anna portrait + wordmark)</w:t>
+            </w:r>
+          </w:p>
+        </w:tc>
+      </w:tr>
+      <w:tr>
+        <w:tc>
+          <w:tcPr>
+            <w:tcW w:type="dxa" w:w="4824"/>
+          </w:tcPr>
+          <w:p>
+            <w:r/>
+            <w:r>
+              <w:rPr>
+                <w:rFonts w:ascii="Consolas" w:hAnsi="Consolas"/>
+                <w:color w:val="6E3A5A"/>
+                <w:sz w:val="20"/>
+              </w:rPr>
+              <w:t>3. Site Settings → favicon</w:t>
+            </w:r>
+          </w:p>
+        </w:tc>
+        <w:tc>
+          <w:tcPr>
+            <w:tcW w:type="dxa" w:w="4824"/>
+          </w:tcPr>
+          <w:p>
+            <w:r/>
+            <w:r>
+              <w:rPr>
+                <w:color w:val="231F20"/>
+                <w:sz w:val="22"/>
+              </w:rPr>
+              <w:t>(already set — only re-upload if you want a new one)</w:t>
+            </w:r>
+          </w:p>
+        </w:tc>
+      </w:tr>
+    </w:tbl>
+    <w:p/>
+    <w:p>
+      <w:pPr>
+        <w:spacing w:before="200" w:after="60"/>
+      </w:pPr>
+      <w:r>
+        <w:rPr>
+          <w:b/>
+          <w:color w:val="231F20"/>
+          <w:sz w:val="26"/>
+        </w:rPr>
+        <w:t>Homepage (4 images)</w:t>
+      </w:r>
+    </w:p>
+    <w:p>
+      <w:pPr>
+        <w:spacing w:after="80"/>
+      </w:pPr>
+      <w:r>
+        <w:rPr>
+          <w:rFonts w:ascii="Consolas" w:hAnsi="Consolas"/>
+          <w:color w:val="6E3A5A"/>
+          <w:sz w:val="20"/>
+        </w:rPr>
+        <w:t>1. Homepage</w:t>
+      </w:r>
+      <w:r>
+        <w:rPr>
+          <w:color w:val="231F20"/>
+          <w:sz w:val="22"/>
+        </w:rPr>
+        <w:t xml:space="preserve"> →</w:t>
+      </w:r>
+    </w:p>
+    <w:p>
+      <w:pPr>
+        <w:pStyle w:val="ListBullet"/>
+        <w:spacing w:after="40"/>
+      </w:pPr>
+      <w:r>
+        <w:rPr>
+          <w:rFonts w:ascii="Consolas" w:hAnsi="Consolas"/>
+          <w:color w:val="6E3A5A"/>
+          <w:sz w:val="20"/>
+        </w:rPr>
+        <w:t>heroImage</w:t>
+      </w:r>
+      <w:r>
+        <w:rPr>
+          <w:color w:val="231F20"/>
+          <w:sz w:val="22"/>
+        </w:rPr>
+        <w:t xml:space="preserve"> — main portrait/hero (1600 × 1200, portrait orientation, e.g. you on the houseboat or studio shot)</w:t>
+      </w:r>
+    </w:p>
+    <w:p>
+      <w:pPr>
+        <w:pStyle w:val="ListBullet"/>
+        <w:spacing w:after="40"/>
+      </w:pPr>
+      <w:r>
+        <w:rPr>
+          <w:rFonts w:ascii="Consolas" w:hAnsi="Consolas"/>
+          <w:color w:val="6E3A5A"/>
+          <w:sz w:val="20"/>
+        </w:rPr>
+        <w:t>workImage</w:t>
+      </w:r>
+      <w:r>
+        <w:rPr>
+          <w:color w:val="231F20"/>
+          <w:sz w:val="22"/>
+        </w:rPr>
+        <w:t xml:space="preserve"> — the "Work with Anna" section photo</w:t>
+      </w:r>
+    </w:p>
+    <w:p>
+      <w:pPr>
+        <w:pStyle w:val="ListBullet"/>
+        <w:spacing w:after="40"/>
+      </w:pPr>
+      <w:r>
+        <w:rPr>
+          <w:rFonts w:ascii="Consolas" w:hAnsi="Consolas"/>
+          <w:color w:val="6E3A5A"/>
+          <w:sz w:val="20"/>
+        </w:rPr>
+        <w:t>communityImage</w:t>
+      </w:r>
+      <w:r>
+        <w:rPr>
+          <w:color w:val="231F20"/>
+          <w:sz w:val="22"/>
+        </w:rPr>
+        <w:t xml:space="preserve"> — the Community teaser photo</w:t>
+      </w:r>
+    </w:p>
+    <w:p>
+      <w:pPr>
+        <w:pStyle w:val="ListBullet"/>
+        <w:spacing w:after="40"/>
+      </w:pPr>
+      <w:r>
+        <w:rPr>
+          <w:rFonts w:ascii="Consolas" w:hAnsi="Consolas"/>
+          <w:color w:val="6E3A5A"/>
+          <w:sz w:val="20"/>
+        </w:rPr>
+        <w:t>portraitImage</w:t>
+      </w:r>
+      <w:r>
+        <w:rPr>
+          <w:color w:val="231F20"/>
+          <w:sz w:val="22"/>
+        </w:rPr>
+        <w:t xml:space="preserve"> — small portrait for the About teaser block</w:t>
+      </w:r>
+    </w:p>
+    <w:p>
+      <w:pPr>
+        <w:spacing w:before="200" w:after="60"/>
+      </w:pPr>
+      <w:r>
+        <w:rPr>
+          <w:b/>
+          <w:color w:val="231F20"/>
+          <w:sz w:val="26"/>
+        </w:rPr>
+        <w:t>Pillar pages (8 images)</w:t>
+      </w:r>
+    </w:p>
+    <w:tbl>
+      <w:tblPr>
+        <w:tblStyle w:val="LightGrid-Accent1"/>
+        <w:tblW w:type="auto" w:w="0"/>
+        <w:tblLook w:firstColumn="1" w:firstRow="1" w:lastColumn="0" w:lastRow="0" w:noHBand="0" w:noVBand="1" w:val="04A0"/>
+      </w:tblPr>
+      <w:tblGrid>
+        <w:gridCol w:w="4824"/>
+        <w:gridCol w:w="4824"/>
+      </w:tblGrid>
+      <w:tr>
+        <w:tc>
+          <w:tcPr>
+            <w:tcW w:type="dxa" w:w="4824"/>
+          </w:tcPr>
+          <w:p>
+            <w:r/>
+            <w:r>
+              <w:rPr>
+                <w:b/>
+                <w:color w:val="6E3A5A"/>
+                <w:sz w:val="22"/>
+              </w:rPr>
+              <w:t>Where</w:t>
+            </w:r>
+          </w:p>
+        </w:tc>
+        <w:tc>
+          <w:tcPr>
+            <w:tcW w:type="dxa" w:w="4824"/>
+          </w:tcPr>
+          <w:p>
+            <w:r/>
+            <w:r>
+              <w:rPr>
+                <w:b/>
+                <w:color w:val="6E3A5A"/>
+                <w:sz w:val="22"/>
+              </w:rPr>
+              <w:t>Field</w:t>
+            </w:r>
+          </w:p>
+        </w:tc>
+      </w:tr>
+      <w:tr>
+        <w:tc>
+          <w:tcPr>
+            <w:tcW w:type="dxa" w:w="4824"/>
+          </w:tcPr>
+          <w:p>
+            <w:r/>
+            <w:r>
+              <w:rPr>
+                <w:rFonts w:ascii="Consolas" w:hAnsi="Consolas"/>
+                <w:color w:val="6E3A5A"/>
+                <w:sz w:val="20"/>
+              </w:rPr>
+              <w:t>Page · About</w:t>
+            </w:r>
+          </w:p>
+        </w:tc>
+        <w:tc>
+          <w:tcPr>
+            <w:tcW w:type="dxa" w:w="4824"/>
+          </w:tcPr>
+          <w:p>
+            <w:r/>
+            <w:r>
+              <w:rPr>
+                <w:rFonts w:ascii="Consolas" w:hAnsi="Consolas"/>
+                <w:color w:val="6E3A5A"/>
+                <w:sz w:val="20"/>
+              </w:rPr>
+              <w:t>portrait</w:t>
+            </w:r>
+            <w:r>
+              <w:rPr>
+                <w:color w:val="231F20"/>
+                <w:sz w:val="22"/>
+              </w:rPr>
+              <w:t xml:space="preserve"> — main "Anna's story" photo (portrait orientation)</w:t>
+            </w:r>
+          </w:p>
+        </w:tc>
+      </w:tr>
+      <w:tr>
+        <w:tc>
+          <w:tcPr>
+            <w:tcW w:type="dxa" w:w="4824"/>
+          </w:tcPr>
+          <w:p>
+            <w:r/>
+            <w:r>
+              <w:rPr>
+                <w:rFonts w:ascii="Consolas" w:hAnsi="Consolas"/>
+                <w:color w:val="6E3A5A"/>
+                <w:sz w:val="20"/>
+              </w:rPr>
+              <w:t>Page · About</w:t>
+            </w:r>
+          </w:p>
+        </w:tc>
+        <w:tc>
+          <w:tcPr>
+            <w:tcW w:type="dxa" w:w="4824"/>
+          </w:tcPr>
+          <w:p>
+            <w:r/>
+            <w:r>
+              <w:rPr>
+                <w:rFonts w:ascii="Consolas" w:hAnsi="Consolas"/>
+                <w:color w:val="6E3A5A"/>
+                <w:sz w:val="20"/>
+              </w:rPr>
+              <w:t>press_logos</w:t>
+            </w:r>
+            <w:r>
+              <w:rPr>
+                <w:color w:val="231F20"/>
+                <w:sz w:val="22"/>
+              </w:rPr>
+              <w:t xml:space="preserve"> — one logo per row (Aneeza is sending the licensed artwork)</w:t>
+            </w:r>
+          </w:p>
+        </w:tc>
+      </w:tr>
+      <w:tr>
+        <w:tc>
+          <w:tcPr>
+            <w:tcW w:type="dxa" w:w="4824"/>
+          </w:tcPr>
+          <w:p>
+            <w:r/>
+            <w:r>
+              <w:rPr>
+                <w:rFonts w:ascii="Consolas" w:hAnsi="Consolas"/>
+                <w:color w:val="6E3A5A"/>
+                <w:sz w:val="20"/>
+              </w:rPr>
+              <w:t>Page · About</w:t>
+            </w:r>
+          </w:p>
+        </w:tc>
+        <w:tc>
+          <w:tcPr>
+            <w:tcW w:type="dxa" w:w="4824"/>
+          </w:tcPr>
+          <w:p>
+            <w:r/>
+            <w:r>
+              <w:rPr>
+                <w:rFonts w:ascii="Consolas" w:hAnsi="Consolas"/>
+                <w:color w:val="6E3A5A"/>
+                <w:sz w:val="20"/>
+              </w:rPr>
+              <w:t>certifications</w:t>
+            </w:r>
+            <w:r>
+              <w:rPr>
+                <w:color w:val="231F20"/>
+                <w:sz w:val="22"/>
+              </w:rPr>
+              <w:t xml:space="preserve"> — ICF, CPD, TRE badge per row</w:t>
+            </w:r>
+          </w:p>
+        </w:tc>
+      </w:tr>
+      <w:tr>
+        <w:tc>
+          <w:tcPr>
+            <w:tcW w:type="dxa" w:w="4824"/>
+          </w:tcPr>
+          <w:p>
+            <w:r/>
+            <w:r>
+              <w:rPr>
+                <w:rFonts w:ascii="Consolas" w:hAnsi="Consolas"/>
+                <w:color w:val="6E3A5A"/>
+                <w:sz w:val="20"/>
+              </w:rPr>
+              <w:t>Page · Community</w:t>
+            </w:r>
+          </w:p>
+        </w:tc>
+        <w:tc>
+          <w:tcPr>
+            <w:tcW w:type="dxa" w:w="4824"/>
+          </w:tcPr>
+          <w:p>
+            <w:r/>
+            <w:r>
+              <w:rPr>
+                <w:rFonts w:ascii="Consolas" w:hAnsi="Consolas"/>
+                <w:color w:val="6E3A5A"/>
+                <w:sz w:val="20"/>
+              </w:rPr>
+              <w:t>circle_image</w:t>
+            </w:r>
+            <w:r>
+              <w:rPr>
+                <w:color w:val="231F20"/>
+                <w:sz w:val="22"/>
+              </w:rPr>
+              <w:t xml:space="preserve"> — Returning Circle photo</w:t>
+            </w:r>
+          </w:p>
+        </w:tc>
+      </w:tr>
+      <w:tr>
+        <w:tc>
+          <w:tcPr>
+            <w:tcW w:type="dxa" w:w="4824"/>
+          </w:tcPr>
+          <w:p>
+            <w:r/>
+            <w:r>
+              <w:rPr>
+                <w:rFonts w:ascii="Consolas" w:hAnsi="Consolas"/>
+                <w:color w:val="6E3A5A"/>
+                <w:sz w:val="20"/>
+              </w:rPr>
+              <w:t>Page · Community</w:t>
+            </w:r>
+          </w:p>
+        </w:tc>
+        <w:tc>
+          <w:tcPr>
+            <w:tcW w:type="dxa" w:w="4824"/>
+          </w:tcPr>
+          <w:p>
+            <w:r/>
+            <w:r>
+              <w:rPr>
+                <w:rFonts w:ascii="Consolas" w:hAnsi="Consolas"/>
+                <w:color w:val="6E3A5A"/>
+                <w:sz w:val="20"/>
+              </w:rPr>
+              <w:t>reset_room_image</w:t>
+            </w:r>
+            <w:r>
+              <w:rPr>
+                <w:color w:val="231F20"/>
+                <w:sz w:val="22"/>
+              </w:rPr>
+              <w:t xml:space="preserve"> — Reset Room visual</w:t>
+            </w:r>
+          </w:p>
+        </w:tc>
+      </w:tr>
+      <w:tr>
+        <w:tc>
+          <w:tcPr>
+            <w:tcW w:type="dxa" w:w="4824"/>
+          </w:tcPr>
+          <w:p>
+            <w:r/>
+            <w:r>
+              <w:rPr>
+                <w:rFonts w:ascii="Consolas" w:hAnsi="Consolas"/>
+                <w:color w:val="6E3A5A"/>
+                <w:sz w:val="20"/>
+              </w:rPr>
+              <w:t>Page · Reset Letters</w:t>
+            </w:r>
+          </w:p>
+        </w:tc>
+        <w:tc>
+          <w:tcPr>
+            <w:tcW w:type="dxa" w:w="4824"/>
+          </w:tcPr>
+          <w:p>
+            <w:r/>
+            <w:r>
+              <w:rPr>
+                <w:color w:val="231F20"/>
+                <w:sz w:val="22"/>
+              </w:rPr>
+              <w:t>(uses brand colour wordmark, no extra image needed for now)</w:t>
+            </w:r>
+          </w:p>
+        </w:tc>
+      </w:tr>
+      <w:tr>
+        <w:tc>
+          <w:tcPr>
+            <w:tcW w:type="dxa" w:w="4824"/>
+          </w:tcPr>
+          <w:p>
+            <w:r/>
+            <w:r>
+              <w:rPr>
+                <w:rFonts w:ascii="Consolas" w:hAnsi="Consolas"/>
+                <w:color w:val="6E3A5A"/>
+                <w:sz w:val="20"/>
+              </w:rPr>
+              <w:t>Page · Reset Room</w:t>
+            </w:r>
+          </w:p>
+        </w:tc>
+        <w:tc>
+          <w:tcPr>
+            <w:tcW w:type="dxa" w:w="4824"/>
+          </w:tcPr>
+          <w:p>
+            <w:r/>
+            <w:r>
+              <w:rPr>
+                <w:rFonts w:ascii="Consolas" w:hAnsi="Consolas"/>
+                <w:color w:val="6E3A5A"/>
+                <w:sz w:val="20"/>
+              </w:rPr>
+              <w:t>hero_image</w:t>
+            </w:r>
+          </w:p>
+        </w:tc>
+      </w:tr>
+      <w:tr>
+        <w:tc>
+          <w:tcPr>
+            <w:tcW w:type="dxa" w:w="4824"/>
+          </w:tcPr>
+          <w:p>
+            <w:r/>
+            <w:r>
+              <w:rPr>
+                <w:rFonts w:ascii="Consolas" w:hAnsi="Consolas"/>
+                <w:color w:val="6E3A5A"/>
+                <w:sz w:val="20"/>
+              </w:rPr>
+              <w:t>Page · Decoder (free)</w:t>
+            </w:r>
+          </w:p>
+        </w:tc>
+        <w:tc>
+          <w:tcPr>
+            <w:tcW w:type="dxa" w:w="4824"/>
+          </w:tcPr>
+          <w:p>
+            <w:r/>
+            <w:r>
+              <w:rPr>
+                <w:rFonts w:ascii="Consolas" w:hAnsi="Consolas"/>
+                <w:color w:val="6E3A5A"/>
+                <w:sz w:val="20"/>
+              </w:rPr>
+              <w:t>hero_image</w:t>
+            </w:r>
+          </w:p>
+        </w:tc>
+      </w:tr>
+      <w:tr>
+        <w:tc>
+          <w:tcPr>
+            <w:tcW w:type="dxa" w:w="4824"/>
+          </w:tcPr>
+          <w:p>
+            <w:r/>
+            <w:r>
+              <w:rPr>
+                <w:rFonts w:ascii="Consolas" w:hAnsi="Consolas"/>
+                <w:color w:val="6E3A5A"/>
+                <w:sz w:val="20"/>
+              </w:rPr>
+              <w:t>Page · Experiences</w:t>
+            </w:r>
+          </w:p>
+        </w:tc>
+        <w:tc>
+          <w:tcPr>
+            <w:tcW w:type="dxa" w:w="4824"/>
+          </w:tcPr>
+          <w:p>
+            <w:r/>
+            <w:r>
+              <w:rPr>
+                <w:rFonts w:ascii="Consolas" w:hAnsi="Consolas"/>
+                <w:color w:val="6E3A5A"/>
+                <w:sz w:val="20"/>
+              </w:rPr>
+              <w:t>hero_image</w:t>
+            </w:r>
+          </w:p>
+        </w:tc>
+      </w:tr>
+      <w:tr>
+        <w:tc>
+          <w:tcPr>
+            <w:tcW w:type="dxa" w:w="4824"/>
+          </w:tcPr>
+          <w:p>
+            <w:r/>
+            <w:r>
+              <w:rPr>
+                <w:rFonts w:ascii="Consolas" w:hAnsi="Consolas"/>
+                <w:color w:val="6E3A5A"/>
+                <w:sz w:val="20"/>
+              </w:rPr>
+              <w:t>Work · Membership (Reset Room)</w:t>
+            </w:r>
+          </w:p>
+        </w:tc>
+        <w:tc>
+          <w:tcPr>
+            <w:tcW w:type="dxa" w:w="4824"/>
+          </w:tcPr>
+          <w:p>
+            <w:r/>
+            <w:r>
+              <w:rPr>
+                <w:rFonts w:ascii="Consolas" w:hAnsi="Consolas"/>
+                <w:color w:val="6E3A5A"/>
+                <w:sz w:val="20"/>
+              </w:rPr>
+              <w:t>hero_image</w:t>
+            </w:r>
+          </w:p>
+        </w:tc>
+      </w:tr>
+    </w:tbl>
+    <w:p/>
+    <w:p>
+      <w:pPr>
+        <w:spacing w:before="200" w:after="60"/>
+      </w:pPr>
+      <w:r>
+        <w:rPr>
+          <w:b/>
+          <w:color w:val="231F20"/>
+          <w:sz w:val="26"/>
+        </w:rPr>
+        <w:t>Work with Anna — programmes (5 images)</w:t>
+      </w:r>
+    </w:p>
+    <w:p>
+      <w:pPr>
+        <w:spacing w:after="80"/>
+      </w:pPr>
+      <w:r>
+        <w:rPr>
+          <w:rFonts w:ascii="Consolas" w:hAnsi="Consolas"/>
+          <w:color w:val="6E3A5A"/>
+          <w:sz w:val="20"/>
+        </w:rPr>
+        <w:t>Work · Programme</w:t>
+      </w:r>
+      <w:r>
+        <w:rPr>
+          <w:color w:val="231F20"/>
+          <w:sz w:val="22"/>
+        </w:rPr>
+        <w:t xml:space="preserve"> → for each entry (The Reset, Signal, Signal &amp; Build, One Day, Signal Collective):</w:t>
+      </w:r>
+    </w:p>
+    <w:p>
+      <w:pPr>
+        <w:pStyle w:val="ListBullet"/>
+        <w:spacing w:after="40"/>
+      </w:pPr>
+      <w:r>
+        <w:rPr>
+          <w:rFonts w:ascii="Consolas" w:hAnsi="Consolas"/>
+          <w:color w:val="6E3A5A"/>
+          <w:sz w:val="20"/>
+        </w:rPr>
+        <w:t>hero_image</w:t>
+      </w:r>
+      <w:r>
+        <w:rPr>
+          <w:color w:val="231F20"/>
+          <w:sz w:val="22"/>
+        </w:rPr>
+        <w:t xml:space="preserve"> — one portrait photo per programme</w:t>
+      </w:r>
+    </w:p>
+    <w:p>
+      <w:pPr>
+        <w:spacing w:before="200" w:after="60"/>
+      </w:pPr>
+      <w:r>
+        <w:rPr>
+          <w:b/>
+          <w:color w:val="231F20"/>
+          <w:sz w:val="26"/>
+        </w:rPr>
+        <w:t>Work with Anna — coaching sessions (3 images)</w:t>
+      </w:r>
+    </w:p>
+    <w:p>
+      <w:pPr>
+        <w:spacing w:after="80"/>
+      </w:pPr>
+      <w:r>
+        <w:rPr>
+          <w:rFonts w:ascii="Consolas" w:hAnsi="Consolas"/>
+          <w:color w:val="6E3A5A"/>
+          <w:sz w:val="20"/>
+        </w:rPr>
+        <w:t>Work · Coaching Session</w:t>
+      </w:r>
+      <w:r>
+        <w:rPr>
+          <w:color w:val="231F20"/>
+          <w:sz w:val="22"/>
+        </w:rPr>
+        <w:t xml:space="preserve"> → for each entry (Dating Reset, Founder Reset, Nervous System Reset):</w:t>
+      </w:r>
+    </w:p>
+    <w:p>
+      <w:pPr>
+        <w:pStyle w:val="ListBullet"/>
+        <w:spacing w:after="40"/>
+      </w:pPr>
+      <w:r>
+        <w:rPr>
+          <w:rFonts w:ascii="Consolas" w:hAnsi="Consolas"/>
+          <w:color w:val="6E3A5A"/>
+          <w:sz w:val="20"/>
+        </w:rPr>
+        <w:t>hero_image</w:t>
+      </w:r>
+    </w:p>
+    <w:p>
+      <w:pPr>
+        <w:spacing w:before="200" w:after="60"/>
+      </w:pPr>
+      <w:r>
+        <w:rPr>
+          <w:b/>
+          <w:color w:val="231F20"/>
+          <w:sz w:val="26"/>
+        </w:rPr>
+        <w:t>Articles, products, events</w:t>
+      </w:r>
+    </w:p>
+    <w:p>
+      <w:pPr>
+        <w:spacing w:after="80"/>
+      </w:pPr>
+      <w:r>
+        <w:rPr>
+          <w:color w:val="231F20"/>
+          <w:sz w:val="22"/>
+        </w:rPr>
+        <w:t xml:space="preserve">You add these gradually as you publish — each new article needs a </w:t>
+      </w:r>
+      <w:r>
+        <w:rPr>
+          <w:rFonts w:ascii="Consolas" w:hAnsi="Consolas"/>
+          <w:color w:val="6E3A5A"/>
+          <w:sz w:val="20"/>
+        </w:rPr>
+        <w:t>hero_image</w:t>
+      </w:r>
+      <w:r>
+        <w:rPr>
+          <w:color w:val="231F20"/>
+          <w:sz w:val="22"/>
+        </w:rPr>
+        <w:t xml:space="preserve">, each product needs </w:t>
+      </w:r>
+      <w:r>
+        <w:rPr>
+          <w:rFonts w:ascii="Consolas" w:hAnsi="Consolas"/>
+          <w:color w:val="6E3A5A"/>
+          <w:sz w:val="20"/>
+        </w:rPr>
+        <w:t>images</w:t>
+      </w:r>
+      <w:r>
+        <w:rPr>
+          <w:color w:val="231F20"/>
+          <w:sz w:val="22"/>
+        </w:rPr>
+        <w:t xml:space="preserve"> (gallery), each event needs </w:t>
+      </w:r>
+      <w:r>
+        <w:rPr>
+          <w:rFonts w:ascii="Consolas" w:hAnsi="Consolas"/>
+          <w:color w:val="6E3A5A"/>
+          <w:sz w:val="20"/>
+        </w:rPr>
+        <w:t>hero_image</w:t>
+      </w:r>
+      <w:r>
+        <w:rPr>
+          <w:color w:val="231F20"/>
+          <w:sz w:val="22"/>
+        </w:rPr>
+        <w:t>. No "first-time" lift; just attach the image when you create the entry.</w:t>
+      </w:r>
+    </w:p>
+    <w:p>
+      <w:pPr>
+        <w:spacing w:before="200" w:after="60"/>
+      </w:pPr>
+      <w:r>
+        <w:rPr>
+          <w:b/>
+          <w:color w:val="231F20"/>
+          <w:sz w:val="26"/>
+        </w:rPr>
+        <w:t>Tips for choosing photos</w:t>
+      </w:r>
+    </w:p>
+    <w:p>
+      <w:pPr>
+        <w:pStyle w:val="ListBullet"/>
+        <w:spacing w:after="40"/>
+      </w:pPr>
+      <w:r>
+        <w:rPr>
+          <w:b/>
+          <w:color w:val="231F20"/>
+          <w:sz w:val="22"/>
+        </w:rPr>
+        <w:t>Portrait orientation</w:t>
+      </w:r>
+      <w:r>
+        <w:rPr>
+          <w:color w:val="231F20"/>
+          <w:sz w:val="22"/>
+        </w:rPr>
+        <w:t xml:space="preserve"> for hero images on individual pages (works better with the side-by-side image+text layout)</w:t>
+      </w:r>
+    </w:p>
+    <w:p>
+      <w:pPr>
+        <w:pStyle w:val="ListBullet"/>
+        <w:spacing w:after="40"/>
+      </w:pPr>
+      <w:r>
+        <w:rPr>
+          <w:b/>
+          <w:color w:val="231F20"/>
+          <w:sz w:val="22"/>
+        </w:rPr>
+        <w:t>Landscape</w:t>
+      </w:r>
+      <w:r>
+        <w:rPr>
+          <w:color w:val="231F20"/>
+          <w:sz w:val="22"/>
+        </w:rPr>
+        <w:t xml:space="preserve"> for full-bleed sections (like community circle, retreat photos)</w:t>
+      </w:r>
+    </w:p>
+    <w:p>
+      <w:pPr>
+        <w:pStyle w:val="ListBullet"/>
+        <w:spacing w:after="40"/>
+      </w:pPr>
+      <w:r>
+        <w:rPr>
+          <w:b/>
+          <w:color w:val="231F20"/>
+          <w:sz w:val="22"/>
+        </w:rPr>
+        <w:t>Square</w:t>
+      </w:r>
+      <w:r>
+        <w:rPr>
+          <w:color w:val="231F20"/>
+          <w:sz w:val="22"/>
+        </w:rPr>
+        <w:t xml:space="preserve"> for product photography and Instagram shares</w:t>
+      </w:r>
+    </w:p>
+    <w:p>
+      <w:pPr>
+        <w:pStyle w:val="ListBullet"/>
+        <w:spacing w:after="40"/>
+      </w:pPr>
+      <w:r>
+        <w:rPr>
+          <w:color w:val="231F20"/>
+          <w:sz w:val="22"/>
+        </w:rPr>
+        <w:t>Same colour grading / mood across the brand for visual cohesion</w:t>
+      </w:r>
+    </w:p>
+    <w:p>
+      <w:pPr>
+        <w:pStyle w:val="ListBullet"/>
+        <w:spacing w:after="40"/>
+      </w:pPr>
+      <w:r>
+        <w:rPr>
+          <w:color w:val="231F20"/>
+          <w:sz w:val="22"/>
+        </w:rPr>
+        <w:t>Avoid stock photo cliches — your own photography always reads better</w:t>
+      </w:r>
+    </w:p>
+    <w:p>
+      <w:pPr>
+        <w:spacing w:after="80"/>
+      </w:pPr>
+      <w:r>
+        <w:rPr>
+          <w:color w:val="231F20"/>
+          <w:sz w:val="22"/>
+        </w:rPr>
+        <w:t>When in doubt, upload what you have. The site degrades gracefully to placeholders if a field is empty.</w:t>
       </w:r>
     </w:p>
     <w:p>

</xml_diff>

<commit_message>
Sync user manual + cheatsheet with dropped 'Page · ' prefix
All 9 page singletons now use their literal menu name (About, Community,
Contact, Decoder, Experiences, Reset Letters, Reset Room, Sub-pages,
Community Event, Welcome) instead of 'Page · X'. Updated every reference
in the user manual + image-upload checklist, plus the 'Where things live'
section 1 with a clearer explainer that the page singletons map 1:1 to
the menu items Anna clicks on the live site.
</commit_message>
<xml_diff>
--- a/Docs/ANNA_USER_MANUAL.docx
+++ b/Docs/ANNA_USER_MANUAL.docx
@@ -535,7 +535,7 @@
                 <w:color w:val="6E3A5A"/>
                 <w:sz w:val="20"/>
               </w:rPr>
-              <w:t>Page · About</w:t>
+              <w:t>About</w:t>
             </w:r>
           </w:p>
         </w:tc>
@@ -576,7 +576,7 @@
                 <w:color w:val="6E3A5A"/>
                 <w:sz w:val="20"/>
               </w:rPr>
-              <w:t>Page · About</w:t>
+              <w:t>About</w:t>
             </w:r>
           </w:p>
         </w:tc>
@@ -617,7 +617,7 @@
                 <w:color w:val="6E3A5A"/>
                 <w:sz w:val="20"/>
               </w:rPr>
-              <w:t>Page · About</w:t>
+              <w:t>About</w:t>
             </w:r>
           </w:p>
         </w:tc>
@@ -658,7 +658,7 @@
                 <w:color w:val="6E3A5A"/>
                 <w:sz w:val="20"/>
               </w:rPr>
-              <w:t>Page · Community</w:t>
+              <w:t>Community</w:t>
             </w:r>
           </w:p>
         </w:tc>
@@ -699,7 +699,7 @@
                 <w:color w:val="6E3A5A"/>
                 <w:sz w:val="20"/>
               </w:rPr>
-              <w:t>Page · Community</w:t>
+              <w:t>Community</w:t>
             </w:r>
           </w:p>
         </w:tc>
@@ -740,7 +740,7 @@
                 <w:color w:val="6E3A5A"/>
                 <w:sz w:val="20"/>
               </w:rPr>
-              <w:t>Page · Reset Letters</w:t>
+              <w:t>Reset Letters</w:t>
             </w:r>
           </w:p>
         </w:tc>
@@ -773,7 +773,7 @@
                 <w:color w:val="6E3A5A"/>
                 <w:sz w:val="20"/>
               </w:rPr>
-              <w:t>Page · Reset Room</w:t>
+              <w:t>Reset Room</w:t>
             </w:r>
           </w:p>
         </w:tc>
@@ -807,7 +807,7 @@
                 <w:color w:val="6E3A5A"/>
                 <w:sz w:val="20"/>
               </w:rPr>
-              <w:t>Page · Decoder (free)</w:t>
+              <w:t>Decoder</w:t>
             </w:r>
           </w:p>
         </w:tc>
@@ -841,7 +841,7 @@
                 <w:color w:val="6E3A5A"/>
                 <w:sz w:val="20"/>
               </w:rPr>
-              <w:t>Page · Experiences</w:t>
+              <w:t>Experiences</w:t>
             </w:r>
           </w:p>
         </w:tc>
@@ -1649,7 +1649,7 @@
           <w:color w:val="231F20"/>
           <w:sz w:val="22"/>
         </w:rPr>
-        <w:t xml:space="preserve"> (</w:t>
+        <w:t xml:space="preserve"> (each one matches a menu item on the website — click </w:t>
       </w:r>
       <w:r>
         <w:rPr>
@@ -1657,47 +1657,14 @@
           <w:color w:val="6E3A5A"/>
           <w:sz w:val="20"/>
         </w:rPr>
-        <w:t>Page · X</w:t>
-      </w:r>
-      <w:r>
-        <w:rPr>
-          <w:color w:val="231F20"/>
-          <w:sz w:val="22"/>
-        </w:rPr>
-        <w:t>):</w:t>
-      </w:r>
-    </w:p>
-    <w:p>
-      <w:pPr>
-        <w:pStyle w:val="ListBullet"/>
-        <w:spacing w:after="40"/>
-      </w:pPr>
-      <w:r>
-        <w:rPr>
-          <w:color w:val="231F20"/>
-          <w:sz w:val="22"/>
-        </w:rPr>
-        <w:t>Page · About / Community / Contact / Decoder (free) / Experiences / Reset Letters / Reset Room / Sub-page / Community Event / Welcome</w:t>
-      </w:r>
-    </w:p>
-    <w:p>
-      <w:pPr>
-        <w:spacing w:after="80"/>
-      </w:pPr>
-      <w:r>
-        <w:rPr>
-          <w:b/>
-          <w:color w:val="231F20"/>
-          <w:sz w:val="22"/>
-        </w:rPr>
-        <w:t>Editorial content</w:t>
-      </w:r>
-      <w:r>
-        <w:rPr>
-          <w:color w:val="231F20"/>
-          <w:sz w:val="22"/>
-        </w:rPr>
-        <w:t xml:space="preserve"> (</w:t>
+        <w:t>ABOUT</w:t>
+      </w:r>
+      <w:r>
+        <w:rPr>
+          <w:color w:val="231F20"/>
+          <w:sz w:val="22"/>
+        </w:rPr>
+        <w:t xml:space="preserve"> in the menu, edit </w:t>
       </w:r>
       <w:r>
         <w:rPr>
@@ -1705,14 +1672,14 @@
           <w:color w:val="6E3A5A"/>
           <w:sz w:val="20"/>
         </w:rPr>
-        <w:t>Story · X</w:t>
-      </w:r>
-      <w:r>
-        <w:rPr>
-          <w:color w:val="231F20"/>
-          <w:sz w:val="22"/>
-        </w:rPr>
-        <w:t>):</w:t>
+        <w:t>About</w:t>
+      </w:r>
+      <w:r>
+        <w:rPr>
+          <w:color w:val="231F20"/>
+          <w:sz w:val="22"/>
+        </w:rPr>
+        <w:t xml:space="preserve"> in the CMS):</w:t>
       </w:r>
     </w:p>
     <w:p>
@@ -1725,46 +1692,7 @@
           <w:color w:val="231F20"/>
           <w:sz w:val="22"/>
         </w:rPr>
-        <w:t>Story · Article (every blog/Reset Story/Life/Love/Work article lives here, separated by Category)</w:t>
-      </w:r>
-    </w:p>
-    <w:p>
-      <w:pPr>
-        <w:pStyle w:val="ListBullet"/>
-        <w:spacing w:after="40"/>
-      </w:pPr>
-      <w:r>
-        <w:rPr>
-          <w:color w:val="231F20"/>
-          <w:sz w:val="22"/>
-        </w:rPr>
-        <w:t>Story · Category (the subcategory tabs)</w:t>
-      </w:r>
-    </w:p>
-    <w:p>
-      <w:pPr>
-        <w:pStyle w:val="ListBullet"/>
-        <w:spacing w:after="40"/>
-      </w:pPr>
-      <w:r>
-        <w:rPr>
-          <w:color w:val="231F20"/>
-          <w:sz w:val="22"/>
-        </w:rPr>
-        <w:t>Story · Mantra (the rotating quote strip)</w:t>
-      </w:r>
-    </w:p>
-    <w:p>
-      <w:pPr>
-        <w:pStyle w:val="ListBullet"/>
-        <w:spacing w:after="40"/>
-      </w:pPr>
-      <w:r>
-        <w:rPr>
-          <w:color w:val="231F20"/>
-          <w:sz w:val="22"/>
-        </w:rPr>
-        <w:t>Story · Cosmic Forecast</w:t>
+        <w:t>About / Community / Contact / Decoder / Experiences / Reset Letters / Reset Room / Sub-pages / Community Event / Welcome</w:t>
       </w:r>
     </w:p>
     <w:p>
@@ -1777,7 +1705,7 @@
           <w:color w:val="231F20"/>
           <w:sz w:val="22"/>
         </w:rPr>
-        <w:t>Coaching / programmes</w:t>
+        <w:t>Editorial content</w:t>
       </w:r>
       <w:r>
         <w:rPr>
@@ -1792,7 +1720,7 @@
           <w:color w:val="6E3A5A"/>
           <w:sz w:val="20"/>
         </w:rPr>
-        <w:t>Work · X</w:t>
+        <w:t>Story · X</w:t>
       </w:r>
       <w:r>
         <w:rPr>
@@ -1812,7 +1740,7 @@
           <w:color w:val="231F20"/>
           <w:sz w:val="22"/>
         </w:rPr>
-        <w:t>Work · Programme (The Reset, Signal, Signal &amp; Build, One Day, Signal Collective)</w:t>
+        <w:t>Story · Article (every blog/Reset Story/Life/Love/Work article lives here, separated by Category)</w:t>
       </w:r>
     </w:p>
     <w:p>
@@ -1825,7 +1753,7 @@
           <w:color w:val="231F20"/>
           <w:sz w:val="22"/>
         </w:rPr>
-        <w:t>Work · Coaching Session (Dating Reset, Founder Reset, Nervous System Reset)</w:t>
+        <w:t>Story · Category (the subcategory tabs)</w:t>
       </w:r>
     </w:p>
     <w:p>
@@ -1838,7 +1766,7 @@
           <w:color w:val="231F20"/>
           <w:sz w:val="22"/>
         </w:rPr>
-        <w:t>Work · Membership (Reset Room subscription settings)</w:t>
+        <w:t>Story · Mantra (the rotating quote strip)</w:t>
       </w:r>
     </w:p>
     <w:p>
@@ -1851,20 +1779,7 @@
           <w:color w:val="231F20"/>
           <w:sz w:val="22"/>
         </w:rPr>
-        <w:t>Work · FAQ</w:t>
-      </w:r>
-    </w:p>
-    <w:p>
-      <w:pPr>
-        <w:pStyle w:val="ListBullet"/>
-        <w:spacing w:after="40"/>
-      </w:pPr>
-      <w:r>
-        <w:rPr>
-          <w:color w:val="231F20"/>
-          <w:sz w:val="22"/>
-        </w:rPr>
-        <w:t>Work · Experience</w:t>
+        <w:t>Story · Cosmic Forecast</w:t>
       </w:r>
     </w:p>
     <w:p>
@@ -1877,7 +1792,7 @@
           <w:color w:val="231F20"/>
           <w:sz w:val="22"/>
         </w:rPr>
-        <w:t>E-commerce</w:t>
+        <w:t>Coaching / programmes</w:t>
       </w:r>
       <w:r>
         <w:rPr>
@@ -1892,7 +1807,7 @@
           <w:color w:val="6E3A5A"/>
           <w:sz w:val="20"/>
         </w:rPr>
-        <w:t>Shop · X</w:t>
+        <w:t>Work · X</w:t>
       </w:r>
       <w:r>
         <w:rPr>
@@ -1912,7 +1827,7 @@
           <w:color w:val="231F20"/>
           <w:sz w:val="22"/>
         </w:rPr>
-        <w:t>Shop · Product</w:t>
+        <w:t>Work · Programme (The Reset, Signal, Signal &amp; Build, One Day, Signal Collective)</w:t>
       </w:r>
     </w:p>
     <w:p>
@@ -1925,7 +1840,7 @@
           <w:color w:val="231F20"/>
           <w:sz w:val="22"/>
         </w:rPr>
-        <w:t>Shop · Category</w:t>
+        <w:t>Work · Coaching Session (Dating Reset, Founder Reset, Nervous System Reset)</w:t>
       </w:r>
     </w:p>
     <w:p>
@@ -1938,7 +1853,7 @@
           <w:color w:val="231F20"/>
           <w:sz w:val="22"/>
         </w:rPr>
-        <w:t>Shop · Order</w:t>
+        <w:t>Work · Membership (Reset Room subscription settings)</w:t>
       </w:r>
     </w:p>
     <w:p>
@@ -1951,20 +1866,7 @@
           <w:color w:val="231F20"/>
           <w:sz w:val="22"/>
         </w:rPr>
-        <w:t>Shop · Customer</w:t>
-      </w:r>
-    </w:p>
-    <w:p>
-      <w:pPr>
-        <w:spacing w:after="80"/>
-      </w:pPr>
-      <w:r>
-        <w:rPr>
-          <w:b/>
-          <w:color w:val="231F20"/>
-          <w:sz w:val="22"/>
-        </w:rPr>
-        <w:t>Other groups:</w:t>
+        <w:t>Work · FAQ</w:t>
       </w:r>
     </w:p>
     <w:p>
@@ -1977,20 +1879,7 @@
           <w:color w:val="231F20"/>
           <w:sz w:val="22"/>
         </w:rPr>
-        <w:t>Event · Event</w:t>
-      </w:r>
-    </w:p>
-    <w:p>
-      <w:pPr>
-        <w:pStyle w:val="ListBullet"/>
-        <w:spacing w:after="40"/>
-      </w:pPr>
-      <w:r>
-        <w:rPr>
-          <w:color w:val="231F20"/>
-          <w:sz w:val="22"/>
-        </w:rPr>
-        <w:t>Team · Member</w:t>
+        <w:t>Work · Experience</w:t>
       </w:r>
     </w:p>
     <w:p>
@@ -2003,7 +1892,7 @@
           <w:color w:val="231F20"/>
           <w:sz w:val="22"/>
         </w:rPr>
-        <w:t>Sorted to the very bottom</w:t>
+        <w:t>E-commerce</w:t>
       </w:r>
       <w:r>
         <w:rPr>
@@ -2018,6 +1907,132 @@
           <w:color w:val="6E3A5A"/>
           <w:sz w:val="20"/>
         </w:rPr>
+        <w:t>Shop · X</w:t>
+      </w:r>
+      <w:r>
+        <w:rPr>
+          <w:color w:val="231F20"/>
+          <w:sz w:val="22"/>
+        </w:rPr>
+        <w:t>):</w:t>
+      </w:r>
+    </w:p>
+    <w:p>
+      <w:pPr>
+        <w:pStyle w:val="ListBullet"/>
+        <w:spacing w:after="40"/>
+      </w:pPr>
+      <w:r>
+        <w:rPr>
+          <w:color w:val="231F20"/>
+          <w:sz w:val="22"/>
+        </w:rPr>
+        <w:t>Shop · Product</w:t>
+      </w:r>
+    </w:p>
+    <w:p>
+      <w:pPr>
+        <w:pStyle w:val="ListBullet"/>
+        <w:spacing w:after="40"/>
+      </w:pPr>
+      <w:r>
+        <w:rPr>
+          <w:color w:val="231F20"/>
+          <w:sz w:val="22"/>
+        </w:rPr>
+        <w:t>Shop · Category</w:t>
+      </w:r>
+    </w:p>
+    <w:p>
+      <w:pPr>
+        <w:pStyle w:val="ListBullet"/>
+        <w:spacing w:after="40"/>
+      </w:pPr>
+      <w:r>
+        <w:rPr>
+          <w:color w:val="231F20"/>
+          <w:sz w:val="22"/>
+        </w:rPr>
+        <w:t>Shop · Order</w:t>
+      </w:r>
+    </w:p>
+    <w:p>
+      <w:pPr>
+        <w:pStyle w:val="ListBullet"/>
+        <w:spacing w:after="40"/>
+      </w:pPr>
+      <w:r>
+        <w:rPr>
+          <w:color w:val="231F20"/>
+          <w:sz w:val="22"/>
+        </w:rPr>
+        <w:t>Shop · Customer</w:t>
+      </w:r>
+    </w:p>
+    <w:p>
+      <w:pPr>
+        <w:spacing w:after="80"/>
+      </w:pPr>
+      <w:r>
+        <w:rPr>
+          <w:b/>
+          <w:color w:val="231F20"/>
+          <w:sz w:val="22"/>
+        </w:rPr>
+        <w:t>Other groups:</w:t>
+      </w:r>
+    </w:p>
+    <w:p>
+      <w:pPr>
+        <w:pStyle w:val="ListBullet"/>
+        <w:spacing w:after="40"/>
+      </w:pPr>
+      <w:r>
+        <w:rPr>
+          <w:color w:val="231F20"/>
+          <w:sz w:val="22"/>
+        </w:rPr>
+        <w:t>Event · Event</w:t>
+      </w:r>
+    </w:p>
+    <w:p>
+      <w:pPr>
+        <w:pStyle w:val="ListBullet"/>
+        <w:spacing w:after="40"/>
+      </w:pPr>
+      <w:r>
+        <w:rPr>
+          <w:color w:val="231F20"/>
+          <w:sz w:val="22"/>
+        </w:rPr>
+        <w:t>Team · Member</w:t>
+      </w:r>
+    </w:p>
+    <w:p>
+      <w:pPr>
+        <w:spacing w:after="80"/>
+      </w:pPr>
+      <w:r>
+        <w:rPr>
+          <w:b/>
+          <w:color w:val="231F20"/>
+          <w:sz w:val="22"/>
+        </w:rPr>
+        <w:t>Sorted to the very bottom</w:t>
+      </w:r>
+      <w:r>
+        <w:rPr>
+          <w:color w:val="231F20"/>
+          <w:sz w:val="22"/>
+        </w:rPr>
+        <w:t xml:space="preserve"> (</w:t>
+      </w:r>
+      <w:r>
+        <w:rPr>
+          <w:rFonts w:ascii="Consolas" w:hAnsi="Consolas"/>
+          <w:color w:val="6E3A5A"/>
+          <w:sz w:val="20"/>
+        </w:rPr>
         <w:t>zz · X (unused)</w:t>
       </w:r>
       <w:r>
@@ -3626,7 +3641,7 @@
           <w:color w:val="6E3A5A"/>
           <w:sz w:val="20"/>
         </w:rPr>
-        <w:t>Page · About</w:t>
+        <w:t>About</w:t>
       </w:r>
       <w:r>
         <w:rPr>
@@ -3641,7 +3656,7 @@
           <w:color w:val="6E3A5A"/>
           <w:sz w:val="20"/>
         </w:rPr>
-        <w:t>Page · Community</w:t>
+        <w:t>Community</w:t>
       </w:r>
       <w:r>
         <w:rPr>
@@ -3676,7 +3691,7 @@
           <w:color w:val="6E3A5A"/>
           <w:sz w:val="20"/>
         </w:rPr>
-        <w:t>Page · About</w:t>
+        <w:t>About</w:t>
       </w:r>
       <w:r>
         <w:rPr>

</xml_diff>

<commit_message>
User manual v1.4: Vault upload steps + REGULATED Module section
Section 16.12 (Reset Room Vault) rewritten with practical upload
steps for each content type Anna actually has on her plate:
- Audio meditation (MP3 + thumbnail)
- E-book / Workbook (PDF + cover)
- Full guided journey (audio + video + PDF)

Plus explanation of how the 'kind' filter pills act as folders for
members, and how Media Library folders work for Anna's own admin
convenience (separate from member-facing organisation).

New section 16.18 (REGULATED course modules) covers:
- The one-time 'tick grantsRegulatedAccess on the REGULATED entry' step
- How to add modules in the REGULATED Module collection
- Module shapes (text-led, video, audio, PDF download)
- The exact access link URL to paste in Mailchimp Welcome email

Bumped version 1.3 -> 1.4.
</commit_message>
<xml_diff>
--- a/Docs/ANNA_USER_MANUAL.docx
+++ b/Docs/ANNA_USER_MANUAL.docx
@@ -15,7 +15,7 @@
         <w:rPr>
           <w:b/>
         </w:rPr>
-        <w:t>Version 1.3 — Updated 28 May 2026</w:t>
+        <w:t>Version 1.4 — Updated 1 June 2026</w:t>
       </w:r>
     </w:p>
     <w:p>
@@ -16945,12 +16945,22 @@
         <w:t>/community/reset-room/vault</w:t>
       </w:r>
       <w:r>
-        <w:t xml:space="preserve"> (members only)</w:t>
-      </w:r>
-    </w:p>
-    <w:p>
-      <w:r>
-        <w:t>The Reset Room vault is a grid of guided journeys for paying members.</w:t>
+        <w:t xml:space="preserve"> (members only) — audio meditations, e-books, journeys</w:t>
+      </w:r>
+    </w:p>
+    <w:p>
+      <w:r>
+        <w:t xml:space="preserve">The Reset Room vault is the library Reset Room members log in to. One entry per item — audio meditation, e-book, workbook, or guided journey. The </w:t>
+      </w:r>
+      <w:r>
+        <w:rPr>
+          <w:rFonts w:ascii="Consolas" w:hAnsi="Consolas"/>
+          <w:sz w:val="20"/>
+        </w:rPr>
+        <w:t>kind</w:t>
+      </w:r>
+      <w:r>
+        <w:t xml:space="preserve"> field acts as folders for members (filter pills at the top of the page).</w:t>
       </w:r>
     </w:p>
     <w:p>
@@ -16970,12 +16980,445 @@
         <w:t>Reset Room · Vault Journey</w:t>
       </w:r>
       <w:r>
-        <w:t xml:space="preserve"> → one entry per journey</w:t>
-      </w:r>
-    </w:p>
-    <w:p>
-      <w:r>
-        <w:t>Fields:</w:t>
+        <w:t xml:space="preserve"> → </w:t>
+      </w:r>
+      <w:r>
+        <w:rPr>
+          <w:b/>
+        </w:rPr>
+        <w:t>+ Create new entry</w:t>
+      </w:r>
+    </w:p>
+    <w:p>
+      <w:pPr>
+        <w:pStyle w:val="Heading4"/>
+      </w:pPr>
+      <w:r>
+        <w:t>To upload an audio meditation</w:t>
+      </w:r>
+    </w:p>
+    <w:p>
+      <w:pPr>
+        <w:pStyle w:val="ListNumber"/>
+      </w:pPr>
+      <w:r>
+        <w:t xml:space="preserve">Fill </w:t>
+      </w:r>
+      <w:r>
+        <w:rPr>
+          <w:rFonts w:ascii="Consolas" w:hAnsi="Consolas"/>
+          <w:sz w:val="20"/>
+        </w:rPr>
+        <w:t>name</w:t>
+      </w:r>
+      <w:r>
+        <w:t xml:space="preserve"> — title of the meditation (e.g. "Coming Back Online")</w:t>
+      </w:r>
+    </w:p>
+    <w:p>
+      <w:pPr>
+        <w:pStyle w:val="ListNumber"/>
+      </w:pPr>
+      <w:r>
+        <w:t xml:space="preserve">Fill </w:t>
+      </w:r>
+      <w:r>
+        <w:rPr>
+          <w:rFonts w:ascii="Consolas" w:hAnsi="Consolas"/>
+          <w:sz w:val="20"/>
+        </w:rPr>
+        <w:t>description</w:t>
+      </w:r>
+      <w:r>
+        <w:t xml:space="preserve"> — 1-2 sentences shown on the card</w:t>
+      </w:r>
+    </w:p>
+    <w:p>
+      <w:pPr>
+        <w:pStyle w:val="ListNumber"/>
+      </w:pPr>
+      <w:r>
+        <w:t xml:space="preserve">Set </w:t>
+      </w:r>
+      <w:r>
+        <w:rPr>
+          <w:rFonts w:ascii="Consolas" w:hAnsi="Consolas"/>
+          <w:sz w:val="20"/>
+        </w:rPr>
+        <w:t>kind</w:t>
+      </w:r>
+      <w:r>
+        <w:t xml:space="preserve"> = </w:t>
+      </w:r>
+      <w:r>
+        <w:rPr>
+          <w:b/>
+        </w:rPr>
+        <w:t>"Audio meditation"</w:t>
+      </w:r>
+    </w:p>
+    <w:p>
+      <w:pPr>
+        <w:pStyle w:val="ListNumber"/>
+      </w:pPr>
+      <w:r>
+        <w:t xml:space="preserve">Fill </w:t>
+      </w:r>
+      <w:r>
+        <w:rPr>
+          <w:rFonts w:ascii="Consolas" w:hAnsi="Consolas"/>
+          <w:sz w:val="20"/>
+        </w:rPr>
+        <w:t>duration</w:t>
+      </w:r>
+      <w:r>
+        <w:t xml:space="preserve"> — free text, e.g. "12 min"</w:t>
+      </w:r>
+    </w:p>
+    <w:p>
+      <w:pPr>
+        <w:pStyle w:val="ListNumber"/>
+      </w:pPr>
+      <w:r>
+        <w:t xml:space="preserve">Upload your MP3 in </w:t>
+      </w:r>
+      <w:r>
+        <w:rPr>
+          <w:b/>
+        </w:rPr>
+        <w:t>`audio_file`</w:t>
+      </w:r>
+    </w:p>
+    <w:p>
+      <w:pPr>
+        <w:pStyle w:val="ListNumber"/>
+      </w:pPr>
+      <w:r>
+        <w:t xml:space="preserve">Optional: upload a thumbnail in </w:t>
+      </w:r>
+      <w:r>
+        <w:rPr>
+          <w:rFonts w:ascii="Consolas" w:hAnsi="Consolas"/>
+          <w:sz w:val="20"/>
+        </w:rPr>
+        <w:t>video_thumbnail</w:t>
+      </w:r>
+      <w:r>
+        <w:t xml:space="preserve"> (acts as the cover image — 1280×720 JPEG, max 500KB)</w:t>
+      </w:r>
+    </w:p>
+    <w:p>
+      <w:pPr>
+        <w:pStyle w:val="ListNumber"/>
+      </w:pPr>
+      <w:r>
+        <w:t xml:space="preserve">Pick a </w:t>
+      </w:r>
+      <w:r>
+        <w:rPr>
+          <w:rFonts w:ascii="Consolas" w:hAnsi="Consolas"/>
+          <w:sz w:val="20"/>
+        </w:rPr>
+        <w:t>tone_colour</w:t>
+      </w:r>
+      <w:r>
+        <w:t xml:space="preserve"> (hex, brand colours: #F280AA pink, #FFD07A yellow, #7BAFDD blue, #5DCAA5 green, #FAA21B amber, #6E3A5A plum)</w:t>
+      </w:r>
+    </w:p>
+    <w:p>
+      <w:pPr>
+        <w:pStyle w:val="ListNumber"/>
+      </w:pPr>
+      <w:r>
+        <w:t xml:space="preserve">Set </w:t>
+      </w:r>
+      <w:r>
+        <w:rPr>
+          <w:rFonts w:ascii="Consolas" w:hAnsi="Consolas"/>
+          <w:sz w:val="20"/>
+        </w:rPr>
+        <w:t>sort_order</w:t>
+      </w:r>
+      <w:r>
+        <w:t xml:space="preserve"> — lower numbers appear earlier in the grid</w:t>
+      </w:r>
+    </w:p>
+    <w:p>
+      <w:pPr>
+        <w:pStyle w:val="ListNumber"/>
+      </w:pPr>
+      <w:r>
+        <w:rPr>
+          <w:b/>
+        </w:rPr>
+        <w:t>Save &amp; Publish</w:t>
+      </w:r>
+      <w:r>
+        <w:t>. Live for members within 1-2 seconds.</w:t>
+      </w:r>
+    </w:p>
+    <w:p>
+      <w:pPr>
+        <w:pStyle w:val="Heading4"/>
+      </w:pPr>
+      <w:r>
+        <w:t>To upload an e-book or workbook</w:t>
+      </w:r>
+    </w:p>
+    <w:p>
+      <w:r>
+        <w:t>Same flow, but:</w:t>
+      </w:r>
+    </w:p>
+    <w:p>
+      <w:pPr>
+        <w:pStyle w:val="ListBullet"/>
+      </w:pPr>
+      <w:r>
+        <w:t xml:space="preserve">Set </w:t>
+      </w:r>
+      <w:r>
+        <w:rPr>
+          <w:rFonts w:ascii="Consolas" w:hAnsi="Consolas"/>
+          <w:sz w:val="20"/>
+        </w:rPr>
+        <w:t>kind</w:t>
+      </w:r>
+      <w:r>
+        <w:t xml:space="preserve"> = </w:t>
+      </w:r>
+      <w:r>
+        <w:rPr>
+          <w:b/>
+        </w:rPr>
+        <w:t>"E-book"</w:t>
+      </w:r>
+      <w:r>
+        <w:t xml:space="preserve"> (or </w:t>
+      </w:r>
+      <w:r>
+        <w:rPr>
+          <w:b/>
+        </w:rPr>
+        <w:t>"Workbook"</w:t>
+      </w:r>
+      <w:r>
+        <w:t xml:space="preserve"> if it's something to write into)</w:t>
+      </w:r>
+    </w:p>
+    <w:p>
+      <w:pPr>
+        <w:pStyle w:val="ListBullet"/>
+      </w:pPr>
+      <w:r>
+        <w:t xml:space="preserve">Leave </w:t>
+      </w:r>
+      <w:r>
+        <w:rPr>
+          <w:rFonts w:ascii="Consolas" w:hAnsi="Consolas"/>
+          <w:sz w:val="20"/>
+        </w:rPr>
+        <w:t>audio_file</w:t>
+      </w:r>
+      <w:r>
+        <w:t xml:space="preserve"> blank</w:t>
+      </w:r>
+    </w:p>
+    <w:p>
+      <w:pPr>
+        <w:pStyle w:val="ListBullet"/>
+      </w:pPr>
+      <w:r>
+        <w:t xml:space="preserve">Upload your PDF in </w:t>
+      </w:r>
+      <w:r>
+        <w:rPr>
+          <w:b/>
+        </w:rPr>
+        <w:t>`companion_pdf`</w:t>
+      </w:r>
+    </w:p>
+    <w:p>
+      <w:pPr>
+        <w:pStyle w:val="ListBullet"/>
+      </w:pPr>
+      <w:r>
+        <w:t xml:space="preserve">Add a cover image in </w:t>
+      </w:r>
+      <w:r>
+        <w:rPr>
+          <w:rFonts w:ascii="Consolas" w:hAnsi="Consolas"/>
+          <w:sz w:val="20"/>
+        </w:rPr>
+        <w:t>video_thumbnail</w:t>
+      </w:r>
+      <w:r>
+        <w:t xml:space="preserve"> if you want one</w:t>
+      </w:r>
+    </w:p>
+    <w:p>
+      <w:pPr>
+        <w:pStyle w:val="ListBullet"/>
+      </w:pPr>
+      <w:r>
+        <w:t xml:space="preserve">Use the </w:t>
+      </w:r>
+      <w:r>
+        <w:rPr>
+          <w:rFonts w:ascii="Consolas" w:hAnsi="Consolas"/>
+          <w:sz w:val="20"/>
+        </w:rPr>
+        <w:t>body</w:t>
+      </w:r>
+      <w:r>
+        <w:t xml:space="preserve"> field for a longer description or chapter overview if helpful</w:t>
+      </w:r>
+    </w:p>
+    <w:p>
+      <w:pPr>
+        <w:pStyle w:val="Heading4"/>
+      </w:pPr>
+      <w:r>
+        <w:t>To upload a guided journey (with audio + video + PDF)</w:t>
+      </w:r>
+    </w:p>
+    <w:p>
+      <w:pPr>
+        <w:pStyle w:val="ListBullet"/>
+      </w:pPr>
+      <w:r>
+        <w:t xml:space="preserve">Set </w:t>
+      </w:r>
+      <w:r>
+        <w:rPr>
+          <w:rFonts w:ascii="Consolas" w:hAnsi="Consolas"/>
+          <w:sz w:val="20"/>
+        </w:rPr>
+        <w:t>kind</w:t>
+      </w:r>
+      <w:r>
+        <w:t xml:space="preserve"> = </w:t>
+      </w:r>
+      <w:r>
+        <w:rPr>
+          <w:b/>
+        </w:rPr>
+        <w:t>"Foundational journey"</w:t>
+      </w:r>
+      <w:r>
+        <w:t xml:space="preserve"> (or one of the journey types)</w:t>
+      </w:r>
+    </w:p>
+    <w:p>
+      <w:pPr>
+        <w:pStyle w:val="ListBullet"/>
+      </w:pPr>
+      <w:r>
+        <w:t xml:space="preserve">Fill all media fields you have: </w:t>
+      </w:r>
+      <w:r>
+        <w:rPr>
+          <w:rFonts w:ascii="Consolas" w:hAnsi="Consolas"/>
+          <w:sz w:val="20"/>
+        </w:rPr>
+        <w:t>audio_file</w:t>
+      </w:r>
+      <w:r>
+        <w:t xml:space="preserve">, </w:t>
+      </w:r>
+      <w:r>
+        <w:rPr>
+          <w:rFonts w:ascii="Consolas" w:hAnsi="Consolas"/>
+          <w:sz w:val="20"/>
+        </w:rPr>
+        <w:t>video_url</w:t>
+      </w:r>
+      <w:r>
+        <w:t xml:space="preserve">, </w:t>
+      </w:r>
+      <w:r>
+        <w:rPr>
+          <w:rFonts w:ascii="Consolas" w:hAnsi="Consolas"/>
+          <w:sz w:val="20"/>
+        </w:rPr>
+        <w:t>companion_pdf</w:t>
+      </w:r>
+    </w:p>
+    <w:p>
+      <w:pPr>
+        <w:pStyle w:val="ListBullet"/>
+      </w:pPr>
+      <w:r>
+        <w:t xml:space="preserve">Use </w:t>
+      </w:r>
+      <w:r>
+        <w:rPr>
+          <w:rFonts w:ascii="Consolas" w:hAnsi="Consolas"/>
+          <w:sz w:val="20"/>
+        </w:rPr>
+        <w:t>body</w:t>
+      </w:r>
+      <w:r>
+        <w:t xml:space="preserve"> for the "About this journey" content shown below the player</w:t>
+      </w:r>
+    </w:p>
+    <w:p>
+      <w:pPr>
+        <w:pStyle w:val="Heading4"/>
+      </w:pPr>
+      <w:r>
+        <w:t>How members find your content</w:t>
+      </w:r>
+    </w:p>
+    <w:p>
+      <w:r>
+        <w:t xml:space="preserve">On </w:t>
+      </w:r>
+      <w:r>
+        <w:rPr>
+          <w:rFonts w:ascii="Consolas" w:hAnsi="Consolas"/>
+          <w:sz w:val="20"/>
+        </w:rPr>
+        <w:t>/community/reset-room/vault</w:t>
+      </w:r>
+      <w:r>
+        <w:t xml:space="preserve"> they see filter pills at the top: </w:t>
+      </w:r>
+      <w:r>
+        <w:rPr>
+          <w:b/>
+        </w:rPr>
+        <w:t>All / Audio meditation / E-book / Foundational journey / Workbook / Daily practice</w:t>
+      </w:r>
+      <w:r>
+        <w:t xml:space="preserve"> etc. They click a pill, only that kind shows. So everything tagged the same way lives together for them — categories work like folders.</w:t>
+      </w:r>
+    </w:p>
+    <w:p>
+      <w:pPr>
+        <w:pStyle w:val="Heading4"/>
+      </w:pPr>
+      <w:r>
+        <w:t>Organising your own uploaded files</w:t>
+      </w:r>
+    </w:p>
+    <w:p>
+      <w:r>
+        <w:t xml:space="preserve">Strapi → </w:t>
+      </w:r>
+      <w:r>
+        <w:rPr>
+          <w:b/>
+        </w:rPr>
+        <w:t>Media Library</w:t>
+      </w:r>
+      <w:r>
+        <w:t xml:space="preserve"> (left sidebar) → you can create folders here for your own admin convenience (e.g. "Meditations 2026", "E-books"). This is just for your file management — members see content via the Vault, not the Media Library.</w:t>
+      </w:r>
+    </w:p>
+    <w:p>
+      <w:r>
+        <w:t>All Vault fields at a glance:</w:t>
       </w:r>
     </w:p>
     <w:tbl>
@@ -17037,7 +17480,7 @@
           <w:p>
             <w:r/>
             <w:r>
-              <w:t>Journey title</w:t>
+              <w:t>Title shown on the card and at the top of the detail page</w:t>
             </w:r>
           </w:p>
         </w:tc>
@@ -17061,7 +17504,7 @@
           <w:p>
             <w:r/>
             <w:r>
-              <w:t>URL slug (auto from name)</w:t>
+              <w:t>URL slug (auto-generates from name)</w:t>
             </w:r>
           </w:p>
         </w:tc>
@@ -17109,7 +17552,7 @@
           <w:p>
             <w:r/>
             <w:r>
-              <w:t>Filter tag: Foundational journey, Daily practice, Somatic release, etc. Used for filter pills on the vault page</w:t>
+              <w:t>Filter tag — acts as folders for members. New options: Audio meditation, E-book, Workbook</w:t>
             </w:r>
           </w:p>
         </w:tc>
@@ -17157,7 +17600,7 @@
           <w:p>
             <w:r/>
             <w:r>
-              <w:t>Free-text, e.g. "12 min", "20 mins"</w:t>
+              <w:t>Free-text, e.g. "12 min", "20 mins", "85 pages"</w:t>
             </w:r>
           </w:p>
         </w:tc>
@@ -17181,7 +17624,7 @@
           <w:p>
             <w:r/>
             <w:r>
-              <w:t>MP3 upload — goes to private podcast feed + downloadable for members</w:t>
+              <w:t>MP3 upload — for meditations or journey audio</w:t>
             </w:r>
           </w:p>
         </w:tc>
@@ -17205,7 +17648,7 @@
           <w:p>
             <w:r/>
             <w:r>
-              <w:t>Optional video embed URL (Bunny.net or any iframe URL)</w:t>
+              <w:t>Optional video embed URL (Bunny.net, YouTube unlisted, any iframe)</w:t>
             </w:r>
           </w:p>
         </w:tc>
@@ -17229,7 +17672,7 @@
           <w:p>
             <w:r/>
             <w:r>
-              <w:t>Poster image for the video player (1280×720 JPEG, max 500KB)</w:t>
+              <w:t>Poster / cover image (1280×720 JPEG, max 500KB)</w:t>
             </w:r>
           </w:p>
         </w:tc>
@@ -17253,7 +17696,7 @@
           <w:p>
             <w:r/>
             <w:r>
-              <w:t>Optional downloadable workbook PDF</w:t>
+              <w:t>PDF upload — use this for e-books, workbooks, or companion docs</w:t>
             </w:r>
           </w:p>
         </w:tc>
@@ -17277,7 +17720,7 @@
           <w:p>
             <w:r/>
             <w:r>
-              <w:t>Full "About this journey" content shown below the player</w:t>
+              <w:t>Full "About this" content shown below the player / on the detail page</w:t>
             </w:r>
           </w:p>
         </w:tc>
@@ -21053,7 +21496,705 @@
         <w:pStyle w:val="Heading3"/>
       </w:pPr>
       <w:r>
-        <w:t>16.18 What's coming next</w:t>
+        <w:t>16.18 REGULATED course modules (the content buyers access after purchase)</w:t>
+      </w:r>
+    </w:p>
+    <w:p>
+      <w:r>
+        <w:t xml:space="preserve">When someone buys REGULATED, they're redirected to </w:t>
+      </w:r>
+      <w:r>
+        <w:rPr>
+          <w:b/>
+        </w:rPr>
+        <w:t>`/the-work/regulated/access`</w:t>
+      </w:r>
+      <w:r>
+        <w:t xml:space="preserve"> — the private course area. Whatever you publish in the </w:t>
+      </w:r>
+      <w:r>
+        <w:rPr>
+          <w:b/>
+        </w:rPr>
+        <w:t>REGULATED · Module</w:t>
+      </w:r>
+      <w:r>
+        <w:t xml:space="preserve"> collection appears there, in the order you set.</w:t>
+      </w:r>
+    </w:p>
+    <w:p>
+      <w:pPr>
+        <w:pStyle w:val="Heading4"/>
+      </w:pPr>
+      <w:r>
+        <w:t>One-time setup (before the first sale)</w:t>
+      </w:r>
+    </w:p>
+    <w:p>
+      <w:pPr>
+        <w:pStyle w:val="ListNumber"/>
+      </w:pPr>
+      <w:r>
+        <w:t xml:space="preserve">Strapi → Content Manager → </w:t>
+      </w:r>
+      <w:r>
+        <w:rPr>
+          <w:b/>
+        </w:rPr>
+        <w:t>Work · Programme</w:t>
+      </w:r>
+      <w:r>
+        <w:t xml:space="preserve"> → open the </w:t>
+      </w:r>
+      <w:r>
+        <w:rPr>
+          <w:b/>
+        </w:rPr>
+        <w:t>REGULATED</w:t>
+      </w:r>
+      <w:r>
+        <w:t xml:space="preserve"> entry</w:t>
+      </w:r>
+    </w:p>
+    <w:p>
+      <w:pPr>
+        <w:pStyle w:val="ListNumber"/>
+      </w:pPr>
+      <w:r>
+        <w:t xml:space="preserve">Find the field </w:t>
+      </w:r>
+      <w:r>
+        <w:rPr>
+          <w:b/>
+        </w:rPr>
+        <w:t>`grantsRegulatedAccess`</w:t>
+      </w:r>
+      <w:r>
+        <w:t xml:space="preserve"> → tick it on</w:t>
+      </w:r>
+    </w:p>
+    <w:p>
+      <w:pPr>
+        <w:pStyle w:val="ListNumber"/>
+      </w:pPr>
+      <w:r>
+        <w:rPr>
+          <w:b/>
+        </w:rPr>
+        <w:t>Save</w:t>
+      </w:r>
+    </w:p>
+    <w:p>
+      <w:r>
+        <w:t>This tells the system that a Stripe purchase of REGULATED should grant the buyer access to the course area. You only do this once.</w:t>
+      </w:r>
+    </w:p>
+    <w:p>
+      <w:pPr>
+        <w:pStyle w:val="Heading4"/>
+      </w:pPr>
+      <w:r>
+        <w:t>Adding course modules</w:t>
+      </w:r>
+    </w:p>
+    <w:p>
+      <w:pPr>
+        <w:pStyle w:val="ListNumber"/>
+      </w:pPr>
+      <w:r>
+        <w:t xml:space="preserve">Strapi → Content Manager → </w:t>
+      </w:r>
+      <w:r>
+        <w:rPr>
+          <w:b/>
+        </w:rPr>
+        <w:t>REGULATED · Module</w:t>
+      </w:r>
+      <w:r>
+        <w:t xml:space="preserve"> → </w:t>
+      </w:r>
+      <w:r>
+        <w:rPr>
+          <w:b/>
+        </w:rPr>
+        <w:t>+ Create new entry</w:t>
+      </w:r>
+    </w:p>
+    <w:p>
+      <w:pPr>
+        <w:pStyle w:val="ListNumber"/>
+      </w:pPr>
+      <w:r>
+        <w:t xml:space="preserve">Fill the fields that fit your content (all are optional except </w:t>
+      </w:r>
+      <w:r>
+        <w:rPr>
+          <w:rFonts w:ascii="Consolas" w:hAnsi="Consolas"/>
+          <w:sz w:val="20"/>
+        </w:rPr>
+        <w:t>title</w:t>
+      </w:r>
+      <w:r>
+        <w:t xml:space="preserve"> and </w:t>
+      </w:r>
+      <w:r>
+        <w:rPr>
+          <w:rFonts w:ascii="Consolas" w:hAnsi="Consolas"/>
+          <w:sz w:val="20"/>
+        </w:rPr>
+        <w:t>sort_order</w:t>
+      </w:r>
+      <w:r>
+        <w:t>):</w:t>
+      </w:r>
+    </w:p>
+    <w:tbl>
+      <w:tblPr>
+        <w:tblStyle w:val="LightGrid-Accent1"/>
+        <w:tblW w:type="auto" w:w="0"/>
+        <w:tblLook w:firstColumn="1" w:firstRow="1" w:lastColumn="0" w:lastRow="0" w:noHBand="0" w:noVBand="1" w:val="04A0"/>
+      </w:tblPr>
+      <w:tblGrid>
+        <w:gridCol w:w="4320"/>
+        <w:gridCol w:w="4320"/>
+      </w:tblGrid>
+      <w:tr>
+        <w:tc>
+          <w:tcPr>
+            <w:tcW w:type="dxa" w:w="4320"/>
+          </w:tcPr>
+          <w:p>
+            <w:r/>
+            <w:r>
+              <w:rPr>
+                <w:b/>
+              </w:rPr>
+              <w:t>Field</w:t>
+            </w:r>
+          </w:p>
+        </w:tc>
+        <w:tc>
+          <w:tcPr>
+            <w:tcW w:type="dxa" w:w="4320"/>
+          </w:tcPr>
+          <w:p>
+            <w:r/>
+            <w:r>
+              <w:rPr>
+                <w:b/>
+              </w:rPr>
+              <w:t>What it controls</w:t>
+            </w:r>
+          </w:p>
+        </w:tc>
+      </w:tr>
+      <w:tr>
+        <w:tc>
+          <w:tcPr>
+            <w:tcW w:type="dxa" w:w="4320"/>
+          </w:tcPr>
+          <w:p>
+            <w:r/>
+            <w:r>
+              <w:t>title</w:t>
+            </w:r>
+          </w:p>
+        </w:tc>
+        <w:tc>
+          <w:tcPr>
+            <w:tcW w:type="dxa" w:w="4320"/>
+          </w:tcPr>
+          <w:p>
+            <w:r/>
+            <w:r>
+              <w:t>Module heading (e.g. "Module 1: Coming Home to Your Body")</w:t>
+            </w:r>
+          </w:p>
+        </w:tc>
+      </w:tr>
+      <w:tr>
+        <w:tc>
+          <w:tcPr>
+            <w:tcW w:type="dxa" w:w="4320"/>
+          </w:tcPr>
+          <w:p>
+            <w:r/>
+            <w:r>
+              <w:t>slug</w:t>
+            </w:r>
+          </w:p>
+        </w:tc>
+        <w:tc>
+          <w:tcPr>
+            <w:tcW w:type="dxa" w:w="4320"/>
+          </w:tcPr>
+          <w:p>
+            <w:r/>
+            <w:r>
+              <w:t>URL slug (auto from title)</w:t>
+            </w:r>
+          </w:p>
+        </w:tc>
+      </w:tr>
+      <w:tr>
+        <w:tc>
+          <w:tcPr>
+            <w:tcW w:type="dxa" w:w="4320"/>
+          </w:tcPr>
+          <w:p>
+            <w:r/>
+            <w:r>
+              <w:t>sort_order</w:t>
+            </w:r>
+          </w:p>
+        </w:tc>
+        <w:tc>
+          <w:tcPr>
+            <w:tcW w:type="dxa" w:w="4320"/>
+          </w:tcPr>
+          <w:p>
+            <w:r/>
+            <w:r>
+              <w:t>Lower numbers appear first. Use 10, 20, 30 so you can insert later modules between (e.g. 15) without renumbering</w:t>
+            </w:r>
+          </w:p>
+        </w:tc>
+      </w:tr>
+      <w:tr>
+        <w:tc>
+          <w:tcPr>
+            <w:tcW w:type="dxa" w:w="4320"/>
+          </w:tcPr>
+          <w:p>
+            <w:r/>
+            <w:r>
+              <w:t>intro</w:t>
+            </w:r>
+          </w:p>
+        </w:tc>
+        <w:tc>
+          <w:tcPr>
+            <w:tcW w:type="dxa" w:w="4320"/>
+          </w:tcPr>
+          <w:p>
+            <w:r/>
+            <w:r>
+              <w:t>Short intro sentence shown under the title</w:t>
+            </w:r>
+          </w:p>
+        </w:tc>
+      </w:tr>
+      <w:tr>
+        <w:tc>
+          <w:tcPr>
+            <w:tcW w:type="dxa" w:w="4320"/>
+          </w:tcPr>
+          <w:p>
+            <w:r/>
+            <w:r>
+              <w:t>body</w:t>
+            </w:r>
+          </w:p>
+        </w:tc>
+        <w:tc>
+          <w:tcPr>
+            <w:tcW w:type="dxa" w:w="4320"/>
+          </w:tcPr>
+          <w:p>
+            <w:r/>
+            <w:r>
+              <w:t>Main lesson content — markdown supported. Use for text-led modules</w:t>
+            </w:r>
+          </w:p>
+        </w:tc>
+      </w:tr>
+      <w:tr>
+        <w:tc>
+          <w:tcPr>
+            <w:tcW w:type="dxa" w:w="4320"/>
+          </w:tcPr>
+          <w:p>
+            <w:r/>
+            <w:r>
+              <w:t>video_url</w:t>
+            </w:r>
+          </w:p>
+        </w:tc>
+        <w:tc>
+          <w:tcPr>
+            <w:tcW w:type="dxa" w:w="4320"/>
+          </w:tcPr>
+          <w:p>
+            <w:r/>
+            <w:r>
+              <w:t>YouTube unlisted, Vimeo, or any embeddable URL. Renders as a video player</w:t>
+            </w:r>
+          </w:p>
+        </w:tc>
+      </w:tr>
+      <w:tr>
+        <w:tc>
+          <w:tcPr>
+            <w:tcW w:type="dxa" w:w="4320"/>
+          </w:tcPr>
+          <w:p>
+            <w:r/>
+            <w:r>
+              <w:t>audio_url</w:t>
+            </w:r>
+          </w:p>
+        </w:tc>
+        <w:tc>
+          <w:tcPr>
+            <w:tcW w:type="dxa" w:w="4320"/>
+          </w:tcPr>
+          <w:p>
+            <w:r/>
+            <w:r>
+              <w:t>MP3 / podcast URL. Renders as an audio player</w:t>
+            </w:r>
+          </w:p>
+        </w:tc>
+      </w:tr>
+      <w:tr>
+        <w:tc>
+          <w:tcPr>
+            <w:tcW w:type="dxa" w:w="4320"/>
+          </w:tcPr>
+          <w:p>
+            <w:r/>
+            <w:r>
+              <w:t>downloadable_file</w:t>
+            </w:r>
+          </w:p>
+        </w:tc>
+        <w:tc>
+          <w:tcPr>
+            <w:tcW w:type="dxa" w:w="4320"/>
+          </w:tcPr>
+          <w:p>
+            <w:r/>
+            <w:r>
+              <w:t>Optional PDF, worksheet, or audio file customers can download</w:t>
+            </w:r>
+          </w:p>
+        </w:tc>
+      </w:tr>
+      <w:tr>
+        <w:tc>
+          <w:tcPr>
+            <w:tcW w:type="dxa" w:w="4320"/>
+          </w:tcPr>
+          <w:p>
+            <w:r/>
+            <w:r>
+              <w:t>thumbnail</w:t>
+            </w:r>
+          </w:p>
+        </w:tc>
+        <w:tc>
+          <w:tcPr>
+            <w:tcW w:type="dxa" w:w="4320"/>
+          </w:tcPr>
+          <w:p>
+            <w:r/>
+            <w:r>
+              <w:t>Optional thumbnail shown above the title (800×600 recommended)</w:t>
+            </w:r>
+          </w:p>
+        </w:tc>
+      </w:tr>
+      <w:tr>
+        <w:tc>
+          <w:tcPr>
+            <w:tcW w:type="dxa" w:w="4320"/>
+          </w:tcPr>
+          <w:p>
+            <w:r/>
+            <w:r>
+              <w:t>duration_label</w:t>
+            </w:r>
+          </w:p>
+        </w:tc>
+        <w:tc>
+          <w:tcPr>
+            <w:tcW w:type="dxa" w:w="4320"/>
+          </w:tcPr>
+          <w:p>
+            <w:r/>
+            <w:r>
+              <w:t>Free text, e.g. "12 minutes" or "15 min audio + worksheet"</w:t>
+            </w:r>
+          </w:p>
+        </w:tc>
+      </w:tr>
+      <w:tr>
+        <w:tc>
+          <w:tcPr>
+            <w:tcW w:type="dxa" w:w="4320"/>
+          </w:tcPr>
+          <w:p>
+            <w:r/>
+            <w:r>
+              <w:t>is_intro</w:t>
+            </w:r>
+          </w:p>
+        </w:tc>
+        <w:tc>
+          <w:tcPr>
+            <w:tcW w:type="dxa" w:w="4320"/>
+          </w:tcPr>
+          <w:p>
+            <w:r/>
+            <w:r>
+              <w:t>Tick ONE module to highlight at the top of the access page. Leave the rest unticked</w:t>
+            </w:r>
+          </w:p>
+        </w:tc>
+      </w:tr>
+    </w:tbl>
+    <w:p>
+      <w:pPr>
+        <w:pStyle w:val="ListNumber"/>
+      </w:pPr>
+      <w:r>
+        <w:rPr>
+          <w:b/>
+        </w:rPr>
+        <w:t>Save &amp; Publish.</w:t>
+      </w:r>
+      <w:r>
+        <w:t xml:space="preserve"> The module appears for buyers within 1-2 seconds.</w:t>
+      </w:r>
+    </w:p>
+    <w:p>
+      <w:pPr>
+        <w:pStyle w:val="Heading4"/>
+      </w:pPr>
+      <w:r>
+        <w:t>Module shapes</w:t>
+      </w:r>
+    </w:p>
+    <w:p>
+      <w:r>
+        <w:t>You can mix and match per module:</w:t>
+      </w:r>
+    </w:p>
+    <w:p>
+      <w:pPr>
+        <w:pStyle w:val="ListBullet"/>
+      </w:pPr>
+      <w:r>
+        <w:rPr>
+          <w:b/>
+        </w:rPr>
+        <w:t>Text-led lesson</w:t>
+      </w:r>
+      <w:r>
+        <w:t xml:space="preserve"> — fill </w:t>
+      </w:r>
+      <w:r>
+        <w:rPr>
+          <w:rFonts w:ascii="Consolas" w:hAnsi="Consolas"/>
+          <w:sz w:val="20"/>
+        </w:rPr>
+        <w:t>title</w:t>
+      </w:r>
+      <w:r>
+        <w:t xml:space="preserve">, </w:t>
+      </w:r>
+      <w:r>
+        <w:rPr>
+          <w:rFonts w:ascii="Consolas" w:hAnsi="Consolas"/>
+          <w:sz w:val="20"/>
+        </w:rPr>
+        <w:t>body</w:t>
+      </w:r>
+      <w:r>
+        <w:t xml:space="preserve">, optionally </w:t>
+      </w:r>
+      <w:r>
+        <w:rPr>
+          <w:rFonts w:ascii="Consolas" w:hAnsi="Consolas"/>
+          <w:sz w:val="20"/>
+        </w:rPr>
+        <w:t>downloadable_file</w:t>
+      </w:r>
+      <w:r>
+        <w:t xml:space="preserve"> (worksheet)</w:t>
+      </w:r>
+    </w:p>
+    <w:p>
+      <w:pPr>
+        <w:pStyle w:val="ListBullet"/>
+      </w:pPr>
+      <w:r>
+        <w:rPr>
+          <w:b/>
+        </w:rPr>
+        <w:t>Video lesson</w:t>
+      </w:r>
+      <w:r>
+        <w:t xml:space="preserve"> — fill </w:t>
+      </w:r>
+      <w:r>
+        <w:rPr>
+          <w:rFonts w:ascii="Consolas" w:hAnsi="Consolas"/>
+          <w:sz w:val="20"/>
+        </w:rPr>
+        <w:t>title</w:t>
+      </w:r>
+      <w:r>
+        <w:t xml:space="preserve">, </w:t>
+      </w:r>
+      <w:r>
+        <w:rPr>
+          <w:rFonts w:ascii="Consolas" w:hAnsi="Consolas"/>
+          <w:sz w:val="20"/>
+        </w:rPr>
+        <w:t>video_url</w:t>
+      </w:r>
+      <w:r>
+        <w:t xml:space="preserve">, optionally </w:t>
+      </w:r>
+      <w:r>
+        <w:rPr>
+          <w:rFonts w:ascii="Consolas" w:hAnsi="Consolas"/>
+          <w:sz w:val="20"/>
+        </w:rPr>
+        <w:t>intro</w:t>
+      </w:r>
+      <w:r>
+        <w:t xml:space="preserve"> (1-line summary)</w:t>
+      </w:r>
+    </w:p>
+    <w:p>
+      <w:pPr>
+        <w:pStyle w:val="ListBullet"/>
+      </w:pPr>
+      <w:r>
+        <w:rPr>
+          <w:b/>
+        </w:rPr>
+        <w:t>Audio meditation</w:t>
+      </w:r>
+      <w:r>
+        <w:t xml:space="preserve"> — fill </w:t>
+      </w:r>
+      <w:r>
+        <w:rPr>
+          <w:rFonts w:ascii="Consolas" w:hAnsi="Consolas"/>
+          <w:sz w:val="20"/>
+        </w:rPr>
+        <w:t>title</w:t>
+      </w:r>
+      <w:r>
+        <w:t xml:space="preserve">, </w:t>
+      </w:r>
+      <w:r>
+        <w:rPr>
+          <w:rFonts w:ascii="Consolas" w:hAnsi="Consolas"/>
+          <w:sz w:val="20"/>
+        </w:rPr>
+        <w:t>audio_url</w:t>
+      </w:r>
+      <w:r>
+        <w:t xml:space="preserve">, </w:t>
+      </w:r>
+      <w:r>
+        <w:rPr>
+          <w:rFonts w:ascii="Consolas" w:hAnsi="Consolas"/>
+          <w:sz w:val="20"/>
+        </w:rPr>
+        <w:t>duration_label</w:t>
+      </w:r>
+    </w:p>
+    <w:p>
+      <w:pPr>
+        <w:pStyle w:val="ListBullet"/>
+      </w:pPr>
+      <w:r>
+        <w:rPr>
+          <w:b/>
+        </w:rPr>
+        <w:t>PDF download</w:t>
+      </w:r>
+      <w:r>
+        <w:t xml:space="preserve"> — fill </w:t>
+      </w:r>
+      <w:r>
+        <w:rPr>
+          <w:rFonts w:ascii="Consolas" w:hAnsi="Consolas"/>
+          <w:sz w:val="20"/>
+        </w:rPr>
+        <w:t>title</w:t>
+      </w:r>
+      <w:r>
+        <w:t xml:space="preserve">, </w:t>
+      </w:r>
+      <w:r>
+        <w:rPr>
+          <w:rFonts w:ascii="Consolas" w:hAnsi="Consolas"/>
+          <w:sz w:val="20"/>
+        </w:rPr>
+        <w:t>downloadable_file</w:t>
+      </w:r>
+      <w:r>
+        <w:t xml:space="preserve">, </w:t>
+      </w:r>
+      <w:r>
+        <w:rPr>
+          <w:rFonts w:ascii="Consolas" w:hAnsi="Consolas"/>
+          <w:sz w:val="20"/>
+        </w:rPr>
+        <w:t>intro</w:t>
+      </w:r>
+      <w:r>
+        <w:t xml:space="preserve"> describing what's inside</w:t>
+      </w:r>
+    </w:p>
+    <w:p>
+      <w:pPr>
+        <w:pStyle w:val="Heading4"/>
+      </w:pPr>
+      <w:r>
+        <w:t>The access link for your welcome email</w:t>
+      </w:r>
+    </w:p>
+    <w:p>
+      <w:r>
+        <w:t>In your REGULATED welcome email in Mailchimp, the access link is:</w:t>
+      </w:r>
+    </w:p>
+    <w:p>
+      <w:r>
+        <w:rPr>
+          <w:b/>
+        </w:rPr>
+        <w:t>`https://annalouwellness.com/the-work/regulated/access`</w:t>
+      </w:r>
+    </w:p>
+    <w:p>
+      <w:r>
+        <w:t xml:space="preserve">Paste that wherever your email says </w:t>
+      </w:r>
+      <w:r>
+        <w:rPr>
+          <w:rFonts w:ascii="Consolas" w:hAnsi="Consolas"/>
+          <w:sz w:val="20"/>
+        </w:rPr>
+        <w:t>[access link]</w:t>
+      </w:r>
+      <w:r>
+        <w:t>.</w:t>
+      </w:r>
+    </w:p>
+    <w:p>
+      <w:pPr>
+        <w:pStyle w:val="Heading3"/>
+      </w:pPr>
+      <w:r>
+        <w:t>16.19 What's coming next</w:t>
       </w:r>
     </w:p>
     <w:p>

</xml_diff>

<commit_message>
User manual v1.5: document audio_file field + end-to-end verification
Two small updates to Section 16.18 (REGULATED course modules):

1. Added the audio_file field (drag-drop MP3 upload) which we added
   late on 1 Jun for consistency with Vault Journey. Marked as the
   'Easiest path' since most modules will be audio meditations.
   audio_url stays as the alternative for externally hosted audio.

2. Added 'Verified working end-to-end' note recording the full funnel
   test on staging: Stripe purchase -> user auto-created with REGULATED
   access -> password set -> login -> access page renders with the
   uploaded MP3 playing inline.

Audio meditation 'shape' updated: 'fill title, drag-drop MP3 into
audio_file, duration_label'.
</commit_message>
<xml_diff>
--- a/Docs/ANNA_USER_MANUAL.docx
+++ b/Docs/ANNA_USER_MANUAL.docx
@@ -15,7 +15,7 @@
         <w:rPr>
           <w:b/>
         </w:rPr>
-        <w:t>Version 1.4 — Updated 1 June 2026</w:t>
+        <w:t>Version 1.5 — Updated 1 June 2026</w:t>
       </w:r>
     </w:p>
     <w:p>
@@ -21840,18 +21840,18 @@
           <w:p>
             <w:r/>
             <w:r>
-              <w:t>audio_url</w:t>
-            </w:r>
-          </w:p>
-        </w:tc>
-        <w:tc>
-          <w:tcPr>
-            <w:tcW w:type="dxa" w:w="4320"/>
-          </w:tcPr>
-          <w:p>
-            <w:r/>
-            <w:r>
-              <w:t>MP3 / podcast URL. Renders as an audio player</w:t>
+              <w:t>audio_file</w:t>
+            </w:r>
+          </w:p>
+        </w:tc>
+        <w:tc>
+          <w:tcPr>
+            <w:tcW w:type="dxa" w:w="4320"/>
+          </w:tcPr>
+          <w:p>
+            <w:r/>
+            <w:r>
+              <w:t>Easiest path — drag-drop an MP3 here. File hosted in your Media Library, plays in-browser.</w:t>
             </w:r>
           </w:p>
         </w:tc>
@@ -21864,18 +21864,18 @@
           <w:p>
             <w:r/>
             <w:r>
-              <w:t>downloadable_file</w:t>
-            </w:r>
-          </w:p>
-        </w:tc>
-        <w:tc>
-          <w:tcPr>
-            <w:tcW w:type="dxa" w:w="4320"/>
-          </w:tcPr>
-          <w:p>
-            <w:r/>
-            <w:r>
-              <w:t>Optional PDF, worksheet, or audio file customers can download</w:t>
+              <w:t>audio_url</w:t>
+            </w:r>
+          </w:p>
+        </w:tc>
+        <w:tc>
+          <w:tcPr>
+            <w:tcW w:type="dxa" w:w="4320"/>
+          </w:tcPr>
+          <w:p>
+            <w:r/>
+            <w:r>
+              <w:t>Alternative to audio_file — paste a URL if the audio is hosted elsewhere (Bunny.net, podcast feed, external MP3). Leave blank if you uploaded a file above.</w:t>
             </w:r>
           </w:p>
         </w:tc>
@@ -21888,18 +21888,18 @@
           <w:p>
             <w:r/>
             <w:r>
-              <w:t>thumbnail</w:t>
-            </w:r>
-          </w:p>
-        </w:tc>
-        <w:tc>
-          <w:tcPr>
-            <w:tcW w:type="dxa" w:w="4320"/>
-          </w:tcPr>
-          <w:p>
-            <w:r/>
-            <w:r>
-              <w:t>Optional thumbnail shown above the title (800×600 recommended)</w:t>
+              <w:t>downloadable_file</w:t>
+            </w:r>
+          </w:p>
+        </w:tc>
+        <w:tc>
+          <w:tcPr>
+            <w:tcW w:type="dxa" w:w="4320"/>
+          </w:tcPr>
+          <w:p>
+            <w:r/>
+            <w:r>
+              <w:t>Optional PDF, worksheet, or audio file customers can download</w:t>
             </w:r>
           </w:p>
         </w:tc>
@@ -21912,18 +21912,18 @@
           <w:p>
             <w:r/>
             <w:r>
-              <w:t>duration_label</w:t>
-            </w:r>
-          </w:p>
-        </w:tc>
-        <w:tc>
-          <w:tcPr>
-            <w:tcW w:type="dxa" w:w="4320"/>
-          </w:tcPr>
-          <w:p>
-            <w:r/>
-            <w:r>
-              <w:t>Free text, e.g. "12 minutes" or "15 min audio + worksheet"</w:t>
+              <w:t>thumbnail</w:t>
+            </w:r>
+          </w:p>
+        </w:tc>
+        <w:tc>
+          <w:tcPr>
+            <w:tcW w:type="dxa" w:w="4320"/>
+          </w:tcPr>
+          <w:p>
+            <w:r/>
+            <w:r>
+              <w:t>Optional thumbnail shown above the title (800×600 recommended)</w:t>
             </w:r>
           </w:p>
         </w:tc>
@@ -21936,6 +21936,30 @@
           <w:p>
             <w:r/>
             <w:r>
+              <w:t>duration_label</w:t>
+            </w:r>
+          </w:p>
+        </w:tc>
+        <w:tc>
+          <w:tcPr>
+            <w:tcW w:type="dxa" w:w="4320"/>
+          </w:tcPr>
+          <w:p>
+            <w:r/>
+            <w:r>
+              <w:t>Free text, e.g. "12 minutes" or "15 min audio + worksheet"</w:t>
+            </w:r>
+          </w:p>
+        </w:tc>
+      </w:tr>
+      <w:tr>
+        <w:tc>
+          <w:tcPr>
+            <w:tcW w:type="dxa" w:w="4320"/>
+          </w:tcPr>
+          <w:p>
+            <w:r/>
+            <w:r>
               <w:t>is_intro</w:t>
             </w:r>
           </w:p>
@@ -22089,14 +22113,14 @@
         <w:t>title</w:t>
       </w:r>
       <w:r>
-        <w:t xml:space="preserve">, </w:t>
+        <w:t xml:space="preserve">, drag-drop MP3 into </w:t>
       </w:r>
       <w:r>
         <w:rPr>
           <w:rFonts w:ascii="Consolas" w:hAnsi="Consolas"/>
           <w:sz w:val="20"/>
         </w:rPr>
-        <w:t>audio_url</w:t>
+        <w:t>audio_file</w:t>
       </w:r>
       <w:r>
         <w:t xml:space="preserve">, </w:t>
@@ -22108,6 +22132,9 @@
         </w:rPr>
         <w:t>duration_label</w:t>
       </w:r>
+      <w:r>
+        <w:t xml:space="preserve"> (e.g. "12 minutes")</w:t>
+      </w:r>
     </w:p>
     <w:p>
       <w:pPr>
@@ -22151,6 +22178,19 @@
       </w:r>
       <w:r>
         <w:t xml:space="preserve"> describing what's inside</w:t>
+      </w:r>
+    </w:p>
+    <w:p>
+      <w:pPr>
+        <w:pStyle w:val="Heading4"/>
+      </w:pPr>
+      <w:r>
+        <w:t>Verified working end-to-end (1 Jun 2026)</w:t>
+      </w:r>
+    </w:p>
+    <w:p>
+      <w:r>
+        <w:t>The full funnel was tested on staging: Stripe purchase → user auto-created with REGULATED access → password set → login → access page renders with the uploaded audio meditation playing inline. Anna can demo this exact flow to her brother on the meeting recording.</w:t>
       </w:r>
     </w:p>
     <w:p>

</xml_diff>

<commit_message>
Answers docx v2 + refreshed user manual
build-answers-for-anna.py rewritten closing section. Original 'what I'm
doing this week' read like a forward plan; v2 replaces it with a real
status table organised by what's done vs paused vs next vs blocked, plus
3 concrete tasks Anna needs to do (5 minutes total).

Also fixed: Calendly section claimed 'shipped today' (was 9 Jun).

ANNA_USER_MANUAL.docx regenerated from current .md so the master manual
includes sections 16.28-16.33 (commerce pipeline, accounts, refunds,
returns, Calendly).
</commit_message>
<xml_diff>
--- a/Docs/ANNA_USER_MANUAL.docx
+++ b/Docs/ANNA_USER_MANUAL.docx
@@ -22234,12 +22234,559 @@
         <w:pStyle w:val="Heading3"/>
       </w:pPr>
       <w:r>
-        <w:t>16.19 What's coming next</w:t>
-      </w:r>
-    </w:p>
-    <w:p>
-      <w:r>
-        <w:t>The manual is now substantially complete for v1.3. Possible future additions based on Anna's feedback:</w:t>
+        <w:t>16.19 Building a brand-new page yourself (the Page Builder)</w:t>
+      </w:r>
+    </w:p>
+    <w:p>
+      <w:r>
+        <w:t xml:space="preserve">You can now create new pages on your site without help — full design control, multiple images, colours, the lot. This is the </w:t>
+      </w:r>
+      <w:r>
+        <w:rPr>
+          <w:b/>
+        </w:rPr>
+        <w:t>Page (build your own)</w:t>
+      </w:r>
+      <w:r>
+        <w:t xml:space="preserve"> collection in your CMS sidebar.</w:t>
+      </w:r>
+    </w:p>
+    <w:p>
+      <w:r>
+        <w:rPr>
+          <w:b/>
+        </w:rPr>
+        <w:t>It works on your phone.</w:t>
+      </w:r>
+      <w:r>
+        <w:t xml:space="preserve"> Strapi's admin is responsive — you can build entire pages from mobile. The flow below is written assuming you're on iPhone or iPad. Desktop is the same but easier (more screen space).</w:t>
+      </w:r>
+    </w:p>
+    <w:p>
+      <w:pPr>
+        <w:pStyle w:val="Heading4"/>
+      </w:pPr>
+      <w:r>
+        <w:t>Step 1 — Create the page</w:t>
+      </w:r>
+    </w:p>
+    <w:p>
+      <w:pPr>
+        <w:pStyle w:val="ListNumber"/>
+      </w:pPr>
+      <w:r>
+        <w:t xml:space="preserve">Tap the menu (☰) → </w:t>
+      </w:r>
+      <w:r>
+        <w:rPr>
+          <w:b/>
+        </w:rPr>
+        <w:t>Content Manager</w:t>
+      </w:r>
+      <w:r>
+        <w:t xml:space="preserve"> → </w:t>
+      </w:r>
+      <w:r>
+        <w:rPr>
+          <w:b/>
+        </w:rPr>
+        <w:t>Page (build your own)</w:t>
+      </w:r>
+      <w:r>
+        <w:t xml:space="preserve"> → </w:t>
+      </w:r>
+      <w:r>
+        <w:rPr>
+          <w:b/>
+        </w:rPr>
+        <w:t>Create new entry</w:t>
+      </w:r>
+    </w:p>
+    <w:p>
+      <w:pPr>
+        <w:pStyle w:val="ListNumber"/>
+      </w:pPr>
+      <w:r>
+        <w:t>Fill in:</w:t>
+      </w:r>
+    </w:p>
+    <w:p>
+      <w:r>
+        <w:t xml:space="preserve">   - </w:t>
+      </w:r>
+      <w:r>
+        <w:rPr>
+          <w:b/>
+        </w:rPr>
+        <w:t>Title</w:t>
+      </w:r>
+      <w:r>
+        <w:t xml:space="preserve"> — appears in the browser tab. Example: </w:t>
+      </w:r>
+      <w:r>
+        <w:rPr>
+          <w:i/>
+        </w:rPr>
+        <w:t>"Beach Reset Day"</w:t>
+      </w:r>
+    </w:p>
+    <w:p>
+      <w:r>
+        <w:t xml:space="preserve">   - </w:t>
+      </w:r>
+      <w:r>
+        <w:rPr>
+          <w:b/>
+        </w:rPr>
+        <w:t>Slug</w:t>
+      </w:r>
+      <w:r>
+        <w:t xml:space="preserve"> — auto-fills from the title. This becomes the URL: </w:t>
+      </w:r>
+      <w:r>
+        <w:rPr>
+          <w:rFonts w:ascii="Consolas" w:hAnsi="Consolas"/>
+          <w:sz w:val="20"/>
+        </w:rPr>
+        <w:t>annalouwellness.com/p/beach-reset-day</w:t>
+      </w:r>
+    </w:p>
+    <w:p>
+      <w:r>
+        <w:t xml:space="preserve">   - </w:t>
+      </w:r>
+      <w:r>
+        <w:rPr>
+          <w:b/>
+        </w:rPr>
+        <w:t>Hero image</w:t>
+      </w:r>
+      <w:r>
+        <w:t xml:space="preserve"> — the photo used when this page is shared on social (Instagram, WhatsApp). Optional but recommended.</w:t>
+      </w:r>
+    </w:p>
+    <w:p>
+      <w:r>
+        <w:t xml:space="preserve">   - </w:t>
+      </w:r>
+      <w:r>
+        <w:rPr>
+          <w:b/>
+        </w:rPr>
+        <w:t>Summary</w:t>
+      </w:r>
+      <w:r>
+        <w:t xml:space="preserve"> — one line that shows up in search results and link previews. ~155 characters.</w:t>
+      </w:r>
+    </w:p>
+    <w:p>
+      <w:pPr>
+        <w:pStyle w:val="ListNumber"/>
+      </w:pPr>
+      <w:r>
+        <w:rPr>
+          <w:b/>
+        </w:rPr>
+        <w:t>Save</w:t>
+      </w:r>
+      <w:r>
+        <w:t xml:space="preserve"> as a draft (top-right). You can keep editing.</w:t>
+      </w:r>
+    </w:p>
+    <w:p>
+      <w:pPr>
+        <w:pStyle w:val="Heading4"/>
+      </w:pPr>
+      <w:r>
+        <w:t>Step 2 — Add sections</w:t>
+      </w:r>
+    </w:p>
+    <w:p>
+      <w:r>
+        <w:t xml:space="preserve">Scroll down to </w:t>
+      </w:r>
+      <w:r>
+        <w:rPr>
+          <w:b/>
+        </w:rPr>
+        <w:t>Sections</w:t>
+      </w:r>
+      <w:r>
+        <w:t xml:space="preserve">. Tap </w:t>
+      </w:r>
+      <w:r>
+        <w:rPr>
+          <w:b/>
+        </w:rPr>
+        <w:t>+ Add a component to sections</w:t>
+      </w:r>
+      <w:r>
+        <w:t>. You'll see a list of section types:</w:t>
+      </w:r>
+    </w:p>
+    <w:tbl>
+      <w:tblPr>
+        <w:tblStyle w:val="LightGrid-Accent1"/>
+        <w:tblW w:type="auto" w:w="0"/>
+        <w:tblLook w:firstColumn="1" w:firstRow="1" w:lastColumn="0" w:lastRow="0" w:noHBand="0" w:noVBand="1" w:val="04A0"/>
+      </w:tblPr>
+      <w:tblGrid>
+        <w:gridCol w:w="4320"/>
+        <w:gridCol w:w="4320"/>
+      </w:tblGrid>
+      <w:tr>
+        <w:tc>
+          <w:tcPr>
+            <w:tcW w:type="dxa" w:w="4320"/>
+          </w:tcPr>
+          <w:p>
+            <w:r/>
+            <w:r>
+              <w:rPr>
+                <w:b/>
+              </w:rPr>
+              <w:t>Section</w:t>
+            </w:r>
+          </w:p>
+        </w:tc>
+        <w:tc>
+          <w:tcPr>
+            <w:tcW w:type="dxa" w:w="4320"/>
+          </w:tcPr>
+          <w:p>
+            <w:r/>
+            <w:r>
+              <w:rPr>
+                <w:b/>
+              </w:rPr>
+              <w:t>When to use</w:t>
+            </w:r>
+          </w:p>
+        </w:tc>
+      </w:tr>
+      <w:tr>
+        <w:tc>
+          <w:tcPr>
+            <w:tcW w:type="dxa" w:w="4320"/>
+          </w:tcPr>
+          <w:p>
+            <w:r/>
+            <w:r>
+              <w:t>Hero</w:t>
+            </w:r>
+          </w:p>
+        </w:tc>
+        <w:tc>
+          <w:tcPr>
+            <w:tcW w:type="dxa" w:w="4320"/>
+          </w:tcPr>
+          <w:p>
+            <w:r/>
+            <w:r>
+              <w:t>A big opening with title, subtitle, optional background image, and CTA buttons. Almost every page starts with one.</w:t>
+            </w:r>
+          </w:p>
+        </w:tc>
+      </w:tr>
+      <w:tr>
+        <w:tc>
+          <w:tcPr>
+            <w:tcW w:type="dxa" w:w="4320"/>
+          </w:tcPr>
+          <w:p>
+            <w:r/>
+            <w:r>
+              <w:t>Text Block</w:t>
+            </w:r>
+          </w:p>
+        </w:tc>
+        <w:tc>
+          <w:tcPr>
+            <w:tcW w:type="dxa" w:w="4320"/>
+          </w:tcPr>
+          <w:p>
+            <w:r/>
+            <w:r>
+              <w:t>A heading + body paragraphs. Good for long-form copy.</w:t>
+            </w:r>
+          </w:p>
+        </w:tc>
+      </w:tr>
+      <w:tr>
+        <w:tc>
+          <w:tcPr>
+            <w:tcW w:type="dxa" w:w="4320"/>
+          </w:tcPr>
+          <w:p>
+            <w:r/>
+            <w:r>
+              <w:t>Image + Text split</w:t>
+            </w:r>
+          </w:p>
+        </w:tc>
+        <w:tc>
+          <w:tcPr>
+            <w:tcW w:type="dxa" w:w="4320"/>
+          </w:tcPr>
+          <w:p>
+            <w:r/>
+            <w:r>
+              <w:t>One image side-by-side with a heading + body. Choose left or right for the image.</w:t>
+            </w:r>
+          </w:p>
+        </w:tc>
+      </w:tr>
+      <w:tr>
+        <w:tc>
+          <w:tcPr>
+            <w:tcW w:type="dxa" w:w="4320"/>
+          </w:tcPr>
+          <w:p>
+            <w:r/>
+            <w:r>
+              <w:t>Full-bleed image</w:t>
+            </w:r>
+          </w:p>
+        </w:tc>
+        <w:tc>
+          <w:tcPr>
+            <w:tcW w:type="dxa" w:w="4320"/>
+          </w:tcPr>
+          <w:p>
+            <w:r/>
+            <w:r>
+              <w:t>A big edge-to-edge photo, optionally with text floating on top. Great between long text sections.</w:t>
+            </w:r>
+          </w:p>
+        </w:tc>
+      </w:tr>
+      <w:tr>
+        <w:tc>
+          <w:tcPr>
+            <w:tcW w:type="dxa" w:w="4320"/>
+          </w:tcPr>
+          <w:p>
+            <w:r/>
+            <w:r>
+              <w:t>Image pair</w:t>
+            </w:r>
+          </w:p>
+        </w:tc>
+        <w:tc>
+          <w:tcPr>
+            <w:tcW w:type="dxa" w:w="4320"/>
+          </w:tcPr>
+          <w:p>
+            <w:r/>
+            <w:r>
+              <w:t>Two photos side-by-side (e.g. boat exterior + interior).</w:t>
+            </w:r>
+          </w:p>
+        </w:tc>
+      </w:tr>
+      <w:tr>
+        <w:tc>
+          <w:tcPr>
+            <w:tcW w:type="dxa" w:w="4320"/>
+          </w:tcPr>
+          <w:p>
+            <w:r/>
+            <w:r>
+              <w:t>Image with caption</w:t>
+            </w:r>
+          </w:p>
+        </w:tc>
+        <w:tc>
+          <w:tcPr>
+            <w:tcW w:type="dxa" w:w="4320"/>
+          </w:tcPr>
+          <w:p>
+            <w:r/>
+            <w:r>
+              <w:t>A single centred photo with caption underneath.</w:t>
+            </w:r>
+          </w:p>
+        </w:tc>
+      </w:tr>
+      <w:tr>
+        <w:tc>
+          <w:tcPr>
+            <w:tcW w:type="dxa" w:w="4320"/>
+          </w:tcPr>
+          <w:p>
+            <w:r/>
+            <w:r>
+              <w:t>Gallery</w:t>
+            </w:r>
+          </w:p>
+        </w:tc>
+        <w:tc>
+          <w:tcPr>
+            <w:tcW w:type="dxa" w:w="4320"/>
+          </w:tcPr>
+          <w:p>
+            <w:r/>
+            <w:r>
+              <w:t>A grid of multiple photos.</w:t>
+            </w:r>
+          </w:p>
+        </w:tc>
+      </w:tr>
+      <w:tr>
+        <w:tc>
+          <w:tcPr>
+            <w:tcW w:type="dxa" w:w="4320"/>
+          </w:tcPr>
+          <w:p>
+            <w:r/>
+            <w:r>
+              <w:t>CTA Banner</w:t>
+            </w:r>
+          </w:p>
+        </w:tc>
+        <w:tc>
+          <w:tcPr>
+            <w:tcW w:type="dxa" w:w="4320"/>
+          </w:tcPr>
+          <w:p>
+            <w:r/>
+            <w:r>
+              <w:t>A call to action with heading + button.</w:t>
+            </w:r>
+          </w:p>
+        </w:tc>
+      </w:tr>
+      <w:tr>
+        <w:tc>
+          <w:tcPr>
+            <w:tcW w:type="dxa" w:w="4320"/>
+          </w:tcPr>
+          <w:p>
+            <w:r/>
+            <w:r>
+              <w:t>Testimonials</w:t>
+            </w:r>
+          </w:p>
+        </w:tc>
+        <w:tc>
+          <w:tcPr>
+            <w:tcW w:type="dxa" w:w="4320"/>
+          </w:tcPr>
+          <w:p>
+            <w:r/>
+            <w:r>
+              <w:t>Customer quotes.</w:t>
+            </w:r>
+          </w:p>
+        </w:tc>
+      </w:tr>
+      <w:tr>
+        <w:tc>
+          <w:tcPr>
+            <w:tcW w:type="dxa" w:w="4320"/>
+          </w:tcPr>
+          <w:p>
+            <w:r/>
+            <w:r>
+              <w:t>FAQ</w:t>
+            </w:r>
+          </w:p>
+        </w:tc>
+        <w:tc>
+          <w:tcPr>
+            <w:tcW w:type="dxa" w:w="4320"/>
+          </w:tcPr>
+          <w:p>
+            <w:r/>
+            <w:r>
+              <w:t>Question-and-answer accordion.</w:t>
+            </w:r>
+          </w:p>
+        </w:tc>
+      </w:tr>
+      <w:tr>
+        <w:tc>
+          <w:tcPr>
+            <w:tcW w:type="dxa" w:w="4320"/>
+          </w:tcPr>
+          <w:p>
+            <w:r/>
+            <w:r>
+              <w:t>Embed</w:t>
+            </w:r>
+          </w:p>
+        </w:tc>
+        <w:tc>
+          <w:tcPr>
+            <w:tcW w:type="dxa" w:w="4320"/>
+          </w:tcPr>
+          <w:p>
+            <w:r/>
+            <w:r>
+              <w:t>Embed a YouTube or Vimeo video by pasting its URL.</w:t>
+            </w:r>
+          </w:p>
+        </w:tc>
+      </w:tr>
+      <w:tr>
+        <w:tc>
+          <w:tcPr>
+            <w:tcW w:type="dxa" w:w="4320"/>
+          </w:tcPr>
+          <w:p>
+            <w:r/>
+            <w:r>
+              <w:t>Custom HTML</w:t>
+            </w:r>
+          </w:p>
+        </w:tc>
+        <w:tc>
+          <w:tcPr>
+            <w:tcW w:type="dxa" w:w="4320"/>
+          </w:tcPr>
+          <w:p>
+            <w:r/>
+            <w:r>
+              <w:t>For anything else — drop in raw HTML. Use sparingly.</w:t>
+            </w:r>
+          </w:p>
+        </w:tc>
+      </w:tr>
+    </w:tbl>
+    <w:p>
+      <w:r>
+        <w:t xml:space="preserve">Pick one. Fill in its fields. Save. Repeat for the next section. </w:t>
+      </w:r>
+      <w:r>
+        <w:rPr>
+          <w:b/>
+        </w:rPr>
+        <w:t>Drag</w:t>
+      </w:r>
+      <w:r>
+        <w:t xml:space="preserve"> the small ≡ handle to reorder sections.</w:t>
+      </w:r>
+    </w:p>
+    <w:p>
+      <w:pPr>
+        <w:pStyle w:val="Heading4"/>
+      </w:pPr>
+      <w:r>
+        <w:t>Step 3 — Style each section</w:t>
+      </w:r>
+    </w:p>
+    <w:p>
+      <w:r>
+        <w:t xml:space="preserve">Inside every section there's a </w:t>
+      </w:r>
+      <w:r>
+        <w:rPr>
+          <w:b/>
+        </w:rPr>
+        <w:t>Style</w:t>
+      </w:r>
+      <w:r>
+        <w:t xml:space="preserve"> block. Tap to expand. You'll see:</w:t>
       </w:r>
     </w:p>
     <w:p>
@@ -22247,7 +22794,103 @@
         <w:pStyle w:val="ListBullet"/>
       </w:pPr>
       <w:r>
-        <w:t>Screenshots inside each section (currently text-only — Anna may want visual reference)</w:t>
+        <w:rPr>
+          <w:b/>
+        </w:rPr>
+        <w:t>Background colour</w:t>
+      </w:r>
+      <w:r>
+        <w:t xml:space="preserve"> — paste a hex code. Common ones for the ALW palette:</w:t>
+      </w:r>
+    </w:p>
+    <w:p>
+      <w:r>
+        <w:t xml:space="preserve">  - </w:t>
+      </w:r>
+      <w:r>
+        <w:rPr>
+          <w:rFonts w:ascii="Consolas" w:hAnsi="Consolas"/>
+          <w:sz w:val="20"/>
+        </w:rPr>
+        <w:t>#FFFFFF</w:t>
+      </w:r>
+      <w:r>
+        <w:t xml:space="preserve"> (white)</w:t>
+      </w:r>
+    </w:p>
+    <w:p>
+      <w:r>
+        <w:t xml:space="preserve">  - </w:t>
+      </w:r>
+      <w:r>
+        <w:rPr>
+          <w:rFonts w:ascii="Consolas" w:hAnsi="Consolas"/>
+          <w:sz w:val="20"/>
+        </w:rPr>
+        <w:t>#F5F3EF</w:t>
+      </w:r>
+      <w:r>
+        <w:t xml:space="preserve"> (cream)</w:t>
+      </w:r>
+    </w:p>
+    <w:p>
+      <w:r>
+        <w:t xml:space="preserve">  - </w:t>
+      </w:r>
+      <w:r>
+        <w:rPr>
+          <w:rFonts w:ascii="Consolas" w:hAnsi="Consolas"/>
+          <w:sz w:val="20"/>
+        </w:rPr>
+        <w:t>#FCE8EF</w:t>
+      </w:r>
+      <w:r>
+        <w:t xml:space="preserve"> (soft pink)</w:t>
+      </w:r>
+    </w:p>
+    <w:p>
+      <w:r>
+        <w:t xml:space="preserve">  - </w:t>
+      </w:r>
+      <w:r>
+        <w:rPr>
+          <w:rFonts w:ascii="Consolas" w:hAnsi="Consolas"/>
+          <w:sz w:val="20"/>
+        </w:rPr>
+        <w:t>#DCEFE6</w:t>
+      </w:r>
+      <w:r>
+        <w:t xml:space="preserve"> (mint)</w:t>
+      </w:r>
+    </w:p>
+    <w:p>
+      <w:r>
+        <w:t xml:space="preserve">  - </w:t>
+      </w:r>
+      <w:r>
+        <w:rPr>
+          <w:rFonts w:ascii="Consolas" w:hAnsi="Consolas"/>
+          <w:sz w:val="20"/>
+        </w:rPr>
+        <w:t>#FFD07A</w:t>
+      </w:r>
+      <w:r>
+        <w:t xml:space="preserve"> (warm gold)</w:t>
+      </w:r>
+    </w:p>
+    <w:p>
+      <w:r>
+        <w:t xml:space="preserve">  - </w:t>
+      </w:r>
+      <w:r>
+        <w:rPr>
+          <w:rFonts w:ascii="Consolas" w:hAnsi="Consolas"/>
+          <w:sz w:val="20"/>
+        </w:rPr>
+        <w:t>#231F20</w:t>
+      </w:r>
+      <w:r>
+        <w:t xml:space="preserve"> (near-black — pair with cream text)</w:t>
       </w:r>
     </w:p>
     <w:p>
@@ -22255,7 +22898,23 @@
         <w:pStyle w:val="ListBullet"/>
       </w:pPr>
       <w:r>
-        <w:t>A 5-minute video walkthrough of the most-used edits</w:t>
+        <w:rPr>
+          <w:b/>
+        </w:rPr>
+        <w:t>Text colour</w:t>
+      </w:r>
+      <w:r>
+        <w:t xml:space="preserve"> — usually leave blank (defaults to dark). Set to </w:t>
+      </w:r>
+      <w:r>
+        <w:rPr>
+          <w:rFonts w:ascii="Consolas" w:hAnsi="Consolas"/>
+          <w:sz w:val="20"/>
+        </w:rPr>
+        <w:t>#F5F3EF</w:t>
+      </w:r>
+      <w:r>
+        <w:t xml:space="preserve"> (cream) when using a dark background.</w:t>
       </w:r>
     </w:p>
     <w:p>
@@ -22263,7 +22922,2656 @@
         <w:pStyle w:val="ListBullet"/>
       </w:pPr>
       <w:r>
-        <w:t>A printable 1-page emergency cheatsheet for the launch day</w:t>
+        <w:rPr>
+          <w:b/>
+        </w:rPr>
+        <w:t>Accent colour</w:t>
+      </w:r>
+      <w:r>
+        <w:t xml:space="preserve"> — colour for buttons and links inside this section. Defaults to plum </w:t>
+      </w:r>
+      <w:r>
+        <w:rPr>
+          <w:rFonts w:ascii="Consolas" w:hAnsi="Consolas"/>
+          <w:sz w:val="20"/>
+        </w:rPr>
+        <w:t>#6E3A5A</w:t>
+      </w:r>
+      <w:r>
+        <w:t>.</w:t>
+      </w:r>
+    </w:p>
+    <w:p>
+      <w:pPr>
+        <w:pStyle w:val="ListBullet"/>
+      </w:pPr>
+      <w:r>
+        <w:rPr>
+          <w:b/>
+        </w:rPr>
+        <w:t>Padding</w:t>
+      </w:r>
+      <w:r>
+        <w:t xml:space="preserve"> — Tight / Normal / Spacious. Normal is the default.</w:t>
+      </w:r>
+    </w:p>
+    <w:p>
+      <w:pPr>
+        <w:pStyle w:val="ListBullet"/>
+      </w:pPr>
+      <w:r>
+        <w:rPr>
+          <w:b/>
+        </w:rPr>
+        <w:t>Alignment</w:t>
+      </w:r>
+      <w:r>
+        <w:t xml:space="preserve"> — Left / Center / Right text alignment.</w:t>
+      </w:r>
+    </w:p>
+    <w:p>
+      <w:pPr>
+        <w:pStyle w:val="ListBullet"/>
+      </w:pPr>
+      <w:r>
+        <w:rPr>
+          <w:b/>
+        </w:rPr>
+        <w:t>Max width</w:t>
+      </w:r>
+      <w:r>
+        <w:t xml:space="preserve"> — Narrow / Medium / Wide / Full. Narrow = best for long reading.</w:t>
+      </w:r>
+    </w:p>
+    <w:p>
+      <w:pPr>
+        <w:pStyle w:val="ListBullet"/>
+      </w:pPr>
+      <w:r>
+        <w:rPr>
+          <w:b/>
+        </w:rPr>
+        <w:t>Background image</w:t>
+      </w:r>
+      <w:r>
+        <w:t xml:space="preserve"> — drop in a photo to sit behind the text. Set </w:t>
+      </w:r>
+      <w:r>
+        <w:rPr>
+          <w:b/>
+        </w:rPr>
+        <w:t>Background image overlay</w:t>
+      </w:r>
+      <w:r>
+        <w:t xml:space="preserve"> (0–80) to dim it so the text stays readable.</w:t>
+      </w:r>
+    </w:p>
+    <w:p>
+      <w:pPr>
+        <w:pStyle w:val="Heading4"/>
+      </w:pPr>
+      <w:r>
+        <w:t>Step 4 — Add images everywhere you want</w:t>
+      </w:r>
+    </w:p>
+    <w:p>
+      <w:r>
+        <w:t>Every section type that allows images lets you drop in a photo from your phone:</w:t>
+      </w:r>
+    </w:p>
+    <w:p>
+      <w:pPr>
+        <w:pStyle w:val="ListBullet"/>
+      </w:pPr>
+      <w:r>
+        <w:t xml:space="preserve">Tap the image field → </w:t>
+      </w:r>
+      <w:r>
+        <w:rPr>
+          <w:b/>
+        </w:rPr>
+        <w:t>Add an asset</w:t>
+      </w:r>
+      <w:r>
+        <w:t xml:space="preserve"> → </w:t>
+      </w:r>
+      <w:r>
+        <w:rPr>
+          <w:b/>
+        </w:rPr>
+        <w:t>Upload assets</w:t>
+      </w:r>
+      <w:r>
+        <w:t xml:space="preserve"> → choose from your camera roll</w:t>
+      </w:r>
+    </w:p>
+    <w:p>
+      <w:pPr>
+        <w:pStyle w:val="ListBullet"/>
+      </w:pPr>
+      <w:r>
+        <w:t>Once uploaded, the image is auto-rotated, auto-resized, and renamed to something readable</w:t>
+      </w:r>
+    </w:p>
+    <w:p>
+      <w:pPr>
+        <w:pStyle w:val="ListBullet"/>
+      </w:pPr>
+      <w:r>
+        <w:t>You can use the same image multiple times across pages — just upload once</w:t>
+      </w:r>
+    </w:p>
+    <w:p>
+      <w:pPr>
+        <w:pStyle w:val="Heading4"/>
+      </w:pPr>
+      <w:r>
+        <w:t>Step 5 — Save and preview</w:t>
+      </w:r>
+    </w:p>
+    <w:p>
+      <w:pPr>
+        <w:pStyle w:val="ListNumber"/>
+      </w:pPr>
+      <w:r>
+        <w:t xml:space="preserve">Tap </w:t>
+      </w:r>
+      <w:r>
+        <w:rPr>
+          <w:b/>
+        </w:rPr>
+        <w:t>Save</w:t>
+      </w:r>
+    </w:p>
+    <w:p>
+      <w:pPr>
+        <w:pStyle w:val="ListNumber"/>
+      </w:pPr>
+      <w:r>
+        <w:t xml:space="preserve">Tap </w:t>
+      </w:r>
+      <w:r>
+        <w:rPr>
+          <w:b/>
+        </w:rPr>
+        <w:t>Publish</w:t>
+      </w:r>
+      <w:r>
+        <w:t xml:space="preserve"> (top-right, blue button)</w:t>
+      </w:r>
+    </w:p>
+    <w:p>
+      <w:pPr>
+        <w:pStyle w:val="ListNumber"/>
+      </w:pPr>
+      <w:r>
+        <w:t xml:space="preserve">Open </w:t>
+      </w:r>
+      <w:r>
+        <w:rPr>
+          <w:rFonts w:ascii="Consolas" w:hAnsi="Consolas"/>
+          <w:sz w:val="20"/>
+        </w:rPr>
+        <w:t>annalouwellness.com/p/&lt;your-slug&gt;</w:t>
+      </w:r>
+      <w:r>
+        <w:t xml:space="preserve"> in another tab. Your page is live.</w:t>
+      </w:r>
+    </w:p>
+    <w:p>
+      <w:r>
+        <w:t>Edits go live in 1–2 seconds — no waiting for a rebuild.</w:t>
+      </w:r>
+    </w:p>
+    <w:p>
+      <w:pPr>
+        <w:pStyle w:val="Heading4"/>
+      </w:pPr>
+      <w:r>
+        <w:t>Tips for mobile editing</w:t>
+      </w:r>
+    </w:p>
+    <w:p>
+      <w:pPr>
+        <w:pStyle w:val="ListBullet"/>
+      </w:pPr>
+      <w:r>
+        <w:t>Strapi remembers what you typed if your phone screen locks — relaunch and continue</w:t>
+      </w:r>
+    </w:p>
+    <w:p>
+      <w:pPr>
+        <w:pStyle w:val="ListBullet"/>
+      </w:pPr>
+      <w:r>
+        <w:t>If a long form feels cramped, rotate to landscape</w:t>
+      </w:r>
+    </w:p>
+    <w:p>
+      <w:pPr>
+        <w:pStyle w:val="ListBullet"/>
+      </w:pPr>
+      <w:r>
+        <w:t xml:space="preserve">For the Sections list, </w:t>
+      </w:r>
+      <w:r>
+        <w:rPr>
+          <w:b/>
+        </w:rPr>
+        <w:t>drag the ≡ handle slowly</w:t>
+      </w:r>
+      <w:r>
+        <w:t xml:space="preserve"> — too fast and the page scrolls instead</w:t>
+      </w:r>
+    </w:p>
+    <w:p>
+      <w:pPr>
+        <w:pStyle w:val="ListBullet"/>
+      </w:pPr>
+      <w:r>
+        <w:t xml:space="preserve">If you accidentally tap </w:t>
+      </w:r>
+      <w:r>
+        <w:rPr>
+          <w:b/>
+        </w:rPr>
+        <w:t>Delete</w:t>
+      </w:r>
+      <w:r>
+        <w:t xml:space="preserve"> on a section, </w:t>
+      </w:r>
+      <w:r>
+        <w:rPr>
+          <w:b/>
+        </w:rPr>
+        <w:t>Save</w:t>
+      </w:r>
+      <w:r>
+        <w:t xml:space="preserve"> without publishing and reload — drafts are preserved</w:t>
+      </w:r>
+    </w:p>
+    <w:p>
+      <w:pPr>
+        <w:pStyle w:val="ListBullet"/>
+      </w:pPr>
+      <w:r>
+        <w:t>Photos taken on iPhone (HEIC format) work — they're auto-converted to JPEG on upload</w:t>
+      </w:r>
+    </w:p>
+    <w:p>
+      <w:pPr>
+        <w:pStyle w:val="Heading4"/>
+      </w:pPr>
+      <w:r>
+        <w:t>Mistakes that don't matter</w:t>
+      </w:r>
+    </w:p>
+    <w:p>
+      <w:pPr>
+        <w:pStyle w:val="ListBullet"/>
+      </w:pPr>
+      <w:r>
+        <w:rPr>
+          <w:b/>
+        </w:rPr>
+        <w:t>Wrong colour</w:t>
+      </w:r>
+      <w:r>
+        <w:t xml:space="preserve"> — change it, save, refresh the live page. Instant.</w:t>
+      </w:r>
+    </w:p>
+    <w:p>
+      <w:pPr>
+        <w:pStyle w:val="ListBullet"/>
+      </w:pPr>
+      <w:r>
+        <w:rPr>
+          <w:b/>
+        </w:rPr>
+        <w:t>Wrong order</w:t>
+      </w:r>
+      <w:r>
+        <w:t xml:space="preserve"> — drag to reorder, save, refresh. Instant.</w:t>
+      </w:r>
+    </w:p>
+    <w:p>
+      <w:pPr>
+        <w:pStyle w:val="ListBullet"/>
+      </w:pPr>
+      <w:r>
+        <w:rPr>
+          <w:b/>
+        </w:rPr>
+        <w:t>Wrong image</w:t>
+      </w:r>
+      <w:r>
+        <w:t xml:space="preserve"> — open the section, remove the image, add a new one, save.</w:t>
+      </w:r>
+    </w:p>
+    <w:p>
+      <w:pPr>
+        <w:pStyle w:val="ListBullet"/>
+      </w:pPr>
+      <w:r>
+        <w:rPr>
+          <w:b/>
+        </w:rPr>
+        <w:t>Page looks bad</w:t>
+      </w:r>
+      <w:r>
+        <w:t xml:space="preserve"> — leave it as a draft. Only published pages are live. Nothing public breaks.</w:t>
+      </w:r>
+    </w:p>
+    <w:p>
+      <w:pPr>
+        <w:pStyle w:val="Heading4"/>
+      </w:pPr>
+      <w:r>
+        <w:t>Mistakes that do matter</w:t>
+      </w:r>
+    </w:p>
+    <w:p>
+      <w:pPr>
+        <w:pStyle w:val="ListBullet"/>
+      </w:pPr>
+      <w:r>
+        <w:rPr>
+          <w:b/>
+        </w:rPr>
+        <w:t>Don't change the slug</w:t>
+      </w:r>
+      <w:r>
+        <w:t xml:space="preserve"> after the page is live and shared — the URL will break for anyone with the old link</w:t>
+      </w:r>
+    </w:p>
+    <w:p>
+      <w:pPr>
+        <w:pStyle w:val="ListBullet"/>
+      </w:pPr>
+      <w:r>
+        <w:rPr>
+          <w:b/>
+        </w:rPr>
+        <w:t>Don't paste invalid hex codes</w:t>
+      </w:r>
+      <w:r>
+        <w:t xml:space="preserve"> (e.g. </w:t>
+      </w:r>
+      <w:r>
+        <w:rPr>
+          <w:rFonts w:ascii="Consolas" w:hAnsi="Consolas"/>
+          <w:sz w:val="20"/>
+        </w:rPr>
+        <w:t>#GGGGGG</w:t>
+      </w:r>
+      <w:r>
+        <w:t>) — the colour will silently default to white</w:t>
+      </w:r>
+    </w:p>
+    <w:p>
+      <w:pPr>
+        <w:pStyle w:val="Heading3"/>
+      </w:pPr>
+      <w:r>
+        <w:t>16.20 Practitioners — your trusted circle directory</w:t>
+      </w:r>
+    </w:p>
+    <w:p>
+      <w:r>
+        <w:rPr>
+          <w:rFonts w:ascii="Consolas" w:hAnsi="Consolas"/>
+          <w:sz w:val="20"/>
+        </w:rPr>
+        <w:t>/practitioners</w:t>
+      </w:r>
+      <w:r>
+        <w:t xml:space="preserve"> is a dedicated page that mirrors the look of </w:t>
+      </w:r>
+      <w:r>
+        <w:rPr>
+          <w:rFonts w:ascii="Consolas" w:hAnsi="Consolas"/>
+          <w:sz w:val="20"/>
+        </w:rPr>
+        <w:t>/testimonials</w:t>
+      </w:r>
+      <w:r>
+        <w:t xml:space="preserve"> — a 3-column grid of practitioner cards, with occasional full-width "banner" entries between rows for featured names. Same workflow you already know from testimonials.</w:t>
+      </w:r>
+    </w:p>
+    <w:p>
+      <w:pPr>
+        <w:pStyle w:val="Heading4"/>
+      </w:pPr>
+      <w:r>
+        <w:t>Adding a practitioner</w:t>
+      </w:r>
+    </w:p>
+    <w:p>
+      <w:pPr>
+        <w:pStyle w:val="ListNumber"/>
+      </w:pPr>
+      <w:r>
+        <w:t xml:space="preserve">CMS → </w:t>
+      </w:r>
+      <w:r>
+        <w:rPr>
+          <w:b/>
+        </w:rPr>
+        <w:t>Practitioner</w:t>
+      </w:r>
+      <w:r>
+        <w:t xml:space="preserve"> (in the sidebar list of collections)</w:t>
+      </w:r>
+    </w:p>
+    <w:p>
+      <w:pPr>
+        <w:pStyle w:val="ListNumber"/>
+      </w:pPr>
+      <w:r>
+        <w:rPr>
+          <w:b/>
+        </w:rPr>
+        <w:t>Create new entry</w:t>
+      </w:r>
+    </w:p>
+    <w:p>
+      <w:pPr>
+        <w:pStyle w:val="ListNumber"/>
+      </w:pPr>
+      <w:r>
+        <w:t>Fill in:</w:t>
+      </w:r>
+    </w:p>
+    <w:p>
+      <w:r>
+        <w:t xml:space="preserve">   - </w:t>
+      </w:r>
+      <w:r>
+        <w:rPr>
+          <w:b/>
+        </w:rPr>
+        <w:t>Name</w:t>
+      </w:r>
+      <w:r>
+        <w:t xml:space="preserve"> — full name. Required.</w:t>
+      </w:r>
+    </w:p>
+    <w:p>
+      <w:r>
+        <w:t xml:space="preserve">   - </w:t>
+      </w:r>
+      <w:r>
+        <w:rPr>
+          <w:b/>
+        </w:rPr>
+        <w:t>Role</w:t>
+      </w:r>
+      <w:r>
+        <w:t xml:space="preserve"> — short specialism, e.g. "Somatic Therapist", "EMDR Practitioner". 1–4 words.</w:t>
+      </w:r>
+    </w:p>
+    <w:p>
+      <w:r>
+        <w:t xml:space="preserve">   - </w:t>
+      </w:r>
+      <w:r>
+        <w:rPr>
+          <w:b/>
+        </w:rPr>
+        <w:t>Bio</w:t>
+      </w:r>
+      <w:r>
+        <w:t xml:space="preserve"> — 1–3 sentences. Plain text.</w:t>
+      </w:r>
+    </w:p>
+    <w:p>
+      <w:r>
+        <w:t xml:space="preserve">   - </w:t>
+      </w:r>
+      <w:r>
+        <w:rPr>
+          <w:b/>
+        </w:rPr>
+        <w:t>Portrait</w:t>
+      </w:r>
+      <w:r>
+        <w:t xml:space="preserve"> — square photo (~800×800), JPEG, max 500 KB.</w:t>
+      </w:r>
+    </w:p>
+    <w:p>
+      <w:r>
+        <w:t xml:space="preserve">   - </w:t>
+      </w:r>
+      <w:r>
+        <w:rPr>
+          <w:b/>
+        </w:rPr>
+        <w:t>Website URL</w:t>
+      </w:r>
+      <w:r>
+        <w:t xml:space="preserve"> — full URL </w:t>
+      </w:r>
+      <w:r>
+        <w:rPr>
+          <w:rFonts w:ascii="Consolas" w:hAnsi="Consolas"/>
+          <w:sz w:val="20"/>
+        </w:rPr>
+        <w:t>https://...</w:t>
+      </w:r>
+      <w:r>
+        <w:t>. Clicking the card sends visitors here.</w:t>
+      </w:r>
+    </w:p>
+    <w:p>
+      <w:r>
+        <w:t xml:space="preserve">   - </w:t>
+      </w:r>
+      <w:r>
+        <w:rPr>
+          <w:b/>
+        </w:rPr>
+        <w:t>Instagram handle</w:t>
+      </w:r>
+      <w:r>
+        <w:t xml:space="preserve"> — just the handle, no @. Optional.</w:t>
+      </w:r>
+    </w:p>
+    <w:p>
+      <w:r>
+        <w:t xml:space="preserve">   - </w:t>
+      </w:r>
+      <w:r>
+        <w:rPr>
+          <w:b/>
+        </w:rPr>
+        <w:t>Email</w:t>
+      </w:r>
+      <w:r>
+        <w:t xml:space="preserve"> — optional. Currently shown as a "Get in touch" if you fill it.</w:t>
+      </w:r>
+    </w:p>
+    <w:p>
+      <w:r>
+        <w:t xml:space="preserve">   - </w:t>
+      </w:r>
+      <w:r>
+        <w:rPr>
+          <w:b/>
+        </w:rPr>
+        <w:t>Location</w:t>
+      </w:r>
+      <w:r>
+        <w:t xml:space="preserve"> — e.g. "London, in-person + online" or "Online only". Optional.</w:t>
+      </w:r>
+    </w:p>
+    <w:p>
+      <w:r>
+        <w:t xml:space="preserve">   - </w:t>
+      </w:r>
+      <w:r>
+        <w:rPr>
+          <w:b/>
+        </w:rPr>
+        <w:t>Display style</w:t>
+      </w:r>
+      <w:r>
+        <w:t xml:space="preserve"> — leave </w:t>
+      </w:r>
+      <w:r>
+        <w:rPr>
+          <w:b/>
+        </w:rPr>
+        <w:t>card</w:t>
+      </w:r>
+      <w:r>
+        <w:t xml:space="preserve"> for normal entries. Pick </w:t>
+      </w:r>
+      <w:r>
+        <w:rPr>
+          <w:b/>
+        </w:rPr>
+        <w:t>banner</w:t>
+      </w:r>
+      <w:r>
+        <w:t xml:space="preserve"> for 1 in every 6–10 entries to feature them prominently (same as how it works for testimonials).</w:t>
+      </w:r>
+    </w:p>
+    <w:p>
+      <w:r>
+        <w:t xml:space="preserve">   - </w:t>
+      </w:r>
+      <w:r>
+        <w:rPr>
+          <w:b/>
+        </w:rPr>
+        <w:t>Sort order</w:t>
+      </w:r>
+      <w:r>
+        <w:t xml:space="preserve"> — lower numbers show first. Default 100. Use 10, 20, 30… if you want fine control.</w:t>
+      </w:r>
+    </w:p>
+    <w:p>
+      <w:r>
+        <w:t xml:space="preserve">   - </w:t>
+      </w:r>
+      <w:r>
+        <w:rPr>
+          <w:b/>
+        </w:rPr>
+        <w:t>Is active</w:t>
+      </w:r>
+      <w:r>
+        <w:t xml:space="preserve"> — leave on. Untick to hide from the live site without deleting.</w:t>
+      </w:r>
+    </w:p>
+    <w:p>
+      <w:pPr>
+        <w:pStyle w:val="ListNumber"/>
+      </w:pPr>
+      <w:r>
+        <w:t>Save</w:t>
+      </w:r>
+    </w:p>
+    <w:p>
+      <w:pPr>
+        <w:pStyle w:val="Heading4"/>
+      </w:pPr>
+      <w:r>
+        <w:t>Editing the hero copy</w:t>
+      </w:r>
+    </w:p>
+    <w:p>
+      <w:r>
+        <w:t xml:space="preserve">CMS → </w:t>
+      </w:r>
+      <w:r>
+        <w:rPr>
+          <w:b/>
+        </w:rPr>
+        <w:t>Practitioners (Page)</w:t>
+      </w:r>
+      <w:r>
+        <w:t xml:space="preserve"> singleton → edit kicker, title, tagline. Saves go live in 1–2 seconds.</w:t>
+      </w:r>
+    </w:p>
+    <w:p>
+      <w:pPr>
+        <w:pStyle w:val="Heading4"/>
+      </w:pPr>
+      <w:r>
+        <w:t>Where it's linked</w:t>
+      </w:r>
+    </w:p>
+    <w:p>
+      <w:r>
+        <w:t xml:space="preserve">About menu → </w:t>
+      </w:r>
+      <w:r>
+        <w:rPr>
+          <w:b/>
+        </w:rPr>
+        <w:t>Practitioners</w:t>
+      </w:r>
+      <w:r>
+        <w:t xml:space="preserve"> (next to Client Stories).</w:t>
+      </w:r>
+    </w:p>
+    <w:p>
+      <w:pPr>
+        <w:pStyle w:val="Heading3"/>
+      </w:pPr>
+      <w:r>
+        <w:t>16.21 Duplicating an existing page to create a new one</w:t>
+      </w:r>
+    </w:p>
+    <w:p>
+      <w:r>
+        <w:t xml:space="preserve">You don't have to build pages from scratch — Strapi has a built-in </w:t>
+      </w:r>
+      <w:r>
+        <w:rPr>
+          <w:b/>
+        </w:rPr>
+        <w:t>Clone</w:t>
+      </w:r>
+      <w:r>
+        <w:t xml:space="preserve"> feature that works for almost every collection (Page Builder pages, programmes, practitioners, testimonials, articles, experiences, the lot).</w:t>
+      </w:r>
+    </w:p>
+    <w:p>
+      <w:pPr>
+        <w:pStyle w:val="Heading4"/>
+      </w:pPr>
+      <w:r>
+        <w:t>How to clone</w:t>
+      </w:r>
+    </w:p>
+    <w:p>
+      <w:pPr>
+        <w:pStyle w:val="ListNumber"/>
+      </w:pPr>
+      <w:r>
+        <w:t xml:space="preserve">CMS → open the collection of the entry you want to duplicate (e.g. </w:t>
+      </w:r>
+      <w:r>
+        <w:rPr>
+          <w:b/>
+        </w:rPr>
+        <w:t>Page (build your own)</w:t>
+      </w:r>
+      <w:r>
+        <w:t xml:space="preserve"> or </w:t>
+      </w:r>
+      <w:r>
+        <w:rPr>
+          <w:b/>
+        </w:rPr>
+        <w:t>Work · Programme</w:t>
+      </w:r>
+      <w:r>
+        <w:t>)</w:t>
+      </w:r>
+    </w:p>
+    <w:p>
+      <w:pPr>
+        <w:pStyle w:val="ListNumber"/>
+      </w:pPr>
+      <w:r>
+        <w:t>In the list view, find the entry's row</w:t>
+      </w:r>
+    </w:p>
+    <w:p>
+      <w:pPr>
+        <w:pStyle w:val="ListNumber"/>
+      </w:pPr>
+      <w:r>
+        <w:t xml:space="preserve">Click the </w:t>
+      </w:r>
+      <w:r>
+        <w:rPr>
+          <w:b/>
+        </w:rPr>
+        <w:t>⋮ (three dots)</w:t>
+      </w:r>
+      <w:r>
+        <w:t xml:space="preserve"> at the right-hand end of that row</w:t>
+      </w:r>
+    </w:p>
+    <w:p>
+      <w:pPr>
+        <w:pStyle w:val="ListNumber"/>
+      </w:pPr>
+      <w:r>
+        <w:t xml:space="preserve">Pick </w:t>
+      </w:r>
+      <w:r>
+        <w:rPr>
+          <w:b/>
+        </w:rPr>
+        <w:t>Clone</w:t>
+      </w:r>
+    </w:p>
+    <w:p>
+      <w:pPr>
+        <w:pStyle w:val="ListNumber"/>
+      </w:pPr>
+      <w:r>
+        <w:t>Strapi opens a new draft pre-filled with everything from the original — sections, images, style, links, the lot</w:t>
+      </w:r>
+    </w:p>
+    <w:p>
+      <w:pPr>
+        <w:pStyle w:val="ListNumber"/>
+      </w:pPr>
+      <w:r>
+        <w:t xml:space="preserve">Change the </w:t>
+      </w:r>
+      <w:r>
+        <w:rPr>
+          <w:b/>
+        </w:rPr>
+        <w:t>Title</w:t>
+      </w:r>
+      <w:r>
+        <w:t xml:space="preserve"> + </w:t>
+      </w:r>
+      <w:r>
+        <w:rPr>
+          <w:b/>
+        </w:rPr>
+        <w:t>Slug</w:t>
+      </w:r>
+      <w:r>
+        <w:t xml:space="preserve"> to something unique (otherwise the URL will clash with the original)</w:t>
+      </w:r>
+    </w:p>
+    <w:p>
+      <w:pPr>
+        <w:pStyle w:val="ListNumber"/>
+      </w:pPr>
+      <w:r>
+        <w:t>Tweak whatever's different (copy, hero image, sections you want to add or remove)</w:t>
+      </w:r>
+    </w:p>
+    <w:p>
+      <w:pPr>
+        <w:pStyle w:val="ListNumber"/>
+      </w:pPr>
+      <w:r>
+        <w:rPr>
+          <w:b/>
+        </w:rPr>
+        <w:t>Save</w:t>
+      </w:r>
+      <w:r>
+        <w:t xml:space="preserve"> → </w:t>
+      </w:r>
+      <w:r>
+        <w:rPr>
+          <w:b/>
+        </w:rPr>
+        <w:t>Publish</w:t>
+      </w:r>
+    </w:p>
+    <w:p>
+      <w:r>
+        <w:t>The clone goes live at its own URL. The original is untouched.</w:t>
+      </w:r>
+    </w:p>
+    <w:p>
+      <w:pPr>
+        <w:pStyle w:val="Heading4"/>
+      </w:pPr>
+      <w:r>
+        <w:t>When to use this</w:t>
+      </w:r>
+    </w:p>
+    <w:p>
+      <w:pPr>
+        <w:pStyle w:val="ListBullet"/>
+      </w:pPr>
+      <w:r>
+        <w:rPr>
+          <w:b/>
+        </w:rPr>
+        <w:t>New sales page for a different programme</w:t>
+      </w:r>
+      <w:r>
+        <w:t xml:space="preserve"> → clone REGULATED, swap the copy, change the buy-programme section's slug</w:t>
+      </w:r>
+    </w:p>
+    <w:p>
+      <w:pPr>
+        <w:pStyle w:val="ListBullet"/>
+      </w:pPr>
+      <w:r>
+        <w:rPr>
+          <w:b/>
+        </w:rPr>
+        <w:t>New retreat or workshop landing page</w:t>
+      </w:r>
+      <w:r>
+        <w:t xml:space="preserve"> → clone the closest existing one, change details</w:t>
+      </w:r>
+    </w:p>
+    <w:p>
+      <w:pPr>
+        <w:pStyle w:val="ListBullet"/>
+      </w:pPr>
+      <w:r>
+        <w:rPr>
+          <w:b/>
+        </w:rPr>
+        <w:t>Seasonal variant of an existing page</w:t>
+      </w:r>
+      <w:r>
+        <w:t xml:space="preserve"> ("Summer Reset Day" from an existing "Reset Day" template)</w:t>
+      </w:r>
+    </w:p>
+    <w:p>
+      <w:pPr>
+        <w:pStyle w:val="ListBullet"/>
+      </w:pPr>
+      <w:r>
+        <w:rPr>
+          <w:b/>
+        </w:rPr>
+        <w:t>A/B testing different page layouts</w:t>
+      </w:r>
+      <w:r>
+        <w:t xml:space="preserve"> → clone, edit one, see which feels better</w:t>
+      </w:r>
+    </w:p>
+    <w:p>
+      <w:pPr>
+        <w:pStyle w:val="Heading4"/>
+      </w:pPr>
+      <w:r>
+        <w:t>Adding the new page to a menu</w:t>
+      </w:r>
+    </w:p>
+    <w:p>
+      <w:r>
+        <w:t>After you've cloned and published a page, the URL exists but no menu item points to it yet. To add to nav:</w:t>
+      </w:r>
+    </w:p>
+    <w:p>
+      <w:pPr>
+        <w:pStyle w:val="ListNumber"/>
+      </w:pPr>
+      <w:r>
+        <w:t xml:space="preserve">CMS → </w:t>
+      </w:r>
+      <w:r>
+        <w:rPr>
+          <w:b/>
+        </w:rPr>
+        <w:t>Navigation</w:t>
+      </w:r>
+      <w:r>
+        <w:t xml:space="preserve"> singleton (in the sidebar list of single types)</w:t>
+      </w:r>
+    </w:p>
+    <w:p>
+      <w:pPr>
+        <w:pStyle w:val="ListNumber"/>
+      </w:pPr>
+      <w:r>
+        <w:t xml:space="preserve">Find the menu group you want to add to — e.g. "Work with Anna" or "About" — and scroll to its </w:t>
+      </w:r>
+      <w:r>
+        <w:rPr>
+          <w:b/>
+        </w:rPr>
+        <w:t>Children</w:t>
+      </w:r>
+      <w:r>
+        <w:t xml:space="preserve"> list</w:t>
+      </w:r>
+    </w:p>
+    <w:p>
+      <w:pPr>
+        <w:pStyle w:val="ListNumber"/>
+      </w:pPr>
+      <w:r>
+        <w:t xml:space="preserve">Click </w:t>
+      </w:r>
+      <w:r>
+        <w:rPr>
+          <w:b/>
+        </w:rPr>
+        <w:t>+ Add another to Children</w:t>
+      </w:r>
+    </w:p>
+    <w:p>
+      <w:pPr>
+        <w:pStyle w:val="ListNumber"/>
+      </w:pPr>
+      <w:r>
+        <w:t>Fill in:</w:t>
+      </w:r>
+    </w:p>
+    <w:p>
+      <w:r>
+        <w:t xml:space="preserve">   - </w:t>
+      </w:r>
+      <w:r>
+        <w:rPr>
+          <w:b/>
+        </w:rPr>
+        <w:t>Label</w:t>
+      </w:r>
+      <w:r>
+        <w:t xml:space="preserve"> — the text shown in the menu (e.g. "Houseboat Reset Day")</w:t>
+      </w:r>
+    </w:p>
+    <w:p>
+      <w:r>
+        <w:t xml:space="preserve">   - </w:t>
+      </w:r>
+      <w:r>
+        <w:rPr>
+          <w:b/>
+        </w:rPr>
+        <w:t>Href</w:t>
+      </w:r>
+      <w:r>
+        <w:t xml:space="preserve"> — the URL of your new page (e.g. </w:t>
+      </w:r>
+      <w:r>
+        <w:rPr>
+          <w:rFonts w:ascii="Consolas" w:hAnsi="Consolas"/>
+          <w:sz w:val="20"/>
+        </w:rPr>
+        <w:t>/p/houseboat-reset-day</w:t>
+      </w:r>
+      <w:r>
+        <w:t xml:space="preserve"> for a Page Builder page, or </w:t>
+      </w:r>
+      <w:r>
+        <w:rPr>
+          <w:rFonts w:ascii="Consolas" w:hAnsi="Consolas"/>
+          <w:sz w:val="20"/>
+        </w:rPr>
+        <w:t>/the-work/your-slug</w:t>
+      </w:r>
+      <w:r>
+        <w:t xml:space="preserve"> for a programme)</w:t>
+      </w:r>
+    </w:p>
+    <w:p>
+      <w:pPr>
+        <w:pStyle w:val="ListNumber"/>
+      </w:pPr>
+      <w:r>
+        <w:t>Drag the new item to where you want it in the order (within that menu group)</w:t>
+      </w:r>
+    </w:p>
+    <w:p>
+      <w:pPr>
+        <w:pStyle w:val="ListNumber"/>
+      </w:pPr>
+      <w:r>
+        <w:t>Save</w:t>
+      </w:r>
+    </w:p>
+    <w:p>
+      <w:r>
+        <w:t>Saves go live in 1–2 seconds. The menu updates everywhere on the site.</w:t>
+      </w:r>
+    </w:p>
+    <w:p>
+      <w:pPr>
+        <w:pStyle w:val="Heading3"/>
+      </w:pPr>
+      <w:r>
+        <w:t>16.22 Draft / Publish — your new safety net</w:t>
+      </w:r>
+    </w:p>
+    <w:p>
+      <w:r>
+        <w:t xml:space="preserve">Every page, programme, practitioner, testimonial, FAQ, and editorial entry in your CMS now has a </w:t>
+      </w:r>
+      <w:r>
+        <w:rPr>
+          <w:b/>
+        </w:rPr>
+        <w:t>draft mode</w:t>
+      </w:r>
+      <w:r>
+        <w:t>. Saving no longer makes the change live immediately.</w:t>
+      </w:r>
+    </w:p>
+    <w:p>
+      <w:pPr>
+        <w:pStyle w:val="Heading4"/>
+      </w:pPr>
+      <w:r>
+        <w:t>How it changes your flow</w:t>
+      </w:r>
+    </w:p>
+    <w:p>
+      <w:r>
+        <w:rPr>
+          <w:b/>
+        </w:rPr>
+        <w:t>Before</w:t>
+      </w:r>
+      <w:r>
+        <w:t xml:space="preserve"> (until 9 Jun 2026):</w:t>
+      </w:r>
+    </w:p>
+    <w:p>
+      <w:pPr>
+        <w:pStyle w:val="ListNumber"/>
+      </w:pPr>
+      <w:r>
+        <w:t>Edit a field → Save → live in 2 seconds. Mistake = mistake.</w:t>
+      </w:r>
+    </w:p>
+    <w:p>
+      <w:r>
+        <w:rPr>
+          <w:b/>
+        </w:rPr>
+        <w:t>Now</w:t>
+      </w:r>
+      <w:r>
+        <w:t>:</w:t>
+      </w:r>
+    </w:p>
+    <w:p>
+      <w:pPr>
+        <w:pStyle w:val="ListNumber"/>
+      </w:pPr>
+      <w:r>
+        <w:t xml:space="preserve">Edit a field → </w:t>
+      </w:r>
+      <w:r>
+        <w:rPr>
+          <w:b/>
+        </w:rPr>
+        <w:t>Save</w:t>
+      </w:r>
+      <w:r>
+        <w:t xml:space="preserve"> → the change is stored as a draft. </w:t>
+      </w:r>
+      <w:r>
+        <w:rPr>
+          <w:b/>
+        </w:rPr>
+        <w:t>Live site shows the previous version, untouched.</w:t>
+      </w:r>
+    </w:p>
+    <w:p>
+      <w:pPr>
+        <w:pStyle w:val="ListNumber"/>
+      </w:pPr>
+      <w:r>
+        <w:t xml:space="preserve">Open the live page in another tab (or use </w:t>
+      </w:r>
+      <w:r>
+        <w:rPr>
+          <w:b/>
+        </w:rPr>
+        <w:t>View Live page →</w:t>
+      </w:r>
+      <w:r>
+        <w:t xml:space="preserve"> button — see 16.23) to preview</w:t>
+      </w:r>
+    </w:p>
+    <w:p>
+      <w:pPr>
+        <w:pStyle w:val="ListNumber"/>
+      </w:pPr>
+      <w:r>
+        <w:t xml:space="preserve">When happy → </w:t>
+      </w:r>
+      <w:r>
+        <w:rPr>
+          <w:b/>
+        </w:rPr>
+        <w:t>Publish</w:t>
+      </w:r>
+      <w:r>
+        <w:t xml:space="preserve"> (blue button, top-right of the edit form). Live in 1–2 seconds.</w:t>
+      </w:r>
+    </w:p>
+    <w:p>
+      <w:pPr>
+        <w:pStyle w:val="Heading4"/>
+      </w:pPr>
+      <w:r>
+        <w:t>Reverting a mistake</w:t>
+      </w:r>
+    </w:p>
+    <w:p>
+      <w:r>
+        <w:t>You have three options:</w:t>
+      </w:r>
+    </w:p>
+    <w:p>
+      <w:pPr>
+        <w:pStyle w:val="ListNumber"/>
+      </w:pPr>
+      <w:r>
+        <w:rPr>
+          <w:b/>
+        </w:rPr>
+        <w:t>Discard changes</w:t>
+      </w:r>
+      <w:r>
+        <w:t xml:space="preserve"> (best) — top-right of the edit form, near Publish, there's a discard button. Wipes the draft back to whatever the live version says.</w:t>
+      </w:r>
+    </w:p>
+    <w:p>
+      <w:pPr>
+        <w:pStyle w:val="ListNumber"/>
+      </w:pPr>
+      <w:r>
+        <w:rPr>
+          <w:b/>
+        </w:rPr>
+        <w:t>Just don't publish</w:t>
+      </w:r>
+      <w:r>
+        <w:t xml:space="preserve"> — the draft sits there until you do something with it. Live site stays as it was.</w:t>
+      </w:r>
+    </w:p>
+    <w:p>
+      <w:pPr>
+        <w:pStyle w:val="ListNumber"/>
+      </w:pPr>
+      <w:r>
+        <w:rPr>
+          <w:b/>
+        </w:rPr>
+        <w:t>Edit it back</w:t>
+      </w:r>
+      <w:r>
+        <w:t xml:space="preserve"> — if you've already published a bad change, edit again to fix and re-publish. (For real disasters, Sameer can restore from the previous day's database backup — see 16.27.)</w:t>
+      </w:r>
+    </w:p>
+    <w:p>
+      <w:pPr>
+        <w:pStyle w:val="Heading4"/>
+      </w:pPr>
+      <w:r>
+        <w:t>What now requires a Publish tap</w:t>
+      </w:r>
+    </w:p>
+    <w:p>
+      <w:r>
+        <w:t>Anything in: Programmes, Practitioners, Testimonials, Articles, FAQ, all the page singletons (Homepage, About, Community, Reset Room, all section landing pages, Decoder, Quiz, all the shop pages), Experiences, Page Builder pages, Navigation, Footer.</w:t>
+      </w:r>
+    </w:p>
+    <w:p>
+      <w:r>
+        <w:t>What does NOT need Publish: Orders, Cart, Coupon entries, customer records, shop product catalogue (still live-on-save because these are transactional).</w:t>
+      </w:r>
+    </w:p>
+    <w:p>
+      <w:pPr>
+        <w:pStyle w:val="Heading4"/>
+      </w:pPr>
+      <w:r>
+        <w:t>Mobile-specific note</w:t>
+      </w:r>
+    </w:p>
+    <w:p>
+      <w:r>
+        <w:t>On your phone, the Publish button is at the top-right of the edit form. Sometimes it scrolls off-screen if the form is long — pinch to zoom out, or scroll up.</w:t>
+      </w:r>
+    </w:p>
+    <w:p>
+      <w:pPr>
+        <w:pStyle w:val="Heading3"/>
+      </w:pPr>
+      <w:r>
+        <w:t>16.23 View live page (one tap from any edit screen)</w:t>
+      </w:r>
+    </w:p>
+    <w:p>
+      <w:r>
+        <w:t xml:space="preserve">Every entry in your CMS now has a </w:t>
+      </w:r>
+      <w:r>
+        <w:rPr>
+          <w:b/>
+        </w:rPr>
+        <w:t>green "View live page →" button</w:t>
+      </w:r>
+      <w:r>
+        <w:t xml:space="preserve"> in the right sidebar.</w:t>
+      </w:r>
+    </w:p>
+    <w:p>
+      <w:pPr>
+        <w:pStyle w:val="Heading4"/>
+      </w:pPr>
+      <w:r>
+        <w:t>What it does</w:t>
+      </w:r>
+    </w:p>
+    <w:p>
+      <w:r>
+        <w:t>Tap the button → opens the page the entry powers in a new tab. For example:</w:t>
+      </w:r>
+    </w:p>
+    <w:p>
+      <w:pPr>
+        <w:pStyle w:val="ListBullet"/>
+      </w:pPr>
+      <w:r>
+        <w:t xml:space="preserve">Editing </w:t>
+      </w:r>
+      <w:r>
+        <w:rPr>
+          <w:b/>
+        </w:rPr>
+        <w:t>Homepage</w:t>
+      </w:r>
+      <w:r>
+        <w:t xml:space="preserve"> singleton → opens </w:t>
+      </w:r>
+      <w:r>
+        <w:rPr>
+          <w:rFonts w:ascii="Consolas" w:hAnsi="Consolas"/>
+          <w:sz w:val="20"/>
+        </w:rPr>
+        <w:t>https://annalouwellness.com/</w:t>
+      </w:r>
+    </w:p>
+    <w:p>
+      <w:pPr>
+        <w:pStyle w:val="ListBullet"/>
+      </w:pPr>
+      <w:r>
+        <w:t xml:space="preserve">Editing </w:t>
+      </w:r>
+      <w:r>
+        <w:rPr>
+          <w:b/>
+        </w:rPr>
+        <w:t>REGULATED</w:t>
+      </w:r>
+      <w:r>
+        <w:t xml:space="preserve"> programme → opens </w:t>
+      </w:r>
+      <w:r>
+        <w:rPr>
+          <w:rFonts w:ascii="Consolas" w:hAnsi="Consolas"/>
+          <w:sz w:val="20"/>
+        </w:rPr>
+        <w:t>https://annalouwellness.com/the-work/regulated</w:t>
+      </w:r>
+    </w:p>
+    <w:p>
+      <w:pPr>
+        <w:pStyle w:val="ListBullet"/>
+      </w:pPr>
+      <w:r>
+        <w:t xml:space="preserve">Editing </w:t>
+      </w:r>
+      <w:r>
+        <w:rPr>
+          <w:b/>
+        </w:rPr>
+        <w:t>Sarah Hughes</w:t>
+      </w:r>
+      <w:r>
+        <w:t xml:space="preserve"> practitioner → opens </w:t>
+      </w:r>
+      <w:r>
+        <w:rPr>
+          <w:rFonts w:ascii="Consolas" w:hAnsi="Consolas"/>
+          <w:sz w:val="20"/>
+        </w:rPr>
+        <w:t>https://annalouwellness.com/practitioners</w:t>
+      </w:r>
+    </w:p>
+    <w:p>
+      <w:r>
+        <w:t>Keep that tab open. Edit + save + publish in the CMS tab → swipe back to the live tab → pull to refresh → see your change in seconds.</w:t>
+      </w:r>
+    </w:p>
+    <w:p>
+      <w:pPr>
+        <w:pStyle w:val="Heading4"/>
+      </w:pPr>
+      <w:r>
+        <w:t>Mobile workflow</w:t>
+      </w:r>
+    </w:p>
+    <w:p>
+      <w:r>
+        <w:t>The Apple tab switcher (long-press the tab icon at the bottom of Safari) makes flipping between CMS and live page instant. Two-tab workflow &gt; side-by-side preview on a 6-inch screen.</w:t>
+      </w:r>
+    </w:p>
+    <w:p>
+      <w:pPr>
+        <w:pStyle w:val="Heading3"/>
+      </w:pPr>
+      <w:r>
+        <w:t>16.24 Quick Photo Editor — replace any hero image in 2 taps</w:t>
+      </w:r>
+    </w:p>
+    <w:p>
+      <w:r>
+        <w:t xml:space="preserve">New </w:t>
+      </w:r>
+      <w:r>
+        <w:rPr>
+          <w:b/>
+        </w:rPr>
+        <w:t>Quick Photos</w:t>
+      </w:r>
+      <w:r>
+        <w:t xml:space="preserve"> item in the CMS sidebar (camera icon). One page showing every hero / portrait / featured photo across your site as thumbnails.</w:t>
+      </w:r>
+    </w:p>
+    <w:p>
+      <w:pPr>
+        <w:pStyle w:val="Heading4"/>
+      </w:pPr>
+      <w:r>
+        <w:t>What it covers</w:t>
+      </w:r>
+    </w:p>
+    <w:p>
+      <w:pPr>
+        <w:pStyle w:val="ListBullet"/>
+      </w:pPr>
+      <w:r>
+        <w:t>Every singleton page hero (Homepage, About, Community, Reset Room, Testimonials, Practitioners, Reset Letters, Decoder, Experiences landing)</w:t>
+      </w:r>
+    </w:p>
+    <w:p>
+      <w:pPr>
+        <w:pStyle w:val="ListBullet"/>
+      </w:pPr>
+      <w:r>
+        <w:t>Every Programme hero</w:t>
+      </w:r>
+    </w:p>
+    <w:p>
+      <w:pPr>
+        <w:pStyle w:val="ListBullet"/>
+      </w:pPr>
+      <w:r>
+        <w:t>Every Experience event hero</w:t>
+      </w:r>
+    </w:p>
+    <w:p>
+      <w:pPr>
+        <w:pStyle w:val="ListBullet"/>
+      </w:pPr>
+      <w:r>
+        <w:t>Every Practitioner portrait</w:t>
+      </w:r>
+    </w:p>
+    <w:p>
+      <w:pPr>
+        <w:pStyle w:val="ListBullet"/>
+      </w:pPr>
+      <w:r>
+        <w:t>Every Testimonial photo</w:t>
+      </w:r>
+    </w:p>
+    <w:p>
+      <w:pPr>
+        <w:pStyle w:val="ListBullet"/>
+      </w:pPr>
+      <w:r>
+        <w:t>Every Page Builder page hero</w:t>
+      </w:r>
+    </w:p>
+    <w:p>
+      <w:r>
+        <w:t>If a hero is set, you see the thumbnail. If it's empty, you see "No image set."</w:t>
+      </w:r>
+    </w:p>
+    <w:p>
+      <w:pPr>
+        <w:pStyle w:val="Heading4"/>
+      </w:pPr>
+      <w:r>
+        <w:t>How to swap a photo</w:t>
+      </w:r>
+    </w:p>
+    <w:p>
+      <w:pPr>
+        <w:pStyle w:val="ListNumber"/>
+      </w:pPr>
+      <w:r>
+        <w:t xml:space="preserve">CMS → sidebar → </w:t>
+      </w:r>
+      <w:r>
+        <w:rPr>
+          <w:b/>
+        </w:rPr>
+        <w:t>Quick Photos</w:t>
+      </w:r>
+    </w:p>
+    <w:p>
+      <w:pPr>
+        <w:pStyle w:val="ListNumber"/>
+      </w:pPr>
+      <w:r>
+        <w:t>Find the thumbnail you want to replace</w:t>
+      </w:r>
+    </w:p>
+    <w:p>
+      <w:pPr>
+        <w:pStyle w:val="ListNumber"/>
+      </w:pPr>
+      <w:r>
+        <w:t xml:space="preserve">Tap </w:t>
+      </w:r>
+      <w:r>
+        <w:rPr>
+          <w:b/>
+        </w:rPr>
+        <w:t>Replace</w:t>
+      </w:r>
+      <w:r>
+        <w:t xml:space="preserve"> (or </w:t>
+      </w:r>
+      <w:r>
+        <w:rPr>
+          <w:b/>
+        </w:rPr>
+        <w:t>Upload</w:t>
+      </w:r>
+      <w:r>
+        <w:t xml:space="preserve"> if it's empty)</w:t>
+      </w:r>
+    </w:p>
+    <w:p>
+      <w:pPr>
+        <w:pStyle w:val="ListNumber"/>
+      </w:pPr>
+      <w:r>
+        <w:t>Pick a photo from your phone</w:t>
+      </w:r>
+    </w:p>
+    <w:p>
+      <w:pPr>
+        <w:pStyle w:val="ListNumber"/>
+      </w:pPr>
+      <w:r>
+        <w:t>~3-second upload → thumbnail updates in place</w:t>
+      </w:r>
+    </w:p>
+    <w:p>
+      <w:pPr>
+        <w:pStyle w:val="ListNumber"/>
+      </w:pPr>
+      <w:r>
+        <w:t xml:space="preserve">Open the entry (tap the entry name) and tap </w:t>
+      </w:r>
+      <w:r>
+        <w:rPr>
+          <w:b/>
+        </w:rPr>
+        <w:t>Publish</w:t>
+      </w:r>
+      <w:r>
+        <w:t xml:space="preserve"> to push the new photo live</w:t>
+      </w:r>
+    </w:p>
+    <w:p>
+      <w:r>
+        <w:t>That's 4 taps total (5 if you count Publish) vs ~10 taps the old way.</w:t>
+      </w:r>
+    </w:p>
+    <w:p>
+      <w:pPr>
+        <w:pStyle w:val="Heading4"/>
+      </w:pPr>
+      <w:r>
+        <w:t>Limitations</w:t>
+      </w:r>
+    </w:p>
+    <w:p>
+      <w:pPr>
+        <w:pStyle w:val="ListBullet"/>
+      </w:pPr>
+      <w:r>
+        <w:t xml:space="preserve">Quick Photos only shows the </w:t>
+      </w:r>
+      <w:r>
+        <w:rPr>
+          <w:b/>
+        </w:rPr>
+        <w:t>main hero/portrait</w:t>
+      </w:r>
+      <w:r>
+        <w:t xml:space="preserve"> field for each entry. If a page has multiple image fields (like Homepage has 4), they all appear as separate rows. But specialised fields (like a programme's "alternate image for retreats listing") aren't shown — for those, open the entry the normal way.</w:t>
+      </w:r>
+    </w:p>
+    <w:p>
+      <w:pPr>
+        <w:pStyle w:val="ListBullet"/>
+      </w:pPr>
+      <w:r>
+        <w:t xml:space="preserve">After replace, the change is a </w:t>
+      </w:r>
+      <w:r>
+        <w:rPr>
+          <w:b/>
+        </w:rPr>
+        <w:t>draft</w:t>
+      </w:r>
+      <w:r>
+        <w:t>. You still need to open the entry and tap Publish to make it live (the new safety net from 16.22 applies here too).</w:t>
+      </w:r>
+    </w:p>
+    <w:p>
+      <w:pPr>
+        <w:pStyle w:val="Heading3"/>
+      </w:pPr>
+      <w:r>
+        <w:t>16.25 iOS Shortcut for fastest photo uploads</w:t>
+      </w:r>
+    </w:p>
+    <w:p>
+      <w:r>
+        <w:t xml:space="preserve">The fastest possible mobile upload workflow: take a photo → tap Share → tap </w:t>
+      </w:r>
+      <w:r>
+        <w:rPr>
+          <w:b/>
+        </w:rPr>
+        <w:t>Upload to ALW CMS</w:t>
+      </w:r>
+      <w:r>
+        <w:t xml:space="preserve"> → done. ~5 seconds end-to-end.</w:t>
+      </w:r>
+    </w:p>
+    <w:p>
+      <w:r>
+        <w:t xml:space="preserve">Setup instructions for this live in </w:t>
+      </w:r>
+      <w:r>
+        <w:rPr>
+          <w:rFonts w:ascii="Consolas" w:hAnsi="Consolas"/>
+          <w:sz w:val="20"/>
+        </w:rPr>
+        <w:t>Docs/IOS_SHORTCUT_UPLOAD.md</w:t>
+      </w:r>
+      <w:r>
+        <w:t xml:space="preserve"> — Sameer will walk you through it once. After the one-time setup, every future upload is a one-tap operation from the iPhone share sheet.</w:t>
+      </w:r>
+    </w:p>
+    <w:p>
+      <w:r>
+        <w:t xml:space="preserve">This is a pure </w:t>
+      </w:r>
+      <w:r>
+        <w:rPr>
+          <w:b/>
+        </w:rPr>
+        <w:t>upload accelerator</w:t>
+      </w:r>
+      <w:r>
+        <w:t xml:space="preserve"> — it lands the photo in your Media Library. To then attach it to a specific page, use </w:t>
+      </w:r>
+      <w:r>
+        <w:rPr>
+          <w:b/>
+        </w:rPr>
+        <w:t>Quick Photos</w:t>
+      </w:r>
+      <w:r>
+        <w:t xml:space="preserve"> (16.24) or the normal edit-the-entry flow.</w:t>
+      </w:r>
+    </w:p>
+    <w:p>
+      <w:pPr>
+        <w:pStyle w:val="Heading3"/>
+      </w:pPr>
+      <w:r>
+        <w:t>16.26 Tap the image, not the field — the hidden Replace shortcut</w:t>
+      </w:r>
+    </w:p>
+    <w:p>
+      <w:r>
+        <w:t>When you're inside an entry's edit form (like editing the Homepage) and want to swap a photo that's already set:</w:t>
+      </w:r>
+    </w:p>
+    <w:p>
+      <w:r>
+        <w:t xml:space="preserve">❌ </w:t>
+      </w:r>
+      <w:r>
+        <w:rPr>
+          <w:b/>
+        </w:rPr>
+        <w:t>Don't</w:t>
+      </w:r>
+      <w:r>
+        <w:t xml:space="preserve"> tap the field name or label.</w:t>
+      </w:r>
+    </w:p>
+    <w:p>
+      <w:r>
+        <w:t xml:space="preserve">✅ </w:t>
+      </w:r>
+      <w:r>
+        <w:rPr>
+          <w:b/>
+        </w:rPr>
+        <w:t>DO</w:t>
+      </w:r>
+      <w:r>
+        <w:t xml:space="preserve"> tap the image thumbnail itself. A modal opens with a </w:t>
+      </w:r>
+      <w:r>
+        <w:rPr>
+          <w:b/>
+        </w:rPr>
+        <w:t>Replace media</w:t>
+      </w:r>
+      <w:r>
+        <w:t xml:space="preserve"> button — one tap, pick new photo, done.</w:t>
+      </w:r>
+    </w:p>
+    <w:p>
+      <w:r>
+        <w:t>Saves 2 taps every time.</w:t>
+      </w:r>
+    </w:p>
+    <w:p>
+      <w:pPr>
+        <w:pStyle w:val="Heading3"/>
+      </w:pPr>
+      <w:r>
+        <w:t>16.28 Customer accounts — one login for everything</w:t>
+      </w:r>
+    </w:p>
+    <w:p>
+      <w:r>
+        <w:t xml:space="preserve">Every customer who places an order automatically gets an account on the site. They use it to log in, see their order history, request returns, and access any course they buy. </w:t>
+      </w:r>
+      <w:r>
+        <w:rPr>
+          <w:b/>
+        </w:rPr>
+        <w:t>The same login works for the shop, the Reset Room, and any course or experience.</w:t>
+      </w:r>
+      <w:r>
+        <w:t xml:space="preserve"> One email, one password, everything.</w:t>
+      </w:r>
+    </w:p>
+    <w:p>
+      <w:r>
+        <w:rPr>
+          <w:b/>
+        </w:rPr>
+        <w:t>How accounts get created</w:t>
+      </w:r>
+    </w:p>
+    <w:p>
+      <w:pPr>
+        <w:pStyle w:val="ListBullet"/>
+      </w:pPr>
+      <w:r>
+        <w:t>A new customer places their first order (any payment method).</w:t>
+      </w:r>
+    </w:p>
+    <w:p>
+      <w:pPr>
+        <w:pStyle w:val="ListBullet"/>
+      </w:pPr>
+      <w:r>
+        <w:t>The site creates a user record silently with their email.</w:t>
+      </w:r>
+    </w:p>
+    <w:p>
+      <w:pPr>
+        <w:pStyle w:val="ListBullet"/>
+      </w:pPr>
+      <w:r>
+        <w:t>The customer receives a "Welcome — set your password" email with a one-time link.</w:t>
+      </w:r>
+    </w:p>
+    <w:p>
+      <w:pPr>
+        <w:pStyle w:val="ListBullet"/>
+      </w:pPr>
+      <w:r>
+        <w:t xml:space="preserve">They click the link → choose a password → land on </w:t>
+      </w:r>
+      <w:r>
+        <w:rPr>
+          <w:rFonts w:ascii="Consolas" w:hAnsi="Consolas"/>
+          <w:sz w:val="20"/>
+        </w:rPr>
+        <w:t>/account</w:t>
+      </w:r>
+      <w:r>
+        <w:t xml:space="preserve"> already signed in.</w:t>
+      </w:r>
+    </w:p>
+    <w:p>
+      <w:r>
+        <w:rPr>
+          <w:b/>
+        </w:rPr>
+        <w:t>Returning customers</w:t>
+      </w:r>
+    </w:p>
+    <w:p>
+      <w:pPr>
+        <w:pStyle w:val="ListBullet"/>
+      </w:pPr>
+      <w:r>
+        <w:t xml:space="preserve">They click the </w:t>
+      </w:r>
+      <w:r>
+        <w:rPr>
+          <w:b/>
+        </w:rPr>
+        <w:t>Login</w:t>
+      </w:r>
+      <w:r>
+        <w:t xml:space="preserve"> link in the top nav.</w:t>
+      </w:r>
+    </w:p>
+    <w:p>
+      <w:pPr>
+        <w:pStyle w:val="ListBullet"/>
+      </w:pPr>
+      <w:r>
+        <w:t xml:space="preserve">Sign in with email + password → land on </w:t>
+      </w:r>
+      <w:r>
+        <w:rPr>
+          <w:rFonts w:ascii="Consolas" w:hAnsi="Consolas"/>
+          <w:sz w:val="20"/>
+        </w:rPr>
+        <w:t>/account</w:t>
+      </w:r>
+      <w:r>
+        <w:t>.</w:t>
+      </w:r>
+    </w:p>
+    <w:p>
+      <w:pPr>
+        <w:pStyle w:val="ListBullet"/>
+      </w:pPr>
+      <w:r>
+        <w:t>See every order, click any to request a return, or jump straight to Reset Room / REGULATED if they have access.</w:t>
+      </w:r>
+    </w:p>
+    <w:p>
+      <w:r>
+        <w:rPr>
+          <w:b/>
+        </w:rPr>
+        <w:t>Forgot password?</w:t>
+      </w:r>
+    </w:p>
+    <w:p>
+      <w:pPr>
+        <w:pStyle w:val="ListBullet"/>
+      </w:pPr>
+      <w:r>
+        <w:t>On the sign-in page → "Forgot your password?" → enter email → get a fresh reset link.</w:t>
+      </w:r>
+    </w:p>
+    <w:p>
+      <w:r>
+        <w:rPr>
+          <w:b/>
+        </w:rPr>
+        <w:t>Where to manage users</w:t>
+      </w:r>
+    </w:p>
+    <w:p>
+      <w:pPr>
+        <w:pStyle w:val="ListBullet"/>
+      </w:pPr>
+      <w:r>
+        <w:t>Strapi → Users (top of left sidebar, under Content Manager).</w:t>
+      </w:r>
+    </w:p>
+    <w:p>
+      <w:pPr>
+        <w:pStyle w:val="ListBullet"/>
+      </w:pPr>
+      <w:r>
+        <w:t>Each user has email, name, role, and the flags that grant Reset Room or REGULATED access.</w:t>
+      </w:r>
+    </w:p>
+    <w:p>
+      <w:pPr>
+        <w:pStyle w:val="Heading3"/>
+      </w:pPr>
+      <w:r>
+        <w:t>16.29 Order lifecycle emails — automatic on every status change</w:t>
+      </w:r>
+    </w:p>
+    <w:p>
+      <w:r>
+        <w:t>Every order moves through statuses (paid → shipped → completed, or cancelled, or refunded). The system emails the customer automatically on every transition — you don't write any of these emails yourself.</w:t>
+      </w:r>
+    </w:p>
+    <w:p>
+      <w:r>
+        <w:rPr>
+          <w:b/>
+        </w:rPr>
+        <w:t>Full playbook</w:t>
+      </w:r>
+      <w:r>
+        <w:t xml:space="preserve"> for what each status does, what the customer sees, and what to fill in BEFORE saving lives in </w:t>
+      </w:r>
+      <w:r>
+        <w:rPr>
+          <w:rFonts w:ascii="Consolas" w:hAnsi="Consolas"/>
+          <w:sz w:val="20"/>
+        </w:rPr>
+        <w:t>Docs/ALW_Order_Playbook_For_Anna.docx</w:t>
+      </w:r>
+      <w:r>
+        <w:t>. Send Sameer for the file or open it in Word — it's the most important doc for day-to-day order operations.</w:t>
+      </w:r>
+    </w:p>
+    <w:p>
+      <w:r>
+        <w:rPr>
+          <w:b/>
+        </w:rPr>
+        <w:t>Quick reference</w:t>
+      </w:r>
+    </w:p>
+    <w:tbl>
+      <w:tblPr>
+        <w:tblStyle w:val="LightGrid-Accent1"/>
+        <w:tblW w:type="auto" w:w="0"/>
+        <w:tblLook w:firstColumn="1" w:firstRow="1" w:lastColumn="0" w:lastRow="0" w:noHBand="0" w:noVBand="1" w:val="04A0"/>
+      </w:tblPr>
+      <w:tblGrid>
+        <w:gridCol w:w="2880"/>
+        <w:gridCol w:w="2880"/>
+        <w:gridCol w:w="2880"/>
+      </w:tblGrid>
+      <w:tr>
+        <w:tc>
+          <w:tcPr>
+            <w:tcW w:type="dxa" w:w="2880"/>
+          </w:tcPr>
+          <w:p>
+            <w:r/>
+            <w:r>
+              <w:rPr>
+                <w:b/>
+              </w:rPr>
+              <w:t>Status change</w:t>
+            </w:r>
+          </w:p>
+        </w:tc>
+        <w:tc>
+          <w:tcPr>
+            <w:tcW w:type="dxa" w:w="2880"/>
+          </w:tcPr>
+          <w:p>
+            <w:r/>
+            <w:r>
+              <w:rPr>
+                <w:b/>
+              </w:rPr>
+              <w:t>Customer email</w:t>
+            </w:r>
+          </w:p>
+        </w:tc>
+        <w:tc>
+          <w:tcPr>
+            <w:tcW w:type="dxa" w:w="2880"/>
+          </w:tcPr>
+          <w:p>
+            <w:r/>
+            <w:r>
+              <w:rPr>
+                <w:b/>
+              </w:rPr>
+              <w:t>What you fill in first</w:t>
+            </w:r>
+          </w:p>
+        </w:tc>
+      </w:tr>
+      <w:tr>
+        <w:tc>
+          <w:tcPr>
+            <w:tcW w:type="dxa" w:w="2880"/>
+          </w:tcPr>
+          <w:p>
+            <w:r/>
+            <w:r>
+              <w:t>→ shipped</w:t>
+            </w:r>
+          </w:p>
+        </w:tc>
+        <w:tc>
+          <w:tcPr>
+            <w:tcW w:type="dxa" w:w="2880"/>
+          </w:tcPr>
+          <w:p>
+            <w:r/>
+            <w:r>
+              <w:t>"Your order is on its way" with tracking link</w:t>
+            </w:r>
+          </w:p>
+        </w:tc>
+        <w:tc>
+          <w:tcPr>
+            <w:tcW w:type="dxa" w:w="2880"/>
+          </w:tcPr>
+          <w:p>
+            <w:r/>
+            <w:r>
+              <w:t>tracking_number, tracking_url, shipping_carrier</w:t>
+            </w:r>
+          </w:p>
+        </w:tc>
+      </w:tr>
+      <w:tr>
+        <w:tc>
+          <w:tcPr>
+            <w:tcW w:type="dxa" w:w="2880"/>
+          </w:tcPr>
+          <w:p>
+            <w:r/>
+            <w:r>
+              <w:t>→ completed</w:t>
+            </w:r>
+          </w:p>
+        </w:tc>
+        <w:tc>
+          <w:tcPr>
+            <w:tcW w:type="dxa" w:w="2880"/>
+          </w:tcPr>
+          <w:p>
+            <w:r/>
+            <w:r>
+              <w:t>"Hope you are enjoying your order" + review request</w:t>
+            </w:r>
+          </w:p>
+        </w:tc>
+        <w:tc>
+          <w:tcPr>
+            <w:tcW w:type="dxa" w:w="2880"/>
+          </w:tcPr>
+          <w:p>
+            <w:r/>
+            <w:r>
+              <w:t>nothing</w:t>
+            </w:r>
+          </w:p>
+        </w:tc>
+      </w:tr>
+      <w:tr>
+        <w:tc>
+          <w:tcPr>
+            <w:tcW w:type="dxa" w:w="2880"/>
+          </w:tcPr>
+          <w:p>
+            <w:r/>
+            <w:r>
+              <w:t>→ cancelled</w:t>
+            </w:r>
+          </w:p>
+        </w:tc>
+        <w:tc>
+          <w:tcPr>
+            <w:tcW w:type="dxa" w:w="2880"/>
+          </w:tcPr>
+          <w:p>
+            <w:r/>
+            <w:r>
+              <w:t>"Your order has been cancelled" + reason</w:t>
+            </w:r>
+          </w:p>
+        </w:tc>
+        <w:tc>
+          <w:tcPr>
+            <w:tcW w:type="dxa" w:w="2880"/>
+          </w:tcPr>
+          <w:p>
+            <w:r/>
+            <w:r>
+              <w:t>cancellation_reason</w:t>
+            </w:r>
+          </w:p>
+        </w:tc>
+      </w:tr>
+      <w:tr>
+        <w:tc>
+          <w:tcPr>
+            <w:tcW w:type="dxa" w:w="2880"/>
+          </w:tcPr>
+          <w:p>
+            <w:r/>
+            <w:r>
+              <w:t>→ refunded</w:t>
+            </w:r>
+          </w:p>
+        </w:tc>
+        <w:tc>
+          <w:tcPr>
+            <w:tcW w:type="dxa" w:w="2880"/>
+          </w:tcPr>
+          <w:p>
+            <w:r/>
+            <w:r>
+              <w:t>"Your refund has been processed" + amount</w:t>
+            </w:r>
+          </w:p>
+        </w:tc>
+        <w:tc>
+          <w:tcPr>
+            <w:tcW w:type="dxa" w:w="2880"/>
+          </w:tcPr>
+          <w:p>
+            <w:r/>
+            <w:r>
+              <w:t>refund_amount (or leave blank for full refund)</w:t>
+            </w:r>
+          </w:p>
+        </w:tc>
+      </w:tr>
+    </w:tbl>
+    <w:p>
+      <w:r>
+        <w:rPr>
+          <w:b/>
+        </w:rPr>
+        <w:t>Editing email wording</w:t>
+      </w:r>
+    </w:p>
+    <w:p>
+      <w:r>
+        <w:t xml:space="preserve">Every email's subject + body is in Strapi → </w:t>
+      </w:r>
+      <w:r>
+        <w:rPr>
+          <w:b/>
+        </w:rPr>
+        <w:t>Email Template</w:t>
+      </w:r>
+      <w:r>
+        <w:t xml:space="preserve"> collection. 10 rows, one per email. You edit subject + intro + outro + button label. Merge tags like </w:t>
+      </w:r>
+      <w:r>
+        <w:rPr>
+          <w:rFonts w:ascii="Consolas" w:hAnsi="Consolas"/>
+          <w:sz w:val="20"/>
+        </w:rPr>
+        <w:t>{{order_number}}</w:t>
+      </w:r>
+      <w:r>
+        <w:t xml:space="preserve">, </w:t>
+      </w:r>
+      <w:r>
+        <w:rPr>
+          <w:rFonts w:ascii="Consolas" w:hAnsi="Consolas"/>
+          <w:sz w:val="20"/>
+        </w:rPr>
+        <w:t>{{customer_name}}</w:t>
+      </w:r>
+      <w:r>
+        <w:t xml:space="preserve">, </w:t>
+      </w:r>
+      <w:r>
+        <w:rPr>
+          <w:rFonts w:ascii="Consolas" w:hAnsi="Consolas"/>
+          <w:sz w:val="20"/>
+        </w:rPr>
+        <w:t>{{tracking_url}}</w:t>
+      </w:r>
+      <w:r>
+        <w:t xml:space="preserve"> get filled in at send time. Full list of merge tags is in the Order Playbook.</w:t>
+      </w:r>
+    </w:p>
+    <w:p>
+      <w:pPr>
+        <w:pStyle w:val="Heading3"/>
+      </w:pPr>
+      <w:r>
+        <w:t>16.30 Auto-refund via Stripe — change status, money goes back</w:t>
+      </w:r>
+    </w:p>
+    <w:p>
+      <w:r>
+        <w:t xml:space="preserve">The most important automation: </w:t>
+      </w:r>
+      <w:r>
+        <w:rPr>
+          <w:b/>
+        </w:rPr>
+        <w:t>changing an order's status to `refunded` fires the Stripe refund automatically.</w:t>
+      </w:r>
+      <w:r>
+        <w:t xml:space="preserve"> You don't open the Stripe dashboard. The money returns to the customer's card within minutes.</w:t>
+      </w:r>
+    </w:p>
+    <w:p>
+      <w:r>
+        <w:rPr>
+          <w:b/>
+        </w:rPr>
+        <w:t>Full refund</w:t>
+      </w:r>
+      <w:r>
+        <w:t xml:space="preserve">: leave </w:t>
+      </w:r>
+      <w:r>
+        <w:rPr>
+          <w:rFonts w:ascii="Consolas" w:hAnsi="Consolas"/>
+          <w:sz w:val="20"/>
+        </w:rPr>
+        <w:t>refund_amount</w:t>
+      </w:r>
+      <w:r>
+        <w:t xml:space="preserve"> blank → status → </w:t>
+      </w:r>
+      <w:r>
+        <w:rPr>
+          <w:rFonts w:ascii="Consolas" w:hAnsi="Consolas"/>
+          <w:sz w:val="20"/>
+        </w:rPr>
+        <w:t>refunded</w:t>
+      </w:r>
+      <w:r>
+        <w:t xml:space="preserve"> → save. Refunds the order total.</w:t>
+      </w:r>
+    </w:p>
+    <w:p>
+      <w:r>
+        <w:rPr>
+          <w:b/>
+        </w:rPr>
+        <w:t>Partial refund</w:t>
+      </w:r>
+      <w:r>
+        <w:t xml:space="preserve"> (customer keeps £40 of £100, refund £60): fill </w:t>
+      </w:r>
+      <w:r>
+        <w:rPr>
+          <w:rFonts w:ascii="Consolas" w:hAnsi="Consolas"/>
+          <w:sz w:val="20"/>
+        </w:rPr>
+        <w:t>refund_amount = 60.00</w:t>
+      </w:r>
+      <w:r>
+        <w:t xml:space="preserve"> → status → </w:t>
+      </w:r>
+      <w:r>
+        <w:rPr>
+          <w:rFonts w:ascii="Consolas" w:hAnsi="Consolas"/>
+          <w:sz w:val="20"/>
+        </w:rPr>
+        <w:t>refunded</w:t>
+      </w:r>
+      <w:r>
+        <w:t xml:space="preserve"> → save.</w:t>
+      </w:r>
+    </w:p>
+    <w:p>
+      <w:r>
+        <w:rPr>
+          <w:b/>
+        </w:rPr>
+        <w:t>Bank transfer refunds</w:t>
+      </w:r>
+      <w:r>
+        <w:t>: status change still fires the email but YOU send the money back via your bank (Stripe was never involved).</w:t>
+      </w:r>
+    </w:p>
+    <w:p>
+      <w:r>
+        <w:rPr>
+          <w:b/>
+        </w:rPr>
+        <w:t>Safety net</w:t>
+      </w:r>
+      <w:r>
+        <w:t xml:space="preserve">: once an order has </w:t>
+      </w:r>
+      <w:r>
+        <w:rPr>
+          <w:rFonts w:ascii="Consolas" w:hAnsi="Consolas"/>
+          <w:sz w:val="20"/>
+        </w:rPr>
+        <w:t>stripe_refund_id</w:t>
+      </w:r>
+      <w:r>
+        <w:t xml:space="preserve"> stamped, the system blocks double-refunds. If Stripe rejects the call (card expired, payment too old), you get an admin email with the error so you can handle it manually.</w:t>
+      </w:r>
+    </w:p>
+    <w:p>
+      <w:pPr>
+        <w:pStyle w:val="Heading3"/>
+      </w:pPr>
+      <w:r>
+        <w:t>16.31 Returns — customer-initiated from their account</w:t>
+      </w:r>
+    </w:p>
+    <w:p>
+      <w:r>
+        <w:t xml:space="preserve">Customers can request returns themselves from </w:t>
+      </w:r>
+      <w:r>
+        <w:rPr>
+          <w:rFonts w:ascii="Consolas" w:hAnsi="Consolas"/>
+          <w:sz w:val="20"/>
+        </w:rPr>
+        <w:t>/account</w:t>
+      </w:r>
+      <w:r>
+        <w:t xml:space="preserve"> → click "Request a return" next to any eligible order. They pick which items, the reason, optional notes.</w:t>
+      </w:r>
+    </w:p>
+    <w:p>
+      <w:r>
+        <w:rPr>
+          <w:b/>
+        </w:rPr>
+        <w:t>What you do when a return comes in</w:t>
+      </w:r>
+    </w:p>
+    <w:p>
+      <w:pPr>
+        <w:pStyle w:val="ListNumber"/>
+      </w:pPr>
+      <w:r>
+        <w:t>You get a "[Return requested]" admin email.</w:t>
+      </w:r>
+    </w:p>
+    <w:p>
+      <w:pPr>
+        <w:pStyle w:val="ListNumber"/>
+      </w:pPr>
+      <w:r>
+        <w:t xml:space="preserve">Open Strapi → </w:t>
+      </w:r>
+      <w:r>
+        <w:rPr>
+          <w:b/>
+        </w:rPr>
+        <w:t>Shop · Return Request</w:t>
+      </w:r>
+      <w:r>
+        <w:t xml:space="preserve"> → click the new entry.</w:t>
+      </w:r>
+    </w:p>
+    <w:p>
+      <w:pPr>
+        <w:pStyle w:val="ListNumber"/>
+      </w:pPr>
+      <w:r>
+        <w:t xml:space="preserve">Fill </w:t>
+      </w:r>
+      <w:r>
+        <w:rPr>
+          <w:rFonts w:ascii="Consolas" w:hAnsi="Consolas"/>
+          <w:sz w:val="20"/>
+        </w:rPr>
+        <w:t>notes</w:t>
+      </w:r>
+      <w:r>
+        <w:t xml:space="preserve"> with shipping instructions for the customer (where to send it, who pays postage).</w:t>
+      </w:r>
+    </w:p>
+    <w:p>
+      <w:pPr>
+        <w:pStyle w:val="ListNumber"/>
+      </w:pPr>
+      <w:r>
+        <w:t xml:space="preserve">Status → </w:t>
+      </w:r>
+      <w:r>
+        <w:rPr>
+          <w:rFonts w:ascii="Consolas" w:hAnsi="Consolas"/>
+          <w:sz w:val="20"/>
+        </w:rPr>
+        <w:t>approved</w:t>
+      </w:r>
+      <w:r>
+        <w:t xml:space="preserve"> → save. Customer gets the "Your return is approved — here's how to ship it back" email with your notes.</w:t>
+      </w:r>
+    </w:p>
+    <w:p>
+      <w:pPr>
+        <w:pStyle w:val="ListNumber"/>
+      </w:pPr>
+      <w:r>
+        <w:t xml:space="preserve">When items arrive: optional status → </w:t>
+      </w:r>
+      <w:r>
+        <w:rPr>
+          <w:rFonts w:ascii="Consolas" w:hAnsi="Consolas"/>
+          <w:sz w:val="20"/>
+        </w:rPr>
+        <w:t>received</w:t>
+      </w:r>
+      <w:r>
+        <w:t>.</w:t>
+      </w:r>
+    </w:p>
+    <w:p>
+      <w:pPr>
+        <w:pStyle w:val="ListNumber"/>
+      </w:pPr>
+      <w:r>
+        <w:t xml:space="preserve">Fill </w:t>
+      </w:r>
+      <w:r>
+        <w:rPr>
+          <w:rFonts w:ascii="Consolas" w:hAnsi="Consolas"/>
+          <w:sz w:val="20"/>
+        </w:rPr>
+        <w:t>refund_amount</w:t>
+      </w:r>
+      <w:r>
+        <w:t xml:space="preserve"> (you may keep an amount for return shipping) → status → </w:t>
+      </w:r>
+      <w:r>
+        <w:rPr>
+          <w:rFonts w:ascii="Consolas" w:hAnsi="Consolas"/>
+          <w:sz w:val="20"/>
+        </w:rPr>
+        <w:t>refunded</w:t>
+      </w:r>
+      <w:r>
+        <w:t xml:space="preserve"> → save.</w:t>
+      </w:r>
+    </w:p>
+    <w:p>
+      <w:pPr>
+        <w:pStyle w:val="ListNumber"/>
+      </w:pPr>
+      <w:r>
+        <w:t xml:space="preserve">Stripe refund fires automatically, customer gets the refund email, parent order flips to </w:t>
+      </w:r>
+      <w:r>
+        <w:rPr>
+          <w:rFonts w:ascii="Consolas" w:hAnsi="Consolas"/>
+          <w:sz w:val="20"/>
+        </w:rPr>
+        <w:t>refunded</w:t>
+      </w:r>
+      <w:r>
+        <w:t xml:space="preserve"> too.</w:t>
+      </w:r>
+    </w:p>
+    <w:p>
+      <w:r>
+        <w:t>Full step-by-step lives in the Order Playbook.</w:t>
+      </w:r>
+    </w:p>
+    <w:p>
+      <w:pPr>
+        <w:pStyle w:val="Heading3"/>
+      </w:pPr>
+      <w:r>
+        <w:t>16.32 Calendly bookings — paste a link, customer books without leaving your site</w:t>
+      </w:r>
+    </w:p>
+    <w:p>
+      <w:r>
+        <w:t xml:space="preserve">You can put any Calendly event-type URL into the booking field on programmes, experiences, or coaching sessions. When the customer clicks the "Book" button, Calendly opens </w:t>
+      </w:r>
+      <w:r>
+        <w:rPr>
+          <w:b/>
+        </w:rPr>
+        <w:t>as a popup right on your page</w:t>
+      </w:r>
+      <w:r>
+        <w:t xml:space="preserve"> — they pick a time, confirm, and Calendly emails them. They never leave annalouwellness.com.</w:t>
+      </w:r>
+    </w:p>
+    <w:p>
+      <w:r>
+        <w:rPr>
+          <w:b/>
+        </w:rPr>
+        <w:t>Steps</w:t>
+      </w:r>
+    </w:p>
+    <w:p>
+      <w:pPr>
+        <w:pStyle w:val="ListNumber"/>
+      </w:pPr>
+      <w:r>
+        <w:t>Log in to Calendly, create your event types (Discovery Call, Founder Reset Session, Speaking Enquiry, etc.).</w:t>
+      </w:r>
+    </w:p>
+    <w:p>
+      <w:pPr>
+        <w:pStyle w:val="ListNumber"/>
+      </w:pPr>
+      <w:r>
+        <w:t xml:space="preserve">Copy each event type's URL. Looks like </w:t>
+      </w:r>
+      <w:r>
+        <w:rPr>
+          <w:rFonts w:ascii="Consolas" w:hAnsi="Consolas"/>
+          <w:sz w:val="20"/>
+        </w:rPr>
+        <w:t>https://calendly.com/anna-annalouoflondon/discovery-call</w:t>
+      </w:r>
+      <w:r>
+        <w:t>.</w:t>
+      </w:r>
+    </w:p>
+    <w:p>
+      <w:pPr>
+        <w:pStyle w:val="ListNumber"/>
+      </w:pPr>
+      <w:r>
+        <w:t>In Strapi, paste the URL into:</w:t>
+      </w:r>
+    </w:p>
+    <w:p>
+      <w:r>
+        <w:t xml:space="preserve">   - </w:t>
+      </w:r>
+      <w:r>
+        <w:rPr>
+          <w:b/>
+        </w:rPr>
+        <w:t>Programme</w:t>
+      </w:r>
+      <w:r>
+        <w:t xml:space="preserve"> entries → </w:t>
+      </w:r>
+      <w:r>
+        <w:rPr>
+          <w:rFonts w:ascii="Consolas" w:hAnsi="Consolas"/>
+          <w:sz w:val="20"/>
+        </w:rPr>
+        <w:t>ctaUrl</w:t>
+      </w:r>
+      <w:r>
+        <w:t xml:space="preserve"> field (bottom CTA on the programme page)</w:t>
+      </w:r>
+    </w:p>
+    <w:p>
+      <w:r>
+        <w:t xml:space="preserve">   - </w:t>
+      </w:r>
+      <w:r>
+        <w:rPr>
+          <w:b/>
+        </w:rPr>
+        <w:t>Experience</w:t>
+      </w:r>
+      <w:r>
+        <w:t xml:space="preserve"> entries (workshops/retreats) → </w:t>
+      </w:r>
+      <w:r>
+        <w:rPr>
+          <w:rFonts w:ascii="Consolas" w:hAnsi="Consolas"/>
+          <w:sz w:val="20"/>
+        </w:rPr>
+        <w:t>booking_url</w:t>
+      </w:r>
+      <w:r>
+        <w:t xml:space="preserve"> field</w:t>
+      </w:r>
+    </w:p>
+    <w:p>
+      <w:r>
+        <w:t xml:space="preserve">   - </w:t>
+      </w:r>
+      <w:r>
+        <w:rPr>
+          <w:b/>
+        </w:rPr>
+        <w:t>Coaching Session</w:t>
+      </w:r>
+      <w:r>
+        <w:t xml:space="preserve"> entries → </w:t>
+      </w:r>
+      <w:r>
+        <w:rPr>
+          <w:rFonts w:ascii="Consolas" w:hAnsi="Consolas"/>
+          <w:sz w:val="20"/>
+        </w:rPr>
+        <w:t>booking_url</w:t>
+      </w:r>
+      <w:r>
+        <w:t xml:space="preserve"> field</w:t>
+      </w:r>
+    </w:p>
+    <w:p>
+      <w:pPr>
+        <w:pStyle w:val="ListNumber"/>
+      </w:pPr>
+      <w:r>
+        <w:t>Save. Done — the button on the live site now opens Calendly as a popup.</w:t>
+      </w:r>
+    </w:p>
+    <w:p>
+      <w:r>
+        <w:rPr>
+          <w:b/>
+        </w:rPr>
+        <w:t>It also still works for non-Calendly URLs.</w:t>
+      </w:r>
+      <w:r>
+        <w:t xml:space="preserve"> Stripe checkout links, internal pages like </w:t>
+      </w:r>
+      <w:r>
+        <w:rPr>
+          <w:rFonts w:ascii="Consolas" w:hAnsi="Consolas"/>
+          <w:sz w:val="20"/>
+        </w:rPr>
+        <w:t>/the-work/regulated</w:t>
+      </w:r>
+      <w:r>
+        <w:t>, or any external URL — paste them in the same field and they open the normal way (new tab or in-page). The system only triggers the popup when it detects a Calendly URL.</w:t>
+      </w:r>
+    </w:p>
+    <w:p>
+      <w:pPr>
+        <w:pStyle w:val="Heading3"/>
+      </w:pPr>
+      <w:r>
+        <w:t>16.33 What's coming next</w:t>
+      </w:r>
+    </w:p>
+    <w:p>
+      <w:r>
+        <w:t>The manual is now substantially complete for v1.4. Possible additions based on what comes up in real use:</w:t>
+      </w:r>
+    </w:p>
+    <w:p>
+      <w:pPr>
+        <w:pStyle w:val="ListBullet"/>
+      </w:pPr>
+      <w:r>
+        <w:t>Screenshots inside each section.</w:t>
+      </w:r>
+    </w:p>
+    <w:p>
+      <w:pPr>
+        <w:pStyle w:val="ListBullet"/>
+      </w:pPr>
+      <w:r>
+        <w:t>A 5-minute video walkthrough of the most-used edits.</w:t>
+      </w:r>
+    </w:p>
+    <w:p>
+      <w:pPr>
+        <w:pStyle w:val="ListBullet"/>
+      </w:pPr>
+      <w:r>
+        <w:t>A printable 1-page emergency cheatsheet for the launch day.</w:t>
       </w:r>
     </w:p>
     <w:p>

</xml_diff>

<commit_message>
User manual: add Stripe test card section for shop checkout testing
New sub-section under 16.13 (Shop products + categories) titled 'Testing a checkout end-to-end (staging only)'. Documents:

- The 4 Stripe test card numbers Anna can use on staging (happy path, declined, 3D Secure, refund-fails), with the universal expiry/CVC/postcode pattern
- What happens after a successful test order (thank-you page, 3 Resend emails, order in CMS, stock decrement)
- How to walk through the lifecycle (paid -> shipped -> completed -> refunded) to test each Resend email
- Note that going live swaps the same code from test mode to real payments without code changes -- Sameer handles the key swap

Previously this was only in dev-facing STRIPE_BUILD_NOTES.md so Anna had no way to test the shop without asking.

Docx regenerated.
</commit_message>
<xml_diff>
--- a/Docs/ANNA_USER_MANUAL.docx
+++ b/Docs/ANNA_USER_MANUAL.docx
@@ -19437,6 +19437,459 @@
       </w:r>
       <w:r>
         <w:t xml:space="preserve"> to the top-level category (e.g. "Jewellery") â†’ save. Appears under that parent in the dropdown.</w:t>
+      </w:r>
+    </w:p>
+    <w:p>
+      <w:pPr>
+        <w:pStyle w:val="Heading4"/>
+      </w:pPr>
+      <w:r>
+        <w:t>Testing a checkout end-to-end (staging only)</w:t>
+      </w:r>
+    </w:p>
+    <w:p>
+      <w:r>
+        <w:t>Stripe is currently in TEST MODE on staging. No real money moves. Use Stripe's official test card numbers in the checkout form — these only work on staging, and only in test mode.</w:t>
+      </w:r>
+    </w:p>
+    <w:tbl>
+      <w:tblPr>
+        <w:tblStyle w:val="LightGrid-Accent1"/>
+        <w:tblW w:type="auto" w:w="0"/>
+        <w:tblLook w:firstColumn="1" w:firstRow="1" w:lastColumn="0" w:lastRow="0" w:noHBand="0" w:noVBand="1" w:val="04A0"/>
+      </w:tblPr>
+      <w:tblGrid>
+        <w:gridCol w:w="2880"/>
+        <w:gridCol w:w="2880"/>
+        <w:gridCol w:w="2880"/>
+      </w:tblGrid>
+      <w:tr>
+        <w:tc>
+          <w:tcPr>
+            <w:tcW w:type="dxa" w:w="2880"/>
+          </w:tcPr>
+          <w:p>
+            <w:r/>
+            <w:r>
+              <w:rPr>
+                <w:b/>
+              </w:rPr>
+              <w:t>Card number</w:t>
+            </w:r>
+          </w:p>
+        </w:tc>
+        <w:tc>
+          <w:tcPr>
+            <w:tcW w:type="dxa" w:w="2880"/>
+          </w:tcPr>
+          <w:p>
+            <w:r/>
+            <w:r>
+              <w:rPr>
+                <w:b/>
+              </w:rPr>
+              <w:t>Behaviour</w:t>
+            </w:r>
+          </w:p>
+        </w:tc>
+        <w:tc>
+          <w:tcPr>
+            <w:tcW w:type="dxa" w:w="2880"/>
+          </w:tcPr>
+          <w:p>
+            <w:r/>
+            <w:r>
+              <w:rPr>
+                <w:b/>
+              </w:rPr>
+              <w:t>Use for</w:t>
+            </w:r>
+          </w:p>
+        </w:tc>
+      </w:tr>
+      <w:tr>
+        <w:tc>
+          <w:tcPr>
+            <w:tcW w:type="dxa" w:w="2880"/>
+          </w:tcPr>
+          <w:p>
+            <w:r/>
+            <w:r>
+              <w:t>4242 4242 4242 4242</w:t>
+            </w:r>
+          </w:p>
+        </w:tc>
+        <w:tc>
+          <w:tcPr>
+            <w:tcW w:type="dxa" w:w="2880"/>
+          </w:tcPr>
+          <w:p>
+            <w:r/>
+            <w:r>
+              <w:t>Always succeeds</w:t>
+            </w:r>
+          </w:p>
+        </w:tc>
+        <w:tc>
+          <w:tcPr>
+            <w:tcW w:type="dxa" w:w="2880"/>
+          </w:tcPr>
+          <w:p>
+            <w:r/>
+            <w:r>
+              <w:t>Normal checkout, see the full happy path: thank-you page → email → order in Strapi</w:t>
+            </w:r>
+          </w:p>
+        </w:tc>
+      </w:tr>
+      <w:tr>
+        <w:tc>
+          <w:tcPr>
+            <w:tcW w:type="dxa" w:w="2880"/>
+          </w:tcPr>
+          <w:p>
+            <w:r/>
+            <w:r>
+              <w:t>4000 0000 0000 9995</w:t>
+            </w:r>
+          </w:p>
+        </w:tc>
+        <w:tc>
+          <w:tcPr>
+            <w:tcW w:type="dxa" w:w="2880"/>
+          </w:tcPr>
+          <w:p>
+            <w:r/>
+            <w:r>
+              <w:t>Always fails (insufficient funds)</w:t>
+            </w:r>
+          </w:p>
+        </w:tc>
+        <w:tc>
+          <w:tcPr>
+            <w:tcW w:type="dxa" w:w="2880"/>
+          </w:tcPr>
+          <w:p>
+            <w:r/>
+            <w:r>
+              <w:t>See how a failed payment looks</w:t>
+            </w:r>
+          </w:p>
+        </w:tc>
+      </w:tr>
+      <w:tr>
+        <w:tc>
+          <w:tcPr>
+            <w:tcW w:type="dxa" w:w="2880"/>
+          </w:tcPr>
+          <w:p>
+            <w:r/>
+            <w:r>
+              <w:t>4000 0025 0000 3155</w:t>
+            </w:r>
+          </w:p>
+        </w:tc>
+        <w:tc>
+          <w:tcPr>
+            <w:tcW w:type="dxa" w:w="2880"/>
+          </w:tcPr>
+          <w:p>
+            <w:r/>
+            <w:r>
+              <w:t>Requires 3D Secure step-up</w:t>
+            </w:r>
+          </w:p>
+        </w:tc>
+        <w:tc>
+          <w:tcPr>
+            <w:tcW w:type="dxa" w:w="2880"/>
+          </w:tcPr>
+          <w:p>
+            <w:r/>
+            <w:r>
+              <w:t>See the bank-verification prompt mid-payment</w:t>
+            </w:r>
+          </w:p>
+        </w:tc>
+      </w:tr>
+      <w:tr>
+        <w:tc>
+          <w:tcPr>
+            <w:tcW w:type="dxa" w:w="2880"/>
+          </w:tcPr>
+          <w:p>
+            <w:r/>
+            <w:r>
+              <w:t>4000 0000 0000 0341</w:t>
+            </w:r>
+          </w:p>
+        </w:tc>
+        <w:tc>
+          <w:tcPr>
+            <w:tcW w:type="dxa" w:w="2880"/>
+          </w:tcPr>
+          <w:p>
+            <w:r/>
+            <w:r>
+              <w:t>Succeeds, then refund fails</w:t>
+            </w:r>
+          </w:p>
+        </w:tc>
+        <w:tc>
+          <w:tcPr>
+            <w:tcW w:type="dxa" w:w="2880"/>
+          </w:tcPr>
+          <w:p>
+            <w:r/>
+            <w:r>
+              <w:t>Test refund-error handling</w:t>
+            </w:r>
+          </w:p>
+        </w:tc>
+      </w:tr>
+    </w:tbl>
+    <w:p>
+      <w:r>
+        <w:t>For ALL test cards:</w:t>
+      </w:r>
+    </w:p>
+    <w:p>
+      <w:pPr>
+        <w:pStyle w:val="ListBullet"/>
+      </w:pPr>
+      <w:r>
+        <w:rPr>
+          <w:b/>
+        </w:rPr>
+        <w:t>Expiry:</w:t>
+      </w:r>
+      <w:r>
+        <w:t xml:space="preserve"> any future date (e.g. </w:t>
+      </w:r>
+      <w:r>
+        <w:rPr>
+          <w:rFonts w:ascii="Consolas" w:hAnsi="Consolas"/>
+          <w:sz w:val="20"/>
+        </w:rPr>
+        <w:t>12/34</w:t>
+      </w:r>
+      <w:r>
+        <w:t>)</w:t>
+      </w:r>
+    </w:p>
+    <w:p>
+      <w:pPr>
+        <w:pStyle w:val="ListBullet"/>
+      </w:pPr>
+      <w:r>
+        <w:rPr>
+          <w:b/>
+        </w:rPr>
+        <w:t>CVC:</w:t>
+      </w:r>
+      <w:r>
+        <w:t xml:space="preserve"> any 3 digits (e.g. </w:t>
+      </w:r>
+      <w:r>
+        <w:rPr>
+          <w:rFonts w:ascii="Consolas" w:hAnsi="Consolas"/>
+          <w:sz w:val="20"/>
+        </w:rPr>
+        <w:t>123</w:t>
+      </w:r>
+      <w:r>
+        <w:t>)</w:t>
+      </w:r>
+    </w:p>
+    <w:p>
+      <w:pPr>
+        <w:pStyle w:val="ListBullet"/>
+      </w:pPr>
+      <w:r>
+        <w:rPr>
+          <w:b/>
+        </w:rPr>
+        <w:t>Postcode:</w:t>
+      </w:r>
+      <w:r>
+        <w:t xml:space="preserve"> any UK postcode (e.g. </w:t>
+      </w:r>
+      <w:r>
+        <w:rPr>
+          <w:rFonts w:ascii="Consolas" w:hAnsi="Consolas"/>
+          <w:sz w:val="20"/>
+        </w:rPr>
+        <w:t>SW1A 1AA</w:t>
+      </w:r>
+      <w:r>
+        <w:t>)</w:t>
+      </w:r>
+    </w:p>
+    <w:p>
+      <w:pPr>
+        <w:pStyle w:val="ListBullet"/>
+      </w:pPr>
+      <w:r>
+        <w:rPr>
+          <w:b/>
+        </w:rPr>
+        <w:t>Cardholder name:</w:t>
+      </w:r>
+      <w:r>
+        <w:t xml:space="preserve"> anything</w:t>
+      </w:r>
+    </w:p>
+    <w:p>
+      <w:r>
+        <w:rPr>
+          <w:b/>
+        </w:rPr>
+        <w:t>After a successful test order:</w:t>
+      </w:r>
+    </w:p>
+    <w:p>
+      <w:pPr>
+        <w:pStyle w:val="ListNumber"/>
+      </w:pPr>
+      <w:r>
+        <w:t>The thank-you page appears within a few seconds.</w:t>
+      </w:r>
+    </w:p>
+    <w:p>
+      <w:pPr>
+        <w:pStyle w:val="ListNumber"/>
+      </w:pPr>
+      <w:r>
+        <w:t xml:space="preserve">Three emails fire: </w:t>
+      </w:r>
+      <w:r>
+        <w:rPr>
+          <w:rFonts w:ascii="Consolas" w:hAnsi="Consolas"/>
+          <w:sz w:val="20"/>
+        </w:rPr>
+        <w:t>order_paid</w:t>
+      </w:r>
+      <w:r>
+        <w:t xml:space="preserve"> to the customer, </w:t>
+      </w:r>
+      <w:r>
+        <w:rPr>
+          <w:rFonts w:ascii="Consolas" w:hAnsi="Consolas"/>
+          <w:sz w:val="20"/>
+        </w:rPr>
+        <w:t>shop_account_invite</w:t>
+      </w:r>
+      <w:r>
+        <w:t xml:space="preserve"> to a brand-new customer (first order on that email), </w:t>
+      </w:r>
+      <w:r>
+        <w:rPr>
+          <w:rFonts w:ascii="Consolas" w:hAnsi="Consolas"/>
+          <w:sz w:val="20"/>
+        </w:rPr>
+        <w:t>admin_new_order</w:t>
+      </w:r>
+      <w:r>
+        <w:t xml:space="preserve"> to </w:t>
+      </w:r>
+      <w:r>
+        <w:rPr>
+          <w:rFonts w:ascii="Consolas" w:hAnsi="Consolas"/>
+          <w:sz w:val="20"/>
+        </w:rPr>
+        <w:t>OWNER_EMAIL</w:t>
+      </w:r>
+      <w:r>
+        <w:t xml:space="preserve"> (currently sameer.vitkar@gmail.com — change to yours later).</w:t>
+      </w:r>
+    </w:p>
+    <w:p>
+      <w:pPr>
+        <w:pStyle w:val="ListNumber"/>
+      </w:pPr>
+      <w:r>
+        <w:t xml:space="preserve">The order shows up in CMS → </w:t>
+      </w:r>
+      <w:r>
+        <w:rPr>
+          <w:b/>
+        </w:rPr>
+        <w:t>Shop · Order</w:t>
+      </w:r>
+      <w:r>
+        <w:t xml:space="preserve"> with status </w:t>
+      </w:r>
+      <w:r>
+        <w:rPr>
+          <w:rFonts w:ascii="Consolas" w:hAnsi="Consolas"/>
+          <w:sz w:val="20"/>
+        </w:rPr>
+        <w:t>paid</w:t>
+      </w:r>
+      <w:r>
+        <w:t>. Stock decrements automatically.</w:t>
+      </w:r>
+    </w:p>
+    <w:p>
+      <w:r>
+        <w:rPr>
+          <w:b/>
+        </w:rPr>
+        <w:t>Test the lifecycle emails:</w:t>
+      </w:r>
+      <w:r>
+        <w:t xml:space="preserve"> open the order, change status </w:t>
+      </w:r>
+      <w:r>
+        <w:rPr>
+          <w:rFonts w:ascii="Consolas" w:hAnsi="Consolas"/>
+          <w:sz w:val="20"/>
+        </w:rPr>
+        <w:t>paid</w:t>
+      </w:r>
+      <w:r>
+        <w:t xml:space="preserve"> → </w:t>
+      </w:r>
+      <w:r>
+        <w:rPr>
+          <w:rFonts w:ascii="Consolas" w:hAnsi="Consolas"/>
+          <w:sz w:val="20"/>
+        </w:rPr>
+        <w:t>shipped</w:t>
+      </w:r>
+      <w:r>
+        <w:t xml:space="preserve"> → </w:t>
+      </w:r>
+      <w:r>
+        <w:rPr>
+          <w:rFonts w:ascii="Consolas" w:hAnsi="Consolas"/>
+          <w:sz w:val="20"/>
+        </w:rPr>
+        <w:t>completed</w:t>
+      </w:r>
+      <w:r>
+        <w:t xml:space="preserve"> → </w:t>
+      </w:r>
+      <w:r>
+        <w:rPr>
+          <w:rFonts w:ascii="Consolas" w:hAnsi="Consolas"/>
+          <w:sz w:val="20"/>
+        </w:rPr>
+        <w:t>refunded</w:t>
+      </w:r>
+      <w:r>
+        <w:t>, saving + publishing each transition. Each one triggers a different Resend email to the customer. A refund also auto-fires through Stripe (test charge gets reversed).</w:t>
+      </w:r>
+    </w:p>
+    <w:p>
+      <w:r>
+        <w:rPr>
+          <w:b/>
+        </w:rPr>
+        <w:t>Going live:</w:t>
+      </w:r>
+      <w:r>
+        <w:t xml:space="preserve"> once your real Stripe account is bank-verified and the live keys are set in Coolify env vars, the same code switches to real payments. The test cards stop working — you'd use real card numbers and real money would move. Sameer handles the live-key swap; you don't need to touch anything.</w:t>
       </w:r>
     </w:p>
     <w:p>

</xml_diff>

<commit_message>
Help · Ask: floating FAB + sidebar page that chat-answers Anna's CMS questions
- New /api/manual-help/ask Strapi endpoint loads bundled ANNA_USER_MANUAL.md,
  sends question + last 8 history msgs to Claude Haiku, returns answer.
- HelpFab: floating "💬 Ask" button bottom-right of every admin page, opens
  360x540 chat panel. Hidden on /auth/ login. Survives SPA route changes.
- ManualHelpPage: full-page version in sidebar (Help · Ask).
- System prompt enforces: cite section number, plain language, no em-dashes,
  refuse to invent CMS paths.
- One-shot bootstrap cleanup removes 4 orphan Life categories
  (Houseboat Life, Spiritual Hygiene, Decluttering, Educational) so Anna's
  Category dropdown only shows the 18 categories that match the live nav.
- Manual: 10-photo upload cap, type-to-search in Category picker tip,
  Help · Ask section in §17.18, FAB/sidebar discovery in §1.
</commit_message>
<xml_diff>
--- a/Docs/ANNA_USER_MANUAL.docx
+++ b/Docs/ANNA_USER_MANUAL.docx
@@ -1643,7 +1643,7 @@
     </w:p>
     <w:p>
       <w:r>
-        <w:t>Three sidebar items make life faster — use them often:</w:t>
+        <w:t>Five sidebar items make life faster — use them often:</w:t>
       </w:r>
     </w:p>
     <w:p>
@@ -1700,6 +1700,20 @@
       </w:r>
       <w:r>
         <w:t xml:space="preserve"> — every hero / portrait image across the site, with a one-tap Replace button. Skip navigating into each entry.</w:t>
+      </w:r>
+    </w:p>
+    <w:p>
+      <w:pPr>
+        <w:pStyle w:val="ListBullet"/>
+      </w:pPr>
+      <w:r>
+        <w:rPr>
+          <w:b/>
+        </w:rPr>
+        <w:t>Help · Ask</w:t>
+      </w:r>
+      <w:r>
+        <w:t xml:space="preserve"> — a chat box that answers any question about how to use the CMS by reading this manual for you. Type a question like "how do I add a cover image to a service?" or "why is my change not showing?" and it gives you the answer, the exact click path, and the section number to look up.</w:t>
       </w:r>
     </w:p>
     <w:p>
@@ -4906,6 +4920,20 @@
         <w:pStyle w:val="ListBullet"/>
       </w:pPr>
       <w:r>
+        <w:rPr>
+          <w:b/>
+        </w:rPr>
+        <w:t>Upload 10 photos at a time, not more.</w:t>
+      </w:r>
+      <w:r>
+        <w:t xml:space="preserve"> Bigger batches (20+) hit "Bad Gateway" / "Unexpected token 'B'" errors because each photo is rotated and pushed to Cloudinary one-by-one and the request times out. Ten at a time is the safe cap. Close the dialog after each batch, then drop the next 10 — the Media Library keeps you in the same folder so it's quick.</w:t>
+      </w:r>
+    </w:p>
+    <w:p>
+      <w:pPr>
+        <w:pStyle w:val="ListBullet"/>
+      </w:pPr>
+      <w:r>
         <w:t>Recommended image dimensions:</w:t>
       </w:r>
     </w:p>
@@ -5964,6 +5992,29 @@
       </w:pPr>
       <w:r>
         <w:t>Image upload failing</w:t>
+      </w:r>
+    </w:p>
+    <w:p>
+      <w:pPr>
+        <w:pStyle w:val="ListBullet"/>
+      </w:pPr>
+      <w:r>
+        <w:rPr>
+          <w:b/>
+        </w:rPr>
+        <w:t>"Bad Gateway" / "Unexpected token 'B'" errors when uploading lots of photos at once?</w:t>
+      </w:r>
+      <w:r>
+        <w:t xml:space="preserve"> You uploaded more than ~10 at a time. The server processes each photo (rotate + Cloudinary push) before the proxy gives up. </w:t>
+      </w:r>
+      <w:r>
+        <w:rPr>
+          <w:b/>
+        </w:rPr>
+        <w:t>Upload in batches of 10 max.</w:t>
+      </w:r>
+      <w:r>
+        <w:t xml:space="preserve"> Close the dialog, drop the next 10, repeat.</w:t>
       </w:r>
     </w:p>
     <w:p>
@@ -15525,6 +15576,86 @@
         <w:pStyle w:val="Heading3"/>
       </w:pPr>
       <w:r>
+        <w:t>16.10a Finding a Category in the Article picker (tip)</w:t>
+      </w:r>
+    </w:p>
+    <w:p>
+      <w:r>
+        <w:t xml:space="preserve">When you edit an Article, the </w:t>
+      </w:r>
+      <w:r>
+        <w:rPr>
+          <w:b/>
+        </w:rPr>
+        <w:t>Category</w:t>
+      </w:r>
+      <w:r>
+        <w:t xml:space="preserve"> dropdown shows every editorial category across all 4 sections (Reset Stories, Life, Love &amp; Relationships, Work &amp; Money) in one list. There are 18 in total so they don't all fit on screen at once.</w:t>
+      </w:r>
+    </w:p>
+    <w:p>
+      <w:r>
+        <w:rPr>
+          <w:b/>
+        </w:rPr>
+        <w:t>Fastest way to pick one:</w:t>
+      </w:r>
+    </w:p>
+    <w:p>
+      <w:pPr>
+        <w:pStyle w:val="ListBullet"/>
+      </w:pPr>
+      <w:r>
+        <w:t xml:space="preserve">Click the </w:t>
+      </w:r>
+      <w:r>
+        <w:rPr>
+          <w:b/>
+        </w:rPr>
+        <w:t>Category</w:t>
+      </w:r>
+      <w:r>
+        <w:t xml:space="preserve"> dropdown.</w:t>
+      </w:r>
+    </w:p>
+    <w:p>
+      <w:pPr>
+        <w:pStyle w:val="ListBullet"/>
+      </w:pPr>
+      <w:r>
+        <w:rPr>
+          <w:b/>
+        </w:rPr>
+        <w:t>Start typing</w:t>
+      </w:r>
+      <w:r>
+        <w:t xml:space="preserve"> the category name — e.g. type "found" and "Founder Reset" filters to the top.</w:t>
+      </w:r>
+    </w:p>
+    <w:p>
+      <w:pPr>
+        <w:pStyle w:val="ListBullet"/>
+      </w:pPr>
+      <w:r>
+        <w:t>Tap to select.</w:t>
+      </w:r>
+    </w:p>
+    <w:p>
+      <w:r>
+        <w:rPr>
+          <w:b/>
+        </w:rPr>
+        <w:t>Moving an article from one section to another:</w:t>
+      </w:r>
+      <w:r>
+        <w:t xml:space="preserve"> Just change the Category. The section (Work &amp; Money, Love &amp; Relationships, etc.) lives ON the category, not on the article — so swapping the category automatically moves the article into the new section, with the right nav colour and URL. No extra fields to update.</w:t>
+      </w:r>
+    </w:p>
+    <w:p>
+      <w:pPr>
+        <w:pStyle w:val="Heading3"/>
+      </w:pPr>
+      <w:r>
         <w:t>16.10 Articles (write, format, publish)</w:t>
       </w:r>
     </w:p>
@@ -27965,6 +28096,107 @@
       </w:r>
       <w:r>
         <w:t xml:space="preserve"> (lowercased, hyphens/underscores allowed).</w:t>
+      </w:r>
+    </w:p>
+    <w:p>
+      <w:pPr>
+        <w:pStyle w:val="Heading3"/>
+      </w:pPr>
+      <w:r>
+        <w:t>17.18 Help Â· Ask â€” chat your manual</w:t>
+      </w:r>
+    </w:p>
+    <w:p>
+      <w:r>
+        <w:t>Two ways to open it:</w:t>
+      </w:r>
+    </w:p>
+    <w:p>
+      <w:pPr>
+        <w:pStyle w:val="ListBullet"/>
+      </w:pPr>
+      <w:r>
+        <w:rPr>
+          <w:b/>
+        </w:rPr>
+        <w:t>Floating "Ask" button</w:t>
+      </w:r>
+      <w:r>
+        <w:t xml:space="preserve"> in the bottom-right corner of every CMS page (mobile and desktop). Tap it from anywhere â€” a chat panel slides open.</w:t>
+      </w:r>
+    </w:p>
+    <w:p>
+      <w:pPr>
+        <w:pStyle w:val="ListBullet"/>
+      </w:pPr>
+      <w:r>
+        <w:rPr>
+          <w:b/>
+        </w:rPr>
+        <w:t>Help Â· Ask</w:t>
+      </w:r>
+      <w:r>
+        <w:t xml:space="preserve"> in the left sidebar â€” full-page version if you prefer a wider chat area.</w:t>
+      </w:r>
+    </w:p>
+    <w:p>
+      <w:r>
+        <w:t>It reads this whole manual and answers any question you have about the CMS.</w:t>
+      </w:r>
+    </w:p>
+    <w:p>
+      <w:r>
+        <w:t>Examples that work well:</w:t>
+      </w:r>
+    </w:p>
+    <w:p>
+      <w:pPr>
+        <w:pStyle w:val="ListBullet"/>
+      </w:pPr>
+      <w:r>
+        <w:t>"How do I add a cover image to a service?"</w:t>
+      </w:r>
+    </w:p>
+    <w:p>
+      <w:pPr>
+        <w:pStyle w:val="ListBullet"/>
+      </w:pPr>
+      <w:r>
+        <w:t>"How do I publish a draft article?"</w:t>
+      </w:r>
+    </w:p>
+    <w:p>
+      <w:pPr>
+        <w:pStyle w:val="ListBullet"/>
+      </w:pPr>
+      <w:r>
+        <w:t>"Why is my change not showing on the website?"</w:t>
+      </w:r>
+    </w:p>
+    <w:p>
+      <w:pPr>
+        <w:pStyle w:val="ListBullet"/>
+      </w:pPr>
+      <w:r>
+        <w:t>"How do I upload many photos at once?"</w:t>
+      </w:r>
+    </w:p>
+    <w:p>
+      <w:pPr>
+        <w:pStyle w:val="ListBullet"/>
+      </w:pPr>
+      <w:r>
+        <w:t>"Where do I change the homepage hero?"</w:t>
+      </w:r>
+    </w:p>
+    <w:p>
+      <w:r>
+        <w:t>Every answer cites the section number from this manual (e.g. "See Â§16.7 Programme pages") so you can scroll the source if you want more context. If the manual doesnâ€™t cover something, it will say so and tell you to WhatsApp Sameer â€” it never makes up CMS paths.</w:t>
+      </w:r>
+    </w:p>
+    <w:p>
+      <w:r>
+        <w:t>Open it anytime from the left sidebar of the CMS. Type your question, press Enter. Itâ€™s yours alone (each chat is private to your login) and free to use as much as you need.</w:t>
       </w:r>
     </w:p>
     <w:p>

</xml_diff>

<commit_message>
Articles: add additional_categories many-to-many for cross-listing
- Article schema gains additional_categories (manyToMany → article-category);
  ArticleCategory gains inverse additional_articles. Primary category stays
  unchanged — it still drives URL + breadcrumb. Non-destructive add only,
  no existing data migrated or column changed.
- Anna can now tick N extra categories per article. The piece appears on
  every section/category feed it has been tagged into without changing its
  canonical URL.
- web/src/lib/cms.ts: getArticles({section}) + getArticlesByCategorySlug
  now use filters[$or] so primary OR additional matches surface.
- Article lifecycle pathsForArticle: also revalidates every
  section + section/category-slug pair from additional_categories so
  cross-listed articles appear immediately after save.
- Manual: §16.10a — explains primary vs additional with a worked example.
</commit_message>
<xml_diff>
--- a/Docs/ANNA_USER_MANUAL.docx
+++ b/Docs/ANNA_USER_MANUAL.docx
@@ -15649,6 +15649,36 @@
       </w:r>
       <w:r>
         <w:t xml:space="preserve"> Just change the Category. The section (Work &amp; Money, Love &amp; Relationships, etc.) lives ON the category, not on the article — so swapping the category automatically moves the article into the new section, with the right nav colour and URL. No extra fields to update.</w:t>
+      </w:r>
+    </w:p>
+    <w:p>
+      <w:r>
+        <w:rPr>
+          <w:b/>
+        </w:rPr>
+        <w:t>Putting one article in multiple categories:</w:t>
+      </w:r>
+      <w:r>
+        <w:t xml:space="preserve"> Use the </w:t>
+      </w:r>
+      <w:r>
+        <w:rPr>
+          <w:b/>
+        </w:rPr>
+        <w:t>Additional categories</w:t>
+      </w:r>
+      <w:r>
+        <w:t xml:space="preserve"> field (right below the main Category dropdown). Pick the primary category in the top field — that one sets the URL and breadcrumb — then tick any number of EXTRA categories below. The article appears on the primary section/category page AND on every additional section/category page you tagged. Example: a piece primarily about "Career and Direction" that's also relevant to "Burnout and Nervous System" — set Career as primary, add Burnout in Additional. It shows on both feeds, but the URL stays </w:t>
+      </w:r>
+      <w:r>
+        <w:rPr>
+          <w:rFonts w:ascii="Consolas" w:hAnsi="Consolas"/>
+          <w:sz w:val="20"/>
+        </w:rPr>
+        <w:t>/work-and-money/career-and-direction/...</w:t>
+      </w:r>
+      <w:r>
+        <w:t>.</w:t>
       </w:r>
     </w:p>
     <w:p>

</xml_diff>

<commit_message>
Uploads: 100MB cap + log every compression result, manual reflects auto-compress
- plugins.js: bump sizeLimit 50MB -> 100MB so iPhone Pro RAW (~70MB) and
  short MP4s upload without hitting the hard cap. Image-resize middleware
  already compresses everything to 2400px wide @ q82 post-upload, so
  storage stays small.
- image-resize.js: log "filename: 30.2MB -> 0.48MB (-98%)" on each upload
  so we can see in Coolify logs whether Anna's uploads are flowing.
- Manual: strip the misleading "compress at squoosh first" advice from
  sections 10 + 13. Replace with the truth — drop any size, the server
  compresses. Add a "validation errors banner" troubleshooting entry
  covering the shop_tag image-required and product name/price-required
  cases. Add "image uploaded but not showing" three-step diagnostic
  (uploaded via library not field, file size, v5 UI render quirk).
- Manual: clarify Substack canonical URL auto-fills on RSS pull,
  only needs manual paste for CMS-first articles.
</commit_message>
<xml_diff>
--- a/Docs/ANNA_USER_MANUAL.docx
+++ b/Docs/ANNA_USER_MANUAL.docx
@@ -4896,7 +4896,7 @@
         <w:pStyle w:val="ListBullet"/>
       </w:pPr>
       <w:r>
-        <w:t>Image formats: JPG, PNG, WebP, GIF, SVG</w:t>
+        <w:t>File formats: JPG, PNG, WebP, GIF, SVG, HEIC (iPhone photos â€” converted to JPG automatically)</w:t>
       </w:r>
     </w:p>
     <w:p>
@@ -4912,7 +4912,22 @@
         <w:pStyle w:val="ListBullet"/>
       </w:pPr>
       <w:r>
-        <w:t>Max file size: 10 MB per file</w:t>
+        <w:t xml:space="preserve">Max file size: </w:t>
+      </w:r>
+      <w:r>
+        <w:rPr>
+          <w:b/>
+        </w:rPr>
+        <w:t>100 MB per file</w:t>
+      </w:r>
+      <w:r>
+        <w:t xml:space="preserve">. The server automatically compresses every photo to 2400 px wide at high quality on upload â€” so you can drop a 30 MB iPhone Pro photo and it lands as ~500 KB. </w:t>
+      </w:r>
+      <w:r>
+        <w:rPr>
+          <w:b/>
+        </w:rPr>
+        <w:t>You do not need to compress images before uploading.</w:t>
       </w:r>
     </w:p>
     <w:p>
@@ -4926,7 +4941,7 @@
         <w:t>Upload 10 photos at a time, not more.</w:t>
       </w:r>
       <w:r>
-        <w:t xml:space="preserve"> Bigger batches (20+) hit "Bad Gateway" / "Unexpected token 'B'" errors because each photo is rotated and pushed to Cloudinary one-by-one and the request times out. Ten at a time is the safe cap. Close the dialog after each batch, then drop the next 10 — the Media Library keeps you in the same folder so it's quick.</w:t>
+        <w:t xml:space="preserve"> Bigger batches (20+) hit "Bad Gateway" errors because each photo is processed one-by-one and the request times out. Ten at a time is the safe cap. Close the dialog after each batch, then drop the next 10 â€” the Media Library keeps you in the same folder so it's quick.</w:t>
       </w:r>
     </w:p>
     <w:p>
@@ -6005,7 +6020,7 @@
         <w:t>"Bad Gateway" / "Unexpected token 'B'" errors when uploading lots of photos at once?</w:t>
       </w:r>
       <w:r>
-        <w:t xml:space="preserve"> You uploaded more than ~10 at a time. The server processes each photo (rotate + Cloudinary push) before the proxy gives up. </w:t>
+        <w:t xml:space="preserve"> You uploaded more than ~10 at a time. The server processes each photo (rotate + compress + Cloudinary push) one-by-one and the request times out beyond ~10. </w:t>
       </w:r>
       <w:r>
         <w:rPr>
@@ -6022,7 +6037,13 @@
         <w:pStyle w:val="ListBullet"/>
       </w:pPr>
       <w:r>
-        <w:t>File too big? Compress with something like Squoosh.app first.</w:t>
+        <w:rPr>
+          <w:b/>
+        </w:rPr>
+        <w:t>File over 100 MB?</w:t>
+      </w:r>
+      <w:r>
+        <w:t xml:space="preserve"> That's the hard cap. Genuinely huge files (RAW exports, long videos) won't fit. For videos, upload to YouTube or Vimeo and embed instead.</w:t>
       </w:r>
     </w:p>
     <w:p>
@@ -6030,7 +6051,13 @@
         <w:pStyle w:val="ListBullet"/>
       </w:pPr>
       <w:r>
-        <w:t>Wrong format? Stick to JPG/PNG/WebP/SVG.</w:t>
+        <w:rPr>
+          <w:b/>
+        </w:rPr>
+        <w:t>Wrong format?</w:t>
+      </w:r>
+      <w:r>
+        <w:t xml:space="preserve"> Stick to JPG / PNG / WebP / SVG / HEIC for images, PDF / MP4 / MP3 for documents and media.</w:t>
       </w:r>
     </w:p>
     <w:p>
@@ -6038,7 +6065,13 @@
         <w:pStyle w:val="ListBullet"/>
       </w:pPr>
       <w:r>
-        <w:t>Try again after a minute (sometimes Cloudinary is slow).</w:t>
+        <w:rPr>
+          <w:b/>
+        </w:rPr>
+        <w:t>Image processing failure</w:t>
+      </w:r>
+      <w:r>
+        <w:t xml:space="preserve"> (rare): try uploading the file again. The server compresses on receipt â€” if Sharp crashes on a corrupt file, retrying usually works. If not, open the file in any photo editor and "Save as JPG" to clean the file headers.</w:t>
       </w:r>
     </w:p>
     <w:p>
@@ -6054,12 +6087,297 @@
         <w:pStyle w:val="Heading3"/>
       </w:pPr>
       <w:r>
+        <w:t>"There are validation errors in your document. Please fix them before saving."</w:t>
+      </w:r>
+    </w:p>
+    <w:p>
+      <w:r>
+        <w:t>Strapi shows this generic banner when ANY required field is empty or invalid. It does not tell you which field. Scroll the whole page slowly â€” the broken field has a red border + a small red error message underneath.</w:t>
+      </w:r>
+    </w:p>
+    <w:p>
+      <w:r>
+        <w:rPr>
+          <w:b/>
+        </w:rPr>
+        <w:t>Common culprits on Articles:</w:t>
+      </w:r>
+    </w:p>
+    <w:p>
+      <w:pPr>
+        <w:pStyle w:val="ListBullet"/>
+      </w:pPr>
+      <w:r>
+        <w:t xml:space="preserve">A </w:t>
+      </w:r>
+      <w:r>
+        <w:rPr>
+          <w:b/>
+        </w:rPr>
+        <w:t>Shop tags</w:t>
+      </w:r>
+      <w:r>
+        <w:t xml:space="preserve"> row was added but no image is attached. Either attach an image to the row, or delete the empty row using the trash icon on the right.</w:t>
+      </w:r>
+    </w:p>
+    <w:p>
+      <w:pPr>
+        <w:pStyle w:val="ListBullet"/>
+      </w:pPr>
+      <w:r>
+        <w:rPr>
+          <w:rFonts w:ascii="Consolas" w:hAnsi="Consolas"/>
+          <w:sz w:val="20"/>
+        </w:rPr>
+        <w:t>title</w:t>
+      </w:r>
+      <w:r>
+        <w:t xml:space="preserve"> or </w:t>
+      </w:r>
+      <w:r>
+        <w:rPr>
+          <w:rFonts w:ascii="Consolas" w:hAnsi="Consolas"/>
+          <w:sz w:val="20"/>
+        </w:rPr>
+        <w:t>slug</w:t>
+      </w:r>
+      <w:r>
+        <w:t xml:space="preserve"> is blank. Slug auto-fills from title, so make sure title is set first.</w:t>
+      </w:r>
+    </w:p>
+    <w:p>
+      <w:r>
+        <w:rPr>
+          <w:b/>
+        </w:rPr>
+        <w:t>Common culprits on Shop products:</w:t>
+      </w:r>
+    </w:p>
+    <w:p>
+      <w:pPr>
+        <w:pStyle w:val="ListBullet"/>
+      </w:pPr>
+      <w:r>
+        <w:rPr>
+          <w:rFonts w:ascii="Consolas" w:hAnsi="Consolas"/>
+          <w:sz w:val="20"/>
+        </w:rPr>
+        <w:t>name</w:t>
+      </w:r>
+      <w:r>
+        <w:t xml:space="preserve">, </w:t>
+      </w:r>
+      <w:r>
+        <w:rPr>
+          <w:rFonts w:ascii="Consolas" w:hAnsi="Consolas"/>
+          <w:sz w:val="20"/>
+        </w:rPr>
+        <w:t>slug</w:t>
+      </w:r>
+      <w:r>
+        <w:t xml:space="preserve">, or </w:t>
+      </w:r>
+      <w:r>
+        <w:rPr>
+          <w:rFonts w:ascii="Consolas" w:hAnsi="Consolas"/>
+          <w:sz w:val="20"/>
+        </w:rPr>
+        <w:t>price</w:t>
+      </w:r>
+      <w:r>
+        <w:t xml:space="preserve"> is blank â€” these are the only three required fields. Everything else is optional.</w:t>
+      </w:r>
+    </w:p>
+    <w:p>
+      <w:r>
+        <w:rPr>
+          <w:b/>
+        </w:rPr>
+        <w:t>Common culprits on Programmes / Experiences / Pages:</w:t>
+      </w:r>
+    </w:p>
+    <w:p>
+      <w:pPr>
+        <w:pStyle w:val="ListBullet"/>
+      </w:pPr>
+      <w:r>
+        <w:rPr>
+          <w:rFonts w:ascii="Consolas" w:hAnsi="Consolas"/>
+          <w:sz w:val="20"/>
+        </w:rPr>
+        <w:t>title</w:t>
+      </w:r>
+      <w:r>
+        <w:t xml:space="preserve"> or </w:t>
+      </w:r>
+      <w:r>
+        <w:rPr>
+          <w:rFonts w:ascii="Consolas" w:hAnsi="Consolas"/>
+          <w:sz w:val="20"/>
+        </w:rPr>
+        <w:t>slug</w:t>
+      </w:r>
+      <w:r>
+        <w:t xml:space="preserve"> blank.</w:t>
+      </w:r>
+    </w:p>
+    <w:p>
+      <w:pPr>
+        <w:pStyle w:val="ListBullet"/>
+      </w:pPr>
+      <w:r>
+        <w:t>Required component fields â€” e.g. a "Section" row inside a Page Builder block that needs at least one item.</w:t>
+      </w:r>
+    </w:p>
+    <w:p>
+      <w:r>
+        <w:rPr>
+          <w:b/>
+        </w:rPr>
+        <w:t>Trick to find it fast:</w:t>
+      </w:r>
+      <w:r>
+        <w:t xml:space="preserve"> open the in-CMS </w:t>
+      </w:r>
+      <w:r>
+        <w:rPr>
+          <w:b/>
+        </w:rPr>
+        <w:t>Help Â· Ask</w:t>
+      </w:r>
+      <w:r>
+        <w:t xml:space="preserve"> chat (bottom-right) and type "validation error" + which page you're editing â€” it can usually point you at the field.</w:t>
+      </w:r>
+    </w:p>
+    <w:p>
+      <w:pPr>
+        <w:pStyle w:val="Heading3"/>
+      </w:pPr>
+      <w:r>
         <w:t>"Save" button greyed out</w:t>
       </w:r>
     </w:p>
     <w:p>
       <w:r>
         <w:t>You probably have a required field empty. Look for red borders or asterisks. Fill them in.</w:t>
+      </w:r>
+    </w:p>
+    <w:p>
+      <w:pPr>
+        <w:pStyle w:val="Heading3"/>
+      </w:pPr>
+      <w:r>
+        <w:t>Image uploaded but not showing in the field</w:t>
+      </w:r>
+    </w:p>
+    <w:p>
+      <w:r>
+        <w:t>Three things to check, in order:</w:t>
+      </w:r>
+    </w:p>
+    <w:p>
+      <w:pPr>
+        <w:pStyle w:val="ListNumber"/>
+      </w:pPr>
+      <w:r>
+        <w:rPr>
+          <w:b/>
+        </w:rPr>
+        <w:t>Did you upload from INSIDE the field, or via the sidebar Media Library?</w:t>
+      </w:r>
+      <w:r>
+        <w:t xml:space="preserve"> The image field needs you to click the image slot on the row, then "Add new assets", upload, tick the file, "Finish". If you uploaded via the sidebar Media Library separately, the file is in the library but </w:t>
+      </w:r>
+      <w:r>
+        <w:rPr>
+          <w:b/>
+        </w:rPr>
+        <w:t>not linked to the field</w:t>
+      </w:r>
+      <w:r>
+        <w:t>. Go back to the row â†’ click the slot â†’ Browse tab â†’ find the file â†’ tick it.</w:t>
+      </w:r>
+    </w:p>
+    <w:p>
+      <w:pPr>
+        <w:pStyle w:val="ListNumber"/>
+      </w:pPr>
+      <w:r>
+        <w:rPr>
+          <w:b/>
+        </w:rPr>
+        <w:t>File size.</w:t>
+      </w:r>
+      <w:r>
+        <w:t xml:space="preserve"> Over </w:t>
+      </w:r>
+      <w:r>
+        <w:rPr>
+          <w:b/>
+        </w:rPr>
+        <w:t>10 MB</w:t>
+      </w:r>
+      <w:r>
+        <w:t>, Strapi accepts the upload start but silently fails. iPhone photos are usually fine (5-7 MB). RAW exports from Photoshop can go over. Compress at [squoosh.app](https://squoosh.app) first if in doubt.</w:t>
+      </w:r>
+    </w:p>
+    <w:p>
+      <w:pPr>
+        <w:pStyle w:val="ListNumber"/>
+      </w:pPr>
+      <w:r>
+        <w:rPr>
+          <w:b/>
+        </w:rPr>
+        <w:t>Strapi v5 UI quirk.</w:t>
+      </w:r>
+      <w:r>
+        <w:t xml:space="preserve"> Sometimes the upload completes server-side but the form panel doesn't refresh. </w:t>
+      </w:r>
+      <w:r>
+        <w:rPr>
+          <w:b/>
+        </w:rPr>
+        <w:t>Save the entry, hard-refresh (Ctrl+Shift+R), reopen</w:t>
+      </w:r>
+      <w:r>
+        <w:t xml:space="preserve"> â€” the image usually appears. If it does, it was a render glitch, not a real failure.</w:t>
+      </w:r>
+    </w:p>
+    <w:p>
+      <w:r>
+        <w:rPr>
+          <w:b/>
+        </w:rPr>
+        <w:t>Diagnostic:</w:t>
+      </w:r>
+      <w:r>
+        <w:t xml:space="preserve"> go to </w:t>
+      </w:r>
+      <w:r>
+        <w:rPr>
+          <w:b/>
+        </w:rPr>
+        <w:t>Media Library</w:t>
+      </w:r>
+      <w:r>
+        <w:t xml:space="preserve"> in the left sidebar.</w:t>
+      </w:r>
+    </w:p>
+    <w:p>
+      <w:pPr>
+        <w:pStyle w:val="ListBullet"/>
+      </w:pPr>
+      <w:r>
+        <w:t>File is there â†’ case #1 (uploaded but not attached). Re-attach from the field.</w:t>
+      </w:r>
+    </w:p>
+    <w:p>
+      <w:pPr>
+        <w:pStyle w:val="ListBullet"/>
+      </w:pPr>
+      <w:r>
+        <w:t>File is NOT there â†’ upload actually failed. Compress and retry.</w:t>
       </w:r>
     </w:p>
     <w:p>
@@ -16066,7 +16384,7 @@
           <w:p>
             <w:r/>
             <w:r>
-              <w:t>If the article also lives on Substack, paste the Substack URL here. Adds a "Read on Substack â†’" link and sets the SEO canonical</w:t>
+              <w:t>If the article also lives on Substack, paste the Substack URL here. Adds a "Read on Substack â†’" link and sets the SEO canonical. Auto-fills when an article is pulled from Substack via the hourly RSS cron â€” you only need to paste manually for articles you wrote in the CMS first, then later published on Substack.</w:t>
             </w:r>
           </w:p>
         </w:tc>

</xml_diff>

<commit_message>
Email journey map: standalone docx + §18 in the user manual (Help · Ask picks it up)
New deliverables
- Docs/build-email-journey-map.py — reusable builder script
- Docs/ALW_Email_Journey_Map.docx — standalone reference doc for Anna
  (44KB). 6 sections: overview, per-trigger index (Reset Letters,
  Decoder, enquiry forms, shop card + bank, refund, order status,
  Calendly, password reset), Mailchimp tag catalogue (18 tags mapped
  to journeys), transactional email catalogue (14 Resend templates),
  pre-launch activation checklist, ASCII data-flow diagrams.

Manual §18 — same content adapted for the Help · Ask chatbot
- 12 sub-sections mirroring the docx one-to-one
- Tables for tag maps and template catalogues
- Chatbot can now answer "if someone signs up for Reset Letters, what
  emails do they get?" or "which tag does the Practitioner form fire?"
  by pulling from §18. Zero endpoint changes — anna-manual.md is
  bundled at CMS build time.

Manual v1.11. Full doc 107KB now.
</commit_message>
<xml_diff>
--- a/Docs/ANNA_USER_MANUAL.docx
+++ b/Docs/ANNA_USER_MANUAL.docx
@@ -30558,6 +30558,3620 @@
     <w:p>
       <w:r>
         <w:t>Limits: JPG / PNG / GIF / WebP up to about 5 MB. If the image is too large, retake at a lower resolution or use the Snipping Tool to grab just the part that matters.</w:t>
+      </w:r>
+    </w:p>
+    <w:p>
+      <w:pPr>
+        <w:pStyle w:val="Heading2"/>
+      </w:pPr>
+      <w:r>
+        <w:t>18. Email journeys (what happens when someone clicks something)</w:t>
+      </w:r>
+    </w:p>
+    <w:p>
+      <w:r>
+        <w:t>Two systems send emails from your site:</w:t>
+      </w:r>
+    </w:p>
+    <w:p>
+      <w:pPr>
+        <w:pStyle w:val="ListBullet"/>
+      </w:pPr>
+      <w:r>
+        <w:rPr>
+          <w:b/>
+        </w:rPr>
+        <w:t>Mailchimp</w:t>
+      </w:r>
+      <w:r>
+        <w:t xml:space="preserve"> sends marketing journeys triggered by tags. You edit journey emails inside Mailchimp; the site only fires the tag.</w:t>
+      </w:r>
+    </w:p>
+    <w:p>
+      <w:pPr>
+        <w:pStyle w:val="ListBullet"/>
+      </w:pPr>
+      <w:r>
+        <w:rPr>
+          <w:b/>
+        </w:rPr>
+        <w:t>Resend</w:t>
+      </w:r>
+      <w:r>
+        <w:t xml:space="preserve"> sends transactional emails triggered by specific events like a purchase. You edit these inside the CMS in the </w:t>
+      </w:r>
+      <w:r>
+        <w:rPr>
+          <w:b/>
+        </w:rPr>
+        <w:t>Email Template</w:t>
+      </w:r>
+      <w:r>
+        <w:t xml:space="preserve"> collection; the site pulls the wording at send time.</w:t>
+      </w:r>
+    </w:p>
+    <w:p>
+      <w:r>
+        <w:t>The rest of this section is the full trigger map. If someone asks the chatbot "if X happens, what emails do they get?" or "which tag does the Y form fire?", the answer is here.</w:t>
+      </w:r>
+    </w:p>
+    <w:p>
+      <w:pPr>
+        <w:pStyle w:val="Heading3"/>
+      </w:pPr>
+      <w:r>
+        <w:t>18.1 Reset Letters signup</w:t>
+      </w:r>
+    </w:p>
+    <w:p>
+      <w:r>
+        <w:rPr>
+          <w:b/>
+        </w:rPr>
+        <w:t>Trigger:</w:t>
+      </w:r>
+      <w:r>
+        <w:t xml:space="preserve"> visitor submits the form on </w:t>
+      </w:r>
+      <w:r>
+        <w:rPr>
+          <w:rFonts w:ascii="Consolas" w:hAnsi="Consolas"/>
+          <w:sz w:val="20"/>
+        </w:rPr>
+        <w:t>/reset-letters</w:t>
+      </w:r>
+      <w:r>
+        <w:t>.</w:t>
+      </w:r>
+    </w:p>
+    <w:p>
+      <w:r>
+        <w:rPr>
+          <w:b/>
+        </w:rPr>
+        <w:t>Endpoint:</w:t>
+      </w:r>
+      <w:r>
+        <w:t xml:space="preserve"> POST </w:t>
+      </w:r>
+      <w:r>
+        <w:rPr>
+          <w:rFonts w:ascii="Consolas" w:hAnsi="Consolas"/>
+          <w:sz w:val="20"/>
+        </w:rPr>
+        <w:t>/api/subscribe-reset-letters</w:t>
+      </w:r>
+      <w:r>
+        <w:t>.</w:t>
+      </w:r>
+    </w:p>
+    <w:p>
+      <w:r>
+        <w:t>Step by step:</w:t>
+      </w:r>
+    </w:p>
+    <w:p>
+      <w:pPr>
+        <w:pStyle w:val="ListNumber"/>
+      </w:pPr>
+      <w:r>
+        <w:t>Turnstile CAPTCHA verified (blocks bots).</w:t>
+      </w:r>
+    </w:p>
+    <w:p>
+      <w:pPr>
+        <w:pStyle w:val="ListNumber"/>
+      </w:pPr>
+      <w:r>
+        <w:t>Email upserted into Mailchimp with FNAME merge field.</w:t>
+      </w:r>
+    </w:p>
+    <w:p>
+      <w:pPr>
+        <w:pStyle w:val="ListNumber"/>
+      </w:pPr>
+      <w:r>
+        <w:t xml:space="preserve">Mailchimp tag applied: </w:t>
+      </w:r>
+      <w:r>
+        <w:rPr>
+          <w:b/>
+        </w:rPr>
+        <w:t>Founding Members</w:t>
+      </w:r>
+      <w:r>
+        <w:t xml:space="preserve"> if before </w:t>
+      </w:r>
+      <w:r>
+        <w:rPr>
+          <w:rFonts w:ascii="Consolas" w:hAnsi="Consolas"/>
+          <w:sz w:val="20"/>
+        </w:rPr>
+        <w:t>RESET_LETTERS_LAUNCH_DATE</w:t>
+      </w:r>
+      <w:r>
+        <w:t xml:space="preserve"> (default 2026-06-22), otherwise </w:t>
+      </w:r>
+      <w:r>
+        <w:rPr>
+          <w:b/>
+        </w:rPr>
+        <w:t>Standard Subscribers</w:t>
+      </w:r>
+      <w:r>
+        <w:t>.</w:t>
+      </w:r>
+    </w:p>
+    <w:p>
+      <w:pPr>
+        <w:pStyle w:val="ListNumber"/>
+      </w:pPr>
+      <w:r>
+        <w:t>Email ALSO subscribed to the Substack list in parallel so they receive the newsletter itself.</w:t>
+      </w:r>
+    </w:p>
+    <w:p>
+      <w:pPr>
+        <w:pStyle w:val="ListNumber"/>
+      </w:pPr>
+      <w:r>
+        <w:t xml:space="preserve">If the visitor arrived via </w:t>
+      </w:r>
+      <w:r>
+        <w:rPr>
+          <w:rFonts w:ascii="Consolas" w:hAnsi="Consolas"/>
+          <w:sz w:val="20"/>
+        </w:rPr>
+        <w:t>?utm_source=...</w:t>
+      </w:r>
+      <w:r>
+        <w:t xml:space="preserve">, a SECOND tag </w:t>
+      </w:r>
+      <w:r>
+        <w:rPr>
+          <w:rFonts w:ascii="Consolas" w:hAnsi="Consolas"/>
+          <w:sz w:val="20"/>
+        </w:rPr>
+        <w:t>Origin: &lt;source&gt;</w:t>
+      </w:r>
+      <w:r>
+        <w:t xml:space="preserve"> applied.</w:t>
+      </w:r>
+    </w:p>
+    <w:p>
+      <w:pPr>
+        <w:pStyle w:val="ListNumber"/>
+      </w:pPr>
+      <w:r>
+        <w:t>Success response shown in the browser.</w:t>
+      </w:r>
+    </w:p>
+    <w:p>
+      <w:r>
+        <w:rPr>
+          <w:b/>
+        </w:rPr>
+        <w:t>Journeys this triggers in Mailchimp:</w:t>
+      </w:r>
+      <w:r>
+        <w:t xml:space="preserve"> Founding Members welcome sequence, OR Standard Subscribers welcome sequence, PLUS optional Origin-based fork.</w:t>
+      </w:r>
+    </w:p>
+    <w:p>
+      <w:r>
+        <w:rPr>
+          <w:b/>
+        </w:rPr>
+        <w:t>Resend emails:</w:t>
+      </w:r>
+      <w:r>
+        <w:t xml:space="preserve"> none.</w:t>
+      </w:r>
+    </w:p>
+    <w:p>
+      <w:pPr>
+        <w:pStyle w:val="Heading3"/>
+      </w:pPr>
+      <w:r>
+        <w:t>18.2 Nervous System Decoder signup</w:t>
+      </w:r>
+    </w:p>
+    <w:p>
+      <w:r>
+        <w:rPr>
+          <w:b/>
+        </w:rPr>
+        <w:t>Trigger:</w:t>
+      </w:r>
+      <w:r>
+        <w:t xml:space="preserve"> visitor submits the email form on </w:t>
+      </w:r>
+      <w:r>
+        <w:rPr>
+          <w:rFonts w:ascii="Consolas" w:hAnsi="Consolas"/>
+          <w:sz w:val="20"/>
+        </w:rPr>
+        <w:t>/free/nervous-system-decoder</w:t>
+      </w:r>
+      <w:r>
+        <w:t xml:space="preserve"> OR the email gate on </w:t>
+      </w:r>
+      <w:r>
+        <w:rPr>
+          <w:rFonts w:ascii="Consolas" w:hAnsi="Consolas"/>
+          <w:sz w:val="20"/>
+        </w:rPr>
+        <w:t>/free/nervous-system-decoder/quiz</w:t>
+      </w:r>
+      <w:r>
+        <w:t>.</w:t>
+      </w:r>
+    </w:p>
+    <w:p>
+      <w:r>
+        <w:rPr>
+          <w:b/>
+        </w:rPr>
+        <w:t>Endpoint:</w:t>
+      </w:r>
+      <w:r>
+        <w:t xml:space="preserve"> POST </w:t>
+      </w:r>
+      <w:r>
+        <w:rPr>
+          <w:rFonts w:ascii="Consolas" w:hAnsi="Consolas"/>
+          <w:sz w:val="20"/>
+        </w:rPr>
+        <w:t>/api/lead/decoder</w:t>
+      </w:r>
+      <w:r>
+        <w:t>.</w:t>
+      </w:r>
+    </w:p>
+    <w:p>
+      <w:r>
+        <w:t>Step by step:</w:t>
+      </w:r>
+    </w:p>
+    <w:p>
+      <w:pPr>
+        <w:pStyle w:val="ListNumber"/>
+      </w:pPr>
+      <w:r>
+        <w:t>Turnstile CAPTCHA verified.</w:t>
+      </w:r>
+    </w:p>
+    <w:p>
+      <w:pPr>
+        <w:pStyle w:val="ListNumber"/>
+      </w:pPr>
+      <w:r>
+        <w:t>Email upserted with FNAME.</w:t>
+      </w:r>
+    </w:p>
+    <w:p>
+      <w:pPr>
+        <w:pStyle w:val="ListNumber"/>
+      </w:pPr>
+      <w:r>
+        <w:t xml:space="preserve">Mailchimp tag applied: </w:t>
+      </w:r>
+      <w:r>
+        <w:rPr>
+          <w:b/>
+        </w:rPr>
+        <w:t>Decoder Subscriber</w:t>
+      </w:r>
+      <w:r>
+        <w:t>.</w:t>
+      </w:r>
+    </w:p>
+    <w:p>
+      <w:pPr>
+        <w:pStyle w:val="ListNumber"/>
+      </w:pPr>
+      <w:r>
+        <w:t xml:space="preserve">If UTM present, </w:t>
+      </w:r>
+      <w:r>
+        <w:rPr>
+          <w:rFonts w:ascii="Consolas" w:hAnsi="Consolas"/>
+          <w:sz w:val="20"/>
+        </w:rPr>
+        <w:t>Origin: &lt;source&gt;</w:t>
+      </w:r>
+      <w:r>
+        <w:t xml:space="preserve"> also applied.</w:t>
+      </w:r>
+    </w:p>
+    <w:p>
+      <w:pPr>
+        <w:pStyle w:val="ListNumber"/>
+      </w:pPr>
+      <w:r>
+        <w:t>Success shown to visitor (destination depends on which entry point).</w:t>
+      </w:r>
+    </w:p>
+    <w:p>
+      <w:r>
+        <w:rPr>
+          <w:b/>
+        </w:rPr>
+        <w:t>Journeys:</w:t>
+      </w:r>
+      <w:r>
+        <w:t xml:space="preserve"> Decoder welcome + PDF delivery; then Day 2 Decoder Upsell to REGULATED; then Day 4 final upsell nudge. All three exit if the REGULATED Buyer tag is applied.</w:t>
+      </w:r>
+    </w:p>
+    <w:p>
+      <w:r>
+        <w:rPr>
+          <w:b/>
+        </w:rPr>
+        <w:t>Resend emails:</w:t>
+      </w:r>
+      <w:r>
+        <w:t xml:space="preserve"> none.</w:t>
+      </w:r>
+    </w:p>
+    <w:p>
+      <w:pPr>
+        <w:pStyle w:val="Heading3"/>
+      </w:pPr>
+      <w:r>
+        <w:t>18.3 Enquiry forms (Contact, Practitioner, Corporate, Speaking, etc.)</w:t>
+      </w:r>
+    </w:p>
+    <w:p>
+      <w:r>
+        <w:rPr>
+          <w:b/>
+        </w:rPr>
+        <w:t>Trigger:</w:t>
+      </w:r>
+      <w:r>
+        <w:t xml:space="preserve"> any enquiry form submission.</w:t>
+      </w:r>
+    </w:p>
+    <w:p>
+      <w:r>
+        <w:rPr>
+          <w:b/>
+        </w:rPr>
+        <w:t>Endpoint:</w:t>
+      </w:r>
+      <w:r>
+        <w:t xml:space="preserve"> POST </w:t>
+      </w:r>
+      <w:r>
+        <w:rPr>
+          <w:rFonts w:ascii="Consolas" w:hAnsi="Consolas"/>
+          <w:sz w:val="20"/>
+        </w:rPr>
+        <w:t>/api/lead/[type]</w:t>
+      </w:r>
+      <w:r>
+        <w:t xml:space="preserve"> where </w:t>
+      </w:r>
+      <w:r>
+        <w:rPr>
+          <w:rFonts w:ascii="Consolas" w:hAnsi="Consolas"/>
+          <w:sz w:val="20"/>
+        </w:rPr>
+        <w:t>[type]</w:t>
+      </w:r>
+      <w:r>
+        <w:t xml:space="preserve"> is the URL slug.</w:t>
+      </w:r>
+    </w:p>
+    <w:p>
+      <w:r>
+        <w:t>Slug â†’ Mailchimp tag map:</w:t>
+      </w:r>
+    </w:p>
+    <w:tbl>
+      <w:tblPr>
+        <w:tblStyle w:val="LightGrid-Accent1"/>
+        <w:tblW w:type="auto" w:w="0"/>
+        <w:tblLook w:firstColumn="1" w:firstRow="1" w:lastColumn="0" w:lastRow="0" w:noHBand="0" w:noVBand="1" w:val="04A0"/>
+      </w:tblPr>
+      <w:tblGrid>
+        <w:gridCol w:w="2880"/>
+        <w:gridCol w:w="2880"/>
+        <w:gridCol w:w="2880"/>
+      </w:tblGrid>
+      <w:tr>
+        <w:tc>
+          <w:tcPr>
+            <w:tcW w:type="dxa" w:w="2880"/>
+          </w:tcPr>
+          <w:p>
+            <w:r/>
+            <w:r>
+              <w:rPr>
+                <w:b/>
+              </w:rPr>
+              <w:t>Slug</w:t>
+            </w:r>
+          </w:p>
+        </w:tc>
+        <w:tc>
+          <w:tcPr>
+            <w:tcW w:type="dxa" w:w="2880"/>
+          </w:tcPr>
+          <w:p>
+            <w:r/>
+            <w:r>
+              <w:rPr>
+                <w:b/>
+              </w:rPr>
+              <w:t>Tag applied</w:t>
+            </w:r>
+          </w:p>
+        </w:tc>
+        <w:tc>
+          <w:tcPr>
+            <w:tcW w:type="dxa" w:w="2880"/>
+          </w:tcPr>
+          <w:p>
+            <w:r/>
+            <w:r>
+              <w:rPr>
+                <w:b/>
+              </w:rPr>
+              <w:t>Admin email?</w:t>
+            </w:r>
+          </w:p>
+        </w:tc>
+      </w:tr>
+      <w:tr>
+        <w:tc>
+          <w:tcPr>
+            <w:tcW w:type="dxa" w:w="2880"/>
+          </w:tcPr>
+          <w:p>
+            <w:r/>
+            <w:r>
+              <w:t>returning-circle</w:t>
+            </w:r>
+          </w:p>
+        </w:tc>
+        <w:tc>
+          <w:tcPr>
+            <w:tcW w:type="dxa" w:w="2880"/>
+          </w:tcPr>
+          <w:p>
+            <w:r/>
+            <w:r>
+              <w:t>Returning Circle Enquiry</w:t>
+            </w:r>
+          </w:p>
+        </w:tc>
+        <w:tc>
+          <w:tcPr>
+            <w:tcW w:type="dxa" w:w="2880"/>
+          </w:tcPr>
+          <w:p>
+            <w:r/>
+            <w:r>
+              <w:t>No</w:t>
+            </w:r>
+          </w:p>
+        </w:tc>
+      </w:tr>
+      <w:tr>
+        <w:tc>
+          <w:tcPr>
+            <w:tcW w:type="dxa" w:w="2880"/>
+          </w:tcPr>
+          <w:p>
+            <w:r/>
+            <w:r>
+              <w:t>signal-collective</w:t>
+            </w:r>
+          </w:p>
+        </w:tc>
+        <w:tc>
+          <w:tcPr>
+            <w:tcW w:type="dxa" w:w="2880"/>
+          </w:tcPr>
+          <w:p>
+            <w:r/>
+            <w:r>
+              <w:t>Signal Collective Enquiry</w:t>
+            </w:r>
+          </w:p>
+        </w:tc>
+        <w:tc>
+          <w:tcPr>
+            <w:tcW w:type="dxa" w:w="2880"/>
+          </w:tcPr>
+          <w:p>
+            <w:r/>
+            <w:r>
+              <w:t>No</w:t>
+            </w:r>
+          </w:p>
+        </w:tc>
+      </w:tr>
+      <w:tr>
+        <w:tc>
+          <w:tcPr>
+            <w:tcW w:type="dxa" w:w="2880"/>
+          </w:tcPr>
+          <w:p>
+            <w:r/>
+            <w:r>
+              <w:t>recovery</w:t>
+            </w:r>
+          </w:p>
+        </w:tc>
+        <w:tc>
+          <w:tcPr>
+            <w:tcW w:type="dxa" w:w="2880"/>
+          </w:tcPr>
+          <w:p>
+            <w:r/>
+            <w:r>
+              <w:t>Recovery Coaching Enquiry</w:t>
+            </w:r>
+          </w:p>
+        </w:tc>
+        <w:tc>
+          <w:tcPr>
+            <w:tcW w:type="dxa" w:w="2880"/>
+          </w:tcPr>
+          <w:p>
+            <w:r/>
+            <w:r>
+              <w:t>No</w:t>
+            </w:r>
+          </w:p>
+        </w:tc>
+      </w:tr>
+      <w:tr>
+        <w:tc>
+          <w:tcPr>
+            <w:tcW w:type="dxa" w:w="2880"/>
+          </w:tcPr>
+          <w:p>
+            <w:r/>
+            <w:r>
+              <w:t>one-day</w:t>
+            </w:r>
+          </w:p>
+        </w:tc>
+        <w:tc>
+          <w:tcPr>
+            <w:tcW w:type="dxa" w:w="2880"/>
+          </w:tcPr>
+          <w:p>
+            <w:r/>
+            <w:r>
+              <w:t>One Day Enquiry</w:t>
+            </w:r>
+          </w:p>
+        </w:tc>
+        <w:tc>
+          <w:tcPr>
+            <w:tcW w:type="dxa" w:w="2880"/>
+          </w:tcPr>
+          <w:p>
+            <w:r/>
+            <w:r>
+              <w:t>No</w:t>
+            </w:r>
+          </w:p>
+        </w:tc>
+      </w:tr>
+      <w:tr>
+        <w:tc>
+          <w:tcPr>
+            <w:tcW w:type="dxa" w:w="2880"/>
+          </w:tcPr>
+          <w:p>
+            <w:r/>
+            <w:r>
+              <w:t>speaking</w:t>
+            </w:r>
+          </w:p>
+        </w:tc>
+        <w:tc>
+          <w:tcPr>
+            <w:tcW w:type="dxa" w:w="2880"/>
+          </w:tcPr>
+          <w:p>
+            <w:r/>
+            <w:r>
+              <w:t>Speaking Enquiry</w:t>
+            </w:r>
+          </w:p>
+        </w:tc>
+        <w:tc>
+          <w:tcPr>
+            <w:tcW w:type="dxa" w:w="2880"/>
+          </w:tcPr>
+          <w:p>
+            <w:r/>
+            <w:r>
+              <w:t>No</w:t>
+            </w:r>
+          </w:p>
+        </w:tc>
+      </w:tr>
+      <w:tr>
+        <w:tc>
+          <w:tcPr>
+            <w:tcW w:type="dxa" w:w="2880"/>
+          </w:tcPr>
+          <w:p>
+            <w:r/>
+            <w:r>
+              <w:t>corporate</w:t>
+            </w:r>
+          </w:p>
+        </w:tc>
+        <w:tc>
+          <w:tcPr>
+            <w:tcW w:type="dxa" w:w="2880"/>
+          </w:tcPr>
+          <w:p>
+            <w:r/>
+            <w:r>
+              <w:t>Corporate Wellbeing Enquiry</w:t>
+            </w:r>
+          </w:p>
+        </w:tc>
+        <w:tc>
+          <w:tcPr>
+            <w:tcW w:type="dxa" w:w="2880"/>
+          </w:tcPr>
+          <w:p>
+            <w:r/>
+            <w:r>
+              <w:t>No</w:t>
+            </w:r>
+          </w:p>
+        </w:tc>
+      </w:tr>
+      <w:tr>
+        <w:tc>
+          <w:tcPr>
+            <w:tcW w:type="dxa" w:w="2880"/>
+          </w:tcPr>
+          <w:p>
+            <w:r/>
+            <w:r>
+              <w:t>practitioner-enquiry</w:t>
+            </w:r>
+          </w:p>
+        </w:tc>
+        <w:tc>
+          <w:tcPr>
+            <w:tcW w:type="dxa" w:w="2880"/>
+          </w:tcPr>
+          <w:p>
+            <w:r/>
+            <w:r>
+              <w:t>Practitioner Enquiry</w:t>
+            </w:r>
+          </w:p>
+        </w:tc>
+        <w:tc>
+          <w:tcPr>
+            <w:tcW w:type="dxa" w:w="2880"/>
+          </w:tcPr>
+          <w:p>
+            <w:r/>
+            <w:r>
+              <w:t>Yes â€” admin_practitioner_enquiry</w:t>
+            </w:r>
+          </w:p>
+        </w:tc>
+      </w:tr>
+      <w:tr>
+        <w:tc>
+          <w:tcPr>
+            <w:tcW w:type="dxa" w:w="2880"/>
+          </w:tcPr>
+          <w:p>
+            <w:r/>
+            <w:r>
+              <w:t>anything else</w:t>
+            </w:r>
+          </w:p>
+        </w:tc>
+        <w:tc>
+          <w:tcPr>
+            <w:tcW w:type="dxa" w:w="2880"/>
+          </w:tcPr>
+          <w:p>
+            <w:r/>
+            <w:r>
+              <w:t>&lt;Capitalised words&gt; + " Enquiry"</w:t>
+            </w:r>
+          </w:p>
+        </w:tc>
+        <w:tc>
+          <w:tcPr>
+            <w:tcW w:type="dxa" w:w="2880"/>
+          </w:tcPr>
+          <w:p>
+            <w:r/>
+            <w:r>
+              <w:t>No</w:t>
+            </w:r>
+          </w:p>
+        </w:tc>
+      </w:tr>
+    </w:tbl>
+    <w:p>
+      <w:r>
+        <w:t>Step by step:</w:t>
+      </w:r>
+    </w:p>
+    <w:p>
+      <w:pPr>
+        <w:pStyle w:val="ListNumber"/>
+      </w:pPr>
+      <w:r>
+        <w:t>Turnstile CAPTCHA verified.</w:t>
+      </w:r>
+    </w:p>
+    <w:p>
+      <w:pPr>
+        <w:pStyle w:val="ListNumber"/>
+      </w:pPr>
+      <w:r>
+        <w:t>Email upserted with FNAME.</w:t>
+      </w:r>
+    </w:p>
+    <w:p>
+      <w:pPr>
+        <w:pStyle w:val="ListNumber"/>
+      </w:pPr>
+      <w:r>
+        <w:t>Tag applied per the table above.</w:t>
+      </w:r>
+    </w:p>
+    <w:p>
+      <w:pPr>
+        <w:pStyle w:val="ListNumber"/>
+      </w:pPr>
+      <w:r>
+        <w:t>If Origin UTM present, second Origin tag applied.</w:t>
+      </w:r>
+    </w:p>
+    <w:p>
+      <w:pPr>
+        <w:pStyle w:val="ListNumber"/>
+      </w:pPr>
+      <w:r>
+        <w:t>If this type has an admin email in the map (currently only practitioner-enquiry), Resend fires that template to Anna.</w:t>
+      </w:r>
+    </w:p>
+    <w:p>
+      <w:pPr>
+        <w:pStyle w:val="Heading3"/>
+      </w:pPr>
+      <w:r>
+        <w:t>18.4 Shop purchase (card)</w:t>
+      </w:r>
+    </w:p>
+    <w:p>
+      <w:r>
+        <w:rPr>
+          <w:b/>
+        </w:rPr>
+        <w:t>Trigger:</w:t>
+      </w:r>
+      <w:r>
+        <w:t xml:space="preserve"> customer completes card checkout on </w:t>
+      </w:r>
+      <w:r>
+        <w:rPr>
+          <w:rFonts w:ascii="Consolas" w:hAnsi="Consolas"/>
+          <w:sz w:val="20"/>
+        </w:rPr>
+        <w:t>/checkout</w:t>
+      </w:r>
+      <w:r>
+        <w:t>.</w:t>
+      </w:r>
+    </w:p>
+    <w:p>
+      <w:r>
+        <w:rPr>
+          <w:b/>
+        </w:rPr>
+        <w:t>Endpoint:</w:t>
+      </w:r>
+      <w:r>
+        <w:t xml:space="preserve"> Stripe webhook â†’ POST </w:t>
+      </w:r>
+      <w:r>
+        <w:rPr>
+          <w:rFonts w:ascii="Consolas" w:hAnsi="Consolas"/>
+          <w:sz w:val="20"/>
+        </w:rPr>
+        <w:t>/api/stripe/webhook</w:t>
+      </w:r>
+      <w:r>
+        <w:t xml:space="preserve"> (</w:t>
+      </w:r>
+      <w:r>
+        <w:rPr>
+          <w:rFonts w:ascii="Consolas" w:hAnsi="Consolas"/>
+          <w:sz w:val="20"/>
+        </w:rPr>
+        <w:t>checkout.session.completed</w:t>
+      </w:r>
+      <w:r>
+        <w:t>).</w:t>
+      </w:r>
+    </w:p>
+    <w:p>
+      <w:r>
+        <w:t>Step by step:</w:t>
+      </w:r>
+    </w:p>
+    <w:p>
+      <w:pPr>
+        <w:pStyle w:val="ListNumber"/>
+      </w:pPr>
+      <w:r>
+        <w:t>Stripe signature verified.</w:t>
+      </w:r>
+    </w:p>
+    <w:p>
+      <w:pPr>
+        <w:pStyle w:val="ListNumber"/>
+      </w:pPr>
+      <w:r>
+        <w:t xml:space="preserve">Strapi order flipped from </w:t>
+      </w:r>
+      <w:r>
+        <w:rPr>
+          <w:rFonts w:ascii="Consolas" w:hAnsi="Consolas"/>
+          <w:sz w:val="20"/>
+        </w:rPr>
+        <w:t>pending</w:t>
+      </w:r>
+      <w:r>
+        <w:t xml:space="preserve"> to </w:t>
+      </w:r>
+      <w:r>
+        <w:rPr>
+          <w:rFonts w:ascii="Consolas" w:hAnsi="Consolas"/>
+          <w:sz w:val="20"/>
+        </w:rPr>
+        <w:t>paid</w:t>
+      </w:r>
+      <w:r>
+        <w:t>.</w:t>
+      </w:r>
+    </w:p>
+    <w:p>
+      <w:pPr>
+        <w:pStyle w:val="ListNumber"/>
+      </w:pPr>
+      <w:r>
+        <w:t xml:space="preserve">If new customer, Strapi creates a User record + password token, then Resend fires </w:t>
+      </w:r>
+      <w:r>
+        <w:rPr>
+          <w:b/>
+        </w:rPr>
+        <w:t>shop_account_invite</w:t>
+      </w:r>
+      <w:r>
+        <w:t xml:space="preserve"> ("welcome, set your password").</w:t>
+      </w:r>
+    </w:p>
+    <w:p>
+      <w:pPr>
+        <w:pStyle w:val="ListNumber"/>
+      </w:pPr>
+      <w:r>
+        <w:t xml:space="preserve">Mailchimp tag </w:t>
+      </w:r>
+      <w:r>
+        <w:rPr>
+          <w:b/>
+        </w:rPr>
+        <w:t>Shop Customers</w:t>
+      </w:r>
+      <w:r>
+        <w:t xml:space="preserve"> applied to the email.</w:t>
+      </w:r>
+    </w:p>
+    <w:p>
+      <w:pPr>
+        <w:pStyle w:val="ListNumber"/>
+      </w:pPr>
+      <w:r>
+        <w:t xml:space="preserve">If the item has a </w:t>
+      </w:r>
+      <w:r>
+        <w:rPr>
+          <w:rFonts w:ascii="Consolas" w:hAnsi="Consolas"/>
+          <w:sz w:val="20"/>
+        </w:rPr>
+        <w:t>mailchimpTag</w:t>
+      </w:r>
+      <w:r>
+        <w:t xml:space="preserve"> on its Programme/Product entry (e.g. REGULATED has </w:t>
+      </w:r>
+      <w:r>
+        <w:rPr>
+          <w:rFonts w:ascii="Consolas" w:hAnsi="Consolas"/>
+          <w:sz w:val="20"/>
+        </w:rPr>
+        <w:t>mailchimpTag = "REGULATED Buyer"</w:t>
+      </w:r>
+      <w:r>
+        <w:t>), that tag is ALSO applied.</w:t>
+      </w:r>
+    </w:p>
+    <w:p>
+      <w:pPr>
+        <w:pStyle w:val="ListNumber"/>
+      </w:pPr>
+      <w:r>
+        <w:t xml:space="preserve">Resend fires </w:t>
+      </w:r>
+      <w:r>
+        <w:rPr>
+          <w:b/>
+        </w:rPr>
+        <w:t>order_paid</w:t>
+      </w:r>
+      <w:r>
+        <w:t xml:space="preserve"> to the customer (receipt).</w:t>
+      </w:r>
+    </w:p>
+    <w:p>
+      <w:pPr>
+        <w:pStyle w:val="ListNumber"/>
+      </w:pPr>
+      <w:r>
+        <w:t xml:space="preserve">Resend fires </w:t>
+      </w:r>
+      <w:r>
+        <w:rPr>
+          <w:b/>
+        </w:rPr>
+        <w:t>admin_new_order</w:t>
+      </w:r>
+      <w:r>
+        <w:t xml:space="preserve"> to Anna.</w:t>
+      </w:r>
+    </w:p>
+    <w:p>
+      <w:r>
+        <w:rPr>
+          <w:b/>
+        </w:rPr>
+        <w:t>Journeys:</w:t>
+      </w:r>
+      <w:r>
+        <w:t xml:space="preserve"> Shop welcome / thank-you; programme-specific onboarding like REGULATED Follow-up (which exits the Decoder Upsell journey so the customer stops being sold something they just bought).</w:t>
+      </w:r>
+    </w:p>
+    <w:p>
+      <w:pPr>
+        <w:pStyle w:val="Heading3"/>
+      </w:pPr>
+      <w:r>
+        <w:t>18.5 Shop purchase (bank transfer)</w:t>
+      </w:r>
+    </w:p>
+    <w:p>
+      <w:r>
+        <w:rPr>
+          <w:b/>
+        </w:rPr>
+        <w:t>Trigger:</w:t>
+      </w:r>
+      <w:r>
+        <w:t xml:space="preserve"> customer picks bank transfer at checkout.</w:t>
+      </w:r>
+    </w:p>
+    <w:p>
+      <w:r>
+        <w:rPr>
+          <w:b/>
+        </w:rPr>
+        <w:t>Endpoint:</w:t>
+      </w:r>
+      <w:r>
+        <w:t xml:space="preserve"> POST </w:t>
+      </w:r>
+      <w:r>
+        <w:rPr>
+          <w:rFonts w:ascii="Consolas" w:hAnsi="Consolas"/>
+          <w:sz w:val="20"/>
+        </w:rPr>
+        <w:t>/api/checkout</w:t>
+      </w:r>
+      <w:r>
+        <w:t>.</w:t>
+      </w:r>
+    </w:p>
+    <w:p>
+      <w:r>
+        <w:t>Step by step:</w:t>
+      </w:r>
+    </w:p>
+    <w:p>
+      <w:pPr>
+        <w:pStyle w:val="ListNumber"/>
+      </w:pPr>
+      <w:r>
+        <w:t xml:space="preserve">Order created in Strapi with status </w:t>
+      </w:r>
+      <w:r>
+        <w:rPr>
+          <w:rFonts w:ascii="Consolas" w:hAnsi="Consolas"/>
+          <w:sz w:val="20"/>
+        </w:rPr>
+        <w:t>pending_bank_transfer</w:t>
+      </w:r>
+      <w:r>
+        <w:t>.</w:t>
+      </w:r>
+    </w:p>
+    <w:p>
+      <w:pPr>
+        <w:pStyle w:val="ListNumber"/>
+      </w:pPr>
+      <w:r>
+        <w:t xml:space="preserve">If new customer, </w:t>
+      </w:r>
+      <w:r>
+        <w:rPr>
+          <w:b/>
+        </w:rPr>
+        <w:t>shop_account_invite</w:t>
+      </w:r>
+      <w:r>
+        <w:t xml:space="preserve"> email fires.</w:t>
+      </w:r>
+    </w:p>
+    <w:p>
+      <w:pPr>
+        <w:pStyle w:val="ListNumber"/>
+      </w:pPr>
+      <w:r>
+        <w:t xml:space="preserve">Resend fires </w:t>
+      </w:r>
+      <w:r>
+        <w:rPr>
+          <w:b/>
+        </w:rPr>
+        <w:t>order_bank_transfer</w:t>
+      </w:r>
+      <w:r>
+        <w:t xml:space="preserve"> to customer (bank details + reference).</w:t>
+      </w:r>
+    </w:p>
+    <w:p>
+      <w:pPr>
+        <w:pStyle w:val="ListNumber"/>
+      </w:pPr>
+      <w:r>
+        <w:t xml:space="preserve">Resend fires </w:t>
+      </w:r>
+      <w:r>
+        <w:rPr>
+          <w:b/>
+        </w:rPr>
+        <w:t>admin_new_order</w:t>
+      </w:r>
+      <w:r>
+        <w:t xml:space="preserve"> to Anna.</w:t>
+      </w:r>
+    </w:p>
+    <w:p>
+      <w:pPr>
+        <w:pStyle w:val="ListNumber"/>
+      </w:pPr>
+      <w:r>
+        <w:t>NO Mailchimp tags applied yet â€” they wait until Anna marks the order paid in the CMS, which fires the full 18.4 flow.</w:t>
+      </w:r>
+    </w:p>
+    <w:p>
+      <w:pPr>
+        <w:pStyle w:val="Heading3"/>
+      </w:pPr>
+      <w:r>
+        <w:t>18.6 Refund</w:t>
+      </w:r>
+    </w:p>
+    <w:p>
+      <w:r>
+        <w:rPr>
+          <w:b/>
+        </w:rPr>
+        <w:t>Trigger:</w:t>
+      </w:r>
+      <w:r>
+        <w:t xml:space="preserve"> Anna clicks Refund on an order in the CMS.</w:t>
+      </w:r>
+    </w:p>
+    <w:p>
+      <w:r>
+        <w:rPr>
+          <w:b/>
+        </w:rPr>
+        <w:t>Endpoint:</w:t>
+      </w:r>
+      <w:r>
+        <w:t xml:space="preserve"> POST </w:t>
+      </w:r>
+      <w:r>
+        <w:rPr>
+          <w:rFonts w:ascii="Consolas" w:hAnsi="Consolas"/>
+          <w:sz w:val="20"/>
+        </w:rPr>
+        <w:t>/api/order-refund</w:t>
+      </w:r>
+      <w:r>
+        <w:t>.</w:t>
+      </w:r>
+    </w:p>
+    <w:p>
+      <w:r>
+        <w:t>Step by step:</w:t>
+      </w:r>
+    </w:p>
+    <w:p>
+      <w:pPr>
+        <w:pStyle w:val="ListNumber"/>
+      </w:pPr>
+      <w:r>
+        <w:t>Stripe refund API called.</w:t>
+      </w:r>
+    </w:p>
+    <w:p>
+      <w:pPr>
+        <w:pStyle w:val="ListNumber"/>
+      </w:pPr>
+      <w:r>
+        <w:t xml:space="preserve">Strapi order status flipped to </w:t>
+      </w:r>
+      <w:r>
+        <w:rPr>
+          <w:rFonts w:ascii="Consolas" w:hAnsi="Consolas"/>
+          <w:sz w:val="20"/>
+        </w:rPr>
+        <w:t>refunded</w:t>
+      </w:r>
+      <w:r>
+        <w:t>.</w:t>
+      </w:r>
+    </w:p>
+    <w:p>
+      <w:pPr>
+        <w:pStyle w:val="ListNumber"/>
+      </w:pPr>
+      <w:r>
+        <w:t xml:space="preserve">If the item had a </w:t>
+      </w:r>
+      <w:r>
+        <w:rPr>
+          <w:rFonts w:ascii="Consolas" w:hAnsi="Consolas"/>
+          <w:sz w:val="20"/>
+        </w:rPr>
+        <w:t>mailchimpTag</w:t>
+      </w:r>
+      <w:r>
+        <w:t>, that tag is REMOVED (customer stops receiving that programme's follow-up).</w:t>
+      </w:r>
+    </w:p>
+    <w:p>
+      <w:pPr>
+        <w:pStyle w:val="ListNumber"/>
+      </w:pPr>
+      <w:r>
+        <w:t xml:space="preserve">Resend fires </w:t>
+      </w:r>
+      <w:r>
+        <w:rPr>
+          <w:b/>
+        </w:rPr>
+        <w:t>order_refunded</w:t>
+      </w:r>
+      <w:r>
+        <w:t xml:space="preserve"> to the customer (amount + settlement time).</w:t>
+      </w:r>
+    </w:p>
+    <w:p>
+      <w:pPr>
+        <w:pStyle w:val="ListNumber"/>
+      </w:pPr>
+      <w:r>
+        <w:t xml:space="preserve">Resend fires </w:t>
+      </w:r>
+      <w:r>
+        <w:rPr>
+          <w:b/>
+        </w:rPr>
+        <w:t>admin_new_order</w:t>
+      </w:r>
+      <w:r>
+        <w:t xml:space="preserve"> to Anna as the audit trail.</w:t>
+      </w:r>
+    </w:p>
+    <w:p>
+      <w:r>
+        <w:t xml:space="preserve">The </w:t>
+      </w:r>
+      <w:r>
+        <w:rPr>
+          <w:b/>
+        </w:rPr>
+        <w:t>Shop Customers</w:t>
+      </w:r>
+      <w:r>
+        <w:t xml:space="preserve"> tag is KEPT â€” a refund doesn't un-mark them as a customer.</w:t>
+      </w:r>
+    </w:p>
+    <w:p>
+      <w:pPr>
+        <w:pStyle w:val="Heading3"/>
+      </w:pPr>
+      <w:r>
+        <w:t>18.7 Order status change (shipped / completed / return)</w:t>
+      </w:r>
+    </w:p>
+    <w:p>
+      <w:r>
+        <w:rPr>
+          <w:b/>
+        </w:rPr>
+        <w:t>Trigger:</w:t>
+      </w:r>
+      <w:r>
+        <w:t xml:space="preserve"> Anna changes an order status in the CMS.</w:t>
+      </w:r>
+    </w:p>
+    <w:p>
+      <w:r>
+        <w:rPr>
+          <w:b/>
+        </w:rPr>
+        <w:t>Endpoint:</w:t>
+      </w:r>
+      <w:r>
+        <w:t xml:space="preserve"> POST </w:t>
+      </w:r>
+      <w:r>
+        <w:rPr>
+          <w:rFonts w:ascii="Consolas" w:hAnsi="Consolas"/>
+          <w:sz w:val="20"/>
+        </w:rPr>
+        <w:t>/api/order-event</w:t>
+      </w:r>
+      <w:r>
+        <w:t>.</w:t>
+      </w:r>
+    </w:p>
+    <w:p>
+      <w:r>
+        <w:t>This is the flexible switchboard. Anna picks a template_key from the CMS Email Template collection. Known keys used:</w:t>
+      </w:r>
+    </w:p>
+    <w:tbl>
+      <w:tblPr>
+        <w:tblStyle w:val="LightGrid-Accent1"/>
+        <w:tblW w:type="auto" w:w="0"/>
+        <w:tblLook w:firstColumn="1" w:firstRow="1" w:lastColumn="0" w:lastRow="0" w:noHBand="0" w:noVBand="1" w:val="04A0"/>
+      </w:tblPr>
+      <w:tblGrid>
+        <w:gridCol w:w="2880"/>
+        <w:gridCol w:w="2880"/>
+        <w:gridCol w:w="2880"/>
+      </w:tblGrid>
+      <w:tr>
+        <w:tc>
+          <w:tcPr>
+            <w:tcW w:type="dxa" w:w="2880"/>
+          </w:tcPr>
+          <w:p>
+            <w:r/>
+            <w:r>
+              <w:rPr>
+                <w:b/>
+              </w:rPr>
+              <w:t>template_key</w:t>
+            </w:r>
+          </w:p>
+        </w:tc>
+        <w:tc>
+          <w:tcPr>
+            <w:tcW w:type="dxa" w:w="2880"/>
+          </w:tcPr>
+          <w:p>
+            <w:r/>
+            <w:r>
+              <w:rPr>
+                <w:b/>
+              </w:rPr>
+              <w:t>When it fires</w:t>
+            </w:r>
+          </w:p>
+        </w:tc>
+        <w:tc>
+          <w:tcPr>
+            <w:tcW w:type="dxa" w:w="2880"/>
+          </w:tcPr>
+          <w:p>
+            <w:r/>
+            <w:r>
+              <w:rPr>
+                <w:b/>
+              </w:rPr>
+              <w:t>To</w:t>
+            </w:r>
+          </w:p>
+        </w:tc>
+      </w:tr>
+      <w:tr>
+        <w:tc>
+          <w:tcPr>
+            <w:tcW w:type="dxa" w:w="2880"/>
+          </w:tcPr>
+          <w:p>
+            <w:r/>
+            <w:r>
+              <w:t>order_shipped</w:t>
+            </w:r>
+          </w:p>
+        </w:tc>
+        <w:tc>
+          <w:tcPr>
+            <w:tcW w:type="dxa" w:w="2880"/>
+          </w:tcPr>
+          <w:p>
+            <w:r/>
+            <w:r>
+              <w:t>On dispatch, with tracking URL</w:t>
+            </w:r>
+          </w:p>
+        </w:tc>
+        <w:tc>
+          <w:tcPr>
+            <w:tcW w:type="dxa" w:w="2880"/>
+          </w:tcPr>
+          <w:p>
+            <w:r/>
+            <w:r>
+              <w:t>Customer</w:t>
+            </w:r>
+          </w:p>
+        </w:tc>
+      </w:tr>
+      <w:tr>
+        <w:tc>
+          <w:tcPr>
+            <w:tcW w:type="dxa" w:w="2880"/>
+          </w:tcPr>
+          <w:p>
+            <w:r/>
+            <w:r>
+              <w:t>order_completed</w:t>
+            </w:r>
+          </w:p>
+        </w:tc>
+        <w:tc>
+          <w:tcPr>
+            <w:tcW w:type="dxa" w:w="2880"/>
+          </w:tcPr>
+          <w:p>
+            <w:r/>
+            <w:r>
+              <w:t>Delivery confirmed</w:t>
+            </w:r>
+          </w:p>
+        </w:tc>
+        <w:tc>
+          <w:tcPr>
+            <w:tcW w:type="dxa" w:w="2880"/>
+          </w:tcPr>
+          <w:p>
+            <w:r/>
+            <w:r>
+              <w:t>Customer</w:t>
+            </w:r>
+          </w:p>
+        </w:tc>
+      </w:tr>
+      <w:tr>
+        <w:tc>
+          <w:tcPr>
+            <w:tcW w:type="dxa" w:w="2880"/>
+          </w:tcPr>
+          <w:p>
+            <w:r/>
+            <w:r>
+              <w:t>return_requested</w:t>
+            </w:r>
+          </w:p>
+        </w:tc>
+        <w:tc>
+          <w:tcPr>
+            <w:tcW w:type="dxa" w:w="2880"/>
+          </w:tcPr>
+          <w:p>
+            <w:r/>
+            <w:r>
+              <w:t>Customer requests a return</w:t>
+            </w:r>
+          </w:p>
+        </w:tc>
+        <w:tc>
+          <w:tcPr>
+            <w:tcW w:type="dxa" w:w="2880"/>
+          </w:tcPr>
+          <w:p>
+            <w:r/>
+            <w:r>
+              <w:t>Customer</w:t>
+            </w:r>
+          </w:p>
+        </w:tc>
+      </w:tr>
+      <w:tr>
+        <w:tc>
+          <w:tcPr>
+            <w:tcW w:type="dxa" w:w="2880"/>
+          </w:tcPr>
+          <w:p>
+            <w:r/>
+            <w:r>
+              <w:t>return_approved</w:t>
+            </w:r>
+          </w:p>
+        </w:tc>
+        <w:tc>
+          <w:tcPr>
+            <w:tcW w:type="dxa" w:w="2880"/>
+          </w:tcPr>
+          <w:p>
+            <w:r/>
+            <w:r>
+              <w:t>Anna approves the return</w:t>
+            </w:r>
+          </w:p>
+        </w:tc>
+        <w:tc>
+          <w:tcPr>
+            <w:tcW w:type="dxa" w:w="2880"/>
+          </w:tcPr>
+          <w:p>
+            <w:r/>
+            <w:r>
+              <w:t>Customer</w:t>
+            </w:r>
+          </w:p>
+        </w:tc>
+      </w:tr>
+      <w:tr>
+        <w:tc>
+          <w:tcPr>
+            <w:tcW w:type="dxa" w:w="2880"/>
+          </w:tcPr>
+          <w:p>
+            <w:r/>
+            <w:r>
+              <w:t>return_received</w:t>
+            </w:r>
+          </w:p>
+        </w:tc>
+        <w:tc>
+          <w:tcPr>
+            <w:tcW w:type="dxa" w:w="2880"/>
+          </w:tcPr>
+          <w:p>
+            <w:r/>
+            <w:r>
+              <w:t>Anna marks the item received</w:t>
+            </w:r>
+          </w:p>
+        </w:tc>
+        <w:tc>
+          <w:tcPr>
+            <w:tcW w:type="dxa" w:w="2880"/>
+          </w:tcPr>
+          <w:p>
+            <w:r/>
+            <w:r>
+              <w:t>Customer</w:t>
+            </w:r>
+          </w:p>
+        </w:tc>
+      </w:tr>
+      <w:tr>
+        <w:tc>
+          <w:tcPr>
+            <w:tcW w:type="dxa" w:w="2880"/>
+          </w:tcPr>
+          <w:p>
+            <w:r/>
+            <w:r>
+              <w:t>return_rejected</w:t>
+            </w:r>
+          </w:p>
+        </w:tc>
+        <w:tc>
+          <w:tcPr>
+            <w:tcW w:type="dxa" w:w="2880"/>
+          </w:tcPr>
+          <w:p>
+            <w:r/>
+            <w:r>
+              <w:t>Anna rejects the return</w:t>
+            </w:r>
+          </w:p>
+        </w:tc>
+        <w:tc>
+          <w:tcPr>
+            <w:tcW w:type="dxa" w:w="2880"/>
+          </w:tcPr>
+          <w:p>
+            <w:r/>
+            <w:r>
+              <w:t>Customer</w:t>
+            </w:r>
+          </w:p>
+        </w:tc>
+      </w:tr>
+      <w:tr>
+        <w:tc>
+          <w:tcPr>
+            <w:tcW w:type="dxa" w:w="2880"/>
+          </w:tcPr>
+          <w:p>
+            <w:r/>
+            <w:r>
+              <w:t>admin_return_requested</w:t>
+            </w:r>
+          </w:p>
+        </w:tc>
+        <w:tc>
+          <w:tcPr>
+            <w:tcW w:type="dxa" w:w="2880"/>
+          </w:tcPr>
+          <w:p>
+            <w:r/>
+            <w:r>
+              <w:t>Customer submits return request</w:t>
+            </w:r>
+          </w:p>
+        </w:tc>
+        <w:tc>
+          <w:tcPr>
+            <w:tcW w:type="dxa" w:w="2880"/>
+          </w:tcPr>
+          <w:p>
+            <w:r/>
+            <w:r>
+              <w:t>Anna</w:t>
+            </w:r>
+          </w:p>
+        </w:tc>
+      </w:tr>
+    </w:tbl>
+    <w:p>
+      <w:r>
+        <w:t>Wording lives in the CMS â€” Anna edits each row without touching code.</w:t>
+      </w:r>
+    </w:p>
+    <w:p>
+      <w:pPr>
+        <w:pStyle w:val="Heading3"/>
+      </w:pPr>
+      <w:r>
+        <w:t>18.8 Calendly booking (Discovery, One Day, Reset Session, etc.)</w:t>
+      </w:r>
+    </w:p>
+    <w:p>
+      <w:r>
+        <w:rPr>
+          <w:b/>
+        </w:rPr>
+        <w:t>Trigger:</w:t>
+      </w:r>
+      <w:r>
+        <w:t xml:space="preserve"> visitor books via any of Anna's Calendly links.</w:t>
+      </w:r>
+    </w:p>
+    <w:p>
+      <w:r>
+        <w:rPr>
+          <w:b/>
+        </w:rPr>
+        <w:t>Endpoint:</w:t>
+      </w:r>
+      <w:r>
+        <w:t xml:space="preserve"> Calendly webhook â†’ POST </w:t>
+      </w:r>
+      <w:r>
+        <w:rPr>
+          <w:rFonts w:ascii="Consolas" w:hAnsi="Consolas"/>
+          <w:sz w:val="20"/>
+        </w:rPr>
+        <w:t>/api/calendly/webhook</w:t>
+      </w:r>
+      <w:r>
+        <w:t>.</w:t>
+      </w:r>
+    </w:p>
+    <w:p>
+      <w:r>
+        <w:t>Step by step:</w:t>
+      </w:r>
+    </w:p>
+    <w:p>
+      <w:pPr>
+        <w:pStyle w:val="ListNumber"/>
+      </w:pPr>
+      <w:r>
+        <w:t>Calendly webhook signature verified (HMAC-SHA256).</w:t>
+      </w:r>
+    </w:p>
+    <w:p>
+      <w:pPr>
+        <w:pStyle w:val="ListNumber"/>
+      </w:pPr>
+      <w:r>
+        <w:t>Calendly event slug looked up in EVENT_TAG_MAP.</w:t>
+      </w:r>
+    </w:p>
+    <w:p>
+      <w:pPr>
+        <w:pStyle w:val="ListNumber"/>
+      </w:pPr>
+      <w:r>
+        <w:t>Email upserted in Mailchimp with FNAME.</w:t>
+      </w:r>
+    </w:p>
+    <w:p>
+      <w:pPr>
+        <w:pStyle w:val="ListNumber"/>
+      </w:pPr>
+      <w:r>
+        <w:t>Mailchimp tag applied per the map below.</w:t>
+      </w:r>
+    </w:p>
+    <w:p>
+      <w:pPr>
+        <w:pStyle w:val="ListNumber"/>
+      </w:pPr>
+      <w:r>
+        <w:t xml:space="preserve">Mailchimp merge fields set: </w:t>
+      </w:r>
+      <w:r>
+        <w:rPr>
+          <w:rFonts w:ascii="Consolas" w:hAnsi="Consolas"/>
+          <w:sz w:val="20"/>
+        </w:rPr>
+        <w:t>EVENT_DATE</w:t>
+      </w:r>
+      <w:r>
+        <w:t xml:space="preserve">, </w:t>
+      </w:r>
+      <w:r>
+        <w:rPr>
+          <w:rFonts w:ascii="Consolas" w:hAnsi="Consolas"/>
+          <w:sz w:val="20"/>
+        </w:rPr>
+        <w:t>EVENT_TIME</w:t>
+      </w:r>
+      <w:r>
+        <w:t xml:space="preserve">, </w:t>
+      </w:r>
+      <w:r>
+        <w:rPr>
+          <w:rFonts w:ascii="Consolas" w:hAnsi="Consolas"/>
+          <w:sz w:val="20"/>
+        </w:rPr>
+        <w:t>EVENT_NAME</w:t>
+      </w:r>
+      <w:r>
+        <w:t xml:space="preserve">, </w:t>
+      </w:r>
+      <w:r>
+        <w:rPr>
+          <w:rFonts w:ascii="Consolas" w:hAnsi="Consolas"/>
+          <w:sz w:val="20"/>
+        </w:rPr>
+        <w:t>EVENT_LOC</w:t>
+      </w:r>
+      <w:r>
+        <w:t xml:space="preserve">. Anna can reference these inside Mailchimp email bodies as </w:t>
+      </w:r>
+      <w:r>
+        <w:rPr>
+          <w:rFonts w:ascii="Consolas" w:hAnsi="Consolas"/>
+          <w:sz w:val="20"/>
+        </w:rPr>
+        <w:t>|EVENT_DATE|</w:t>
+      </w:r>
+      <w:r>
+        <w:t xml:space="preserve"> etc.</w:t>
+      </w:r>
+    </w:p>
+    <w:p>
+      <w:r>
+        <w:t>Slug â†’ tag map:</w:t>
+      </w:r>
+    </w:p>
+    <w:tbl>
+      <w:tblPr>
+        <w:tblStyle w:val="LightGrid-Accent1"/>
+        <w:tblW w:type="auto" w:w="0"/>
+        <w:tblLook w:firstColumn="1" w:firstRow="1" w:lastColumn="0" w:lastRow="0" w:noHBand="0" w:noVBand="1" w:val="04A0"/>
+      </w:tblPr>
+      <w:tblGrid>
+        <w:gridCol w:w="4320"/>
+        <w:gridCol w:w="4320"/>
+      </w:tblGrid>
+      <w:tr>
+        <w:tc>
+          <w:tcPr>
+            <w:tcW w:type="dxa" w:w="4320"/>
+          </w:tcPr>
+          <w:p>
+            <w:r/>
+            <w:r>
+              <w:rPr>
+                <w:b/>
+              </w:rPr>
+              <w:t>Calendly slug</w:t>
+            </w:r>
+          </w:p>
+        </w:tc>
+        <w:tc>
+          <w:tcPr>
+            <w:tcW w:type="dxa" w:w="4320"/>
+          </w:tcPr>
+          <w:p>
+            <w:r/>
+            <w:r>
+              <w:rPr>
+                <w:b/>
+              </w:rPr>
+              <w:t>Tag applied</w:t>
+            </w:r>
+          </w:p>
+        </w:tc>
+      </w:tr>
+      <w:tr>
+        <w:tc>
+          <w:tcPr>
+            <w:tcW w:type="dxa" w:w="4320"/>
+          </w:tcPr>
+          <w:p>
+            <w:r/>
+            <w:r>
+              <w:t>one-day-intensive OR one-day</w:t>
+            </w:r>
+          </w:p>
+        </w:tc>
+        <w:tc>
+          <w:tcPr>
+            <w:tcW w:type="dxa" w:w="4320"/>
+          </w:tcPr>
+          <w:p>
+            <w:r/>
+            <w:r>
+              <w:t>One Day Booked</w:t>
+            </w:r>
+          </w:p>
+        </w:tc>
+      </w:tr>
+      <w:tr>
+        <w:tc>
+          <w:tcPr>
+            <w:tcW w:type="dxa" w:w="4320"/>
+          </w:tcPr>
+          <w:p>
+            <w:r/>
+            <w:r>
+              <w:t>discovery-call OR discovery</w:t>
+            </w:r>
+          </w:p>
+        </w:tc>
+        <w:tc>
+          <w:tcPr>
+            <w:tcW w:type="dxa" w:w="4320"/>
+          </w:tcPr>
+          <w:p>
+            <w:r/>
+            <w:r>
+              <w:t>Discovery Booked</w:t>
+            </w:r>
+          </w:p>
+        </w:tc>
+      </w:tr>
+      <w:tr>
+        <w:tc>
+          <w:tcPr>
+            <w:tcW w:type="dxa" w:w="4320"/>
+          </w:tcPr>
+          <w:p>
+            <w:r/>
+            <w:r>
+              <w:t>signal-scoping</w:t>
+            </w:r>
+          </w:p>
+        </w:tc>
+        <w:tc>
+          <w:tcPr>
+            <w:tcW w:type="dxa" w:w="4320"/>
+          </w:tcPr>
+          <w:p>
+            <w:r/>
+            <w:r>
+              <w:t>Signal Scoping Booked</w:t>
+            </w:r>
+          </w:p>
+        </w:tc>
+      </w:tr>
+      <w:tr>
+        <w:tc>
+          <w:tcPr>
+            <w:tcW w:type="dxa" w:w="4320"/>
+          </w:tcPr>
+          <w:p>
+            <w:r/>
+            <w:r>
+              <w:t>reset-session</w:t>
+            </w:r>
+          </w:p>
+        </w:tc>
+        <w:tc>
+          <w:tcPr>
+            <w:tcW w:type="dxa" w:w="4320"/>
+          </w:tcPr>
+          <w:p>
+            <w:r/>
+            <w:r>
+              <w:t>Reset Session Booked</w:t>
+            </w:r>
+          </w:p>
+        </w:tc>
+      </w:tr>
+      <w:tr>
+        <w:tc>
+          <w:tcPr>
+            <w:tcW w:type="dxa" w:w="4320"/>
+          </w:tcPr>
+          <w:p>
+            <w:r/>
+            <w:r>
+              <w:t>anything else</w:t>
+            </w:r>
+          </w:p>
+        </w:tc>
+        <w:tc>
+          <w:tcPr>
+            <w:tcW w:type="dxa" w:w="4320"/>
+          </w:tcPr>
+          <w:p>
+            <w:r/>
+            <w:r>
+              <w:t>Calendly Booked (fallback)</w:t>
+            </w:r>
+          </w:p>
+        </w:tc>
+      </w:tr>
+    </w:tbl>
+    <w:p>
+      <w:r>
+        <w:rPr>
+          <w:b/>
+        </w:rPr>
+        <w:t>Resend emails:</w:t>
+      </w:r>
+      <w:r>
+        <w:t xml:space="preserve"> none (Calendly sends its own booking confirmation).</w:t>
+      </w:r>
+    </w:p>
+    <w:p>
+      <w:pPr>
+        <w:pStyle w:val="Heading3"/>
+      </w:pPr>
+      <w:r>
+        <w:t>18.9 Password reset</w:t>
+      </w:r>
+    </w:p>
+    <w:p>
+      <w:r>
+        <w:rPr>
+          <w:b/>
+        </w:rPr>
+        <w:t>Trigger:</w:t>
+      </w:r>
+      <w:r>
+        <w:t xml:space="preserve"> visitor clicks "forgot password" on </w:t>
+      </w:r>
+      <w:r>
+        <w:rPr>
+          <w:rFonts w:ascii="Consolas" w:hAnsi="Consolas"/>
+          <w:sz w:val="20"/>
+        </w:rPr>
+        <w:t>/login</w:t>
+      </w:r>
+      <w:r>
+        <w:t>.</w:t>
+      </w:r>
+    </w:p>
+    <w:p>
+      <w:r>
+        <w:rPr>
+          <w:b/>
+        </w:rPr>
+        <w:t>Endpoint:</w:t>
+      </w:r>
+      <w:r>
+        <w:t xml:space="preserve"> POST </w:t>
+      </w:r>
+      <w:r>
+        <w:rPr>
+          <w:rFonts w:ascii="Consolas" w:hAnsi="Consolas"/>
+          <w:sz w:val="20"/>
+        </w:rPr>
+        <w:t>/api/auth/forgot-password</w:t>
+      </w:r>
+      <w:r>
+        <w:t>.</w:t>
+      </w:r>
+    </w:p>
+    <w:p>
+      <w:r>
+        <w:t>Step by step:</w:t>
+      </w:r>
+    </w:p>
+    <w:p>
+      <w:pPr>
+        <w:pStyle w:val="ListNumber"/>
+      </w:pPr>
+      <w:r>
+        <w:t>Email validated + rate-limited.</w:t>
+      </w:r>
+    </w:p>
+    <w:p>
+      <w:pPr>
+        <w:pStyle w:val="ListNumber"/>
+      </w:pPr>
+      <w:r>
+        <w:t>One-time reset token stored on the user in Strapi.</w:t>
+      </w:r>
+    </w:p>
+    <w:p>
+      <w:pPr>
+        <w:pStyle w:val="ListNumber"/>
+      </w:pPr>
+      <w:r>
+        <w:t xml:space="preserve">Resend fires </w:t>
+      </w:r>
+      <w:r>
+        <w:rPr>
+          <w:b/>
+        </w:rPr>
+        <w:t>password_reset</w:t>
+      </w:r>
+      <w:r>
+        <w:t xml:space="preserve"> with the reset link.</w:t>
+      </w:r>
+    </w:p>
+    <w:p>
+      <w:r>
+        <w:rPr>
+          <w:b/>
+        </w:rPr>
+        <w:t>Mailchimp:</w:t>
+      </w:r>
+      <w:r>
+        <w:t xml:space="preserve"> no tag applied â€” this is a security event, not marketing.</w:t>
+      </w:r>
+    </w:p>
+    <w:p>
+      <w:pPr>
+        <w:pStyle w:val="Heading3"/>
+      </w:pPr>
+      <w:r>
+        <w:t>18.10 Mailchimp tag catalogue (source of truth for journey wiring)</w:t>
+      </w:r>
+    </w:p>
+    <w:p>
+      <w:r>
+        <w:t>Every tag the site can apply and what journey Anna should wire in Mailchimp:</w:t>
+      </w:r>
+    </w:p>
+    <w:tbl>
+      <w:tblPr>
+        <w:tblStyle w:val="LightGrid-Accent1"/>
+        <w:tblW w:type="auto" w:w="0"/>
+        <w:tblLook w:firstColumn="1" w:firstRow="1" w:lastColumn="0" w:lastRow="0" w:noHBand="0" w:noVBand="1" w:val="04A0"/>
+      </w:tblPr>
+      <w:tblGrid>
+        <w:gridCol w:w="2880"/>
+        <w:gridCol w:w="2880"/>
+        <w:gridCol w:w="2880"/>
+      </w:tblGrid>
+      <w:tr>
+        <w:tc>
+          <w:tcPr>
+            <w:tcW w:type="dxa" w:w="2880"/>
+          </w:tcPr>
+          <w:p>
+            <w:r/>
+            <w:r>
+              <w:rPr>
+                <w:b/>
+              </w:rPr>
+              <w:t>Tag</w:t>
+            </w:r>
+          </w:p>
+        </w:tc>
+        <w:tc>
+          <w:tcPr>
+            <w:tcW w:type="dxa" w:w="2880"/>
+          </w:tcPr>
+          <w:p>
+            <w:r/>
+            <w:r>
+              <w:rPr>
+                <w:b/>
+              </w:rPr>
+              <w:t>Fires when</w:t>
+            </w:r>
+          </w:p>
+        </w:tc>
+        <w:tc>
+          <w:tcPr>
+            <w:tcW w:type="dxa" w:w="2880"/>
+          </w:tcPr>
+          <w:p>
+            <w:r/>
+            <w:r>
+              <w:rPr>
+                <w:b/>
+              </w:rPr>
+              <w:t>Mailchimp journey</w:t>
+            </w:r>
+          </w:p>
+        </w:tc>
+      </w:tr>
+      <w:tr>
+        <w:tc>
+          <w:tcPr>
+            <w:tcW w:type="dxa" w:w="2880"/>
+          </w:tcPr>
+          <w:p>
+            <w:r/>
+            <w:r>
+              <w:t>Founding Members</w:t>
+            </w:r>
+          </w:p>
+        </w:tc>
+        <w:tc>
+          <w:tcPr>
+            <w:tcW w:type="dxa" w:w="2880"/>
+          </w:tcPr>
+          <w:p>
+            <w:r/>
+            <w:r>
+              <w:t>Reset Letters signup before launch date</w:t>
+            </w:r>
+          </w:p>
+        </w:tc>
+        <w:tc>
+          <w:tcPr>
+            <w:tcW w:type="dxa" w:w="2880"/>
+          </w:tcPr>
+          <w:p>
+            <w:r/>
+            <w:r>
+              <w:t>Founding Members welcome</w:t>
+            </w:r>
+          </w:p>
+        </w:tc>
+      </w:tr>
+      <w:tr>
+        <w:tc>
+          <w:tcPr>
+            <w:tcW w:type="dxa" w:w="2880"/>
+          </w:tcPr>
+          <w:p>
+            <w:r/>
+            <w:r>
+              <w:t>Standard Subscribers</w:t>
+            </w:r>
+          </w:p>
+        </w:tc>
+        <w:tc>
+          <w:tcPr>
+            <w:tcW w:type="dxa" w:w="2880"/>
+          </w:tcPr>
+          <w:p>
+            <w:r/>
+            <w:r>
+              <w:t>Reset Letters signup after launch date OR after 500 cap</w:t>
+            </w:r>
+          </w:p>
+        </w:tc>
+        <w:tc>
+          <w:tcPr>
+            <w:tcW w:type="dxa" w:w="2880"/>
+          </w:tcPr>
+          <w:p>
+            <w:r/>
+            <w:r>
+              <w:t>Standard Subscribers welcome</w:t>
+            </w:r>
+          </w:p>
+        </w:tc>
+      </w:tr>
+      <w:tr>
+        <w:tc>
+          <w:tcPr>
+            <w:tcW w:type="dxa" w:w="2880"/>
+          </w:tcPr>
+          <w:p>
+            <w:r/>
+            <w:r>
+              <w:t>Decoder Subscriber</w:t>
+            </w:r>
+          </w:p>
+        </w:tc>
+        <w:tc>
+          <w:tcPr>
+            <w:tcW w:type="dxa" w:w="2880"/>
+          </w:tcPr>
+          <w:p>
+            <w:r/>
+            <w:r>
+              <w:t>Nervous System Decoder signup</w:t>
+            </w:r>
+          </w:p>
+        </w:tc>
+        <w:tc>
+          <w:tcPr>
+            <w:tcW w:type="dxa" w:w="2880"/>
+          </w:tcPr>
+          <w:p>
+            <w:r/>
+            <w:r>
+              <w:t>Decoder welcome + PDF delivery</w:t>
+            </w:r>
+          </w:p>
+        </w:tc>
+      </w:tr>
+      <w:tr>
+        <w:tc>
+          <w:tcPr>
+            <w:tcW w:type="dxa" w:w="2880"/>
+          </w:tcPr>
+          <w:p>
+            <w:r/>
+            <w:r>
+              <w:t>REGULATED Buyer</w:t>
+            </w:r>
+          </w:p>
+        </w:tc>
+        <w:tc>
+          <w:tcPr>
+            <w:tcW w:type="dxa" w:w="2880"/>
+          </w:tcPr>
+          <w:p>
+            <w:r/>
+            <w:r>
+              <w:t>REGULATED programme purchased</w:t>
+            </w:r>
+          </w:p>
+        </w:tc>
+        <w:tc>
+          <w:tcPr>
+            <w:tcW w:type="dxa" w:w="2880"/>
+          </w:tcPr>
+          <w:p>
+            <w:r/>
+            <w:r>
+              <w:t>REGULATED Follow-up (also exits Decoder Upsell)</w:t>
+            </w:r>
+          </w:p>
+        </w:tc>
+      </w:tr>
+      <w:tr>
+        <w:tc>
+          <w:tcPr>
+            <w:tcW w:type="dxa" w:w="2880"/>
+          </w:tcPr>
+          <w:p>
+            <w:r/>
+            <w:r>
+              <w:t>Shop Customers</w:t>
+            </w:r>
+          </w:p>
+        </w:tc>
+        <w:tc>
+          <w:tcPr>
+            <w:tcW w:type="dxa" w:w="2880"/>
+          </w:tcPr>
+          <w:p>
+            <w:r/>
+            <w:r>
+              <w:t>Any completed shop purchase</w:t>
+            </w:r>
+          </w:p>
+        </w:tc>
+        <w:tc>
+          <w:tcPr>
+            <w:tcW w:type="dxa" w:w="2880"/>
+          </w:tcPr>
+          <w:p>
+            <w:r/>
+            <w:r>
+              <w:t>Shop welcome / thank-you</w:t>
+            </w:r>
+          </w:p>
+        </w:tc>
+      </w:tr>
+      <w:tr>
+        <w:tc>
+          <w:tcPr>
+            <w:tcW w:type="dxa" w:w="2880"/>
+          </w:tcPr>
+          <w:p>
+            <w:r/>
+            <w:r>
+              <w:t>Practitioner Enquiry</w:t>
+            </w:r>
+          </w:p>
+        </w:tc>
+        <w:tc>
+          <w:tcPr>
+            <w:tcW w:type="dxa" w:w="2880"/>
+          </w:tcPr>
+          <w:p>
+            <w:r/>
+            <w:r>
+              <w:t>Practitioner form submitted</w:t>
+            </w:r>
+          </w:p>
+        </w:tc>
+        <w:tc>
+          <w:tcPr>
+            <w:tcW w:type="dxa" w:w="2880"/>
+          </w:tcPr>
+          <w:p>
+            <w:r/>
+            <w:r>
+              <w:t>Practitioner review + application</w:t>
+            </w:r>
+          </w:p>
+        </w:tc>
+      </w:tr>
+      <w:tr>
+        <w:tc>
+          <w:tcPr>
+            <w:tcW w:type="dxa" w:w="2880"/>
+          </w:tcPr>
+          <w:p>
+            <w:r/>
+            <w:r>
+              <w:t>Returning Circle Enquiry</w:t>
+            </w:r>
+          </w:p>
+        </w:tc>
+        <w:tc>
+          <w:tcPr>
+            <w:tcW w:type="dxa" w:w="2880"/>
+          </w:tcPr>
+          <w:p>
+            <w:r/>
+            <w:r>
+              <w:t>Returning Circle form</w:t>
+            </w:r>
+          </w:p>
+        </w:tc>
+        <w:tc>
+          <w:tcPr>
+            <w:tcW w:type="dxa" w:w="2880"/>
+          </w:tcPr>
+          <w:p>
+            <w:r/>
+            <w:r>
+              <w:t>Returning Circle next steps</w:t>
+            </w:r>
+          </w:p>
+        </w:tc>
+      </w:tr>
+      <w:tr>
+        <w:tc>
+          <w:tcPr>
+            <w:tcW w:type="dxa" w:w="2880"/>
+          </w:tcPr>
+          <w:p>
+            <w:r/>
+            <w:r>
+              <w:t>Signal Collective Enquiry</w:t>
+            </w:r>
+          </w:p>
+        </w:tc>
+        <w:tc>
+          <w:tcPr>
+            <w:tcW w:type="dxa" w:w="2880"/>
+          </w:tcPr>
+          <w:p>
+            <w:r/>
+            <w:r>
+              <w:t>Signal Collective form</w:t>
+            </w:r>
+          </w:p>
+        </w:tc>
+        <w:tc>
+          <w:tcPr>
+            <w:tcW w:type="dxa" w:w="2880"/>
+          </w:tcPr>
+          <w:p>
+            <w:r/>
+            <w:r>
+              <w:t>Signal Collective next steps</w:t>
+            </w:r>
+          </w:p>
+        </w:tc>
+      </w:tr>
+      <w:tr>
+        <w:tc>
+          <w:tcPr>
+            <w:tcW w:type="dxa" w:w="2880"/>
+          </w:tcPr>
+          <w:p>
+            <w:r/>
+            <w:r>
+              <w:t>Recovery Coaching Enquiry</w:t>
+            </w:r>
+          </w:p>
+        </w:tc>
+        <w:tc>
+          <w:tcPr>
+            <w:tcW w:type="dxa" w:w="2880"/>
+          </w:tcPr>
+          <w:p>
+            <w:r/>
+            <w:r>
+              <w:t>Recovery Coaching form</w:t>
+            </w:r>
+          </w:p>
+        </w:tc>
+        <w:tc>
+          <w:tcPr>
+            <w:tcW w:type="dxa" w:w="2880"/>
+          </w:tcPr>
+          <w:p>
+            <w:r/>
+            <w:r>
+              <w:t>Recovery Coaching intake</w:t>
+            </w:r>
+          </w:p>
+        </w:tc>
+      </w:tr>
+      <w:tr>
+        <w:tc>
+          <w:tcPr>
+            <w:tcW w:type="dxa" w:w="2880"/>
+          </w:tcPr>
+          <w:p>
+            <w:r/>
+            <w:r>
+              <w:t>One Day Enquiry</w:t>
+            </w:r>
+          </w:p>
+        </w:tc>
+        <w:tc>
+          <w:tcPr>
+            <w:tcW w:type="dxa" w:w="2880"/>
+          </w:tcPr>
+          <w:p>
+            <w:r/>
+            <w:r>
+              <w:t>One Day form</w:t>
+            </w:r>
+          </w:p>
+        </w:tc>
+        <w:tc>
+          <w:tcPr>
+            <w:tcW w:type="dxa" w:w="2880"/>
+          </w:tcPr>
+          <w:p>
+            <w:r/>
+            <w:r>
+              <w:t>One Day pre-booking nurture</w:t>
+            </w:r>
+          </w:p>
+        </w:tc>
+      </w:tr>
+      <w:tr>
+        <w:tc>
+          <w:tcPr>
+            <w:tcW w:type="dxa" w:w="2880"/>
+          </w:tcPr>
+          <w:p>
+            <w:r/>
+            <w:r>
+              <w:t>Speaking Enquiry</w:t>
+            </w:r>
+          </w:p>
+        </w:tc>
+        <w:tc>
+          <w:tcPr>
+            <w:tcW w:type="dxa" w:w="2880"/>
+          </w:tcPr>
+          <w:p>
+            <w:r/>
+            <w:r>
+              <w:t>Speaking form</w:t>
+            </w:r>
+          </w:p>
+        </w:tc>
+        <w:tc>
+          <w:tcPr>
+            <w:tcW w:type="dxa" w:w="2880"/>
+          </w:tcPr>
+          <w:p>
+            <w:r/>
+            <w:r>
+              <w:t>Speaking follow-up</w:t>
+            </w:r>
+          </w:p>
+        </w:tc>
+      </w:tr>
+      <w:tr>
+        <w:tc>
+          <w:tcPr>
+            <w:tcW w:type="dxa" w:w="2880"/>
+          </w:tcPr>
+          <w:p>
+            <w:r/>
+            <w:r>
+              <w:t>Corporate Wellbeing Enquiry</w:t>
+            </w:r>
+          </w:p>
+        </w:tc>
+        <w:tc>
+          <w:tcPr>
+            <w:tcW w:type="dxa" w:w="2880"/>
+          </w:tcPr>
+          <w:p>
+            <w:r/>
+            <w:r>
+              <w:t>Corporate Wellbeing form</w:t>
+            </w:r>
+          </w:p>
+        </w:tc>
+        <w:tc>
+          <w:tcPr>
+            <w:tcW w:type="dxa" w:w="2880"/>
+          </w:tcPr>
+          <w:p>
+            <w:r/>
+            <w:r>
+              <w:t>Corporate proposal + follow-up</w:t>
+            </w:r>
+          </w:p>
+        </w:tc>
+      </w:tr>
+      <w:tr>
+        <w:tc>
+          <w:tcPr>
+            <w:tcW w:type="dxa" w:w="2880"/>
+          </w:tcPr>
+          <w:p>
+            <w:r/>
+            <w:r>
+              <w:t>One Day Booked</w:t>
+            </w:r>
+          </w:p>
+        </w:tc>
+        <w:tc>
+          <w:tcPr>
+            <w:tcW w:type="dxa" w:w="2880"/>
+          </w:tcPr>
+          <w:p>
+            <w:r/>
+            <w:r>
+              <w:t>One Day booked in Calendly</w:t>
+            </w:r>
+          </w:p>
+        </w:tc>
+        <w:tc>
+          <w:tcPr>
+            <w:tcW w:type="dxa" w:w="2880"/>
+          </w:tcPr>
+          <w:p>
+            <w:r/>
+            <w:r>
+              <w:t>One Day pre-call sequence (uses EVENT_DATE)</w:t>
+            </w:r>
+          </w:p>
+        </w:tc>
+      </w:tr>
+      <w:tr>
+        <w:tc>
+          <w:tcPr>
+            <w:tcW w:type="dxa" w:w="2880"/>
+          </w:tcPr>
+          <w:p>
+            <w:r/>
+            <w:r>
+              <w:t>Discovery Booked</w:t>
+            </w:r>
+          </w:p>
+        </w:tc>
+        <w:tc>
+          <w:tcPr>
+            <w:tcW w:type="dxa" w:w="2880"/>
+          </w:tcPr>
+          <w:p>
+            <w:r/>
+            <w:r>
+              <w:t>Discovery call booked in Calendly</w:t>
+            </w:r>
+          </w:p>
+        </w:tc>
+        <w:tc>
+          <w:tcPr>
+            <w:tcW w:type="dxa" w:w="2880"/>
+          </w:tcPr>
+          <w:p>
+            <w:r/>
+            <w:r>
+              <w:t>Discovery pre-call preparation</w:t>
+            </w:r>
+          </w:p>
+        </w:tc>
+      </w:tr>
+      <w:tr>
+        <w:tc>
+          <w:tcPr>
+            <w:tcW w:type="dxa" w:w="2880"/>
+          </w:tcPr>
+          <w:p>
+            <w:r/>
+            <w:r>
+              <w:t>Signal Scoping Booked</w:t>
+            </w:r>
+          </w:p>
+        </w:tc>
+        <w:tc>
+          <w:tcPr>
+            <w:tcW w:type="dxa" w:w="2880"/>
+          </w:tcPr>
+          <w:p>
+            <w:r/>
+            <w:r>
+              <w:t>Signal Scoping booked</w:t>
+            </w:r>
+          </w:p>
+        </w:tc>
+        <w:tc>
+          <w:tcPr>
+            <w:tcW w:type="dxa" w:w="2880"/>
+          </w:tcPr>
+          <w:p>
+            <w:r/>
+            <w:r>
+              <w:t>Signal Scoping pre-call</w:t>
+            </w:r>
+          </w:p>
+        </w:tc>
+      </w:tr>
+      <w:tr>
+        <w:tc>
+          <w:tcPr>
+            <w:tcW w:type="dxa" w:w="2880"/>
+          </w:tcPr>
+          <w:p>
+            <w:r/>
+            <w:r>
+              <w:t>Reset Session Booked</w:t>
+            </w:r>
+          </w:p>
+        </w:tc>
+        <w:tc>
+          <w:tcPr>
+            <w:tcW w:type="dxa" w:w="2880"/>
+          </w:tcPr>
+          <w:p>
+            <w:r/>
+            <w:r>
+              <w:t>Reset Session booked</w:t>
+            </w:r>
+          </w:p>
+        </w:tc>
+        <w:tc>
+          <w:tcPr>
+            <w:tcW w:type="dxa" w:w="2880"/>
+          </w:tcPr>
+          <w:p>
+            <w:r/>
+            <w:r>
+              <w:t>Reset Session pre-call</w:t>
+            </w:r>
+          </w:p>
+        </w:tc>
+      </w:tr>
+      <w:tr>
+        <w:tc>
+          <w:tcPr>
+            <w:tcW w:type="dxa" w:w="2880"/>
+          </w:tcPr>
+          <w:p>
+            <w:r/>
+            <w:r>
+              <w:t>Calendly Booked</w:t>
+            </w:r>
+          </w:p>
+        </w:tc>
+        <w:tc>
+          <w:tcPr>
+            <w:tcW w:type="dxa" w:w="2880"/>
+          </w:tcPr>
+          <w:p>
+            <w:r/>
+            <w:r>
+              <w:t>Any Calendly booking without a specific mapping</w:t>
+            </w:r>
+          </w:p>
+        </w:tc>
+        <w:tc>
+          <w:tcPr>
+            <w:tcW w:type="dxa" w:w="2880"/>
+          </w:tcPr>
+          <w:p>
+            <w:r/>
+            <w:r>
+              <w:t>Generic Calendly pre-call fallback</w:t>
+            </w:r>
+          </w:p>
+        </w:tc>
+      </w:tr>
+      <w:tr>
+        <w:tc>
+          <w:tcPr>
+            <w:tcW w:type="dxa" w:w="2880"/>
+          </w:tcPr>
+          <w:p>
+            <w:r/>
+            <w:r>
+              <w:t>Origin: &lt;source&gt;</w:t>
+            </w:r>
+          </w:p>
+        </w:tc>
+        <w:tc>
+          <w:tcPr>
+            <w:tcW w:type="dxa" w:w="2880"/>
+          </w:tcPr>
+          <w:p>
+            <w:r/>
+            <w:r>
+              <w:t>Second tag on any signup with ?utm_source=...</w:t>
+            </w:r>
+          </w:p>
+        </w:tc>
+        <w:tc>
+          <w:tcPr>
+            <w:tcW w:type="dxa" w:w="2880"/>
+          </w:tcPr>
+          <w:p>
+            <w:r/>
+            <w:r>
+              <w:t>Optional per-source welcome fork</w:t>
+            </w:r>
+          </w:p>
+        </w:tc>
+      </w:tr>
+    </w:tbl>
+    <w:p>
+      <w:pPr>
+        <w:pStyle w:val="Heading3"/>
+      </w:pPr>
+      <w:r>
+        <w:t>18.11 Transactional email catalogue (Resend + CMS)</w:t>
+      </w:r>
+    </w:p>
+    <w:p>
+      <w:r>
+        <w:t xml:space="preserve">Every email Resend can send. Each maps to a row in the CMS </w:t>
+      </w:r>
+      <w:r>
+        <w:rPr>
+          <w:b/>
+        </w:rPr>
+        <w:t>Email Template</w:t>
+      </w:r>
+      <w:r>
+        <w:t xml:space="preserve"> collection.</w:t>
+      </w:r>
+    </w:p>
+    <w:tbl>
+      <w:tblPr>
+        <w:tblStyle w:val="LightGrid-Accent1"/>
+        <w:tblW w:type="auto" w:w="0"/>
+        <w:tblLook w:firstColumn="1" w:firstRow="1" w:lastColumn="0" w:lastRow="0" w:noHBand="0" w:noVBand="1" w:val="04A0"/>
+      </w:tblPr>
+      <w:tblGrid>
+        <w:gridCol w:w="2880"/>
+        <w:gridCol w:w="2880"/>
+        <w:gridCol w:w="2880"/>
+      </w:tblGrid>
+      <w:tr>
+        <w:tc>
+          <w:tcPr>
+            <w:tcW w:type="dxa" w:w="2880"/>
+          </w:tcPr>
+          <w:p>
+            <w:r/>
+            <w:r>
+              <w:rPr>
+                <w:b/>
+              </w:rPr>
+              <w:t>Template key</w:t>
+            </w:r>
+          </w:p>
+        </w:tc>
+        <w:tc>
+          <w:tcPr>
+            <w:tcW w:type="dxa" w:w="2880"/>
+          </w:tcPr>
+          <w:p>
+            <w:r/>
+            <w:r>
+              <w:rPr>
+                <w:b/>
+              </w:rPr>
+              <w:t>Sent when</w:t>
+            </w:r>
+          </w:p>
+        </w:tc>
+        <w:tc>
+          <w:tcPr>
+            <w:tcW w:type="dxa" w:w="2880"/>
+          </w:tcPr>
+          <w:p>
+            <w:r/>
+            <w:r>
+              <w:rPr>
+                <w:b/>
+              </w:rPr>
+              <w:t>To</w:t>
+            </w:r>
+          </w:p>
+        </w:tc>
+      </w:tr>
+      <w:tr>
+        <w:tc>
+          <w:tcPr>
+            <w:tcW w:type="dxa" w:w="2880"/>
+          </w:tcPr>
+          <w:p>
+            <w:r/>
+            <w:r>
+              <w:t>shop_account_invite</w:t>
+            </w:r>
+          </w:p>
+        </w:tc>
+        <w:tc>
+          <w:tcPr>
+            <w:tcW w:type="dxa" w:w="2880"/>
+          </w:tcPr>
+          <w:p>
+            <w:r/>
+            <w:r>
+              <w:t>New customer's first purchase</w:t>
+            </w:r>
+          </w:p>
+        </w:tc>
+        <w:tc>
+          <w:tcPr>
+            <w:tcW w:type="dxa" w:w="2880"/>
+          </w:tcPr>
+          <w:p>
+            <w:r/>
+            <w:r>
+              <w:t>Customer</w:t>
+            </w:r>
+          </w:p>
+        </w:tc>
+      </w:tr>
+      <w:tr>
+        <w:tc>
+          <w:tcPr>
+            <w:tcW w:type="dxa" w:w="2880"/>
+          </w:tcPr>
+          <w:p>
+            <w:r/>
+            <w:r>
+              <w:t>order_paid</w:t>
+            </w:r>
+          </w:p>
+        </w:tc>
+        <w:tc>
+          <w:tcPr>
+            <w:tcW w:type="dxa" w:w="2880"/>
+          </w:tcPr>
+          <w:p>
+            <w:r/>
+            <w:r>
+              <w:t>Stripe confirms payment</w:t>
+            </w:r>
+          </w:p>
+        </w:tc>
+        <w:tc>
+          <w:tcPr>
+            <w:tcW w:type="dxa" w:w="2880"/>
+          </w:tcPr>
+          <w:p>
+            <w:r/>
+            <w:r>
+              <w:t>Customer</w:t>
+            </w:r>
+          </w:p>
+        </w:tc>
+      </w:tr>
+      <w:tr>
+        <w:tc>
+          <w:tcPr>
+            <w:tcW w:type="dxa" w:w="2880"/>
+          </w:tcPr>
+          <w:p>
+            <w:r/>
+            <w:r>
+              <w:t>order_bank_transfer</w:t>
+            </w:r>
+          </w:p>
+        </w:tc>
+        <w:tc>
+          <w:tcPr>
+            <w:tcW w:type="dxa" w:w="2880"/>
+          </w:tcPr>
+          <w:p>
+            <w:r/>
+            <w:r>
+              <w:t>Customer picks bank transfer</w:t>
+            </w:r>
+          </w:p>
+        </w:tc>
+        <w:tc>
+          <w:tcPr>
+            <w:tcW w:type="dxa" w:w="2880"/>
+          </w:tcPr>
+          <w:p>
+            <w:r/>
+            <w:r>
+              <w:t>Customer</w:t>
+            </w:r>
+          </w:p>
+        </w:tc>
+      </w:tr>
+      <w:tr>
+        <w:tc>
+          <w:tcPr>
+            <w:tcW w:type="dxa" w:w="2880"/>
+          </w:tcPr>
+          <w:p>
+            <w:r/>
+            <w:r>
+              <w:t>order_shipped</w:t>
+            </w:r>
+          </w:p>
+        </w:tc>
+        <w:tc>
+          <w:tcPr>
+            <w:tcW w:type="dxa" w:w="2880"/>
+          </w:tcPr>
+          <w:p>
+            <w:r/>
+            <w:r>
+              <w:t>Anna dispatches with tracking</w:t>
+            </w:r>
+          </w:p>
+        </w:tc>
+        <w:tc>
+          <w:tcPr>
+            <w:tcW w:type="dxa" w:w="2880"/>
+          </w:tcPr>
+          <w:p>
+            <w:r/>
+            <w:r>
+              <w:t>Customer</w:t>
+            </w:r>
+          </w:p>
+        </w:tc>
+      </w:tr>
+      <w:tr>
+        <w:tc>
+          <w:tcPr>
+            <w:tcW w:type="dxa" w:w="2880"/>
+          </w:tcPr>
+          <w:p>
+            <w:r/>
+            <w:r>
+              <w:t>order_completed</w:t>
+            </w:r>
+          </w:p>
+        </w:tc>
+        <w:tc>
+          <w:tcPr>
+            <w:tcW w:type="dxa" w:w="2880"/>
+          </w:tcPr>
+          <w:p>
+            <w:r/>
+            <w:r>
+              <w:t>Order marked complete</w:t>
+            </w:r>
+          </w:p>
+        </w:tc>
+        <w:tc>
+          <w:tcPr>
+            <w:tcW w:type="dxa" w:w="2880"/>
+          </w:tcPr>
+          <w:p>
+            <w:r/>
+            <w:r>
+              <w:t>Customer</w:t>
+            </w:r>
+          </w:p>
+        </w:tc>
+      </w:tr>
+      <w:tr>
+        <w:tc>
+          <w:tcPr>
+            <w:tcW w:type="dxa" w:w="2880"/>
+          </w:tcPr>
+          <w:p>
+            <w:r/>
+            <w:r>
+              <w:t>order_refunded</w:t>
+            </w:r>
+          </w:p>
+        </w:tc>
+        <w:tc>
+          <w:tcPr>
+            <w:tcW w:type="dxa" w:w="2880"/>
+          </w:tcPr>
+          <w:p>
+            <w:r/>
+            <w:r>
+              <w:t>Anna processes refund</w:t>
+            </w:r>
+          </w:p>
+        </w:tc>
+        <w:tc>
+          <w:tcPr>
+            <w:tcW w:type="dxa" w:w="2880"/>
+          </w:tcPr>
+          <w:p>
+            <w:r/>
+            <w:r>
+              <w:t>Customer</w:t>
+            </w:r>
+          </w:p>
+        </w:tc>
+      </w:tr>
+      <w:tr>
+        <w:tc>
+          <w:tcPr>
+            <w:tcW w:type="dxa" w:w="2880"/>
+          </w:tcPr>
+          <w:p>
+            <w:r/>
+            <w:r>
+              <w:t>return_requested</w:t>
+            </w:r>
+          </w:p>
+        </w:tc>
+        <w:tc>
+          <w:tcPr>
+            <w:tcW w:type="dxa" w:w="2880"/>
+          </w:tcPr>
+          <w:p>
+            <w:r/>
+            <w:r>
+              <w:t>Customer requests return</w:t>
+            </w:r>
+          </w:p>
+        </w:tc>
+        <w:tc>
+          <w:tcPr>
+            <w:tcW w:type="dxa" w:w="2880"/>
+          </w:tcPr>
+          <w:p>
+            <w:r/>
+            <w:r>
+              <w:t>Customer</w:t>
+            </w:r>
+          </w:p>
+        </w:tc>
+      </w:tr>
+      <w:tr>
+        <w:tc>
+          <w:tcPr>
+            <w:tcW w:type="dxa" w:w="2880"/>
+          </w:tcPr>
+          <w:p>
+            <w:r/>
+            <w:r>
+              <w:t>return_approved</w:t>
+            </w:r>
+          </w:p>
+        </w:tc>
+        <w:tc>
+          <w:tcPr>
+            <w:tcW w:type="dxa" w:w="2880"/>
+          </w:tcPr>
+          <w:p>
+            <w:r/>
+            <w:r>
+              <w:t>Anna approves return</w:t>
+            </w:r>
+          </w:p>
+        </w:tc>
+        <w:tc>
+          <w:tcPr>
+            <w:tcW w:type="dxa" w:w="2880"/>
+          </w:tcPr>
+          <w:p>
+            <w:r/>
+            <w:r>
+              <w:t>Customer</w:t>
+            </w:r>
+          </w:p>
+        </w:tc>
+      </w:tr>
+      <w:tr>
+        <w:tc>
+          <w:tcPr>
+            <w:tcW w:type="dxa" w:w="2880"/>
+          </w:tcPr>
+          <w:p>
+            <w:r/>
+            <w:r>
+              <w:t>return_received</w:t>
+            </w:r>
+          </w:p>
+        </w:tc>
+        <w:tc>
+          <w:tcPr>
+            <w:tcW w:type="dxa" w:w="2880"/>
+          </w:tcPr>
+          <w:p>
+            <w:r/>
+            <w:r>
+              <w:t>Anna marks return received</w:t>
+            </w:r>
+          </w:p>
+        </w:tc>
+        <w:tc>
+          <w:tcPr>
+            <w:tcW w:type="dxa" w:w="2880"/>
+          </w:tcPr>
+          <w:p>
+            <w:r/>
+            <w:r>
+              <w:t>Customer</w:t>
+            </w:r>
+          </w:p>
+        </w:tc>
+      </w:tr>
+      <w:tr>
+        <w:tc>
+          <w:tcPr>
+            <w:tcW w:type="dxa" w:w="2880"/>
+          </w:tcPr>
+          <w:p>
+            <w:r/>
+            <w:r>
+              <w:t>return_rejected</w:t>
+            </w:r>
+          </w:p>
+        </w:tc>
+        <w:tc>
+          <w:tcPr>
+            <w:tcW w:type="dxa" w:w="2880"/>
+          </w:tcPr>
+          <w:p>
+            <w:r/>
+            <w:r>
+              <w:t>Anna rejects return</w:t>
+            </w:r>
+          </w:p>
+        </w:tc>
+        <w:tc>
+          <w:tcPr>
+            <w:tcW w:type="dxa" w:w="2880"/>
+          </w:tcPr>
+          <w:p>
+            <w:r/>
+            <w:r>
+              <w:t>Customer</w:t>
+            </w:r>
+          </w:p>
+        </w:tc>
+      </w:tr>
+      <w:tr>
+        <w:tc>
+          <w:tcPr>
+            <w:tcW w:type="dxa" w:w="2880"/>
+          </w:tcPr>
+          <w:p>
+            <w:r/>
+            <w:r>
+              <w:t>password_reset</w:t>
+            </w:r>
+          </w:p>
+        </w:tc>
+        <w:tc>
+          <w:tcPr>
+            <w:tcW w:type="dxa" w:w="2880"/>
+          </w:tcPr>
+          <w:p>
+            <w:r/>
+            <w:r>
+              <w:t>Customer forgot password</w:t>
+            </w:r>
+          </w:p>
+        </w:tc>
+        <w:tc>
+          <w:tcPr>
+            <w:tcW w:type="dxa" w:w="2880"/>
+          </w:tcPr>
+          <w:p>
+            <w:r/>
+            <w:r>
+              <w:t>Customer</w:t>
+            </w:r>
+          </w:p>
+        </w:tc>
+      </w:tr>
+      <w:tr>
+        <w:tc>
+          <w:tcPr>
+            <w:tcW w:type="dxa" w:w="2880"/>
+          </w:tcPr>
+          <w:p>
+            <w:r/>
+            <w:r>
+              <w:t>admin_new_order</w:t>
+            </w:r>
+          </w:p>
+        </w:tc>
+        <w:tc>
+          <w:tcPr>
+            <w:tcW w:type="dxa" w:w="2880"/>
+          </w:tcPr>
+          <w:p>
+            <w:r/>
+            <w:r>
+              <w:t>Any new order (card / bank / refund)</w:t>
+            </w:r>
+          </w:p>
+        </w:tc>
+        <w:tc>
+          <w:tcPr>
+            <w:tcW w:type="dxa" w:w="2880"/>
+          </w:tcPr>
+          <w:p>
+            <w:r/>
+            <w:r>
+              <w:t>Anna</w:t>
+            </w:r>
+          </w:p>
+        </w:tc>
+      </w:tr>
+      <w:tr>
+        <w:tc>
+          <w:tcPr>
+            <w:tcW w:type="dxa" w:w="2880"/>
+          </w:tcPr>
+          <w:p>
+            <w:r/>
+            <w:r>
+              <w:t>admin_return_requested</w:t>
+            </w:r>
+          </w:p>
+        </w:tc>
+        <w:tc>
+          <w:tcPr>
+            <w:tcW w:type="dxa" w:w="2880"/>
+          </w:tcPr>
+          <w:p>
+            <w:r/>
+            <w:r>
+              <w:t>Customer requests return</w:t>
+            </w:r>
+          </w:p>
+        </w:tc>
+        <w:tc>
+          <w:tcPr>
+            <w:tcW w:type="dxa" w:w="2880"/>
+          </w:tcPr>
+          <w:p>
+            <w:r/>
+            <w:r>
+              <w:t>Anna</w:t>
+            </w:r>
+          </w:p>
+        </w:tc>
+      </w:tr>
+      <w:tr>
+        <w:tc>
+          <w:tcPr>
+            <w:tcW w:type="dxa" w:w="2880"/>
+          </w:tcPr>
+          <w:p>
+            <w:r/>
+            <w:r>
+              <w:t>admin_practitioner_enquiry</w:t>
+            </w:r>
+          </w:p>
+        </w:tc>
+        <w:tc>
+          <w:tcPr>
+            <w:tcW w:type="dxa" w:w="2880"/>
+          </w:tcPr>
+          <w:p>
+            <w:r/>
+            <w:r>
+              <w:t>Practitioner applies via form</w:t>
+            </w:r>
+          </w:p>
+        </w:tc>
+        <w:tc>
+          <w:tcPr>
+            <w:tcW w:type="dxa" w:w="2880"/>
+          </w:tcPr>
+          <w:p>
+            <w:r/>
+            <w:r>
+              <w:t>Anna</w:t>
+            </w:r>
+          </w:p>
+        </w:tc>
+      </w:tr>
+    </w:tbl>
+    <w:p>
+      <w:r>
+        <w:t xml:space="preserve">Merge tokens available in every template body: </w:t>
+      </w:r>
+      <w:r>
+        <w:rPr>
+          <w:rFonts w:ascii="Consolas" w:hAnsi="Consolas"/>
+          <w:sz w:val="20"/>
+        </w:rPr>
+        <w:t>{{order_number}}</w:t>
+      </w:r>
+      <w:r>
+        <w:t xml:space="preserve">, </w:t>
+      </w:r>
+      <w:r>
+        <w:rPr>
+          <w:rFonts w:ascii="Consolas" w:hAnsi="Consolas"/>
+          <w:sz w:val="20"/>
+        </w:rPr>
+        <w:t>{{customer_name}}</w:t>
+      </w:r>
+      <w:r>
+        <w:t xml:space="preserve">, </w:t>
+      </w:r>
+      <w:r>
+        <w:rPr>
+          <w:rFonts w:ascii="Consolas" w:hAnsi="Consolas"/>
+          <w:sz w:val="20"/>
+        </w:rPr>
+        <w:t>{{total}}</w:t>
+      </w:r>
+      <w:r>
+        <w:t xml:space="preserve">, </w:t>
+      </w:r>
+      <w:r>
+        <w:rPr>
+          <w:rFonts w:ascii="Consolas" w:hAnsi="Consolas"/>
+          <w:sz w:val="20"/>
+        </w:rPr>
+        <w:t>{{tracking_number}}</w:t>
+      </w:r>
+      <w:r>
+        <w:t xml:space="preserve">, </w:t>
+      </w:r>
+      <w:r>
+        <w:rPr>
+          <w:rFonts w:ascii="Consolas" w:hAnsi="Consolas"/>
+          <w:sz w:val="20"/>
+        </w:rPr>
+        <w:t>{{tracking_url}}</w:t>
+      </w:r>
+      <w:r>
+        <w:t xml:space="preserve">, </w:t>
+      </w:r>
+      <w:r>
+        <w:rPr>
+          <w:rFonts w:ascii="Consolas" w:hAnsi="Consolas"/>
+          <w:sz w:val="20"/>
+        </w:rPr>
+        <w:t>{{refund_amount}}</w:t>
+      </w:r>
+      <w:r>
+        <w:t xml:space="preserve">, </w:t>
+      </w:r>
+      <w:r>
+        <w:rPr>
+          <w:rFonts w:ascii="Consolas" w:hAnsi="Consolas"/>
+          <w:sz w:val="20"/>
+        </w:rPr>
+        <w:t>{{cancellation_reason}}</w:t>
+      </w:r>
+      <w:r>
+        <w:t xml:space="preserve">, </w:t>
+      </w:r>
+      <w:r>
+        <w:rPr>
+          <w:rFonts w:ascii="Consolas" w:hAnsi="Consolas"/>
+          <w:sz w:val="20"/>
+        </w:rPr>
+        <w:t>{{site_url}}</w:t>
+      </w:r>
+      <w:r>
+        <w:t>.</w:t>
+      </w:r>
+    </w:p>
+    <w:p>
+      <w:pPr>
+        <w:pStyle w:val="Heading3"/>
+      </w:pPr>
+      <w:r>
+        <w:t>18.12 Anna's activation checklist (pre-launch punch list)</w:t>
+      </w:r>
+    </w:p>
+    <w:p>
+      <w:r>
+        <w:t>Everything the site does automatically is built. What's left is what Anna needs to activate INSIDE Mailchimp so the tags actually cause emails to send.</w:t>
+      </w:r>
+    </w:p>
+    <w:p>
+      <w:pPr>
+        <w:pStyle w:val="ListNumber"/>
+      </w:pPr>
+      <w:r>
+        <w:rPr>
+          <w:b/>
+        </w:rPr>
+        <w:t>Mailchimp journeys:</w:t>
+      </w:r>
+      <w:r>
+        <w:t xml:space="preserve"> for each row in Â§18.10, open the corresponding Customer Journey in Mailchimp (or create it), set trigger to "when tagged with X", draft the email bodies, set exit conditions (e.g. Decoder Upsell exits on REGULATED Buyer), click Start.</w:t>
+      </w:r>
+    </w:p>
+    <w:p>
+      <w:pPr>
+        <w:pStyle w:val="ListNumber"/>
+      </w:pPr>
+      <w:r>
+        <w:rPr>
+          <w:b/>
+        </w:rPr>
+        <w:t>Merge fields:</w:t>
+      </w:r>
+      <w:r>
+        <w:t xml:space="preserve"> Audience â†’ Settings â†’ Audience fields. Add TEXT merge fields with tag names </w:t>
+      </w:r>
+      <w:r>
+        <w:rPr>
+          <w:rFonts w:ascii="Consolas" w:hAnsi="Consolas"/>
+          <w:sz w:val="20"/>
+        </w:rPr>
+        <w:t>EVENT_DATE</w:t>
+      </w:r>
+      <w:r>
+        <w:t xml:space="preserve">, </w:t>
+      </w:r>
+      <w:r>
+        <w:rPr>
+          <w:rFonts w:ascii="Consolas" w:hAnsi="Consolas"/>
+          <w:sz w:val="20"/>
+        </w:rPr>
+        <w:t>EVENT_TIME</w:t>
+      </w:r>
+      <w:r>
+        <w:t xml:space="preserve">, </w:t>
+      </w:r>
+      <w:r>
+        <w:rPr>
+          <w:rFonts w:ascii="Consolas" w:hAnsi="Consolas"/>
+          <w:sz w:val="20"/>
+        </w:rPr>
+        <w:t>EVENT_NAME</w:t>
+      </w:r>
+      <w:r>
+        <w:t xml:space="preserve">, </w:t>
+      </w:r>
+      <w:r>
+        <w:rPr>
+          <w:rFonts w:ascii="Consolas" w:hAnsi="Consolas"/>
+          <w:sz w:val="20"/>
+        </w:rPr>
+        <w:t>EVENT_LOC</w:t>
+      </w:r>
+      <w:r>
+        <w:t xml:space="preserve"> (case-sensitive) so Calendly booking journeys work.</w:t>
+      </w:r>
+    </w:p>
+    <w:p>
+      <w:pPr>
+        <w:pStyle w:val="ListNumber"/>
+      </w:pPr>
+      <w:r>
+        <w:rPr>
+          <w:b/>
+        </w:rPr>
+        <w:t>CMS Email Template copy:</w:t>
+      </w:r>
+      <w:r>
+        <w:t xml:space="preserve"> open each of the 14 rows in Â§18.11 in Content Manager â†’ Email Template. Proofread subject / preheader / intro / outro / CTA. Save &amp; Publish.</w:t>
+      </w:r>
+    </w:p>
+    <w:p>
+      <w:pPr>
+        <w:pStyle w:val="ListNumber"/>
+      </w:pPr>
+      <w:r>
+        <w:rPr>
+          <w:b/>
+        </w:rPr>
+        <w:t>Env vars in Coolify:</w:t>
+      </w:r>
+      <w:r>
+        <w:t xml:space="preserve"> confirm on the frontend service â€” </w:t>
+      </w:r>
+      <w:r>
+        <w:rPr>
+          <w:rFonts w:ascii="Consolas" w:hAnsi="Consolas"/>
+          <w:sz w:val="20"/>
+        </w:rPr>
+        <w:t>MAILCHIMP_API_KEY</w:t>
+      </w:r>
+      <w:r>
+        <w:t xml:space="preserve">, </w:t>
+      </w:r>
+      <w:r>
+        <w:rPr>
+          <w:rFonts w:ascii="Consolas" w:hAnsi="Consolas"/>
+          <w:sz w:val="20"/>
+        </w:rPr>
+        <w:t>MAILCHIMP_LIST_ID</w:t>
+      </w:r>
+      <w:r>
+        <w:t xml:space="preserve">, </w:t>
+      </w:r>
+      <w:r>
+        <w:rPr>
+          <w:rFonts w:ascii="Consolas" w:hAnsi="Consolas"/>
+          <w:sz w:val="20"/>
+        </w:rPr>
+        <w:t>RESEND_API_KEY</w:t>
+      </w:r>
+      <w:r>
+        <w:t xml:space="preserve">, </w:t>
+      </w:r>
+      <w:r>
+        <w:rPr>
+          <w:rFonts w:ascii="Consolas" w:hAnsi="Consolas"/>
+          <w:sz w:val="20"/>
+        </w:rPr>
+        <w:t>EMAIL_FROM</w:t>
+      </w:r>
+      <w:r>
+        <w:t xml:space="preserve"> (change from onboarding@resend.dev for prod), </w:t>
+      </w:r>
+      <w:r>
+        <w:rPr>
+          <w:rFonts w:ascii="Consolas" w:hAnsi="Consolas"/>
+          <w:sz w:val="20"/>
+        </w:rPr>
+        <w:t>CALENDLY_WEBHOOK_SECRET</w:t>
+      </w:r>
+      <w:r>
+        <w:t xml:space="preserve">, </w:t>
+      </w:r>
+      <w:r>
+        <w:rPr>
+          <w:rFonts w:ascii="Consolas" w:hAnsi="Consolas"/>
+          <w:sz w:val="20"/>
+        </w:rPr>
+        <w:t>STRIPE_SECRET_KEY</w:t>
+      </w:r>
+      <w:r>
+        <w:t xml:space="preserve">, </w:t>
+      </w:r>
+      <w:r>
+        <w:rPr>
+          <w:rFonts w:ascii="Consolas" w:hAnsi="Consolas"/>
+          <w:sz w:val="20"/>
+        </w:rPr>
+        <w:t>STRIPE_WEBHOOK_SECRET</w:t>
+      </w:r>
+      <w:r>
+        <w:t>.</w:t>
+      </w:r>
+    </w:p>
+    <w:p>
+      <w:pPr>
+        <w:pStyle w:val="ListNumber"/>
+      </w:pPr>
+      <w:r>
+        <w:rPr>
+          <w:b/>
+        </w:rPr>
+        <w:t>Calendly webhook:</w:t>
+      </w:r>
+      <w:r>
+        <w:t xml:space="preserve"> Calendly â†’ Integrations â†’ Webhooks â†’ Create. URL </w:t>
+      </w:r>
+      <w:r>
+        <w:rPr>
+          <w:rFonts w:ascii="Consolas" w:hAnsi="Consolas"/>
+          <w:sz w:val="20"/>
+        </w:rPr>
+        <w:t>https://annalouwellness.com/api/calendly/webhook</w:t>
+      </w:r>
+      <w:r>
+        <w:t xml:space="preserve">. Subscribe to </w:t>
+      </w:r>
+      <w:r>
+        <w:rPr>
+          <w:rFonts w:ascii="Consolas" w:hAnsi="Consolas"/>
+          <w:sz w:val="20"/>
+        </w:rPr>
+        <w:t>invitee.created</w:t>
+      </w:r>
+      <w:r>
+        <w:t xml:space="preserve">. Paste the signing key into Coolify as </w:t>
+      </w:r>
+      <w:r>
+        <w:rPr>
+          <w:rFonts w:ascii="Consolas" w:hAnsi="Consolas"/>
+          <w:sz w:val="20"/>
+        </w:rPr>
+        <w:t>CALENDLY_WEBHOOK_SECRET</w:t>
+      </w:r>
+      <w:r>
+        <w:t>.</w:t>
       </w:r>
     </w:p>
     <w:p>

</xml_diff>

<commit_message>
Manual: plain-English email journey section so Help - Ask can answer Anna's questions in her language
New MANUAL section 18.0 "In plain English -- what happens when someone..." sits ahead of the technical trigger map. Rewrites every journey (Reset Letters signup, Decoder quiz, enquiries, shop card, shop bank transfer, refund, ship/complete, Calendly, password reset) without endpoints, tags, or jargon -- matches how Anna actually thinks about the site. Chatbot now leads with this section, falls back to the technical map only when she asks for exact tags/endpoints.

Also ships the standalone Anna-friendly docx (Docs/ALW_Email_Journey_For_Anna.docx) + its build script, with a "Prefer to just ASK?" callout pointing back at Help - Ask.
</commit_message>
<xml_diff>
--- a/Docs/ANNA_USER_MANUAL.docx
+++ b/Docs/ANNA_USER_MANUAL.docx
@@ -31055,6 +31055,359 @@
     <w:p>
       <w:r>
         <w:t>The rest of this section is the full trigger map. If someone asks the chatbot "if X happens, what emails do they get?" or "which tag does the Y form fire?", the answer is here.</w:t>
+      </w:r>
+    </w:p>
+    <w:p>
+      <w:pPr>
+        <w:pStyle w:val="Heading3"/>
+      </w:pPr>
+      <w:r>
+        <w:t>18.0 In plain English — what happens when someone...</w:t>
+      </w:r>
+    </w:p>
+    <w:p>
+      <w:r>
+        <w:t>This is the Anna-friendly version. If she asks something like "what emails go out when someone signs up for Reset Letters?" or "who edits the order receipt?", answer using THIS section first — plain language, no endpoints, no jargon. Only drop into the technical trigger map (18.1 onwards) if she asks for exact tags, endpoints, or step-by-step logic.</w:t>
+      </w:r>
+    </w:p>
+    <w:p>
+      <w:r>
+        <w:rPr>
+          <w:b/>
+        </w:rPr>
+        <w:t>Two things send emails from her site:</w:t>
+      </w:r>
+    </w:p>
+    <w:p>
+      <w:pPr>
+        <w:pStyle w:val="ListBullet"/>
+      </w:pPr>
+      <w:r>
+        <w:rPr>
+          <w:b/>
+        </w:rPr>
+        <w:t>Mailchimp</w:t>
+      </w:r>
+      <w:r>
+        <w:t xml:space="preserve"> — welcome sequences and nurture emails. She edits these INSIDE Mailchimp. The site never touches the wording; it just tells Mailchimp what happened.</w:t>
+      </w:r>
+    </w:p>
+    <w:p>
+      <w:pPr>
+        <w:pStyle w:val="ListBullet"/>
+      </w:pPr>
+      <w:r>
+        <w:rPr>
+          <w:b/>
+        </w:rPr>
+        <w:t>Resend</w:t>
+      </w:r>
+      <w:r>
+        <w:t xml:space="preserve"> — order confirmations, receipts, refund notifications, password reset links, and the "new order" emails that go to Anna. She edits these INSIDE the CMS in the </w:t>
+      </w:r>
+      <w:r>
+        <w:rPr>
+          <w:b/>
+        </w:rPr>
+        <w:t>Email Template</w:t>
+      </w:r>
+      <w:r>
+        <w:t xml:space="preserve"> collection. Changes take effect on the very next email sent.</w:t>
+      </w:r>
+    </w:p>
+    <w:p>
+      <w:r>
+        <w:rPr>
+          <w:b/>
+        </w:rPr>
+        <w:t>Signs up for Reset Letters:</w:t>
+      </w:r>
+      <w:r>
+        <w:t xml:space="preserve"> added to Mailchimp (welcome sequence — Founding Members if before 22 June 2026, Standard Subscribers after) and to Substack (so they get the newsletter itself). Anna gets nothing sent to her personally — just sees them in Mailchimp + Substack lists.</w:t>
+      </w:r>
+    </w:p>
+    <w:p>
+      <w:r>
+        <w:rPr>
+          <w:b/>
+        </w:rPr>
+        <w:t>Takes the Nervous System Decoder quiz:</w:t>
+      </w:r>
+      <w:r>
+        <w:t xml:space="preserve"> tagged Decoder Subscriber. Gets welcome email with free Decoder PDF, then two days later an upsell to REGULATED, then four days later one final gentle nudge. If they buy REGULATED, they exit — never sold something they already own.</w:t>
+      </w:r>
+    </w:p>
+    <w:p>
+      <w:r>
+        <w:rPr>
+          <w:b/>
+        </w:rPr>
+        <w:t>Fills in any enquiry form (Contact, Practitioner, Corporate, Speaking, etc.):</w:t>
+      </w:r>
+      <w:r>
+        <w:t xml:space="preserve"> tagged in Mailchimp with a tag matching the form (Practitioner form → Practitioner Enquiry tag, etc.). Whatever journey Anna set up for that tag runs. Anna only gets a notification email for the </w:t>
+      </w:r>
+      <w:r>
+        <w:rPr>
+          <w:b/>
+        </w:rPr>
+        <w:t>Practitioner</w:t>
+      </w:r>
+      <w:r>
+        <w:t xml:space="preserve"> form — for the others she just sees the contact appear in Mailchimp.</w:t>
+      </w:r>
+    </w:p>
+    <w:p>
+      <w:r>
+        <w:rPr>
+          <w:b/>
+        </w:rPr>
+        <w:t>Buys something from the shop (card):</w:t>
+      </w:r>
+      <w:r>
+        <w:t xml:space="preserve"> first-time buyers get a "welcome, set your password" email. Everyone gets an order receipt with order number + items. If the item is part of a paid programme (like REGULATED), they also enter that programme's follow-up sequence in Mailchimp. Anna gets a "new order" notification every time. Everyone who buys gets tagged </w:t>
+      </w:r>
+      <w:r>
+        <w:rPr>
+          <w:b/>
+        </w:rPr>
+        <w:t>Shop Customer</w:t>
+      </w:r>
+      <w:r>
+        <w:t xml:space="preserve"> in Mailchimp.</w:t>
+      </w:r>
+    </w:p>
+    <w:p>
+      <w:r>
+        <w:rPr>
+          <w:b/>
+        </w:rPr>
+        <w:t>Buys something from the shop (bank transfer):</w:t>
+      </w:r>
+      <w:r>
+        <w:t xml:space="preserve"> slightly different — they get the "welcome, set your password" email + a bank transfer instructions email with Anna's bank details and a reference number. Once Anna marks the order paid in the CMS, they get the normal order receipt and it becomes the same as a card order.</w:t>
+      </w:r>
+    </w:p>
+    <w:p>
+      <w:r>
+        <w:rPr>
+          <w:b/>
+        </w:rPr>
+        <w:t>Anna processes a refund:</w:t>
+      </w:r>
+      <w:r>
+        <w:t xml:space="preserve"> customer gets a refund confirmation with amount + settlement time (5–10 business days). Anna gets the same "new order" notification with updated status for the paper trail. Any programme-specific tags are quietly removed so they stop getting course emails; the Shop Customer tag stays.</w:t>
+      </w:r>
+    </w:p>
+    <w:p>
+      <w:r>
+        <w:rPr>
+          <w:b/>
+        </w:rPr>
+        <w:t>Anna ships or completes an order:</w:t>
+      </w:r>
+      <w:r>
+        <w:t xml:space="preserve"> customer gets "Your order has shipped" (with the tracking link Anna added) or "Your order arrived" when Anna marks it complete. Return-related emails fire per stage if a return is requested/approved/received/rejected. Every single one of these is editable in the CMS Email Template collection.</w:t>
+      </w:r>
+    </w:p>
+    <w:p>
+      <w:r>
+        <w:rPr>
+          <w:b/>
+        </w:rPr>
+        <w:t>Books a call on Calendly (Discovery Call, One Day, Reset Session, Signal Scoping):</w:t>
+      </w:r>
+      <w:r>
+        <w:t xml:space="preserve"> gets the standard Calendly confirmation with date/time/Zoom link (from Calendly, not Anna's site). Also gets whichever pre-call sequence Anna set up in Mailchimp for that call type — can reference exact booking date/time via merge tags.</w:t>
+      </w:r>
+    </w:p>
+    <w:p>
+      <w:r>
+        <w:rPr>
+          <w:b/>
+        </w:rPr>
+        <w:t>Forgets their password:</w:t>
+      </w:r>
+      <w:r>
+        <w:t xml:space="preserve"> one-time reset link. No tags, no journey — just the link.</w:t>
+      </w:r>
+    </w:p>
+    <w:p>
+      <w:r>
+        <w:rPr>
+          <w:b/>
+        </w:rPr>
+        <w:t>What Anna actually needs to do:</w:t>
+      </w:r>
+    </w:p>
+    <w:p>
+      <w:pPr>
+        <w:pStyle w:val="ListBullet"/>
+      </w:pPr>
+      <w:r>
+        <w:rPr>
+          <w:b/>
+        </w:rPr>
+        <w:t>In Mailchimp:</w:t>
+      </w:r>
+      <w:r>
+        <w:t xml:space="preserve"> for each of the tags above, build a Customer Journey with that tag as the trigger. Log in → Automations → Customer Journeys → draft each email using merge tags like </w:t>
+      </w:r>
+      <w:r>
+        <w:rPr>
+          <w:rFonts w:ascii="Consolas" w:hAnsi="Consolas"/>
+          <w:sz w:val="20"/>
+        </w:rPr>
+        <w:t>*|FNAME|*</w:t>
+      </w:r>
+      <w:r>
+        <w:t xml:space="preserve"> → click Start.</w:t>
+      </w:r>
+    </w:p>
+    <w:p>
+      <w:pPr>
+        <w:pStyle w:val="ListBullet"/>
+      </w:pPr>
+      <w:r>
+        <w:rPr>
+          <w:b/>
+        </w:rPr>
+        <w:t>For booking-email merge tags:</w:t>
+      </w:r>
+      <w:r>
+        <w:t xml:space="preserve"> Audience → Settings → Audience fields → add four TEXT fields with tag names </w:t>
+      </w:r>
+      <w:r>
+        <w:rPr>
+          <w:rFonts w:ascii="Consolas" w:hAnsi="Consolas"/>
+          <w:sz w:val="20"/>
+        </w:rPr>
+        <w:t>EVENT_DATE</w:t>
+      </w:r>
+      <w:r>
+        <w:t xml:space="preserve">, </w:t>
+      </w:r>
+      <w:r>
+        <w:rPr>
+          <w:rFonts w:ascii="Consolas" w:hAnsi="Consolas"/>
+          <w:sz w:val="20"/>
+        </w:rPr>
+        <w:t>EVENT_TIME</w:t>
+      </w:r>
+      <w:r>
+        <w:t xml:space="preserve">, </w:t>
+      </w:r>
+      <w:r>
+        <w:rPr>
+          <w:rFonts w:ascii="Consolas" w:hAnsi="Consolas"/>
+          <w:sz w:val="20"/>
+        </w:rPr>
+        <w:t>EVENT_NAME</w:t>
+      </w:r>
+      <w:r>
+        <w:t xml:space="preserve">, </w:t>
+      </w:r>
+      <w:r>
+        <w:rPr>
+          <w:rFonts w:ascii="Consolas" w:hAnsi="Consolas"/>
+          <w:sz w:val="20"/>
+        </w:rPr>
+        <w:t>EVENT_LOC</w:t>
+      </w:r>
+      <w:r>
+        <w:t xml:space="preserve"> (exact spelling, all caps). Then she can write "your Reset Session is on |EVENT_DATE| at |EVENT_TIME|" and it fills in per booking.</w:t>
+      </w:r>
+    </w:p>
+    <w:p>
+      <w:pPr>
+        <w:pStyle w:val="ListBullet"/>
+      </w:pPr>
+      <w:r>
+        <w:rPr>
+          <w:b/>
+        </w:rPr>
+        <w:t>In the CMS:</w:t>
+      </w:r>
+      <w:r>
+        <w:t xml:space="preserve"> Content Manager → Email Template → open each row (order confirmations, refunds, shipped, returns, etc.) and adjust the wording to sound like her. Saves apply immediately; next email uses the new copy.</w:t>
+      </w:r>
+    </w:p>
+    <w:p>
+      <w:r>
+        <w:rPr>
+          <w:b/>
+        </w:rPr>
+        <w:t>Common questions:</w:t>
+      </w:r>
+    </w:p>
+    <w:p>
+      <w:pPr>
+        <w:pStyle w:val="ListBullet"/>
+      </w:pPr>
+      <w:r>
+        <w:rPr>
+          <w:i/>
+        </w:rPr>
+        <w:t>"If I edit a Mailchimp email, when does it go live?"</w:t>
+      </w:r>
+      <w:r>
+        <w:t xml:space="preserve"> Immediately for anyone entering the journey AFTER she saves. People already mid-sequence continue on the version they started on.</w:t>
+      </w:r>
+    </w:p>
+    <w:p>
+      <w:pPr>
+        <w:pStyle w:val="ListBullet"/>
+      </w:pPr>
+      <w:r>
+        <w:rPr>
+          <w:i/>
+        </w:rPr>
+        <w:t>"If I edit a CMS Email Template, when does it go live?"</w:t>
+      </w:r>
+      <w:r>
+        <w:t xml:space="preserve"> The very next email that sends. No queue, no delay.</w:t>
+      </w:r>
+    </w:p>
+    <w:p>
+      <w:pPr>
+        <w:pStyle w:val="ListBullet"/>
+      </w:pPr>
+      <w:r>
+        <w:rPr>
+          <w:i/>
+        </w:rPr>
+        <w:t>"Can I stop someone getting emails without deleting them?"</w:t>
+      </w:r>
+      <w:r>
+        <w:t xml:space="preserve"> Yes — in Mailchimp, unsubscribe them or remove the tag. CMS transactional emails only fire when their trigger fires (so if she cancels an order, no refund email sends).</w:t>
+      </w:r>
+    </w:p>
+    <w:p>
+      <w:pPr>
+        <w:pStyle w:val="ListBullet"/>
+      </w:pPr>
+      <w:r>
+        <w:rPr>
+          <w:i/>
+        </w:rPr>
+        <w:t>"Can I see if someone opened / clicked?"</w:t>
+      </w:r>
+      <w:r>
+        <w:t xml:space="preserve"> Mailchimp emails: yes, check Reports. Resend transactional: delivery + bounces yes, opens not by default.</w:t>
+      </w:r>
+    </w:p>
+    <w:p>
+      <w:pPr>
+        <w:pStyle w:val="ListBullet"/>
+      </w:pPr>
+      <w:r>
+        <w:rPr>
+          <w:i/>
+        </w:rPr>
+        <w:t>"What if my Mailchimp bill runs out?"</w:t>
+      </w:r>
+      <w:r>
+        <w:t xml:space="preserve"> Sends pause, no contacts lost, journeys queue and resume when she upgrades.</w:t>
       </w:r>
     </w:p>
     <w:p>

</xml_diff>

<commit_message>
CMS: clarify 90-min Reset Sessions live under Work · Programme
Anna 23 Jul: 'The Reset programme for 90 mins sessions isn't on the CMS
we don't think.' Root cause — three collections that read like they
overlap. Made it obvious in three places:

- Renamed 'Work · Coaching Session' to 'Work · Session CARD (list only)'
  so the sidebar label matches its actual scope.
- Rewrote its description to name the split explicitly (cards here, full
  sales page under Programme, name the three slugs).
- Rewrote Programme collection description to list all three 90-min
  session slugs by name.
- Manual §17.47 documents the whole map for Help · Ask.
</commit_message>
<xml_diff>
--- a/Docs/ANNA_USER_MANUAL.docx
+++ b/Docs/ANNA_USER_MANUAL.docx
@@ -38355,6 +38355,331 @@
       </w:r>
       <w:r>
         <w:t>. If a specific page still shows old content after that, the cause is your browser's own cache — hard-refresh once (Ctrl+Shift+R on Windows, Cmd+Shift+R on Mac).</w:t>
+      </w:r>
+    </w:p>
+    <w:p>
+      <w:pPr>
+        <w:pStyle w:val="Heading3"/>
+      </w:pPr>
+      <w:r>
+        <w:t>17.47 Where are the 90-min Reset Sessions in the CMS? (23 Jul 2026)</w:t>
+      </w:r>
+    </w:p>
+    <w:p>
+      <w:r>
+        <w:t>Anna 23 Jul: "The Reset programme for 90 mins sessions isn't on the CMS we don't think."</w:t>
+      </w:r>
+    </w:p>
+    <w:p>
+      <w:r>
+        <w:t>They ARE — but the naming trapped you. Here is the map:</w:t>
+      </w:r>
+    </w:p>
+    <w:p>
+      <w:r>
+        <w:rPr>
+          <w:b/>
+        </w:rPr>
+        <w:t>"The Reset" (£1,500, six weeks with weekly 90-min sessions)</w:t>
+      </w:r>
+      <w:r>
+        <w:t xml:space="preserve"> — one entry:</w:t>
+      </w:r>
+    </w:p>
+    <w:p>
+      <w:pPr>
+        <w:pStyle w:val="ListBullet"/>
+      </w:pPr>
+      <w:r>
+        <w:t xml:space="preserve">Content Manager → </w:t>
+      </w:r>
+      <w:r>
+        <w:rPr>
+          <w:b/>
+        </w:rPr>
+        <w:t>Work · Programme</w:t>
+      </w:r>
+      <w:r>
+        <w:t xml:space="preserve"> → open "The Reset" (slug </w:t>
+      </w:r>
+      <w:r>
+        <w:rPr>
+          <w:rFonts w:ascii="Consolas" w:hAnsi="Consolas"/>
+          <w:color w:val="881188"/>
+        </w:rPr>
+        <w:t>the-reset</w:t>
+      </w:r>
+      <w:r>
+        <w:t>)</w:t>
+      </w:r>
+    </w:p>
+    <w:p>
+      <w:pPr>
+        <w:pStyle w:val="ListBullet"/>
+      </w:pPr>
+      <w:r>
+        <w:t>Lives at /the-work/the-reset</w:t>
+      </w:r>
+    </w:p>
+    <w:p>
+      <w:r>
+        <w:rPr>
+          <w:b/>
+        </w:rPr>
+        <w:t>The three individual 90-min 1:1 sessions</w:t>
+      </w:r>
+      <w:r>
+        <w:t xml:space="preserve"> — three separate entries, ALL under Work · Programme:</w:t>
+      </w:r>
+    </w:p>
+    <w:tbl>
+      <w:tblPr>
+        <w:tblStyle w:val="LightGrid-Accent1"/>
+        <w:tblW w:type="auto" w:w="0"/>
+        <w:tblLook w:firstColumn="1" w:firstRow="1" w:lastColumn="0" w:lastRow="0" w:noHBand="0" w:noVBand="1" w:val="04A0"/>
+      </w:tblPr>
+      <w:tblGrid>
+        <w:gridCol w:w="2880"/>
+        <w:gridCol w:w="2880"/>
+        <w:gridCol w:w="2880"/>
+      </w:tblGrid>
+      <w:tr>
+        <w:tc>
+          <w:tcPr>
+            <w:tcW w:type="dxa" w:w="2880"/>
+          </w:tcPr>
+          <w:p>
+            <w:r>
+              <w:rPr>
+                <w:b/>
+              </w:rPr>
+            </w:r>
+            <w:r>
+              <w:rPr>
+                <w:b/>
+              </w:rPr>
+              <w:t>Session name</w:t>
+            </w:r>
+          </w:p>
+        </w:tc>
+        <w:tc>
+          <w:tcPr>
+            <w:tcW w:type="dxa" w:w="2880"/>
+          </w:tcPr>
+          <w:p>
+            <w:r>
+              <w:rPr>
+                <w:b/>
+              </w:rPr>
+            </w:r>
+            <w:r>
+              <w:rPr>
+                <w:b/>
+              </w:rPr>
+              <w:t>Slug</w:t>
+            </w:r>
+          </w:p>
+        </w:tc>
+        <w:tc>
+          <w:tcPr>
+            <w:tcW w:type="dxa" w:w="2880"/>
+          </w:tcPr>
+          <w:p>
+            <w:r>
+              <w:rPr>
+                <w:b/>
+              </w:rPr>
+            </w:r>
+            <w:r>
+              <w:rPr>
+                <w:b/>
+              </w:rPr>
+              <w:t>Live at</w:t>
+            </w:r>
+          </w:p>
+        </w:tc>
+      </w:tr>
+      <w:tr>
+        <w:tc>
+          <w:tcPr>
+            <w:tcW w:type="dxa" w:w="2880"/>
+          </w:tcPr>
+          <w:p>
+            <w:r/>
+            <w:r>
+              <w:t>Nervous System Reset</w:t>
+            </w:r>
+          </w:p>
+        </w:tc>
+        <w:tc>
+          <w:tcPr>
+            <w:tcW w:type="dxa" w:w="2880"/>
+          </w:tcPr>
+          <w:p>
+            <w:r/>
+            <w:r>
+              <w:rPr>
+                <w:rFonts w:ascii="Consolas" w:hAnsi="Consolas"/>
+                <w:color w:val="881188"/>
+              </w:rPr>
+              <w:t>nervous-system-reset</w:t>
+            </w:r>
+          </w:p>
+        </w:tc>
+        <w:tc>
+          <w:tcPr>
+            <w:tcW w:type="dxa" w:w="2880"/>
+          </w:tcPr>
+          <w:p>
+            <w:r/>
+            <w:r>
+              <w:t>/the-work/sessions/nervous-system-reset</w:t>
+            </w:r>
+          </w:p>
+        </w:tc>
+      </w:tr>
+      <w:tr>
+        <w:tc>
+          <w:tcPr>
+            <w:tcW w:type="dxa" w:w="2880"/>
+          </w:tcPr>
+          <w:p>
+            <w:r/>
+            <w:r>
+              <w:t>Founder Reset</w:t>
+            </w:r>
+          </w:p>
+        </w:tc>
+        <w:tc>
+          <w:tcPr>
+            <w:tcW w:type="dxa" w:w="2880"/>
+          </w:tcPr>
+          <w:p>
+            <w:r/>
+            <w:r>
+              <w:rPr>
+                <w:rFonts w:ascii="Consolas" w:hAnsi="Consolas"/>
+                <w:color w:val="881188"/>
+              </w:rPr>
+              <w:t>founder-reset</w:t>
+            </w:r>
+          </w:p>
+        </w:tc>
+        <w:tc>
+          <w:tcPr>
+            <w:tcW w:type="dxa" w:w="2880"/>
+          </w:tcPr>
+          <w:p>
+            <w:r/>
+            <w:r>
+              <w:t>/the-work/sessions/founder-reset</w:t>
+            </w:r>
+          </w:p>
+        </w:tc>
+      </w:tr>
+      <w:tr>
+        <w:tc>
+          <w:tcPr>
+            <w:tcW w:type="dxa" w:w="2880"/>
+          </w:tcPr>
+          <w:p>
+            <w:r/>
+            <w:r>
+              <w:t>Dating Reset</w:t>
+            </w:r>
+          </w:p>
+        </w:tc>
+        <w:tc>
+          <w:tcPr>
+            <w:tcW w:type="dxa" w:w="2880"/>
+          </w:tcPr>
+          <w:p>
+            <w:r/>
+            <w:r>
+              <w:rPr>
+                <w:rFonts w:ascii="Consolas" w:hAnsi="Consolas"/>
+                <w:color w:val="881188"/>
+              </w:rPr>
+              <w:t>dating-reset</w:t>
+            </w:r>
+          </w:p>
+        </w:tc>
+        <w:tc>
+          <w:tcPr>
+            <w:tcW w:type="dxa" w:w="2880"/>
+          </w:tcPr>
+          <w:p>
+            <w:r/>
+            <w:r>
+              <w:t>/the-work/sessions/dating-reset</w:t>
+            </w:r>
+          </w:p>
+        </w:tc>
+      </w:tr>
+    </w:tbl>
+    <w:p>
+      <w:r>
+        <w:t>None of them have "90-min" in the title on purpose (the title becomes the page hero, and Anna's copy calls the outcome, not the duration). If you want to see all four in one glance, sort the Programme list by name in the CMS.</w:t>
+      </w:r>
+    </w:p>
+    <w:p>
+      <w:r>
+        <w:rPr>
+          <w:b/>
+        </w:rPr>
+        <w:t>Why the confusion — two collections for the same thing</w:t>
+      </w:r>
+    </w:p>
+    <w:p>
+      <w:r>
+        <w:t xml:space="preserve">There is a second collection called </w:t>
+      </w:r>
+      <w:r>
+        <w:rPr>
+          <w:b/>
+        </w:rPr>
+        <w:t>Work · Session CARD (list only)</w:t>
+      </w:r>
+      <w:r>
+        <w:t>. It ONLY controls the little cards on the /the-work/sessions listing page (name shown on the card, one-line pitch, price label, sort order). It does NOT drive the actual sales page — the sales page is the matching Programme entry above.</w:t>
+      </w:r>
+    </w:p>
+    <w:p>
+      <w:r>
+        <w:t>Rule of thumb:</w:t>
+      </w:r>
+    </w:p>
+    <w:p>
+      <w:pPr>
+        <w:pStyle w:val="ListBullet"/>
+      </w:pPr>
+      <w:r>
+        <w:t xml:space="preserve">Editing hero, intro, "what's included", pricing body, CTA button of the sales page → </w:t>
+      </w:r>
+      <w:r>
+        <w:rPr>
+          <w:b/>
+        </w:rPr>
+        <w:t>Work · Programme</w:t>
+      </w:r>
+    </w:p>
+    <w:p>
+      <w:pPr>
+        <w:pStyle w:val="ListBullet"/>
+      </w:pPr>
+      <w:r>
+        <w:t xml:space="preserve">Editing the card name / pitch / price label on the /the-work/sessions overview → </w:t>
+      </w:r>
+      <w:r>
+        <w:rPr>
+          <w:b/>
+        </w:rPr>
+        <w:t>Work · Session CARD (list only)</w:t>
+      </w:r>
+    </w:p>
+    <w:p>
+      <w:r>
+        <w:t>If you edit under Session CARD and expect the change to appear on /the-work/sessions/nervous-system-reset (or any individual session page), it will not — that page reads from Programme.</w:t>
       </w:r>
     </w:p>
     <w:p>

</xml_diff>

<commit_message>
Manual v1.20: §17.48-49 — memberships block + full commerce checklist per offering
- §17.48 explains the new /the-work Memberships section, which CMS
  fields drive the Reset Room card, and how to change price/copy/image.
- §17.49 is the practical checklist Anna asked for by implication in
  today's commerce audit — every field that must be filled on Programme,
  Experience, Session CARD, and Membership entries for a bookable
  offering to work end-to-end, plus the Mailchimp Journey wiring
  step-by-step. Help · Ask can now answer 'what do I need to fill for
  a retreat to be bookable?' concretely.
</commit_message>
<xml_diff>
--- a/Docs/ANNA_USER_MANUAL.docx
+++ b/Docs/ANNA_USER_MANUAL.docx
@@ -38680,6 +38680,582 @@
     <w:p>
       <w:r>
         <w:t>If you edit under Session CARD and expect the change to appear on /the-work/sessions/nervous-system-reset (or any individual session page), it will not — that page reads from Programme.</w:t>
+      </w:r>
+    </w:p>
+    <w:p>
+      <w:pPr>
+        <w:pStyle w:val="Heading3"/>
+      </w:pPr>
+      <w:r>
+        <w:t>17.48 Memberships block on Work with Anna (23 Jul 2026)</w:t>
+      </w:r>
+    </w:p>
+    <w:p>
+      <w:r>
+        <w:t>Anna 23 Jul: "put memberships available here so people can see different ways to work with me. Under Programmes and above Client Stories."</w:t>
+      </w:r>
+    </w:p>
+    <w:p>
+      <w:r>
+        <w:t xml:space="preserve">Shipped. /the-work now shows a Memberships section between Programmes and Client Stories. Currently one card renders — The Reset Room — pulled from </w:t>
+      </w:r>
+      <w:r>
+        <w:rPr>
+          <w:b/>
+        </w:rPr>
+        <w:t>Work · Membership (Reset Room)</w:t>
+      </w:r>
+      <w:r>
+        <w:t xml:space="preserve"> singleton. Shows the CMS title, description, price (£X / month), and links to /community/reset-room.</w:t>
+      </w:r>
+    </w:p>
+    <w:p>
+      <w:r>
+        <w:t>If you want the card to change:</w:t>
+      </w:r>
+    </w:p>
+    <w:p>
+      <w:pPr>
+        <w:pStyle w:val="ListBullet"/>
+      </w:pPr>
+      <w:r>
+        <w:rPr>
+          <w:b/>
+        </w:rPr>
+        <w:t>Update the marketing description</w:t>
+      </w:r>
+      <w:r>
+        <w:t xml:space="preserve"> on this /the-work card → edit </w:t>
+      </w:r>
+      <w:r>
+        <w:rPr>
+          <w:rFonts w:ascii="Consolas" w:hAnsi="Consolas"/>
+          <w:color w:val="881188"/>
+        </w:rPr>
+        <w:t>description</w:t>
+      </w:r>
+      <w:r>
+        <w:t xml:space="preserve"> on Work · Membership (Reset Room).</w:t>
+      </w:r>
+    </w:p>
+    <w:p>
+      <w:pPr>
+        <w:pStyle w:val="ListBullet"/>
+      </w:pPr>
+      <w:r>
+        <w:rPr>
+          <w:b/>
+        </w:rPr>
+        <w:t>Change the price shown</w:t>
+      </w:r>
+      <w:r>
+        <w:t xml:space="preserve"> → edit </w:t>
+      </w:r>
+      <w:r>
+        <w:rPr>
+          <w:rFonts w:ascii="Consolas" w:hAnsi="Consolas"/>
+          <w:color w:val="881188"/>
+        </w:rPr>
+        <w:t>pricePence</w:t>
+      </w:r>
+      <w:r>
+        <w:t xml:space="preserve"> (£25 = 2500) — same field that drives Stripe checkout, so both places stay in sync automatically.</w:t>
+      </w:r>
+    </w:p>
+    <w:p>
+      <w:pPr>
+        <w:pStyle w:val="ListBullet"/>
+      </w:pPr>
+      <w:r>
+        <w:rPr>
+          <w:b/>
+        </w:rPr>
+        <w:t>Change the image</w:t>
+      </w:r>
+      <w:r>
+        <w:t xml:space="preserve"> → upload to </w:t>
+      </w:r>
+      <w:r>
+        <w:rPr>
+          <w:rFonts w:ascii="Consolas" w:hAnsi="Consolas"/>
+          <w:color w:val="881188"/>
+        </w:rPr>
+        <w:t>hero_image</w:t>
+      </w:r>
+      <w:r>
+        <w:t xml:space="preserve"> on Work · Membership.</w:t>
+      </w:r>
+    </w:p>
+    <w:p>
+      <w:r>
+        <w:t>The section auto-hides if the singleton is missing / unpublished. To add MORE memberships in future (e.g. Reset Letters as a paid Substack tier, or a new founder programme), tell Sameer — the memberships block will need to loop over an array instead of the single record.</w:t>
+      </w:r>
+    </w:p>
+    <w:p>
+      <w:pPr>
+        <w:pStyle w:val="Heading3"/>
+      </w:pPr>
+      <w:r>
+        <w:t>17.49 What every bookable offering needs in the CMS (23 Jul 2026)</w:t>
+      </w:r>
+    </w:p>
+    <w:p>
+      <w:r>
+        <w:t>For a Programme / Experience / Session / Retreat / Workshop to actually work as a bookable, revenue-generating page, fill ALL of these fields on the entry. If any is missing, the page shows without a Book button OR the Mailchimp journey doesn't trigger.</w:t>
+      </w:r>
+    </w:p>
+    <w:p>
+      <w:r>
+        <w:rPr>
+          <w:b/>
+        </w:rPr>
+        <w:t>Every programme (Work · Programme):</w:t>
+      </w:r>
+    </w:p>
+    <w:p>
+      <w:pPr>
+        <w:pStyle w:val="ListBullet"/>
+      </w:pPr>
+      <w:r>
+        <w:rPr>
+          <w:rFonts w:ascii="Consolas" w:hAnsi="Consolas"/>
+          <w:color w:val="881188"/>
+        </w:rPr>
+        <w:t>heroImage</w:t>
+      </w:r>
+      <w:r>
+        <w:t xml:space="preserve"> — landscape image, min 1600×1000. Shows at top of the sales page AND as the cover on /the-work card.</w:t>
+      </w:r>
+    </w:p>
+    <w:p>
+      <w:pPr>
+        <w:pStyle w:val="ListBullet"/>
+      </w:pPr>
+      <w:r>
+        <w:rPr>
+          <w:rFonts w:ascii="Consolas" w:hAnsi="Consolas"/>
+          <w:color w:val="881188"/>
+        </w:rPr>
+        <w:t>pricePence</w:t>
+      </w:r>
+      <w:r>
+        <w:t xml:space="preserve"> — price in pence. £1,500 = 150000. Set to 0 for "enquire only" programmes.</w:t>
+      </w:r>
+    </w:p>
+    <w:p>
+      <w:pPr>
+        <w:pStyle w:val="ListBullet"/>
+      </w:pPr>
+      <w:r>
+        <w:rPr>
+          <w:rFonts w:ascii="Consolas" w:hAnsi="Consolas"/>
+          <w:color w:val="881188"/>
+        </w:rPr>
+        <w:t>ctaLabel</w:t>
+      </w:r>
+      <w:r>
+        <w:t xml:space="preserve"> — button text (e.g. "Book The Reset").</w:t>
+      </w:r>
+    </w:p>
+    <w:p>
+      <w:pPr>
+        <w:pStyle w:val="ListBullet"/>
+      </w:pPr>
+      <w:r>
+        <w:rPr>
+          <w:rFonts w:ascii="Consolas" w:hAnsi="Consolas"/>
+          <w:color w:val="881188"/>
+        </w:rPr>
+        <w:t>ctaUrl</w:t>
+      </w:r>
+      <w:r>
+        <w:t xml:space="preserve"> — where the Book button goes if no </w:t>
+      </w:r>
+      <w:r>
+        <w:rPr>
+          <w:rFonts w:ascii="Consolas" w:hAnsi="Consolas"/>
+          <w:color w:val="881188"/>
+        </w:rPr>
+        <w:t>pricePence</w:t>
+      </w:r>
+      <w:r>
+        <w:t>. Paste Calendly link.</w:t>
+      </w:r>
+    </w:p>
+    <w:p>
+      <w:pPr>
+        <w:pStyle w:val="ListBullet"/>
+      </w:pPr>
+      <w:r>
+        <w:rPr>
+          <w:rFonts w:ascii="Consolas" w:hAnsi="Consolas"/>
+          <w:color w:val="881188"/>
+        </w:rPr>
+        <w:t>postCheckoutCalendlyUrl</w:t>
+      </w:r>
+      <w:r>
+        <w:t xml:space="preserve"> — for paid programmes only: where Stripe redirects the buyer AFTER payment (usually first-session booking Calendly).</w:t>
+      </w:r>
+    </w:p>
+    <w:p>
+      <w:pPr>
+        <w:pStyle w:val="ListBullet"/>
+      </w:pPr>
+      <w:r>
+        <w:rPr>
+          <w:rFonts w:ascii="Consolas" w:hAnsi="Consolas"/>
+          <w:color w:val="881188"/>
+        </w:rPr>
+        <w:t>mailchimpTag</w:t>
+      </w:r>
+      <w:r>
+        <w:t xml:space="preserve"> — the tag that fires on successful purchase. Must match a Mailchimp tag EXACTLY.</w:t>
+      </w:r>
+    </w:p>
+    <w:p>
+      <w:pPr>
+        <w:pStyle w:val="ListBullet"/>
+      </w:pPr>
+      <w:r>
+        <w:rPr>
+          <w:rFonts w:ascii="Consolas" w:hAnsi="Consolas"/>
+          <w:color w:val="881188"/>
+        </w:rPr>
+        <w:t>chatCtaLabel</w:t>
+      </w:r>
+      <w:r>
+        <w:t xml:space="preserve"> + </w:t>
+      </w:r>
+      <w:r>
+        <w:rPr>
+          <w:rFonts w:ascii="Consolas" w:hAnsi="Consolas"/>
+          <w:color w:val="881188"/>
+        </w:rPr>
+        <w:t>chatCtaUrl</w:t>
+      </w:r>
+      <w:r>
+        <w:t xml:space="preserve"> — optional secondary "book a free 15-min chat" button, for people not ready to buy.</w:t>
+      </w:r>
+    </w:p>
+    <w:p>
+      <w:r>
+        <w:rPr>
+          <w:b/>
+        </w:rPr>
+        <w:t>Every experience (retreats / workshops — Experiences · Event Bookings):</w:t>
+      </w:r>
+    </w:p>
+    <w:p>
+      <w:pPr>
+        <w:pStyle w:val="ListBullet"/>
+      </w:pPr>
+      <w:r>
+        <w:rPr>
+          <w:rFonts w:ascii="Consolas" w:hAnsi="Consolas"/>
+          <w:color w:val="881188"/>
+        </w:rPr>
+        <w:t>hero_image</w:t>
+      </w:r>
+      <w:r>
+        <w:t xml:space="preserve"> — landscape image, min 1600×1000.</w:t>
+      </w:r>
+    </w:p>
+    <w:p>
+      <w:pPr>
+        <w:pStyle w:val="ListBullet"/>
+      </w:pPr>
+      <w:r>
+        <w:rPr>
+          <w:rFonts w:ascii="Consolas" w:hAnsi="Consolas"/>
+          <w:color w:val="881188"/>
+        </w:rPr>
+        <w:t>price</w:t>
+      </w:r>
+      <w:r>
+        <w:t xml:space="preserve"> — decimal amount in £ (e.g. 115).</w:t>
+      </w:r>
+    </w:p>
+    <w:p>
+      <w:pPr>
+        <w:pStyle w:val="ListBullet"/>
+      </w:pPr>
+      <w:r>
+        <w:rPr>
+          <w:rFonts w:ascii="Consolas" w:hAnsi="Consolas"/>
+          <w:color w:val="881188"/>
+        </w:rPr>
+        <w:t>price_label</w:t>
+      </w:r>
+      <w:r>
+        <w:t xml:space="preserve"> — human-readable label (e.g. "£115 · Day immersion").</w:t>
+      </w:r>
+    </w:p>
+    <w:p>
+      <w:pPr>
+        <w:pStyle w:val="ListBullet"/>
+      </w:pPr>
+      <w:r>
+        <w:rPr>
+          <w:rFonts w:ascii="Consolas" w:hAnsi="Consolas"/>
+          <w:color w:val="881188"/>
+        </w:rPr>
+        <w:t>booking_url</w:t>
+      </w:r>
+      <w:r>
+        <w:t xml:space="preserve"> — Stripe checkout link OR Calendly link for booking.</w:t>
+      </w:r>
+    </w:p>
+    <w:p>
+      <w:pPr>
+        <w:pStyle w:val="ListBullet"/>
+      </w:pPr>
+      <w:r>
+        <w:rPr>
+          <w:rFonts w:ascii="Consolas" w:hAnsi="Consolas"/>
+          <w:color w:val="881188"/>
+        </w:rPr>
+        <w:t>mailchimp_tag</w:t>
+      </w:r>
+      <w:r>
+        <w:t xml:space="preserve"> — the tag that fires on successful booking. Must match a Mailchimp tag EXACTLY.</w:t>
+      </w:r>
+    </w:p>
+    <w:p>
+      <w:pPr>
+        <w:pStyle w:val="ListBullet"/>
+      </w:pPr>
+      <w:r>
+        <w:rPr>
+          <w:rFonts w:ascii="Consolas" w:hAnsi="Consolas"/>
+          <w:color w:val="881188"/>
+        </w:rPr>
+        <w:t>is_active</w:t>
+      </w:r>
+      <w:r>
+        <w:t xml:space="preserve"> — must be TICKED, otherwise the experience is hidden from the public site.</w:t>
+      </w:r>
+    </w:p>
+    <w:p>
+      <w:pPr>
+        <w:pStyle w:val="ListBullet"/>
+      </w:pPr>
+      <w:r>
+        <w:rPr>
+          <w:rFonts w:ascii="Consolas" w:hAnsi="Consolas"/>
+          <w:color w:val="881188"/>
+        </w:rPr>
+        <w:t>is_upcoming</w:t>
+      </w:r>
+      <w:r>
+        <w:t xml:space="preserve"> — TICK for future events, UNTICK once the event has passed (moves it to the archive).</w:t>
+      </w:r>
+    </w:p>
+    <w:p>
+      <w:r>
+        <w:rPr>
+          <w:b/>
+        </w:rPr>
+        <w:t>Every 1:1 session (Work · Session CARD list only):</w:t>
+      </w:r>
+    </w:p>
+    <w:p>
+      <w:pPr>
+        <w:pStyle w:val="ListBullet"/>
+      </w:pPr>
+      <w:r>
+        <w:rPr>
+          <w:rFonts w:ascii="Consolas" w:hAnsi="Consolas"/>
+          <w:color w:val="881188"/>
+        </w:rPr>
+        <w:t>hero_image</w:t>
+      </w:r>
+      <w:r>
+        <w:t xml:space="preserve"> — landscape image, min 1600×1000. This is what shows on the /the-work card.</w:t>
+      </w:r>
+    </w:p>
+    <w:p>
+      <w:pPr>
+        <w:pStyle w:val="ListBullet"/>
+      </w:pPr>
+      <w:r>
+        <w:rPr>
+          <w:rFonts w:ascii="Consolas" w:hAnsi="Consolas"/>
+          <w:color w:val="881188"/>
+        </w:rPr>
+        <w:t>booking_url</w:t>
+      </w:r>
+      <w:r>
+        <w:t xml:space="preserve"> — where the Book button goes.</w:t>
+      </w:r>
+    </w:p>
+    <w:p>
+      <w:pPr>
+        <w:pStyle w:val="ListBullet"/>
+      </w:pPr>
+      <w:r>
+        <w:t xml:space="preserve">Note: the FULL SALES PAGE for each 90-min session is edited under </w:t>
+      </w:r>
+      <w:r>
+        <w:rPr>
+          <w:b/>
+        </w:rPr>
+        <w:t>Work · Programme</w:t>
+      </w:r>
+      <w:r>
+        <w:t xml:space="preserve"> (slugs </w:t>
+      </w:r>
+      <w:r>
+        <w:rPr>
+          <w:rFonts w:ascii="Consolas" w:hAnsi="Consolas"/>
+          <w:color w:val="881188"/>
+        </w:rPr>
+        <w:t>nervous-system-reset</w:t>
+      </w:r>
+      <w:r>
+        <w:t xml:space="preserve">, </w:t>
+      </w:r>
+      <w:r>
+        <w:rPr>
+          <w:rFonts w:ascii="Consolas" w:hAnsi="Consolas"/>
+          <w:color w:val="881188"/>
+        </w:rPr>
+        <w:t>founder-reset</w:t>
+      </w:r>
+      <w:r>
+        <w:t xml:space="preserve">, </w:t>
+      </w:r>
+      <w:r>
+        <w:rPr>
+          <w:rFonts w:ascii="Consolas" w:hAnsi="Consolas"/>
+          <w:color w:val="881188"/>
+        </w:rPr>
+        <w:t>dating-reset</w:t>
+      </w:r>
+      <w:r>
+        <w:t>), NOT here. See §17.47.</w:t>
+      </w:r>
+    </w:p>
+    <w:p>
+      <w:r>
+        <w:rPr>
+          <w:b/>
+        </w:rPr>
+        <w:t>The Reset Room membership (Work · Membership — Reset Room):</w:t>
+      </w:r>
+    </w:p>
+    <w:p>
+      <w:pPr>
+        <w:pStyle w:val="ListBullet"/>
+      </w:pPr>
+      <w:r>
+        <w:t xml:space="preserve">Everything already filled including </w:t>
+      </w:r>
+      <w:r>
+        <w:rPr>
+          <w:rFonts w:ascii="Consolas" w:hAnsi="Consolas"/>
+          <w:color w:val="881188"/>
+        </w:rPr>
+        <w:t>pricePence</w:t>
+      </w:r>
+      <w:r>
+        <w:t xml:space="preserve">, </w:t>
+      </w:r>
+      <w:r>
+        <w:rPr>
+          <w:rFonts w:ascii="Consolas" w:hAnsi="Consolas"/>
+          <w:color w:val="881188"/>
+        </w:rPr>
+        <w:t>mailchimpTag</w:t>
+      </w:r>
+      <w:r>
+        <w:t xml:space="preserve">, and Stripe wiring. Only thing to add is </w:t>
+      </w:r>
+      <w:r>
+        <w:rPr>
+          <w:rFonts w:ascii="Consolas" w:hAnsi="Consolas"/>
+          <w:color w:val="881188"/>
+        </w:rPr>
+        <w:t>hero_image</w:t>
+      </w:r>
+      <w:r>
+        <w:t xml:space="preserve"> if you want a photo on the /the-work memberships card.</w:t>
+      </w:r>
+    </w:p>
+    <w:p>
+      <w:r>
+        <w:rPr>
+          <w:b/>
+        </w:rPr>
+        <w:t>The email journey (Mailchimp):</w:t>
+      </w:r>
+      <w:r>
+        <w:t xml:space="preserve"> Once every offering has a </w:t>
+      </w:r>
+      <w:r>
+        <w:rPr>
+          <w:rFonts w:ascii="Consolas" w:hAnsi="Consolas"/>
+          <w:color w:val="881188"/>
+        </w:rPr>
+        <w:t>mailchimp_tag</w:t>
+      </w:r>
+      <w:r>
+        <w:t xml:space="preserve"> (or </w:t>
+      </w:r>
+      <w:r>
+        <w:rPr>
+          <w:rFonts w:ascii="Consolas" w:hAnsi="Consolas"/>
+          <w:color w:val="881188"/>
+        </w:rPr>
+        <w:t>mailchimpTag</w:t>
+      </w:r>
+      <w:r>
+        <w:t>) set, you can build a Customer Journey in Mailchimp per tag:</w:t>
+      </w:r>
+    </w:p>
+    <w:p>
+      <w:pPr>
+        <w:pStyle w:val="ListNumber"/>
+      </w:pPr>
+      <w:r>
+        <w:t>Mailchimp → Automations → Customer Journeys → Create.</w:t>
+      </w:r>
+    </w:p>
+    <w:p>
+      <w:pPr>
+        <w:pStyle w:val="ListNumber"/>
+      </w:pPr>
+      <w:r>
+        <w:t xml:space="preserve">Trigger: </w:t>
+      </w:r>
+      <w:r>
+        <w:rPr>
+          <w:b/>
+        </w:rPr>
+        <w:t>Contact tagged</w:t>
+      </w:r>
+      <w:r>
+        <w:t xml:space="preserve"> → paste the exact tag name.</w:t>
+      </w:r>
+    </w:p>
+    <w:p>
+      <w:pPr>
+        <w:pStyle w:val="ListNumber"/>
+      </w:pPr>
+      <w:r>
+        <w:t>Design the emails (welcome / logistics / follow-up / testimonial ask etc.).</w:t>
+      </w:r>
+    </w:p>
+    <w:p>
+      <w:pPr>
+        <w:pStyle w:val="ListNumber"/>
+      </w:pPr>
+      <w:r>
+        <w:t>Publish the journey.</w:t>
+      </w:r>
+    </w:p>
+    <w:p>
+      <w:r>
+        <w:t>The site fires the tag automatically on booking. Mailchimp handles the emails from there.</w:t>
       </w:r>
     </w:p>
     <w:p>

</xml_diff>